<commit_message>
Remove unverifiable cells and claims from revised manuscript; update notes
Co-Authored-By: Claude Sonnet 5.5 <noreply@anthropic.com>
Claude-Session: https://claude.ai/code/session_015MZUD2DotEDYTGGfpD8taa
</commit_message>
<xml_diff>
--- a/revision/Acquired_Not_Yet_Assimilated_ISR_revised.docx
+++ b/revision/Acquired_Not_Yet_Assimilated_ISR_revised.docx
@@ -6370,79 +6370,7 @@
         <w:rPr>
           <w:rFonts w:ascii="Times New Roman" w:hAnsi="Times New Roman" w:eastAsia="Times New Roman" w:cs="Times New Roman"/>
         </w:rPr>
-        <w:t xml:space="preserve">0.31 to 0.41), but it was written after one coder’s pattern on a first half-sample had been seen, so we report it only as exploratory. A rule-based score correlates 0.78 to 0.88 with the narrow score and serves as a robustness check. With the broad measure the European coefficients are</w:t>
-      </w:r>
-      <w:r>
-        <w:rPr>
-          <w:rFonts w:ascii="Times New Roman" w:hAnsi="Times New Roman" w:eastAsia="Times New Roman" w:cs="Times New Roman"/>
-        </w:rPr>
-        <w:t xml:space="preserve"> </w:t>
-      </w:r>
-      <m:oMath>
-        <m:r>
-          <m:rPr>
-            <m:sty m:val="p"/>
-          </m:rPr>
-          <m:t>−</m:t>
-        </m:r>
-        <m:r>
-          <m:t>0.009</m:t>
-        </m:r>
-      </m:oMath>
-      <w:r>
-        <w:rPr>
-          <w:rFonts w:ascii="Times New Roman" w:hAnsi="Times New Roman" w:eastAsia="Times New Roman" w:cs="Times New Roman"/>
-        </w:rPr>
-        <w:t xml:space="preserve"> </w:t>
-      </w:r>
-      <w:r>
-        <w:rPr>
-          <w:rFonts w:ascii="Times New Roman" w:hAnsi="Times New Roman" w:eastAsia="Times New Roman" w:cs="Times New Roman"/>
-        </w:rPr>
-        <w:t xml:space="preserve">in 2023 and</w:t>
-      </w:r>
-      <w:r>
-        <w:rPr>
-          <w:rFonts w:ascii="Times New Roman" w:hAnsi="Times New Roman" w:eastAsia="Times New Roman" w:cs="Times New Roman"/>
-        </w:rPr>
-        <w:t xml:space="preserve"> </w:t>
-      </w:r>
-      <m:oMath>
-        <m:r>
-          <m:rPr>
-            <m:sty m:val="p"/>
-          </m:rPr>
-          <m:t>−</m:t>
-        </m:r>
-        <m:r>
-          <m:t>0.004</m:t>
-        </m:r>
-      </m:oMath>
-      <w:r>
-        <w:rPr>
-          <w:rFonts w:ascii="Times New Roman" w:hAnsi="Times New Roman" w:eastAsia="Times New Roman" w:cs="Times New Roman"/>
-        </w:rPr>
-        <w:t xml:space="preserve"> </w:t>
-      </w:r>
-      <w:r>
-        <w:rPr>
-          <w:rFonts w:ascii="Times New Roman" w:hAnsi="Times New Roman" w:eastAsia="Times New Roman" w:cs="Times New Roman"/>
-        </w:rPr>
-        <w:t xml:space="preserve">in 2024 (standard errors 0.007 and 0.015).</w:t>
-      </w:r>
-      <w:r>
-        <w:rPr>
-          <w:rFonts w:ascii="Times New Roman" w:hAnsi="Times New Roman" w:eastAsia="Times New Roman" w:cs="Times New Roman"/>
-        </w:rPr>
-        <w:t xml:space="preserve"> </w:t>
-      </w:r>
-      <w:r>
-        <w:rPr>
-          <w:bCs/>
-          <w:rFonts w:ascii="Times New Roman" w:hAnsi="Times New Roman" w:eastAsia="Times New Roman" w:cs="Times New Roman"/>
-          <w:b/>
-        </w:rPr>
-        <w:t xml:space="preserve">[CHECK: the 2023 figure duplicates the trend-deviation estimate in Table 4; confirm against output.]</w:t>
+        <w:t xml:space="preserve">0.31 to 0.41), but it was written after one coder’s pattern on a first half-sample had been seen, so we report it only as exploratory. A rule-based score correlates 0.78 to 0.88 with the narrow score and serves as a robustness check.</w:t>
       </w:r>
     </w:p>
     <w:p>
@@ -6479,7 +6407,7 @@
         <w:rPr>
           <w:rFonts w:ascii="Times New Roman" w:hAnsi="Times New Roman" w:eastAsia="Times New Roman" w:cs="Times New Roman"/>
         </w:rPr>
-        <w:t xml:space="preserve">at the task level can therefore coexist with high raw agreement. We report prevalence, raw agreement, and a prevalence-robust statistic alongside</w:t>
+        <w:t xml:space="preserve">at the task level can therefore coexist with high raw agreement. Future validation work should report prevalence, raw agreement, and a prevalence-robust statistic alongside</w:t>
       </w:r>
       <w:r>
         <w:rPr>
@@ -6496,13 +6424,7 @@
         <w:rPr>
           <w:rFonts w:ascii="Times New Roman" w:hAnsi="Times New Roman" w:eastAsia="Times New Roman" w:cs="Times New Roman"/>
         </w:rPr>
-        <w:t xml:space="preserve"> </w:t>
-      </w:r>
-      <w:r>
-        <w:rPr>
-          <w:rFonts w:ascii="Times New Roman" w:hAnsi="Times New Roman" w:eastAsia="Times New Roman" w:cs="Times New Roman"/>
-        </w:rPr>
-        <w:t xml:space="preserve">in the replication materials. Second, the exposure measure that enters the regressions is an occupation-level mean over roughly twenty task statements, and averaging raises reliability when task-level errors are independent. By the Spearman–Brown relation, a task-level reliability between 0.04 and 0.18 implies an occupation-level reliability of roughly 0.45 to 0.81 for twenty tasks. This is an indicative range, not an estimate: it assumes independent errors, and systematic bias in the language-model score, for example a tendency to treat all design-related occupations alike, does not average out. Third, and most important for our argument, classical measurement error attenuates the coefficient per standard deviation of exposure by the square root of the reliability (Appendix B). Complete assimilation would therefore produce a</w:t>
+        <w:t xml:space="preserve">. Second, the exposure measure that enters the regressions is an occupation-level mean over roughly twenty task statements, and averaging raises reliability when task-level errors are independent. By the Spearman–Brown relation, a task-level reliability between 0.04 and 0.18 implies an occupation-level reliability of roughly 0.45 to 0.81 for twenty tasks. This is an indicative range, not an estimate: it assumes independent errors, and systematic bias in the language-model score, for example a tendency to treat all design-related occupations alike, does not average out. Third, and most important for our argument, classical measurement error attenuates the coefficient per standard deviation of exposure by the square root of the reliability (Appendix B). Complete assimilation would therefore produce a</w:t>
       </w:r>
       <w:r>
         <w:rPr>
@@ -7789,20 +7711,6 @@
           <w:rFonts w:ascii="Times New Roman" w:hAnsi="Times New Roman" w:eastAsia="Times New Roman" w:cs="Times New Roman"/>
         </w:rPr>
         <w:t xml:space="preserve">Eurostat 2025. Multiple answers allowed. Items refer to AI in general and are asked only of enterprises that considered AI.</w:t>
-      </w:r>
-      <w:r>
-        <w:rPr>
-          <w:rFonts w:ascii="Times New Roman" w:hAnsi="Times New Roman" w:eastAsia="Times New Roman" w:cs="Times New Roman"/>
-        </w:rPr>
-        <w:t xml:space="preserve"> </w:t>
-      </w:r>
-      <w:r>
-        <w:rPr>
-          <w:bCs/>
-          <w:rFonts w:ascii="Times New Roman" w:hAnsi="Times New Roman" w:eastAsia="Times New Roman" w:cs="Times New Roman"/>
-          <w:b/>
-        </w:rPr>
-        <w:t xml:space="preserve">[CHECK: add the data-availability and system-incompatibility items listed in Section 5.1 if their shares are reported.]</w:t>
       </w:r>
     </w:p>
     <w:p>
@@ -8336,7 +8244,7 @@
                 <w:rFonts w:ascii="Times New Roman" w:hAnsi="Times New Roman"/>
                 <w:sz w:val="19"/>
               </w:rPr>
-              <w:t xml:space="preserve">+0.011 (tbd)</w:t>
+              <w:t xml:space="preserve">+0.011 (n.r.)</w:t>
             </w:r>
           </w:p>
         </w:tc>
@@ -8446,7 +8354,7 @@
                 <w:rFonts w:ascii="Times New Roman" w:hAnsi="Times New Roman"/>
                 <w:sz w:val="19"/>
               </w:rPr>
-              <w:t xml:space="preserve">tbd</w:t>
+              <w:t xml:space="preserve">n.r.</w:t>
             </w:r>
           </w:p>
         </w:tc>
@@ -8464,7 +8372,7 @@
                 <w:rFonts w:ascii="Times New Roman" w:hAnsi="Times New Roman"/>
                 <w:sz w:val="19"/>
               </w:rPr>
-              <w:t xml:space="preserve">−0.037 (tbd)</w:t>
+              <w:t xml:space="preserve">−0.037 (n.r.)</w:t>
             </w:r>
           </w:p>
         </w:tc>
@@ -8482,7 +8390,7 @@
                 <w:rFonts w:ascii="Times New Roman" w:hAnsi="Times New Roman"/>
                 <w:sz w:val="19"/>
               </w:rPr>
-              <w:t xml:space="preserve">−0.059 (tbd)</w:t>
+              <w:t xml:space="preserve">−0.059 (n.r.)</w:t>
             </w:r>
           </w:p>
         </w:tc>
@@ -8656,7 +8564,7 @@
                 <w:rFonts w:ascii="Times New Roman" w:hAnsi="Times New Roman"/>
                 <w:sz w:val="19"/>
               </w:rPr>
-              <w:t xml:space="preserve">tbd</w:t>
+              <w:t xml:space="preserve">—</w:t>
             </w:r>
           </w:p>
         </w:tc>
@@ -8674,7 +8582,7 @@
                 <w:rFonts w:ascii="Times New Roman" w:hAnsi="Times New Roman"/>
                 <w:sz w:val="19"/>
               </w:rPr>
-              <w:t xml:space="preserve">tbd</w:t>
+              <w:t xml:space="preserve">—</w:t>
             </w:r>
           </w:p>
         </w:tc>
@@ -8692,7 +8600,7 @@
                 <w:rFonts w:ascii="Times New Roman" w:hAnsi="Times New Roman"/>
                 <w:sz w:val="19"/>
               </w:rPr>
-              <w:t xml:space="preserve">tbd</w:t>
+              <w:t xml:space="preserve">—</w:t>
             </w:r>
           </w:p>
         </w:tc>
@@ -8802,7 +8710,7 @@
                 <w:rFonts w:ascii="Times New Roman" w:hAnsi="Times New Roman"/>
                 <w:sz w:val="19"/>
               </w:rPr>
-              <w:t xml:space="preserve">tbd</w:t>
+              <w:t xml:space="preserve">n.r.</w:t>
             </w:r>
           </w:p>
         </w:tc>
@@ -8869,43 +8777,7 @@
         <w:rPr>
           <w:rFonts w:ascii="Times New Roman" w:hAnsi="Times New Roman" w:eastAsia="Times New Roman" w:cs="Times New Roman"/>
         </w:rPr>
-        <w:t xml:space="preserve">604 country-occupation cells (96 occupations, 16 countries); country-year fixed effects; standard errors clustered by ISCO three-digit occupation in parentheses. The deviation row estimates a linear trend in the exposure gradient on 2019–2021 (−0.0072 per year, standard error 0.0047) and reports the deviation of 2023 and 2024 from its extrapolation. Minimum detectable effect = 2.8 × standard error of the preferred specification (two-sided 5 percent test, 80 percent power).</w:t>
-      </w:r>
-      <w:r>
-        <w:rPr>
-          <w:rFonts w:ascii="Times New Roman" w:hAnsi="Times New Roman" w:eastAsia="Times New Roman" w:cs="Times New Roman"/>
-        </w:rPr>
-        <w:t xml:space="preserve"> </w:t>
-      </w:r>
-      <w:r>
-        <w:rPr>
-          <w:rFonts w:ascii="Times New Roman" w:hAnsi="Times New Roman" w:eastAsia="Times New Roman" w:cs="Times New Roman"/>
-        </w:rPr>
-        <w:t xml:space="preserve">“</w:t>
-      </w:r>
-      <w:r>
-        <w:rPr>
-          <w:rFonts w:ascii="Times New Roman" w:hAnsi="Times New Roman" w:eastAsia="Times New Roman" w:cs="Times New Roman"/>
-        </w:rPr>
-        <w:t xml:space="preserve">tbd</w:t>
-      </w:r>
-      <w:r>
-        <w:rPr>
-          <w:rFonts w:ascii="Times New Roman" w:hAnsi="Times New Roman" w:eastAsia="Times New Roman" w:cs="Times New Roman"/>
-        </w:rPr>
-        <w:t xml:space="preserve">”</w:t>
-      </w:r>
-      <w:r>
-        <w:rPr>
-          <w:rFonts w:ascii="Times New Roman" w:hAnsi="Times New Roman" w:eastAsia="Times New Roman" w:cs="Times New Roman"/>
-        </w:rPr>
-        <w:t xml:space="preserve"> </w:t>
-      </w:r>
-      <w:r>
-        <w:rPr>
-          <w:rFonts w:ascii="Times New Roman" w:hAnsi="Times New Roman" w:eastAsia="Times New Roman" w:cs="Times New Roman"/>
-        </w:rPr>
-        <w:t xml:space="preserve">marks cells that must be filled from the regression output.</w:t>
+        <w:t xml:space="preserve">604 country-occupation cells (96 occupations, 16 countries); country-year fixed effects; standard errors clustered by ISCO three-digit occupation in parentheses. The deviation row estimates a linear trend in the exposure gradient on 2019–2021 (−0.0072 per year, standard error 0.0047) and reports the deviation of 2023 and 2024 from its extrapolation. Minimum detectable effect = 2.8 × standard error of the preferred specification (two-sided 5 percent test, 80 percent power). n.r. = not reported; — = not applicable.</w:t>
       </w:r>
     </w:p>
     <w:p>
@@ -12400,27 +12272,7 @@
         <w:rPr>
           <w:rFonts w:ascii="Times New Roman" w:hAnsi="Times New Roman" w:eastAsia="Times New Roman" w:cs="Times New Roman"/>
         </w:rPr>
-        <w:t xml:space="preserve">We do not observe assimilation. The barrier items refer to AI in general and to firms that considered it, so they speak to the acquisition margin only. The hiring series are experimental, measure adverts or vacancies rather than employment, and would miss substitution through hours, outsourcing, or freelancing. Exposure is measured with low task-level agreement, and although we argue that this strengthens the detectability result, it limits what can be said about the gradients themselves; a categorical treatment defined by occupation codes (for example, graphic designers, visual artists, and photographers) would avoid model-based scoring and is a natural next step</w:t>
-      </w:r>
-      <w:r>
-        <w:rPr>
-          <w:rFonts w:ascii="Times New Roman" w:hAnsi="Times New Roman" w:eastAsia="Times New Roman" w:cs="Times New Roman"/>
-        </w:rPr>
-        <w:t xml:space="preserve"> </w:t>
-      </w:r>
-      <w:r>
-        <w:rPr>
-          <w:bCs/>
-          <w:rFonts w:ascii="Times New Roman" w:hAnsi="Times New Roman" w:eastAsia="Times New Roman" w:cs="Times New Roman"/>
-          <w:b/>
-        </w:rPr>
-        <w:t xml:space="preserve">[TO RUN before submission, or state as future work]</w:t>
-      </w:r>
-      <w:r>
-        <w:rPr>
-          <w:rFonts w:ascii="Times New Roman" w:hAnsi="Times New Roman" w:eastAsia="Times New Roman" w:cs="Times New Roman"/>
-        </w:rPr>
-        <w:t xml:space="preserve">. Acquisition rates are sector averages and do not identify the employers of particular occupations. We study occupations and sectors, not aggregate employment or productivity, and the macroeconomic reading in Section 10.2 interprets the results through the model rather than testing it. The review floor in Proposition 1 rests on the assumption that review hours do not fall with model quality; where better models reduce visible defects, review may become cheaper and the threshold in equation (1) may fall without any change in complements, which would weaken Implication 1 for those tasks. The detectability bound rests on a linear mapping from exposure to the visual share of work and on reference effect sizes from platforms, and both could be refined; however, plausible changes alter the numbers in Tables 5 and 6 without changing the conclusion that current designs lack the power to detect complete assimilation at platform-sized effects.</w:t>
+        <w:t xml:space="preserve">We do not observe assimilation. The barrier items refer to AI in general and to firms that considered it, so they speak to the acquisition margin only. The hiring series are experimental, measure adverts or vacancies rather than employment, and would miss substitution through hours, outsourcing, or freelancing. Exposure is measured with low task-level agreement, and although we argue that this strengthens the detectability result, it limits what can be said about the gradients themselves; a categorical treatment defined by occupation codes (for example, graphic designers, visual artists, and photographers) would avoid model-based scoring and is a natural next step that we leave to future work. Acquisition rates are sector averages and do not identify the employers of particular occupations. We study occupations and sectors, not aggregate employment or productivity, and the macroeconomic reading in Section 10.2 interprets the results through the model rather than testing it. The review floor in Proposition 1 rests on the assumption that review hours do not fall with model quality; where better models reduce visible defects, review may become cheaper and the threshold in equation (1) may fall without any change in complements, which would weaken Implication 1 for those tasks. The detectability bound rests on a linear mapping from exposure to the visual share of work and on reference effect sizes from platforms, and both could be refined; however, plausible changes alter the numbers in Tables 5 and 6 without changing the conclusion that current designs lack the power to detect complete assimilation at platform-sized effects.</w:t>
       </w:r>
     </w:p>
     <w:bookmarkEnd w:id="53"/>
@@ -12475,7 +12327,33 @@
         <w:rPr>
           <w:rFonts w:ascii="Times New Roman" w:hAnsi="Times New Roman" w:eastAsia="Times New Roman" w:cs="Times New Roman"/>
         </w:rPr>
-        <w:t xml:space="preserve">All data are public (Eurostat, Statistics Canada, U.S. Census Bureau, O*NET, Indeed Hiring Lab). Code, prompts, task scores, and human coding files required to reproduce the tables are available in an anonymized replication repository. Large language models were used as measurement instruments to code task statements. A generative AI assistant was used to help write analysis code and to draft and edit the manuscript. The authors reviewed all results, text, and code and take responsibility for the content.</w:t>
+        <w:t xml:space="preserve">All data are public (Eurostat, Statistics Canada, U.S. Census Bureau, O*NET, Indeed Hiring Lab). Code, prompts, task scores, and human coding files required to reproduce the tables are available in an anonymized replication repository.</w:t>
+      </w:r>
+      <w:r>
+        <w:rPr>
+          <w:rFonts w:ascii="Times New Roman" w:hAnsi="Times New Roman" w:eastAsia="Times New Roman" w:cs="Times New Roman"/>
+        </w:rPr>
+        <w:t xml:space="preserve"> </w:t>
+      </w:r>
+      <w:r>
+        <w:rPr>
+          <w:bCs/>
+          <w:rFonts w:ascii="Times New Roman" w:hAnsi="Times New Roman" w:eastAsia="Times New Roman" w:cs="Times New Roman"/>
+          <w:b/>
+        </w:rPr>
+        <w:t xml:space="preserve">[CONFIRM before submission: keep this sentence only if the repository exists; otherwise describe what is actually available.]</w:t>
+      </w:r>
+      <w:r>
+        <w:rPr>
+          <w:rFonts w:ascii="Times New Roman" w:hAnsi="Times New Roman" w:eastAsia="Times New Roman" w:cs="Times New Roman"/>
+        </w:rPr>
+        <w:t xml:space="preserve"> </w:t>
+      </w:r>
+      <w:r>
+        <w:rPr>
+          <w:rFonts w:ascii="Times New Roman" w:hAnsi="Times New Roman" w:eastAsia="Times New Roman" w:cs="Times New Roman"/>
+        </w:rPr>
+        <w:t xml:space="preserve">Large language models were used as measurement instruments to code task statements. A generative AI assistant was used to help write analysis code and to draft and edit the manuscript. The authors reviewed all results, text, and code and take responsibility for the content.</w:t>
       </w:r>
     </w:p>
     <w:bookmarkEnd w:id="56"/>

</xml_diff>

<commit_message>
Replace Tables 4-5 and dependent text with reproduced estimates; add Canada, interaction, and scorer-agreement reproduction
Co-Authored-By: Claude Sonnet 5.5 <noreply@anthropic.com>
Claude-Session: https://claude.ai/code/session_015MZUD2DotEDYTGGfpD8taa
</commit_message>
<xml_diff>
--- a/revision/Acquired_Not_Yet_Assimilated_ISR_revised.docx
+++ b/revision/Acquired_Not_Yet_Assimilated_ISR_revised.docx
@@ -216,7 +216,7 @@
         <w:rPr>
           <w:rFonts w:ascii="Times New Roman" w:hAnsi="Times New Roman" w:eastAsia="Times New Roman" w:cs="Times New Roman"/>
         </w:rPr>
-        <w:t xml:space="preserve">Statistics showing that firms have adopted generative visual AI are often read as evidence that creative work is being displaced. We argue that this reading is premature. Extending information systems research on assimilation, we develop a task-level model in which a firm hands a visual task to a generator only when the share of acceptable output exceeds a threshold set by generation, review, and human production costs. Complementary assets such as expertise, review routines, and compliance procedures enter through review cost alone. Because a generator costs almost nothing to acquire, acquisition can climb without the investment that assimilation requires, and the gap between the two widens. Eurostat data show that 9.6 percent of EU firms use AI that generates pictures, video, or audio, and that firms that considered but did not adopt AI cite missing expertise (70 percent) and legal uncertainty (54 percent) far more often than lack of usefulness (18 percent). European and Canadian job-advert data show no detectable labor-market response, yet we show that these designs could not detect even complete assimilation at the substitution rates observed on freelance platforms. A null result is therefore uninformative. We derive a detectability bound that can accompany any exposure estimate and specify the firm-level data needed to separate the competing accounts.</w:t>
+        <w:t xml:space="preserve">Statistics showing that firms have adopted generative visual AI are often read as evidence that creative work is being displaced. We argue that this reading is premature. Extending information systems research on assimilation, we develop a task-level model in which a firm hands a visual task to a generator only when the share of acceptable output exceeds a threshold set by generation, review, and human production costs. Complementary assets such as expertise, review routines, and compliance procedures enter through review cost alone. Because a generator costs almost nothing to acquire, acquisition can climb without the investment that assimilation requires, and the gap between the two widens. Eurostat data show that 9.6 percent of EU firms use AI that generates pictures, video, or audio, and that firms that considered but did not adopt AI cite missing expertise (70 percent) and legal uncertainty (54 percent) far more often than lack of usefulness (18 percent). European and Canadian job-advert data show only small exposure gradients that cannot be distinguished from earlier trends, and we show that these designs could not detect even complete assimilation at the substitution rates observed on freelance platforms. Such results are therefore uninformative about assimilation. We derive a detectability bound that can accompany any exposure estimate and specify the firm-level data needed to separate the competing accounts.</w:t>
       </w:r>
     </w:p>
     <w:p>
@@ -304,7 +304,7 @@
         <w:rPr>
           <w:rFonts w:ascii="Times New Roman" w:hAnsi="Times New Roman" w:eastAsia="Times New Roman" w:cs="Times New Roman"/>
         </w:rPr>
-        <w:t xml:space="preserve">The results are partly substantive and partly cautionary. Acquisition of generative visual AI is substantial and rising, so the absence of a hiring response cannot be explained by an absence of acquisition. Firms that considered AI and did not adopt it cite missing expertise, legal uncertainty, and data-protection concerns far more often than a tool that is not useful, which is what a complementary-asset account predicts and a capability-failure account does not. The hiring data, however, cannot currently distinguish an assimilation gap from complete assimilation. At observed acquisition rates and at the substitution effects estimated on freelance platforms (Demirci et al., 2025), complete assimilation would reduce adverts in the most exposed occupation by roughly 2 to 17 percent, while the European design cannot detect a reduction smaller than about 24 percent. The exposure gradients the designs do report are small and imprecise, about 1 to 2 percent fewer adverts per standard deviation of exposure in 2023 and 2024, and the European gradient was already moving in the same direction before generative tools were released.</w:t>
+        <w:t xml:space="preserve">The results are partly substantive and partly cautionary. Acquisition of generative visual AI is substantial and rising, so the absence of a hiring response cannot be explained by an absence of acquisition. Firms that considered AI and did not adopt it cite missing expertise, legal uncertainty, and data-protection concerns far more often than a tool that is not useful, which is what a complementary-asset account predicts and a capability-failure account does not. The hiring data, however, cannot currently distinguish an assimilation gap from complete assimilation. At observed acquisition rates and at the substitution effects estimated on freelance platforms (Demirci et al., 2025), complete assimilation would reduce adverts in the most exposed occupation by roughly 2 to 17 percent, while the European design cannot detect a reduction smaller than about 23 percent. The exposure gradients the designs do report are small and imprecise: about 2 to 3 percent fewer adverts per standard deviation of exposure in Europe in 2023 and 2024, and a first-year decline of similar size in Canada that does not persist. Exposed occupations were already declining relative to others before generative tools were released.</w:t>
       </w:r>
     </w:p>
     <w:p>
@@ -388,7 +388,7 @@
         <w:rPr>
           <w:rFonts w:ascii="Times New Roman" w:hAnsi="Times New Roman" w:eastAsia="Times New Roman" w:cs="Times New Roman"/>
         </w:rPr>
-        <w:t xml:space="preserve">We provide a detectability bound that changes how the large and growing literature on AI exposure and hiring should be read. At current acquisition rates and at the substitution effects estimated on platforms, where assimilation is comparatively frictionless, complete assimilation of visual tasks would lower adverts in the most exposed occupations by roughly 2 to 17 percent. Standard European and Canadian occupation-level designs cannot detect effects of that size. The small gradients they do report are no larger than the pre-2022 trend and are therefore uninformative about assimilation. The bound is simple enough to be reported next to any exposure coefficient, and doing so guards against both false alarms and false reassurance.</w:t>
+        <w:t xml:space="preserve">We provide a detectability bound that changes how the large and growing literature on AI exposure and hiring should be read. At current acquisition rates and at the substitution effects estimated on platforms, where assimilation is comparatively frictionless, complete assimilation of visual tasks would lower adverts in the most exposed occupations by roughly 2 to 17 percent. Standard European and Canadian occupation-level designs cannot detect effects of that size. The small gradients they do report cannot be told apart from an extrapolation of the pre-2022 trend and are therefore uninformative about assimilation. The bound is simple enough to be reported next to any exposure coefficient, and doing so guards against both false alarms and false reassurance.</w:t>
       </w:r>
     </w:p>
     <w:p>
@@ -6260,7 +6260,7 @@
         <w:rPr>
           <w:rFonts w:ascii="Times New Roman" w:hAnsi="Times New Roman" w:eastAsia="Times New Roman" w:cs="Times New Roman"/>
         </w:rPr>
-        <w:t xml:space="preserve">Because the acquisition measure covers EU firms, the hiring series is Eurostat’s experimental online job advertisements by ISCO-08 three-digit occupation, 2019 to 2024 (Eurostat, 2026), with 2022 as the base year (604 country-occupation cells, 96 occupations, 16 countries, after a floor of 1,000 base-year adverts). Its population matches the acquisition data, but it offers only two post-2022 years. The Canadian series is the Job Vacancy and Wage Survey by NOC 2021 unit group, 2015 to 2026 (Statistics Canada, 2026), restricted to 308 unit groups with at least 1,000 vacancies in the base window; the quarter 2020Q2 was not collected, so 2020 and 2021 cannot be used. European Labour Force Survey employment by industry and US sector postings from Indeed Hiring Lab (2026) are used descriptively.</w:t>
+        <w:t xml:space="preserve">Because the acquisition measure covers EU firms, the hiring series is Eurostat’s experimental online job advertisements by ISCO-08 three-digit occupation, 2019 to 2024 (Eurostat, 2026), with 2022 as the base year (604 country-occupation cells, 96 occupations, 16 countries, after a floor of 1,000 base-year adverts). Its population matches the acquisition data, but it offers only two post-2022 years. The Canadian series is the Job Vacancy and Wage Survey by NOC 2021 unit group, 2015 to 2026 (Statistics Canada, 2026), restricted to 312 unit groups with all four quarters observed in the 2022 base year and at least 1,000 vacancies in that year. The quarter 2020Q2 was not collected, so 2020 and 2021 cannot be used; annual figures are quarterly means, and 2026 covers the first two quarters, compared with the same quarters of 2022. European Labour Force Survey employment by industry and US sector postings from Indeed Hiring Lab (2026) are used descriptively.</w:t>
       </w:r>
     </w:p>
     <w:bookmarkEnd w:id="36"/>
@@ -6287,7 +6287,7 @@
         <w:rPr>
           <w:rFonts w:ascii="Times New Roman" w:hAnsi="Times New Roman" w:eastAsia="Times New Roman" w:cs="Times New Roman"/>
         </w:rPr>
-        <w:t xml:space="preserve">Occupational exposure to visual content creation is the mean, over O*NET task statements (National Center for O*NET Development, 2026), of a language-model score on a 0 to 2 rubric divided by two. It is mapped to European occupations through ISCO-08 (three-digit prefix of the ESCO crosswalk) and to Canadian occupations through NOC main-duty statements. The primary measure uses a narrow rubric that scores production or editing of visual content (Appendix A).</w:t>
+        <w:t xml:space="preserve">Occupational exposure to visual content creation is the mean, over O*NET task statements (National Center for O*NET Development, 2026), of a language-model score on a 0 to 2 rubric divided by two. We scored the 17,358 distinct task statements of the 914 O*NET-SOC occupations that the ESCO crosswalk links to the 96 European occupations in our sample, using Claude Haiku 5.5 at temperature zero and the narrow rubric in Appendix A, which credits only the production or editing of visual content. An ISCO-08 three-digit group inherits the pooled task statements of all O*NET-SOC occupations linked to it through the three-digit prefix of the ESCO code. For Canada, we scored the 3,559 distinct main-duty statements of the NOC 2021 unit groups in our sample with the same rubric and averaged them by unit group. The control for language-model exposure is built in the same way from a second rubric that credits tasks in which reading, writing, or otherwise producing text is central (Appendix A). Both measures are standardized across occupations (across unit groups in Canada). In Europe they correlate 0.12 across occupations, and in Canada 0.05. The two occupations with the highest visual exposure are architects, planners, surveyors, and designers (ISCO 216, 5.3 standard deviations above the mean) and creative and performing artists (ISCO 265, 4.4). In Canada, graphic arts technicians and graphic designers and illustrators lead.</w:t>
       </w:r>
     </w:p>
     <w:p>
@@ -6301,7 +6301,7 @@
         <w:rPr>
           <w:rFonts w:ascii="Times New Roman" w:hAnsi="Times New Roman" w:eastAsia="Times New Roman" w:cs="Times New Roman"/>
         </w:rPr>
-        <w:t xml:space="preserve">The construct is hard to code reliably, and we report the evidence in full. On 199 human-validated tasks, design-weighted Cohen’s</w:t>
+        <w:t xml:space="preserve">The construct is hard to code, and we have no human coding of these scores. We therefore report two checks on measurement noise, neither of which substitutes for validation against human coders. First, we scored the same statements with a second, unrelated model (GPT-5.6 Luna). On the visual rubric the two models agree on 96.8 percent of task statements (Cohen’s</w:t>
       </w:r>
       <w:r>
         <w:rPr>
@@ -6324,7 +6324,7 @@
         <w:rPr>
           <w:rFonts w:ascii="Times New Roman" w:hAnsi="Times New Roman" w:eastAsia="Times New Roman" w:cs="Times New Roman"/>
         </w:rPr>
-        <w:t xml:space="preserve">between two human coders is 0.18, and the narrow score’s weighted</w:t>
+        <w:t xml:space="preserve">= 0.66, quadratic-weighted</w:t>
       </w:r>
       <w:r>
         <w:rPr>
@@ -6347,7 +6347,7 @@
         <w:rPr>
           <w:rFonts w:ascii="Times New Roman" w:hAnsi="Times New Roman" w:eastAsia="Times New Roman" w:cs="Times New Roman"/>
         </w:rPr>
-        <w:t xml:space="preserve">with the two coders is 0.11 and 0.04. A broad rubric that scores work with visual materials agrees better with the coders (weighted</w:t>
+        <w:t xml:space="preserve">= 0.83, Gwet’s AC1 = 0.97). Chance-corrected coefficients are depressed when one category dominates, and only about 5 percent of statements receive a nonzero visual score, which is why</w:t>
       </w:r>
       <w:r>
         <w:rPr>
@@ -6370,87 +6370,65 @@
         <w:rPr>
           <w:rFonts w:ascii="Times New Roman" w:hAnsi="Times New Roman" w:eastAsia="Times New Roman" w:cs="Times New Roman"/>
         </w:rPr>
-        <w:t xml:space="preserve">0.31 to 0.41), but it was written after one coder’s pattern on a first half-sample had been seen, so we report it only as exploratory. A rule-based score correlates 0.78 to 0.88 with the narrow score and serves as a robustness check.</w:t>
-      </w:r>
-    </w:p>
-    <w:p>
-      <w:pPr>
-        <w:pStyle w:val="BodyText"/>
-        <w:spacing w:line="480" w:lineRule="auto" w:after="0" w:before="0"/>
-        <w:ind w:firstLine="720"/>
-        <w:jc w:val="left"/>
-      </w:pPr>
-      <w:r>
-        <w:rPr>
-          <w:rFonts w:ascii="Times New Roman" w:hAnsi="Times New Roman" w:eastAsia="Times New Roman" w:cs="Times New Roman"/>
-        </w:rPr>
-        <w:t xml:space="preserve">These agreement statistics need careful reading, for three reasons. First, chance-corrected coefficients are depressed when one category dominates, and the great majority of O*NET task statements describe no visual production at all; low</w:t>
-      </w:r>
-      <w:r>
-        <w:rPr>
-          <w:rFonts w:ascii="Times New Roman" w:hAnsi="Times New Roman" w:eastAsia="Times New Roman" w:cs="Times New Roman"/>
-        </w:rPr>
-        <w:t xml:space="preserve"> </w:t>
-      </w:r>
-      <m:oMath>
-        <m:r>
-          <m:t>κ</m:t>
-        </m:r>
-      </m:oMath>
-      <w:r>
-        <w:rPr>
-          <w:rFonts w:ascii="Times New Roman" w:hAnsi="Times New Roman" w:eastAsia="Times New Roman" w:cs="Times New Roman"/>
-        </w:rPr>
-        <w:t xml:space="preserve"> </w:t>
-      </w:r>
-      <w:r>
-        <w:rPr>
-          <w:rFonts w:ascii="Times New Roman" w:hAnsi="Times New Roman" w:eastAsia="Times New Roman" w:cs="Times New Roman"/>
-        </w:rPr>
-        <w:t xml:space="preserve">at the task level can therefore coexist with high raw agreement. Future validation work should report prevalence, raw agreement, and a prevalence-robust statistic alongside</w:t>
-      </w:r>
-      <w:r>
-        <w:rPr>
-          <w:rFonts w:ascii="Times New Roman" w:hAnsi="Times New Roman" w:eastAsia="Times New Roman" w:cs="Times New Roman"/>
-        </w:rPr>
-        <w:t xml:space="preserve"> </w:t>
-      </w:r>
-      <m:oMath>
-        <m:r>
-          <m:t>κ</m:t>
-        </m:r>
-      </m:oMath>
-      <w:r>
-        <w:rPr>
-          <w:rFonts w:ascii="Times New Roman" w:hAnsi="Times New Roman" w:eastAsia="Times New Roman" w:cs="Times New Roman"/>
-        </w:rPr>
-        <w:t xml:space="preserve">. Second, the exposure measure that enters the regressions is an occupation-level mean over roughly twenty task statements, and averaging raises reliability when task-level errors are independent. By the Spearman–Brown relation, a task-level reliability between 0.04 and 0.18 implies an occupation-level reliability of roughly 0.45 to 0.81 for twenty tasks. This is an indicative range, not an estimate: it assumes independent errors, and systematic bias in the language-model score, for example a tendency to treat all design-related occupations alike, does not average out. Third, and most important for our argument, classical measurement error attenuates the coefficient per standard deviation of exposure by the square root of the reliability (Appendix B). Complete assimilation would therefore produce a</w:t>
-      </w:r>
-      <w:r>
-        <w:rPr>
-          <w:rFonts w:ascii="Times New Roman" w:hAnsi="Times New Roman" w:eastAsia="Times New Roman" w:cs="Times New Roman"/>
-        </w:rPr>
-        <w:t xml:space="preserve"> </w:t>
-      </w:r>
-      <w:r>
-        <w:rPr>
-          <w:iCs/>
-          <w:rFonts w:ascii="Times New Roman" w:hAnsi="Times New Roman" w:eastAsia="Times New Roman" w:cs="Times New Roman"/>
-          <w:i/>
-        </w:rPr>
-        <w:t xml:space="preserve">smaller</w:t>
-      </w:r>
-      <w:r>
-        <w:rPr>
-          <w:rFonts w:ascii="Times New Roman" w:hAnsi="Times New Roman" w:eastAsia="Times New Roman" w:cs="Times New Roman"/>
-        </w:rPr>
-        <w:t xml:space="preserve"> </w:t>
-      </w:r>
-      <w:r>
-        <w:rPr>
-          <w:rFonts w:ascii="Times New Roman" w:hAnsi="Times New Roman" w:eastAsia="Times New Roman" w:cs="Times New Roman"/>
-        </w:rPr>
-        <w:t xml:space="preserve">coefficient than the one in equation (5), while the minimum detectable effect is unchanged. Noise in the exposure measure makes the detectability result stronger, not weaker. What it weakens is the substantive reading of any observed gradient, which is why we classify gradients by the bound before interpreting them and make no claim that the gradients are effects of visual generation. We do not correct the coefficients for attenuation.</w:t>
+        <w:t xml:space="preserve">sits well below raw agreement. For the text rubric the corresponding values are 83.3 percent, 0.58, 0.79, and 0.79. At the level that enters the regressions, occupation-level exposure from the two models correlates 0.99 for the visual measure and 0.98 for the text measure, and the gradients in Table 4 change little when the second model’s scores are used (for example,</w:t>
+      </w:r>
+      <w:r>
+        <w:rPr>
+          <w:rFonts w:ascii="Times New Roman" w:hAnsi="Times New Roman" w:eastAsia="Times New Roman" w:cs="Times New Roman"/>
+        </w:rPr>
+        <w:t xml:space="preserve"> </w:t>
+      </w:r>
+      <m:oMath>
+        <m:r>
+          <m:rPr>
+            <m:sty m:val="p"/>
+          </m:rPr>
+          <m:t>−</m:t>
+        </m:r>
+        <m:r>
+          <m:t>0.025</m:t>
+        </m:r>
+      </m:oMath>
+      <w:r>
+        <w:rPr>
+          <w:rFonts w:ascii="Times New Roman" w:hAnsi="Times New Roman" w:eastAsia="Times New Roman" w:cs="Times New Roman"/>
+        </w:rPr>
+        <w:t xml:space="preserve"> </w:t>
+      </w:r>
+      <w:r>
+        <w:rPr>
+          <w:rFonts w:ascii="Times New Roman" w:hAnsi="Times New Roman" w:eastAsia="Times New Roman" w:cs="Times New Roman"/>
+        </w:rPr>
+        <w:t xml:space="preserve">(0.007) in 2023 and</w:t>
+      </w:r>
+      <w:r>
+        <w:rPr>
+          <w:rFonts w:ascii="Times New Roman" w:hAnsi="Times New Roman" w:eastAsia="Times New Roman" w:cs="Times New Roman"/>
+        </w:rPr>
+        <w:t xml:space="preserve"> </w:t>
+      </w:r>
+      <m:oMath>
+        <m:r>
+          <m:rPr>
+            <m:sty m:val="p"/>
+          </m:rPr>
+          <m:t>−</m:t>
+        </m:r>
+        <m:r>
+          <m:t>0.032</m:t>
+        </m:r>
+      </m:oMath>
+      <w:r>
+        <w:rPr>
+          <w:rFonts w:ascii="Times New Roman" w:hAnsi="Times New Roman" w:eastAsia="Times New Roman" w:cs="Times New Roman"/>
+        </w:rPr>
+        <w:t xml:space="preserve"> </w:t>
+      </w:r>
+      <w:r>
+        <w:rPr>
+          <w:rFonts w:ascii="Times New Roman" w:hAnsi="Times New Roman" w:eastAsia="Times New Roman" w:cs="Times New Roman"/>
+        </w:rPr>
+        <w:t xml:space="preserve">(0.017) in 2024). Agreement between two language models shows that the scores are stable, not that they are valid, because the models may share biases. Second, classical measurement error attenuates the coefficient per standard deviation of exposure by the square root of the reliability (Appendix B). Complete assimilation would then produce a smaller coefficient than the one in equation (5), while the minimum detectable effect is unchanged, so noise in exposure strengthens the detectability result. What noise weakens is the substantive reading of any observed gradient, which is why we classify gradients with the bound before interpreting them. We do not correct the coefficients for attenuation.</w:t>
       </w:r>
     </w:p>
     <w:bookmarkEnd w:id="37"/>
@@ -7893,7 +7871,7 @@
         <w:rPr>
           <w:rFonts w:ascii="Times New Roman" w:hAnsi="Times New Roman" w:eastAsia="Times New Roman" w:cs="Times New Roman"/>
         </w:rPr>
-        <w:t xml:space="preserve">For each country-occupation cell in 16 European countries we regress the change in log online adverts relative to 2022 on standardized visual-creation exposure and standardized language-model exposure, with country-year fixed effects and standard errors clustered by ISCO occupation (Table 4). A standard deviation of exposure is associated with 1.6 percent fewer adverts in 2023 (standard error 0.6, randomization</w:t>
+        <w:t xml:space="preserve">For each country-occupation cell in 16 European countries we regress the change in log online adverts relative to 2022 on standardized visual-creation exposure and standardized language-model exposure, separately for each year, with country fixed effects and standard errors clustered by ISCO occupation (Table 4). Randomization</w:t>
       </w:r>
       <w:r>
         <w:rPr>
@@ -7905,6 +7883,23 @@
         <m:r>
           <m:t>p</m:t>
         </m:r>
+      </m:oMath>
+      <w:r>
+        <w:rPr>
+          <w:rFonts w:ascii="Times New Roman" w:hAnsi="Times New Roman" w:eastAsia="Times New Roman" w:cs="Times New Roman"/>
+        </w:rPr>
+        <w:t xml:space="preserve">-values permute exposure across occupations. A standard deviation of exposure is associated with 2.2 percent fewer adverts in 2023 (standard error 0.7, randomization</w:t>
+      </w:r>
+      <w:r>
+        <w:rPr>
+          <w:rFonts w:ascii="Times New Roman" w:hAnsi="Times New Roman" w:eastAsia="Times New Roman" w:cs="Times New Roman"/>
+        </w:rPr>
+        <w:t xml:space="preserve"> </w:t>
+      </w:r>
+      <m:oMath>
+        <m:r>
+          <m:t>p</m:t>
+        </m:r>
         <m:r>
           <m:rPr>
             <m:sty m:val="p"/>
@@ -7912,14 +7907,14 @@
           <m:t>=</m:t>
         </m:r>
         <m:r>
-          <m:t>0.016</m:t>
-        </m:r>
-      </m:oMath>
-      <w:r>
-        <w:rPr>
-          <w:rFonts w:ascii="Times New Roman" w:hAnsi="Times New Roman" w:eastAsia="Times New Roman" w:cs="Times New Roman"/>
-        </w:rPr>
-        <w:t xml:space="preserve">) and 1.2 percent fewer in 2024 (standard error 1.7,</w:t>
+          <m:t>0.012</m:t>
+        </m:r>
+      </m:oMath>
+      <w:r>
+        <w:rPr>
+          <w:rFonts w:ascii="Times New Roman" w:hAnsi="Times New Roman" w:eastAsia="Times New Roman" w:cs="Times New Roman"/>
+        </w:rPr>
+        <w:t xml:space="preserve">) and 2.9 percent fewer in 2024 (standard error 1.8,</w:t>
       </w:r>
       <w:r>
         <w:rPr>
@@ -7938,14 +7933,14 @@
           <m:t>=</m:t>
         </m:r>
         <m:r>
-          <m:t>0.19</m:t>
-        </m:r>
-      </m:oMath>
-      <w:r>
-        <w:rPr>
-          <w:rFonts w:ascii="Times New Roman" w:hAnsi="Times New Roman" w:eastAsia="Times New Roman" w:cs="Times New Roman"/>
-        </w:rPr>
-        <w:t xml:space="preserve">). Without the language-model control the estimates are</w:t>
+          <m:t>0.080</m:t>
+        </m:r>
+      </m:oMath>
+      <w:r>
+        <w:rPr>
+          <w:rFonts w:ascii="Times New Roman" w:hAnsi="Times New Roman" w:eastAsia="Times New Roman" w:cs="Times New Roman"/>
+        </w:rPr>
+        <w:t xml:space="preserve">). Without the language control the estimates are</w:t>
       </w:r>
       <w:r>
         <w:rPr>
@@ -7961,7 +7956,7 @@
           <m:t>−</m:t>
         </m:r>
         <m:r>
-          <m:t>3.7</m:t>
+          <m:t>3.4</m:t>
         </m:r>
       </m:oMath>
       <w:r>
@@ -7990,20 +7985,20 @@
           <m:t>−</m:t>
         </m:r>
         <m:r>
-          <m:t>5.9</m:t>
-        </m:r>
-      </m:oMath>
-      <w:r>
-        <w:rPr>
-          <w:rFonts w:ascii="Times New Roman" w:hAnsi="Times New Roman" w:eastAsia="Times New Roman" w:cs="Times New Roman"/>
-        </w:rPr>
-        <w:t xml:space="preserve"> </w:t>
-      </w:r>
-      <w:r>
-        <w:rPr>
-          <w:rFonts w:ascii="Times New Roman" w:hAnsi="Times New Roman" w:eastAsia="Times New Roman" w:cs="Times New Roman"/>
-        </w:rPr>
-        <w:t xml:space="preserve">percent, because exposure to visual content creation and exposure to language models are positively correlated across occupations (0.27).</w:t>
+          <m:t>5.5</m:t>
+        </m:r>
+      </m:oMath>
+      <w:r>
+        <w:rPr>
+          <w:rFonts w:ascii="Times New Roman" w:hAnsi="Times New Roman" w:eastAsia="Times New Roman" w:cs="Times New Roman"/>
+        </w:rPr>
+        <w:t xml:space="preserve"> </w:t>
+      </w:r>
+      <w:r>
+        <w:rPr>
+          <w:rFonts w:ascii="Times New Roman" w:hAnsi="Times New Roman" w:eastAsia="Times New Roman" w:cs="Times New Roman"/>
+        </w:rPr>
+        <w:t xml:space="preserve">percent, because exposure to visual content creation and exposure to language models are positively correlated across occupations (0.12).</w:t>
       </w:r>
     </w:p>
     <w:p>
@@ -8190,7 +8185,7 @@
                 <w:rFonts w:ascii="Times New Roman" w:hAnsi="Times New Roman"/>
                 <w:sz w:val="19"/>
               </w:rPr>
-              <w:t xml:space="preserve">Preferred (country-year FE, language-model control)</w:t>
+              <w:t xml:space="preserve">Preferred (country FE, language-model control)</w:t>
             </w:r>
           </w:p>
         </w:tc>
@@ -8208,7 +8203,7 @@
                 <w:rFonts w:ascii="Times New Roman" w:hAnsi="Times New Roman"/>
                 <w:sz w:val="19"/>
               </w:rPr>
-              <w:t xml:space="preserve">+0.024 (0.014)</w:t>
+              <w:t xml:space="preserve">+0.024 (0.015)</w:t>
             </w:r>
           </w:p>
         </w:tc>
@@ -8226,7 +8221,7 @@
                 <w:rFonts w:ascii="Times New Roman" w:hAnsi="Times New Roman"/>
                 <w:sz w:val="19"/>
               </w:rPr>
-              <w:t xml:space="preserve">+0.008 (0.013)</w:t>
+              <w:t xml:space="preserve">+0.010 (0.015)</w:t>
             </w:r>
           </w:p>
         </w:tc>
@@ -8244,7 +8239,7 @@
                 <w:rFonts w:ascii="Times New Roman" w:hAnsi="Times New Roman"/>
                 <w:sz w:val="19"/>
               </w:rPr>
-              <w:t xml:space="preserve">+0.011 (n.r.)</w:t>
+              <w:t xml:space="preserve">+0.014 (0.009)</w:t>
             </w:r>
           </w:p>
         </w:tc>
@@ -8262,7 +8257,7 @@
                 <w:rFonts w:ascii="Times New Roman" w:hAnsi="Times New Roman"/>
                 <w:sz w:val="19"/>
               </w:rPr>
-              <w:t xml:space="preserve">−0.016 (0.006)</w:t>
+              <w:t xml:space="preserve">−0.022 (0.007)</w:t>
             </w:r>
           </w:p>
         </w:tc>
@@ -8280,7 +8275,7 @@
                 <w:rFonts w:ascii="Times New Roman" w:hAnsi="Times New Roman"/>
                 <w:sz w:val="19"/>
               </w:rPr>
-              <w:t xml:space="preserve">−0.012 (0.017)</w:t>
+              <w:t xml:space="preserve">−0.029 (0.018)</w:t>
             </w:r>
           </w:p>
         </w:tc>
@@ -8318,7 +8313,7 @@
                 <w:rFonts w:ascii="Times New Roman" w:hAnsi="Times New Roman"/>
                 <w:sz w:val="19"/>
               </w:rPr>
-              <w:t xml:space="preserve">+0.008 (0.013)</w:t>
+              <w:t xml:space="preserve">+0.014 (0.015)</w:t>
             </w:r>
           </w:p>
         </w:tc>
@@ -8336,7 +8331,7 @@
                 <w:rFonts w:ascii="Times New Roman" w:hAnsi="Times New Roman"/>
                 <w:sz w:val="19"/>
               </w:rPr>
-              <w:t xml:space="preserve">−0.002 (0.013)</w:t>
+              <w:t xml:space="preserve">+0.002 (0.015)</w:t>
             </w:r>
           </w:p>
         </w:tc>
@@ -8354,7 +8349,7 @@
                 <w:rFonts w:ascii="Times New Roman" w:hAnsi="Times New Roman"/>
                 <w:sz w:val="19"/>
               </w:rPr>
-              <w:t xml:space="preserve">n.r.</w:t>
+              <w:t xml:space="preserve">+0.011 (0.009)</w:t>
             </w:r>
           </w:p>
         </w:tc>
@@ -8372,7 +8367,7 @@
                 <w:rFonts w:ascii="Times New Roman" w:hAnsi="Times New Roman"/>
                 <w:sz w:val="19"/>
               </w:rPr>
-              <w:t xml:space="preserve">−0.037 (n.r.)</w:t>
+              <w:t xml:space="preserve">−0.034 (0.008)</w:t>
             </w:r>
           </w:p>
         </w:tc>
@@ -8390,7 +8385,7 @@
                 <w:rFonts w:ascii="Times New Roman" w:hAnsi="Times New Roman"/>
                 <w:sz w:val="19"/>
               </w:rPr>
-              <w:t xml:space="preserve">−0.059 (n.r.)</w:t>
+              <w:t xml:space="preserve">−0.055 (0.020)</w:t>
             </w:r>
           </w:p>
         </w:tc>
@@ -8482,7 +8477,7 @@
                 <w:rFonts w:ascii="Times New Roman" w:hAnsi="Times New Roman"/>
                 <w:sz w:val="19"/>
               </w:rPr>
-              <w:t xml:space="preserve">−0.009 (0.007)</w:t>
+              <w:t xml:space="preserve">−0.017 (0.012)</w:t>
             </w:r>
           </w:p>
         </w:tc>
@@ -8500,7 +8495,7 @@
                 <w:rFonts w:ascii="Times New Roman" w:hAnsi="Times New Roman"/>
                 <w:sz w:val="19"/>
               </w:rPr>
-              <w:t xml:space="preserve">+0.002 (0.023)</w:t>
+              <w:t xml:space="preserve">−0.017 (0.029)</w:t>
             </w:r>
           </w:p>
         </w:tc>
@@ -8564,7 +8559,7 @@
                 <w:rFonts w:ascii="Times New Roman" w:hAnsi="Times New Roman"/>
                 <w:sz w:val="19"/>
               </w:rPr>
-              <w:t xml:space="preserve">—</w:t>
+              <w:t xml:space="preserve">0.126</w:t>
             </w:r>
           </w:p>
         </w:tc>
@@ -8582,7 +8577,7 @@
                 <w:rFonts w:ascii="Times New Roman" w:hAnsi="Times New Roman"/>
                 <w:sz w:val="19"/>
               </w:rPr>
-              <w:t xml:space="preserve">—</w:t>
+              <w:t xml:space="preserve">0.595</w:t>
             </w:r>
           </w:p>
         </w:tc>
@@ -8600,7 +8595,7 @@
                 <w:rFonts w:ascii="Times New Roman" w:hAnsi="Times New Roman"/>
                 <w:sz w:val="19"/>
               </w:rPr>
-              <w:t xml:space="preserve">—</w:t>
+              <w:t xml:space="preserve">0.166</w:t>
             </w:r>
           </w:p>
         </w:tc>
@@ -8618,7 +8613,7 @@
                 <w:rFonts w:ascii="Times New Roman" w:hAnsi="Times New Roman"/>
                 <w:sz w:val="19"/>
               </w:rPr>
-              <w:t xml:space="preserve">0.016</w:t>
+              <w:t xml:space="preserve">0.012</w:t>
             </w:r>
           </w:p>
         </w:tc>
@@ -8636,7 +8631,7 @@
                 <w:rFonts w:ascii="Times New Roman" w:hAnsi="Times New Roman"/>
                 <w:sz w:val="19"/>
               </w:rPr>
-              <w:t xml:space="preserve">0.19</w:t>
+              <w:t xml:space="preserve">0.080</w:t>
             </w:r>
           </w:p>
         </w:tc>
@@ -8674,7 +8669,7 @@
                 <w:rFonts w:ascii="Times New Roman" w:hAnsi="Times New Roman"/>
                 <w:sz w:val="19"/>
               </w:rPr>
-              <w:t xml:space="preserve">0.038</w:t>
+              <w:t xml:space="preserve">0.041</w:t>
             </w:r>
           </w:p>
         </w:tc>
@@ -8692,7 +8687,7 @@
                 <w:rFonts w:ascii="Times New Roman" w:hAnsi="Times New Roman"/>
                 <w:sz w:val="19"/>
               </w:rPr>
-              <w:t xml:space="preserve">0.037</w:t>
+              <w:t xml:space="preserve">0.042</w:t>
             </w:r>
           </w:p>
         </w:tc>
@@ -8710,7 +8705,7 @@
                 <w:rFonts w:ascii="Times New Roman" w:hAnsi="Times New Roman"/>
                 <w:sz w:val="19"/>
               </w:rPr>
-              <w:t xml:space="preserve">n.r.</w:t>
+              <w:t xml:space="preserve">0.025</w:t>
             </w:r>
           </w:p>
         </w:tc>
@@ -8728,7 +8723,7 @@
                 <w:rFonts w:ascii="Times New Roman" w:hAnsi="Times New Roman"/>
                 <w:sz w:val="19"/>
               </w:rPr>
-              <w:t xml:space="preserve">0.016</w:t>
+              <w:t xml:space="preserve">0.019</w:t>
             </w:r>
           </w:p>
         </w:tc>
@@ -8746,7 +8741,117 @@
                 <w:rFonts w:ascii="Times New Roman" w:hAnsi="Times New Roman"/>
                 <w:sz w:val="19"/>
               </w:rPr>
-              <w:t xml:space="preserve">0.048</w:t>
+              <w:t xml:space="preserve">0.050</w:t>
+            </w:r>
+          </w:p>
+        </w:tc>
+      </w:tr>
+      <w:tr>
+        <w:tc>
+          <w:tcPr/>
+          <w:p>
+            <w:pPr>
+              <w:pStyle w:val="Compact"/>
+              <w:spacing w:line="240" w:lineRule="auto" w:after="40"/>
+              <w:ind w:firstLine="0"/>
+              <w:jc w:val="left"/>
+            </w:pPr>
+            <w:r>
+              <w:rPr>
+                <w:rFonts w:ascii="Times New Roman" w:hAnsi="Times New Roman"/>
+                <w:sz w:val="19"/>
+              </w:rPr>
+              <w:t xml:space="preserve">Second scorer (preferred)</w:t>
+            </w:r>
+          </w:p>
+        </w:tc>
+        <w:tc>
+          <w:tcPr/>
+          <w:p>
+            <w:pPr>
+              <w:pStyle w:val="Compact"/>
+              <w:spacing w:line="240" w:lineRule="auto" w:after="40"/>
+              <w:ind w:firstLine="0"/>
+              <w:jc w:val="right"/>
+            </w:pPr>
+            <w:r>
+              <w:rPr>
+                <w:rFonts w:ascii="Times New Roman" w:hAnsi="Times New Roman"/>
+                <w:sz w:val="19"/>
+              </w:rPr>
+              <w:t xml:space="preserve">+0.023 (0.015)</w:t>
+            </w:r>
+          </w:p>
+        </w:tc>
+        <w:tc>
+          <w:tcPr/>
+          <w:p>
+            <w:pPr>
+              <w:pStyle w:val="Compact"/>
+              <w:spacing w:line="240" w:lineRule="auto" w:after="40"/>
+              <w:ind w:firstLine="0"/>
+              <w:jc w:val="right"/>
+            </w:pPr>
+            <w:r>
+              <w:rPr>
+                <w:rFonts w:ascii="Times New Roman" w:hAnsi="Times New Roman"/>
+                <w:sz w:val="19"/>
+              </w:rPr>
+              <w:t xml:space="preserve">+0.004 (0.015)</w:t>
+            </w:r>
+          </w:p>
+        </w:tc>
+        <w:tc>
+          <w:tcPr/>
+          <w:p>
+            <w:pPr>
+              <w:pStyle w:val="Compact"/>
+              <w:spacing w:line="240" w:lineRule="auto" w:after="40"/>
+              <w:ind w:firstLine="0"/>
+              <w:jc w:val="right"/>
+            </w:pPr>
+            <w:r>
+              <w:rPr>
+                <w:rFonts w:ascii="Times New Roman" w:hAnsi="Times New Roman"/>
+                <w:sz w:val="19"/>
+              </w:rPr>
+              <w:t xml:space="preserve">+0.011 (0.009)</w:t>
+            </w:r>
+          </w:p>
+        </w:tc>
+        <w:tc>
+          <w:tcPr/>
+          <w:p>
+            <w:pPr>
+              <w:pStyle w:val="Compact"/>
+              <w:spacing w:line="240" w:lineRule="auto" w:after="40"/>
+              <w:ind w:firstLine="0"/>
+              <w:jc w:val="right"/>
+            </w:pPr>
+            <w:r>
+              <w:rPr>
+                <w:rFonts w:ascii="Times New Roman" w:hAnsi="Times New Roman"/>
+                <w:sz w:val="19"/>
+              </w:rPr>
+              <w:t xml:space="preserve">−0.025 (0.007)</w:t>
+            </w:r>
+          </w:p>
+        </w:tc>
+        <w:tc>
+          <w:tcPr/>
+          <w:p>
+            <w:pPr>
+              <w:pStyle w:val="Compact"/>
+              <w:spacing w:line="240" w:lineRule="auto" w:after="40"/>
+              <w:ind w:firstLine="0"/>
+              <w:jc w:val="right"/>
+            </w:pPr>
+            <w:r>
+              <w:rPr>
+                <w:rFonts w:ascii="Times New Roman" w:hAnsi="Times New Roman"/>
+                <w:sz w:val="19"/>
+              </w:rPr>
+              <w:t xml:space="preserve">−0.032 (0.017)</w:t>
             </w:r>
           </w:p>
         </w:tc>
@@ -8777,7 +8882,53 @@
         <w:rPr>
           <w:rFonts w:ascii="Times New Roman" w:hAnsi="Times New Roman" w:eastAsia="Times New Roman" w:cs="Times New Roman"/>
         </w:rPr>
-        <w:t xml:space="preserve">604 country-occupation cells (96 occupations, 16 countries); country-year fixed effects; standard errors clustered by ISCO three-digit occupation in parentheses. The deviation row estimates a linear trend in the exposure gradient on 2019–2021 (−0.0072 per year, standard error 0.0047) and reports the deviation of 2023 and 2024 from its extrapolation. Minimum detectable effect = 2.8 × standard error of the preferred specification (two-sided 5 percent test, 80 percent power). n.r. = not reported; — = not applicable.</w:t>
+        <w:t xml:space="preserve">604 country-occupation cells (96 occupations, 16 countries); separate regressions by year with country fixed effects; standard errors clustered by ISCO three-digit occupation in parentheses. Randomization</w:t>
+      </w:r>
+      <w:r>
+        <w:rPr>
+          <w:rFonts w:ascii="Times New Roman" w:hAnsi="Times New Roman" w:eastAsia="Times New Roman" w:cs="Times New Roman"/>
+        </w:rPr>
+        <w:t xml:space="preserve"> </w:t>
+      </w:r>
+      <m:oMath>
+        <m:r>
+          <m:t>p</m:t>
+        </m:r>
+      </m:oMath>
+      <w:r>
+        <w:rPr>
+          <w:rFonts w:ascii="Times New Roman" w:hAnsi="Times New Roman" w:eastAsia="Times New Roman" w:cs="Times New Roman"/>
+        </w:rPr>
+        <w:t xml:space="preserve">-values come from 5,000 permutations of exposure across occupations. Minimum detectable effect = 2.8 × standard error (two-sided 5 percent test, 80 percent power). The deviation row fits a linear trend to the 2019–2021 coefficients and the 2022 base year (zero by construction) in a joint model with year-specific slopes, and reports the deviation of the 2023 and 2024 coefficients from its extrapolation; the fitted slope is</w:t>
+      </w:r>
+      <w:r>
+        <w:rPr>
+          <w:rFonts w:ascii="Times New Roman" w:hAnsi="Times New Roman" w:eastAsia="Times New Roman" w:cs="Times New Roman"/>
+        </w:rPr>
+        <w:t xml:space="preserve"> </w:t>
+      </w:r>
+      <m:oMath>
+        <m:r>
+          <m:rPr>
+            <m:sty m:val="p"/>
+          </m:rPr>
+          <m:t>−</m:t>
+        </m:r>
+        <m:r>
+          <m:t>0.0069</m:t>
+        </m:r>
+      </m:oMath>
+      <w:r>
+        <w:rPr>
+          <w:rFonts w:ascii="Times New Roman" w:hAnsi="Times New Roman" w:eastAsia="Times New Roman" w:cs="Times New Roman"/>
+        </w:rPr>
+        <w:t xml:space="preserve"> </w:t>
+      </w:r>
+      <w:r>
+        <w:rPr>
+          <w:rFonts w:ascii="Times New Roman" w:hAnsi="Times New Roman" w:eastAsia="Times New Roman" w:cs="Times New Roman"/>
+        </w:rPr>
+        <w:t xml:space="preserve">per year (standard error 0.0056). The last row uses scores from a second model for both exposure measures.</w:t>
       </w:r>
     </w:p>
     <w:p>
@@ -8791,7 +8942,7 @@
         <w:rPr>
           <w:rFonts w:ascii="Times New Roman" w:hAnsi="Times New Roman" w:eastAsia="Times New Roman" w:cs="Times New Roman"/>
         </w:rPr>
-        <w:t xml:space="preserve">The coefficients before 2022 are positive (+0.024, +0.008, and +0.011 for 2019, 2020, and 2021). Because the outcome is the change in adverts relative to 2022, a positive coefficient means that exposed occupations had more adverts in those years than in 2022, that is, they were already declining relative to others before generative tools were released. The trend is weak (</w:t>
+        <w:t xml:space="preserve">The coefficients before 2022 are positive (+0.024, +0.010, and +0.014 for 2019, 2020, and 2021). Because the outcome is the change in adverts relative to 2022, a positive coefficient means that exposed occupations had more adverts in those years than in 2022, that is, they were already declining relative to others before generative tools were released. The trend is weak (</w:t>
       </w:r>
       <m:oMath>
         <m:r>
@@ -8814,7 +8965,7 @@
         <w:rPr>
           <w:rFonts w:ascii="Times New Roman" w:hAnsi="Times New Roman" w:eastAsia="Times New Roman" w:cs="Times New Roman"/>
         </w:rPr>
-        <w:t xml:space="preserve">per year, standard error 0.005), but it runs in the same direction as the post-2022 coefficients: relative to it, the 2023 and 2024 coefficients are</w:t>
+        <w:t xml:space="preserve">per year, standard error 0.006) and rests on four points, but it runs in the same direction as the post-2022 coefficients. Relative to its extrapolation, the 2023 and 2024 coefficients are</w:t>
       </w:r>
       <w:r>
         <w:rPr>
@@ -8830,26 +8981,104 @@
           <m:t>−</m:t>
         </m:r>
         <m:r>
-          <m:t>0.009</m:t>
-        </m:r>
-      </m:oMath>
-      <w:r>
-        <w:rPr>
-          <w:rFonts w:ascii="Times New Roman" w:hAnsi="Times New Roman" w:eastAsia="Times New Roman" w:cs="Times New Roman"/>
-        </w:rPr>
-        <w:t xml:space="preserve"> </w:t>
-      </w:r>
-      <w:r>
-        <w:rPr>
-          <w:rFonts w:ascii="Times New Roman" w:hAnsi="Times New Roman" w:eastAsia="Times New Roman" w:cs="Times New Roman"/>
-        </w:rPr>
-        <w:t xml:space="preserve">(standard error 0.007) and</w:t>
-      </w:r>
-      <w:r>
-        <w:rPr>
-          <w:rFonts w:ascii="Times New Roman" w:hAnsi="Times New Roman" w:eastAsia="Times New Roman" w:cs="Times New Roman"/>
-        </w:rPr>
-        <w:t xml:space="preserve"> </w:t>
+          <m:t>0.017</m:t>
+        </m:r>
+      </m:oMath>
+      <w:r>
+        <w:rPr>
+          <w:rFonts w:ascii="Times New Roman" w:hAnsi="Times New Roman" w:eastAsia="Times New Roman" w:cs="Times New Roman"/>
+        </w:rPr>
+        <w:t xml:space="preserve"> </w:t>
+      </w:r>
+      <w:r>
+        <w:rPr>
+          <w:rFonts w:ascii="Times New Roman" w:hAnsi="Times New Roman" w:eastAsia="Times New Roman" w:cs="Times New Roman"/>
+        </w:rPr>
+        <w:t xml:space="preserve">(standard error 0.012) and</w:t>
+      </w:r>
+      <w:r>
+        <w:rPr>
+          <w:rFonts w:ascii="Times New Roman" w:hAnsi="Times New Roman" w:eastAsia="Times New Roman" w:cs="Times New Roman"/>
+        </w:rPr>
+        <w:t xml:space="preserve"> </w:t>
+      </w:r>
+      <m:oMath>
+        <m:r>
+          <m:rPr>
+            <m:sty m:val="p"/>
+          </m:rPr>
+          <m:t>−</m:t>
+        </m:r>
+        <m:r>
+          <m:t>0.017</m:t>
+        </m:r>
+      </m:oMath>
+      <w:r>
+        <w:rPr>
+          <w:rFonts w:ascii="Times New Roman" w:hAnsi="Times New Roman" w:eastAsia="Times New Roman" w:cs="Times New Roman"/>
+        </w:rPr>
+        <w:t xml:space="preserve"> </w:t>
+      </w:r>
+      <w:r>
+        <w:rPr>
+          <w:rFonts w:ascii="Times New Roman" w:hAnsi="Times New Roman" w:eastAsia="Times New Roman" w:cs="Times New Roman"/>
+        </w:rPr>
+        <w:t xml:space="preserve">(0.029). The series has only two post-2022 years. In Canada, across 312 NOC unit groups with fixed effects for NOC two-digit groups and heteroskedasticity-robust standard errors, the coefficient is</w:t>
+      </w:r>
+      <w:r>
+        <w:rPr>
+          <w:rFonts w:ascii="Times New Roman" w:hAnsi="Times New Roman" w:eastAsia="Times New Roman" w:cs="Times New Roman"/>
+        </w:rPr>
+        <w:t xml:space="preserve"> </w:t>
+      </w:r>
+      <m:oMath>
+        <m:r>
+          <m:rPr>
+            <m:sty m:val="p"/>
+          </m:rPr>
+          <m:t>−</m:t>
+        </m:r>
+        <m:r>
+          <m:t>2.9</m:t>
+        </m:r>
+      </m:oMath>
+      <w:r>
+        <w:rPr>
+          <w:rFonts w:ascii="Times New Roman" w:hAnsi="Times New Roman" w:eastAsia="Times New Roman" w:cs="Times New Roman"/>
+        </w:rPr>
+        <w:t xml:space="preserve"> </w:t>
+      </w:r>
+      <w:r>
+        <w:rPr>
+          <w:rFonts w:ascii="Times New Roman" w:hAnsi="Times New Roman" w:eastAsia="Times New Roman" w:cs="Times New Roman"/>
+        </w:rPr>
+        <w:t xml:space="preserve">percent in 2023 (standard error 1.3, randomization</w:t>
+      </w:r>
+      <w:r>
+        <w:rPr>
+          <w:rFonts w:ascii="Times New Roman" w:hAnsi="Times New Roman" w:eastAsia="Times New Roman" w:cs="Times New Roman"/>
+        </w:rPr>
+        <w:t xml:space="preserve"> </w:t>
+      </w:r>
+      <m:oMath>
+        <m:r>
+          <m:t>p</m:t>
+        </m:r>
+        <m:r>
+          <m:rPr>
+            <m:sty m:val="p"/>
+          </m:rPr>
+          <m:t>=</m:t>
+        </m:r>
+        <m:r>
+          <m:t>0.13</m:t>
+        </m:r>
+      </m:oMath>
+      <w:r>
+        <w:rPr>
+          <w:rFonts w:ascii="Times New Roman" w:hAnsi="Times New Roman" w:eastAsia="Times New Roman" w:cs="Times New Roman"/>
+        </w:rPr>
+        <w:t xml:space="preserve">) and indistinguishable from zero afterward (</w:t>
       </w:r>
       <m:oMath>
         <m:r>
@@ -8859,20 +9088,37 @@
           <m:t>+</m:t>
         </m:r>
         <m:r>
-          <m:t>0.002</m:t>
-        </m:r>
-      </m:oMath>
-      <w:r>
-        <w:rPr>
-          <w:rFonts w:ascii="Times New Roman" w:hAnsi="Times New Roman" w:eastAsia="Times New Roman" w:cs="Times New Roman"/>
-        </w:rPr>
-        <w:t xml:space="preserve"> </w:t>
-      </w:r>
-      <w:r>
-        <w:rPr>
-          <w:rFonts w:ascii="Times New Roman" w:hAnsi="Times New Roman" w:eastAsia="Times New Roman" w:cs="Times New Roman"/>
-        </w:rPr>
-        <w:t xml:space="preserve">(0.023). The series has only two post-2022 years. In Canada, within NOC two-digit groups, the coefficient is</w:t>
+          <m:t>1.4</m:t>
+        </m:r>
+      </m:oMath>
+      <w:r>
+        <w:rPr>
+          <w:rFonts w:ascii="Times New Roman" w:hAnsi="Times New Roman" w:eastAsia="Times New Roman" w:cs="Times New Roman"/>
+        </w:rPr>
+        <w:t xml:space="preserve">,</w:t>
+      </w:r>
+      <w:r>
+        <w:rPr>
+          <w:rFonts w:ascii="Times New Roman" w:hAnsi="Times New Roman" w:eastAsia="Times New Roman" w:cs="Times New Roman"/>
+        </w:rPr>
+        <w:t xml:space="preserve"> </w:t>
+      </w:r>
+      <m:oMath>
+        <m:r>
+          <m:rPr>
+            <m:sty m:val="p"/>
+          </m:rPr>
+          <m:t>+</m:t>
+        </m:r>
+        <m:r>
+          <m:t>0.7</m:t>
+        </m:r>
+      </m:oMath>
+      <w:r>
+        <w:rPr>
+          <w:rFonts w:ascii="Times New Roman" w:hAnsi="Times New Roman" w:eastAsia="Times New Roman" w:cs="Times New Roman"/>
+        </w:rPr>
+        <w:t xml:space="preserve">, and</w:t>
       </w:r>
       <w:r>
         <w:rPr>
@@ -8888,115 +9134,20 @@
           <m:t>−</m:t>
         </m:r>
         <m:r>
-          <m:t>2.2</m:t>
-        </m:r>
-      </m:oMath>
-      <w:r>
-        <w:rPr>
-          <w:rFonts w:ascii="Times New Roman" w:hAnsi="Times New Roman" w:eastAsia="Times New Roman" w:cs="Times New Roman"/>
-        </w:rPr>
-        <w:t xml:space="preserve"> </w:t>
-      </w:r>
-      <w:r>
-        <w:rPr>
-          <w:rFonts w:ascii="Times New Roman" w:hAnsi="Times New Roman" w:eastAsia="Times New Roman" w:cs="Times New Roman"/>
-        </w:rPr>
-        <w:t xml:space="preserve">percent in the first post-2022 year (standard error 0.9, randomization</w:t>
-      </w:r>
-      <w:r>
-        <w:rPr>
-          <w:rFonts w:ascii="Times New Roman" w:hAnsi="Times New Roman" w:eastAsia="Times New Roman" w:cs="Times New Roman"/>
-        </w:rPr>
-        <w:t xml:space="preserve"> </w:t>
-      </w:r>
-      <m:oMath>
-        <m:r>
-          <m:t>p</m:t>
-        </m:r>
-        <m:r>
-          <m:rPr>
-            <m:sty m:val="p"/>
-          </m:rPr>
-          <m:t>=</m:t>
-        </m:r>
-        <m:r>
-          <m:t>0.10</m:t>
-        </m:r>
-      </m:oMath>
-      <w:r>
-        <w:rPr>
-          <w:rFonts w:ascii="Times New Roman" w:hAnsi="Times New Roman" w:eastAsia="Times New Roman" w:cs="Times New Roman"/>
-        </w:rPr>
-        <w:t xml:space="preserve">) and indistinguishable from zero afterward (</w:t>
-      </w:r>
-      <m:oMath>
-        <m:r>
-          <m:rPr>
-            <m:sty m:val="p"/>
-          </m:rPr>
-          <m:t>−</m:t>
-        </m:r>
-        <m:r>
-          <m:t>0.9</m:t>
-        </m:r>
-      </m:oMath>
-      <w:r>
-        <w:rPr>
-          <w:rFonts w:ascii="Times New Roman" w:hAnsi="Times New Roman" w:eastAsia="Times New Roman" w:cs="Times New Roman"/>
-        </w:rPr>
-        <w:t xml:space="preserve">,</w:t>
-      </w:r>
-      <w:r>
-        <w:rPr>
-          <w:rFonts w:ascii="Times New Roman" w:hAnsi="Times New Roman" w:eastAsia="Times New Roman" w:cs="Times New Roman"/>
-        </w:rPr>
-        <w:t xml:space="preserve"> </w:t>
-      </w:r>
-      <m:oMath>
-        <m:r>
-          <m:rPr>
-            <m:sty m:val="p"/>
-          </m:rPr>
-          <m:t>+</m:t>
-        </m:r>
-        <m:r>
-          <m:t>1.6</m:t>
-        </m:r>
-      </m:oMath>
-      <w:r>
-        <w:rPr>
-          <w:rFonts w:ascii="Times New Roman" w:hAnsi="Times New Roman" w:eastAsia="Times New Roman" w:cs="Times New Roman"/>
-        </w:rPr>
-        <w:t xml:space="preserve">, and</w:t>
-      </w:r>
-      <w:r>
-        <w:rPr>
-          <w:rFonts w:ascii="Times New Roman" w:hAnsi="Times New Roman" w:eastAsia="Times New Roman" w:cs="Times New Roman"/>
-        </w:rPr>
-        <w:t xml:space="preserve"> </w:t>
-      </w:r>
-      <m:oMath>
-        <m:r>
-          <m:rPr>
-            <m:sty m:val="p"/>
-          </m:rPr>
-          <m:t>+</m:t>
-        </m:r>
-        <m:r>
-          <m:t>1.1</m:t>
-        </m:r>
-      </m:oMath>
-      <w:r>
-        <w:rPr>
-          <w:rFonts w:ascii="Times New Roman" w:hAnsi="Times New Roman" w:eastAsia="Times New Roman" w:cs="Times New Roman"/>
-        </w:rPr>
-        <w:t xml:space="preserve"> </w:t>
-      </w:r>
-      <w:r>
-        <w:rPr>
-          <w:rFonts w:ascii="Times New Roman" w:hAnsi="Times New Roman" w:eastAsia="Times New Roman" w:cs="Times New Roman"/>
-        </w:rPr>
-        <w:t xml:space="preserve">percent in 2024, 2025, and 2026, with standard errors of 2.5, 2.7, and 3.0), in a market where total vacancies fell 47 percent.</w:t>
+          <m:t>3.4</m:t>
+        </m:r>
+      </m:oMath>
+      <w:r>
+        <w:rPr>
+          <w:rFonts w:ascii="Times New Roman" w:hAnsi="Times New Roman" w:eastAsia="Times New Roman" w:cs="Times New Roman"/>
+        </w:rPr>
+        <w:t xml:space="preserve"> </w:t>
+      </w:r>
+      <w:r>
+        <w:rPr>
+          <w:rFonts w:ascii="Times New Roman" w:hAnsi="Times New Roman" w:eastAsia="Times New Roman" w:cs="Times New Roman"/>
+        </w:rPr>
+        <w:t xml:space="preserve">percent in 2024, 2025, and the first half of 2026, with standard errors of 3.3, 2.2, and 4.3), in a market where total vacancies fell 47 percent between 2022 and 2025–2026.</w:t>
       </w:r>
     </w:p>
     <w:bookmarkEnd w:id="42"/>
@@ -9023,7 +9174,7 @@
         <w:rPr>
           <w:rFonts w:ascii="Times New Roman" w:hAnsi="Times New Roman" w:eastAsia="Times New Roman" w:cs="Times New Roman"/>
         </w:rPr>
-        <w:t xml:space="preserve">In the European exposure distribution the most exposed occupations are creative and performing artists (ISCO 265, 6.2 standard deviations above the mean) and architects, planners, surveyors, and designers (ISCO 216, which includes graphic designers, 5.7 standard deviations). We set</w:t>
+        <w:t xml:space="preserve">In the European exposure distribution the most exposed occupations are architects, planners, surveyors, and designers (ISCO 216, which includes graphic designers, 5.3 standard deviations above the mean) and creative and performing artists (ISCO 265, 4.4 standard deviations). We set</w:t>
       </w:r>
       <w:r>
         <w:rPr>
@@ -9042,14 +9193,14 @@
           <m:t>=</m:t>
         </m:r>
         <m:r>
-          <m:t>5.7</m:t>
-        </m:r>
-      </m:oMath>
-      <w:r>
-        <w:rPr>
-          <w:rFonts w:ascii="Times New Roman" w:hAnsi="Times New Roman" w:eastAsia="Times New Roman" w:cs="Times New Roman"/>
-        </w:rPr>
-        <w:t xml:space="preserve">, the value more favorable to detection. Table 5 reports the coefficient per standard deviation that complete assimilation would produce under equation (5) for a range of acquisition rates and substitution effects, alongside the minimum detectable effect and the observed coefficients.</w:t>
+          <m:t>5.3</m:t>
+        </m:r>
+      </m:oMath>
+      <w:r>
+        <w:rPr>
+          <w:rFonts w:ascii="Times New Roman" w:hAnsi="Times New Roman" w:eastAsia="Times New Roman" w:cs="Times New Roman"/>
+        </w:rPr>
+        <w:t xml:space="preserve">, the larger value and therefore the one more favorable to detection. Table 5 reports the coefficient per standard deviation that complete assimilation would produce under equation (5) for a range of acquisition rates and substitution effects, alongside the minimum detectable effect and the observed coefficients.</w:t>
       </w:r>
     </w:p>
     <w:p>
@@ -9126,7 +9277,7 @@
           <m:t>=</m:t>
         </m:r>
         <m:r>
-          <m:t>5.7</m:t>
+          <m:t>5.3</m:t>
         </m:r>
       </m:oMath>
     </w:p>
@@ -9417,7 +9568,7 @@
                 <w:rFonts w:ascii="Times New Roman" w:hAnsi="Times New Roman"/>
                 <w:sz w:val="19"/>
               </w:rPr>
-              <w:t xml:space="preserve">−0.008</w:t>
+              <w:t xml:space="preserve">−0.009</w:t>
             </w:r>
           </w:p>
         </w:tc>
@@ -9473,7 +9624,7 @@
                 <w:rFonts w:ascii="Times New Roman" w:hAnsi="Times New Roman"/>
                 <w:sz w:val="19"/>
               </w:rPr>
-              <w:t xml:space="preserve">−0.012</w:t>
+              <w:t xml:space="preserve">−0.013</w:t>
             </w:r>
           </w:p>
         </w:tc>
@@ -9491,7 +9642,7 @@
                 <w:rFonts w:ascii="Times New Roman" w:hAnsi="Times New Roman"/>
                 <w:sz w:val="19"/>
               </w:rPr>
-              <w:t xml:space="preserve">−0.032</w:t>
+              <w:t xml:space="preserve">−0.034</w:t>
             </w:r>
           </w:p>
         </w:tc>
@@ -9583,7 +9734,7 @@
                 <w:rFonts w:ascii="Times New Roman" w:hAnsi="Times New Roman"/>
                 <w:sz w:val="19"/>
               </w:rPr>
-              <w:t xml:space="preserve">−0.010</w:t>
+              <w:t xml:space="preserve">−0.011</w:t>
             </w:r>
           </w:p>
         </w:tc>
@@ -9862,7 +10013,7 @@
                 <w:rFonts w:ascii="Times New Roman" w:hAnsi="Times New Roman"/>
                 <w:sz w:val="19"/>
               </w:rPr>
-              <w:t xml:space="preserve">−0.016 (0.006)</w:t>
+              <w:t xml:space="preserve">−0.022 (0.007)</w:t>
             </w:r>
           </w:p>
         </w:tc>
@@ -9880,7 +10031,7 @@
                 <w:rFonts w:ascii="Times New Roman" w:hAnsi="Times New Roman"/>
                 <w:sz w:val="19"/>
               </w:rPr>
-              <w:t xml:space="preserve">−0.037</w:t>
+              <w:t xml:space="preserve">−0.034</w:t>
             </w:r>
           </w:p>
         </w:tc>
@@ -9898,7 +10049,7 @@
                 <w:rFonts w:ascii="Times New Roman" w:hAnsi="Times New Roman"/>
                 <w:sz w:val="19"/>
               </w:rPr>
-              <w:t xml:space="preserve">0.016</w:t>
+              <w:t xml:space="preserve">0.019</w:t>
             </w:r>
           </w:p>
         </w:tc>
@@ -9916,7 +10067,7 @@
                 <w:rFonts w:ascii="Times New Roman" w:hAnsi="Times New Roman"/>
                 <w:sz w:val="19"/>
               </w:rPr>
-              <w:t xml:space="preserve">0.09</w:t>
+              <w:t xml:space="preserve">0.10</w:t>
             </w:r>
           </w:p>
         </w:tc>
@@ -9934,7 +10085,7 @@
                 <w:rFonts w:ascii="Times New Roman" w:hAnsi="Times New Roman"/>
                 <w:sz w:val="19"/>
               </w:rPr>
-              <w:t xml:space="preserve">−0.09</w:t>
+              <w:t xml:space="preserve">−0.12</w:t>
             </w:r>
           </w:p>
         </w:tc>
@@ -9972,7 +10123,7 @@
                 <w:rFonts w:ascii="Times New Roman" w:hAnsi="Times New Roman"/>
                 <w:sz w:val="19"/>
               </w:rPr>
-              <w:t xml:space="preserve">−0.012 (0.017)</w:t>
+              <w:t xml:space="preserve">−0.029 (0.018)</w:t>
             </w:r>
           </w:p>
         </w:tc>
@@ -9990,7 +10141,7 @@
                 <w:rFonts w:ascii="Times New Roman" w:hAnsi="Times New Roman"/>
                 <w:sz w:val="19"/>
               </w:rPr>
-              <w:t xml:space="preserve">−0.059</w:t>
+              <w:t xml:space="preserve">−0.055</w:t>
             </w:r>
           </w:p>
         </w:tc>
@@ -10008,7 +10159,7 @@
                 <w:rFonts w:ascii="Times New Roman" w:hAnsi="Times New Roman"/>
                 <w:sz w:val="19"/>
               </w:rPr>
-              <w:t xml:space="preserve">0.048</w:t>
+              <w:t xml:space="preserve">0.050</w:t>
             </w:r>
           </w:p>
         </w:tc>
@@ -10044,7 +10195,7 @@
                 <w:rFonts w:ascii="Times New Roman" w:hAnsi="Times New Roman"/>
                 <w:sz w:val="19"/>
               </w:rPr>
-              <w:t xml:space="preserve">−0.07</w:t>
+              <w:t xml:space="preserve">−0.15</w:t>
             </w:r>
           </w:p>
         </w:tc>
@@ -10178,7 +10329,7 @@
         <w:rPr>
           <w:rFonts w:ascii="Times New Roman" w:hAnsi="Times New Roman" w:eastAsia="Times New Roman" w:cs="Times New Roman"/>
         </w:rPr>
-        <w:t xml:space="preserve">maximizes the implied response; any assimilation gap makes it smaller. Acquisition rates: Eurostat 2025 (all enterprises; publishing, film, television, and music) and Eurostat 2023 text generation as a proxy for early acquisition. The final column of Panel A multiplies by</w:t>
+        <w:t xml:space="preserve">maximizes the implied response; any assimilation gap makes it smaller. Acquisition rates: Eurostat 2025 (all enterprises; publishing, film, television, and music) and Eurostat 2023 text generation as a proxy for early acquisition. The last column of Panel A and the last two columns of Panel B express the coefficients on the scale of the most exposed occupation. The no-language-control estimate multiplied by</w:t>
       </w:r>
       <w:r>
         <w:rPr>
@@ -10195,23 +10346,6 @@
         <w:rPr>
           <w:rFonts w:ascii="Times New Roman" w:hAnsi="Times New Roman" w:eastAsia="Times New Roman" w:cs="Times New Roman"/>
         </w:rPr>
-        <w:t xml:space="preserve">; the last two columns of Panel B convert coefficients to the scale of the most exposed occupation. The no-language-control estimate multiplied by</w:t>
-      </w:r>
-      <w:r>
-        <w:rPr>
-          <w:rFonts w:ascii="Times New Roman" w:hAnsi="Times New Roman" w:eastAsia="Times New Roman" w:cs="Times New Roman"/>
-        </w:rPr>
-        <w:t xml:space="preserve"> </w:t>
-      </w:r>
-      <m:oMath>
-        <m:r>
-          <m:t>k</m:t>
-        </m:r>
-      </m:oMath>
-      <w:r>
-        <w:rPr>
-          <w:rFonts w:ascii="Times New Roman" w:hAnsi="Times New Roman" w:eastAsia="Times New Roman" w:cs="Times New Roman"/>
-        </w:rPr>
         <w:t xml:space="preserve"> </w:t>
       </w:r>
       <w:r>
@@ -10234,7 +10368,7 @@
           <m:t>−</m:t>
         </m:r>
         <m:r>
-          <m:t>0.34</m:t>
+          <m:t>0.29</m:t>
         </m:r>
       </m:oMath>
       <w:r>
@@ -10261,7 +10395,7 @@
         <w:rPr>
           <w:rFonts w:ascii="Times New Roman" w:hAnsi="Times New Roman" w:eastAsia="Times New Roman" w:cs="Times New Roman"/>
         </w:rPr>
-        <w:t xml:space="preserve">Two results follow. First, every complete-assimilation scenario for 2024 implies a coefficient below the minimum detectable effect of 0.048. The largest,</w:t>
+        <w:t xml:space="preserve">Two results follow. First, every complete-assimilation scenario for 2024 implies a coefficient below the minimum detectable effect of 0.050. The largest,</w:t>
       </w:r>
       <w:r>
         <w:rPr>
@@ -10277,14 +10411,14 @@
           <m:t>−</m:t>
         </m:r>
         <m:r>
-          <m:t>0.032</m:t>
-        </m:r>
-      </m:oMath>
-      <w:r>
-        <w:rPr>
-          <w:rFonts w:ascii="Times New Roman" w:hAnsi="Times New Roman" w:eastAsia="Times New Roman" w:cs="Times New Roman"/>
-        </w:rPr>
-        <w:t xml:space="preserve">, requires a 39 percent fall among assimilating employers in a sector where 36 percent have acquired the tool, and assimilation by all of them. Under rule (i), the 2024 European estimate is uninformative about whether acquisition has been assimilated, and its small and imprecise coefficient supports neither the gap nor substitution. The preferred estimate of</w:t>
+          <m:t>0.034</m:t>
+        </m:r>
+      </m:oMath>
+      <w:r>
+        <w:rPr>
+          <w:rFonts w:ascii="Times New Roman" w:hAnsi="Times New Roman" w:eastAsia="Times New Roman" w:cs="Times New Roman"/>
+        </w:rPr>
+        <w:t xml:space="preserve">, requires a 39 percent fall among assimilating employers in a sector where 36 percent have acquired the tool, and assimilation by all of them. Under rule (i), the 2024 European estimate is uninformative about whether acquisition has been assimilated. The preferred estimate of</w:t>
       </w:r>
       <w:r>
         <w:rPr>
@@ -10300,20 +10434,20 @@
           <m:t>−</m:t>
         </m:r>
         <m:r>
-          <m:t>0.012</m:t>
-        </m:r>
-      </m:oMath>
-      <w:r>
-        <w:rPr>
-          <w:rFonts w:ascii="Times New Roman" w:hAnsi="Times New Roman" w:eastAsia="Times New Roman" w:cs="Times New Roman"/>
-        </w:rPr>
-        <w:t xml:space="preserve"> </w:t>
-      </w:r>
-      <w:r>
-        <w:rPr>
-          <w:rFonts w:ascii="Times New Roman" w:hAnsi="Times New Roman" w:eastAsia="Times New Roman" w:cs="Times New Roman"/>
-        </w:rPr>
-        <w:t xml:space="preserve">equals what the platform effect would produce if every employer in a high-acquisition sector had assimilated, but it lies 0.7 standard errors from zero. The estimate without the language control (</w:t>
+          <m:t>0.029</m:t>
+        </m:r>
+      </m:oMath>
+      <w:r>
+        <w:rPr>
+          <w:rFonts w:ascii="Times New Roman" w:hAnsi="Times New Roman" w:eastAsia="Times New Roman" w:cs="Times New Roman"/>
+        </w:rPr>
+        <w:t xml:space="preserve"> </w:t>
+      </w:r>
+      <w:r>
+        <w:rPr>
+          <w:rFonts w:ascii="Times New Roman" w:hAnsi="Times New Roman" w:eastAsia="Times New Roman" w:cs="Times New Roman"/>
+        </w:rPr>
+        <w:t xml:space="preserve">is larger in magnitude than the economy-wide scenarios (</w:t>
       </w:r>
       <m:oMath>
         <m:r>
@@ -10323,7 +10457,99 @@
           <m:t>−</m:t>
         </m:r>
         <m:r>
-          <m:t>0.059</m:t>
+          <m:t>0.003</m:t>
+        </m:r>
+      </m:oMath>
+      <w:r>
+        <w:rPr>
+          <w:rFonts w:ascii="Times New Roman" w:hAnsi="Times New Roman" w:eastAsia="Times New Roman" w:cs="Times New Roman"/>
+        </w:rPr>
+        <w:t xml:space="preserve"> </w:t>
+      </w:r>
+      <w:r>
+        <w:rPr>
+          <w:rFonts w:ascii="Times New Roman" w:hAnsi="Times New Roman" w:eastAsia="Times New Roman" w:cs="Times New Roman"/>
+        </w:rPr>
+        <w:t xml:space="preserve">to</w:t>
+      </w:r>
+      <w:r>
+        <w:rPr>
+          <w:rFonts w:ascii="Times New Roman" w:hAnsi="Times New Roman" w:eastAsia="Times New Roman" w:cs="Times New Roman"/>
+        </w:rPr>
+        <w:t xml:space="preserve"> </w:t>
+      </w:r>
+      <m:oMath>
+        <m:r>
+          <m:rPr>
+            <m:sty m:val="p"/>
+          </m:rPr>
+          <m:t>−</m:t>
+        </m:r>
+        <m:r>
+          <m:t>0.009</m:t>
+        </m:r>
+      </m:oMath>
+      <w:r>
+        <w:rPr>
+          <w:rFonts w:ascii="Times New Roman" w:hAnsi="Times New Roman" w:eastAsia="Times New Roman" w:cs="Times New Roman"/>
+        </w:rPr>
+        <w:t xml:space="preserve">), but its 95 percent confidence interval (</w:t>
+      </w:r>
+      <m:oMath>
+        <m:r>
+          <m:rPr>
+            <m:sty m:val="p"/>
+          </m:rPr>
+          <m:t>−</m:t>
+        </m:r>
+        <m:r>
+          <m:t>0.064</m:t>
+        </m:r>
+      </m:oMath>
+      <w:r>
+        <w:rPr>
+          <w:rFonts w:ascii="Times New Roman" w:hAnsi="Times New Roman" w:eastAsia="Times New Roman" w:cs="Times New Roman"/>
+        </w:rPr>
+        <w:t xml:space="preserve"> </w:t>
+      </w:r>
+      <w:r>
+        <w:rPr>
+          <w:rFonts w:ascii="Times New Roman" w:hAnsi="Times New Roman" w:eastAsia="Times New Roman" w:cs="Times New Roman"/>
+        </w:rPr>
+        <w:t xml:space="preserve">to</w:t>
+      </w:r>
+      <w:r>
+        <w:rPr>
+          <w:rFonts w:ascii="Times New Roman" w:hAnsi="Times New Roman" w:eastAsia="Times New Roman" w:cs="Times New Roman"/>
+        </w:rPr>
+        <w:t xml:space="preserve"> </w:t>
+      </w:r>
+      <m:oMath>
+        <m:r>
+          <m:rPr>
+            <m:sty m:val="p"/>
+          </m:rPr>
+          <m:t>+</m:t>
+        </m:r>
+        <m:r>
+          <m:t>0.006</m:t>
+        </m:r>
+      </m:oMath>
+      <w:r>
+        <w:rPr>
+          <w:rFonts w:ascii="Times New Roman" w:hAnsi="Times New Roman" w:eastAsia="Times New Roman" w:cs="Times New Roman"/>
+        </w:rPr>
+        <w:t xml:space="preserve">) contains zero and every scenario in Table 5, so it supports neither the gap nor substitution. The estimate without the language control (</w:t>
+      </w:r>
+      <m:oMath>
+        <m:r>
+          <m:rPr>
+            <m:sty m:val="p"/>
+          </m:rPr>
+          <m:t>−</m:t>
+        </m:r>
+        <m:r>
+          <m:t>0.055</m:t>
         </m:r>
       </m:oMath>
       <w:r>
@@ -10381,7 +10607,7 @@
           <m:t>−</m:t>
         </m:r>
         <m:r>
-          <m:t>0.032</m:t>
+          <m:t>0.034</m:t>
         </m:r>
       </m:oMath>
       <w:r>
@@ -10404,10 +10630,10 @@
           <m:rPr>
             <m:sty m:val="p"/>
           </m:rPr>
-          <m:t>=</m:t>
-        </m:r>
-        <m:r>
-          <m:t>1.3</m:t>
+          <m:t>≈</m:t>
+        </m:r>
+        <m:r>
+          <m:t>1.1</m:t>
         </m:r>
       </m:oMath>
       <w:r>
@@ -10428,7 +10654,7 @@
         <w:rPr>
           <w:rFonts w:ascii="Times New Roman" w:hAnsi="Times New Roman" w:eastAsia="Times New Roman" w:cs="Times New Roman"/>
         </w:rPr>
-        <w:t xml:space="preserve">Second, the 2023 estimate has more power (minimum detectable effect 0.016). Text-generation acquisition stood at 2.1 percent in 2023. If acquisition of visual generators was similarly low, complete assimilation with</w:t>
+        <w:t xml:space="preserve">Second, the 2023 estimate has more power (minimum detectable effect 0.019). Text-generation acquisition stood at 2.1 percent in 2023. If acquisition of visual generators was similarly low, complete assimilation with</w:t>
       </w:r>
       <w:r>
         <w:rPr>
@@ -10505,7 +10731,7 @@
           <m:t>−</m:t>
         </m:r>
         <m:r>
-          <m:t>0.016</m:t>
+          <m:t>0.022</m:t>
         </m:r>
       </m:oMath>
       <w:r>
@@ -10531,7 +10757,7 @@
           <m:t>=</m:t>
         </m:r>
         <m:r>
-          <m:t>2.6</m:t>
+          <m:t>2.9</m:t>
         </m:r>
       </m:oMath>
       <w:r>
@@ -10554,20 +10780,20 @@
           <m:t>−</m:t>
         </m:r>
         <m:r>
-          <m:t>0.008</m:t>
-        </m:r>
-      </m:oMath>
-      <w:r>
-        <w:rPr>
-          <w:rFonts w:ascii="Times New Roman" w:hAnsi="Times New Roman" w:eastAsia="Times New Roman" w:cs="Times New Roman"/>
-        </w:rPr>
-        <w:t xml:space="preserve"> </w:t>
-      </w:r>
-      <w:r>
-        <w:rPr>
-          <w:rFonts w:ascii="Times New Roman" w:hAnsi="Times New Roman" w:eastAsia="Times New Roman" w:cs="Times New Roman"/>
-        </w:rPr>
-        <w:t xml:space="preserve">and the difference would not be significant (</w:t>
+          <m:t>0.009</m:t>
+        </m:r>
+      </m:oMath>
+      <w:r>
+        <w:rPr>
+          <w:rFonts w:ascii="Times New Roman" w:hAnsi="Times New Roman" w:eastAsia="Times New Roman" w:cs="Times New Roman"/>
+        </w:rPr>
+        <w:t xml:space="preserve"> </w:t>
+      </w:r>
+      <w:r>
+        <w:rPr>
+          <w:rFonts w:ascii="Times New Roman" w:hAnsi="Times New Roman" w:eastAsia="Times New Roman" w:cs="Times New Roman"/>
+        </w:rPr>
+        <w:t xml:space="preserve">and the difference would be borderline (</w:t>
       </w:r>
       <m:oMath>
         <m:r>
@@ -10580,14 +10806,37 @@
           <m:t>≈</m:t>
         </m:r>
         <m:r>
-          <m:t>1.3</m:t>
-        </m:r>
-      </m:oMath>
-      <w:r>
-        <w:rPr>
-          <w:rFonts w:ascii="Times New Roman" w:hAnsi="Times New Roman" w:eastAsia="Times New Roman" w:cs="Times New Roman"/>
-        </w:rPr>
-        <w:t xml:space="preserve">). Either way, the 2023 gradient is of the size predicted by the trend that preceded the technology, since relative to that trend it is</w:t>
+          <m:t>1.9</m:t>
+        </m:r>
+      </m:oMath>
+      <w:r>
+        <w:rPr>
+          <w:rFonts w:ascii="Times New Roman" w:hAnsi="Times New Roman" w:eastAsia="Times New Roman" w:cs="Times New Roman"/>
+        </w:rPr>
+        <w:t xml:space="preserve">). The 2023 gradient therefore cannot be dismissed as too small to matter, but neither can it be attributed to generative visual AI. Exposed occupations were already declining relative to others before 2022 (the 2019 coefficient is</w:t>
+      </w:r>
+      <w:r>
+        <w:rPr>
+          <w:rFonts w:ascii="Times New Roman" w:hAnsi="Times New Roman" w:eastAsia="Times New Roman" w:cs="Times New Roman"/>
+        </w:rPr>
+        <w:t xml:space="preserve"> </w:t>
+      </w:r>
+      <m:oMath>
+        <m:r>
+          <m:rPr>
+            <m:sty m:val="p"/>
+          </m:rPr>
+          <m:t>+</m:t>
+        </m:r>
+        <m:r>
+          <m:t>0.024</m:t>
+        </m:r>
+      </m:oMath>
+      <w:r>
+        <w:rPr>
+          <w:rFonts w:ascii="Times New Roman" w:hAnsi="Times New Roman" w:eastAsia="Times New Roman" w:cs="Times New Roman"/>
+        </w:rPr>
+        <w:t xml:space="preserve">), and relative to the extrapolated trend the 2023 gradient is</w:t>
       </w:r>
       <w:r>
         <w:rPr>
@@ -10603,20 +10852,20 @@
           <m:t>−</m:t>
         </m:r>
         <m:r>
-          <m:t>0.009</m:t>
-        </m:r>
-      </m:oMath>
-      <w:r>
-        <w:rPr>
-          <w:rFonts w:ascii="Times New Roman" w:hAnsi="Times New Roman" w:eastAsia="Times New Roman" w:cs="Times New Roman"/>
-        </w:rPr>
-        <w:t xml:space="preserve"> </w:t>
-      </w:r>
-      <w:r>
-        <w:rPr>
-          <w:rFonts w:ascii="Times New Roman" w:hAnsi="Times New Roman" w:eastAsia="Times New Roman" w:cs="Times New Roman"/>
-        </w:rPr>
-        <w:t xml:space="preserve">(standard error 0.007). Under rule (iii), the gradient is better attributed to other causes than to generative visual AI.</w:t>
+          <m:t>0.017</m:t>
+        </m:r>
+      </m:oMath>
+      <w:r>
+        <w:rPr>
+          <w:rFonts w:ascii="Times New Roman" w:hAnsi="Times New Roman" w:eastAsia="Times New Roman" w:cs="Times New Roman"/>
+        </w:rPr>
+        <w:t xml:space="preserve"> </w:t>
+      </w:r>
+      <w:r>
+        <w:rPr>
+          <w:rFonts w:ascii="Times New Roman" w:hAnsi="Times New Roman" w:eastAsia="Times New Roman" w:cs="Times New Roman"/>
+        </w:rPr>
+        <w:t xml:space="preserve">(standard error 0.012), a difference we cannot distinguish from zero. The trend is itself imprecise, so we cannot rule out that part of the 2023 gradient reflects the technology. Under rule (iii) we classify the gradient as not attributable to generative visual AI on these data.</w:t>
       </w:r>
     </w:p>
     <w:p>
@@ -10630,7 +10879,7 @@
         <w:rPr>
           <w:rFonts w:ascii="Times New Roman" w:hAnsi="Times New Roman" w:eastAsia="Times New Roman" w:cs="Times New Roman"/>
         </w:rPr>
-        <w:t xml:space="preserve">The Canadian series has standard errors of 0.025 to 0.030 per standard deviation after 2023, so its minimum detectable effect is about 0.07 to 0.08 per standard deviation. For the most exposed unit group, 9.0 standard deviations above the mean, this corresponds to a log change of about 0.6 to 0.8. The Canadian series is therefore uninformative about assimilation at any plausible acquisition rate, and its first-year coefficient, which does not persist, leads to the same classification.</w:t>
+        <w:t xml:space="preserve">The Canadian series has standard errors of 0.013 to 0.043 per standard deviation after 2022, so its minimum detectable effect is about 0.04 to 0.12 per standard deviation. For the most exposed unit group, 7.1 standard deviations above the mean, this corresponds to a log change of about 0.25 to 0.85. The Canadian series is therefore uninformative about assimilation at any plausible acquisition rate, and its first-year coefficient, which does not persist, leads to the same classification.</w:t>
       </w:r>
     </w:p>
     <w:bookmarkEnd w:id="43"/>
@@ -10710,7 +10959,36 @@
         <w:rPr>
           <w:rFonts w:ascii="Times New Roman" w:hAnsi="Times New Roman" w:eastAsia="Times New Roman" w:cs="Times New Roman"/>
         </w:rPr>
-        <w:t xml:space="preserve">A European dose-response test interacts occupational exposure with country-level acquisition of picture, video, or audio generation (Eurostat, 2026), which is available for 12 of the 16 countries. Complete assimilation predicts a steeper exposure gradient where acquisition is higher, whereas the gap and offsetting-scale accounts predict no such interaction. The interaction coefficient per standard deviation of acquisition (5.1 percentage points) is</w:t>
+        <w:t xml:space="preserve">A European dose-response test interacts occupational exposure with country-level acquisition of picture, video, or audio generation in 2025 (Eurostat, 2026), which is available for all 16 countries in the sample; language-model exposure and its interaction enter as controls. Complete assimilation predicts a steeper exposure gradient where acquisition is higher, whereas the gap and offsetting-scale accounts predict no such interaction. The interaction coefficient per standard deviation of acquisition (4.8 percentage points) is</w:t>
+      </w:r>
+      <w:r>
+        <w:rPr>
+          <w:rFonts w:ascii="Times New Roman" w:hAnsi="Times New Roman" w:eastAsia="Times New Roman" w:cs="Times New Roman"/>
+        </w:rPr>
+        <w:t xml:space="preserve"> </w:t>
+      </w:r>
+      <m:oMath>
+        <m:r>
+          <m:rPr>
+            <m:sty m:val="p"/>
+          </m:rPr>
+          <m:t>+</m:t>
+        </m:r>
+        <m:r>
+          <m:t>0.002</m:t>
+        </m:r>
+      </m:oMath>
+      <w:r>
+        <w:rPr>
+          <w:rFonts w:ascii="Times New Roman" w:hAnsi="Times New Roman" w:eastAsia="Times New Roman" w:cs="Times New Roman"/>
+        </w:rPr>
+        <w:t xml:space="preserve"> </w:t>
+      </w:r>
+      <w:r>
+        <w:rPr>
+          <w:rFonts w:ascii="Times New Roman" w:hAnsi="Times New Roman" w:eastAsia="Times New Roman" w:cs="Times New Roman"/>
+        </w:rPr>
+        <w:t xml:space="preserve">(standard error 0.006) in 2023 and</w:t>
       </w:r>
       <w:r>
         <w:rPr>
@@ -10726,49 +11004,20 @@
           <m:t>−</m:t>
         </m:r>
         <m:r>
-          <m:t>0.008</m:t>
-        </m:r>
-      </m:oMath>
-      <w:r>
-        <w:rPr>
-          <w:rFonts w:ascii="Times New Roman" w:hAnsi="Times New Roman" w:eastAsia="Times New Roman" w:cs="Times New Roman"/>
-        </w:rPr>
-        <w:t xml:space="preserve"> </w:t>
-      </w:r>
-      <w:r>
-        <w:rPr>
-          <w:rFonts w:ascii="Times New Roman" w:hAnsi="Times New Roman" w:eastAsia="Times New Roman" w:cs="Times New Roman"/>
-        </w:rPr>
-        <w:t xml:space="preserve">(standard error 0.008) in 2023 and</w:t>
-      </w:r>
-      <w:r>
-        <w:rPr>
-          <w:rFonts w:ascii="Times New Roman" w:hAnsi="Times New Roman" w:eastAsia="Times New Roman" w:cs="Times New Roman"/>
-        </w:rPr>
-        <w:t xml:space="preserve"> </w:t>
-      </w:r>
-      <m:oMath>
-        <m:r>
-          <m:rPr>
-            <m:sty m:val="p"/>
-          </m:rPr>
-          <m:t>+</m:t>
-        </m:r>
-        <m:r>
-          <m:t>0.003</m:t>
-        </m:r>
-      </m:oMath>
-      <w:r>
-        <w:rPr>
-          <w:rFonts w:ascii="Times New Roman" w:hAnsi="Times New Roman" w:eastAsia="Times New Roman" w:cs="Times New Roman"/>
-        </w:rPr>
-        <w:t xml:space="preserve"> </w:t>
-      </w:r>
-      <w:r>
-        <w:rPr>
-          <w:rFonts w:ascii="Times New Roman" w:hAnsi="Times New Roman" w:eastAsia="Times New Roman" w:cs="Times New Roman"/>
-        </w:rPr>
-        <w:t xml:space="preserve">(0.016) in 2024; permutation</w:t>
+          <m:t>0.021</m:t>
+        </m:r>
+      </m:oMath>
+      <w:r>
+        <w:rPr>
+          <w:rFonts w:ascii="Times New Roman" w:hAnsi="Times New Roman" w:eastAsia="Times New Roman" w:cs="Times New Roman"/>
+        </w:rPr>
+        <w:t xml:space="preserve"> </w:t>
+      </w:r>
+      <w:r>
+        <w:rPr>
+          <w:rFonts w:ascii="Times New Roman" w:hAnsi="Times New Roman" w:eastAsia="Times New Roman" w:cs="Times New Roman"/>
+        </w:rPr>
+        <w:t xml:space="preserve">(0.018) in 2024; permutation</w:t>
       </w:r>
       <w:r>
         <w:rPr>
@@ -10785,36 +11034,62 @@
         <w:rPr>
           <w:rFonts w:ascii="Times New Roman" w:hAnsi="Times New Roman" w:eastAsia="Times New Roman" w:cs="Times New Roman"/>
         </w:rPr>
-        <w:t xml:space="preserve">-values across countries are 0.46 and 0.85. In 2021, before the base year, it is</w:t>
-      </w:r>
-      <w:r>
-        <w:rPr>
-          <w:rFonts w:ascii="Times New Roman" w:hAnsi="Times New Roman" w:eastAsia="Times New Roman" w:cs="Times New Roman"/>
-        </w:rPr>
-        <w:t xml:space="preserve"> </w:t>
-      </w:r>
-      <m:oMath>
-        <m:r>
-          <m:rPr>
-            <m:sty m:val="p"/>
-          </m:rPr>
-          <m:t>+</m:t>
-        </m:r>
-        <m:r>
-          <m:t>0.008</m:t>
-        </m:r>
-      </m:oMath>
-      <w:r>
-        <w:rPr>
-          <w:rFonts w:ascii="Times New Roman" w:hAnsi="Times New Roman" w:eastAsia="Times New Roman" w:cs="Times New Roman"/>
-        </w:rPr>
-        <w:t xml:space="preserve"> </w:t>
-      </w:r>
-      <w:r>
-        <w:rPr>
-          <w:rFonts w:ascii="Times New Roman" w:hAnsi="Times New Roman" w:eastAsia="Times New Roman" w:cs="Times New Roman"/>
-        </w:rPr>
-        <w:t xml:space="preserve">(0.007). Complete assimilation with</w:t>
+        <w:t xml:space="preserve">-values across countries are 0.85 and 0.36. In 2021, before the base year, it is</w:t>
+      </w:r>
+      <w:r>
+        <w:rPr>
+          <w:rFonts w:ascii="Times New Roman" w:hAnsi="Times New Roman" w:eastAsia="Times New Roman" w:cs="Times New Roman"/>
+        </w:rPr>
+        <w:t xml:space="preserve"> </w:t>
+      </w:r>
+      <m:oMath>
+        <m:r>
+          <m:rPr>
+            <m:sty m:val="p"/>
+          </m:rPr>
+          <m:t>−</m:t>
+        </m:r>
+        <m:r>
+          <m:t>0.002</m:t>
+        </m:r>
+      </m:oMath>
+      <w:r>
+        <w:rPr>
+          <w:rFonts w:ascii="Times New Roman" w:hAnsi="Times New Roman" w:eastAsia="Times New Roman" w:cs="Times New Roman"/>
+        </w:rPr>
+        <w:t xml:space="preserve"> </w:t>
+      </w:r>
+      <w:r>
+        <w:rPr>
+          <w:rFonts w:ascii="Times New Roman" w:hAnsi="Times New Roman" w:eastAsia="Times New Roman" w:cs="Times New Roman"/>
+        </w:rPr>
+        <w:t xml:space="preserve">(0.008;</w:t>
+      </w:r>
+      <w:r>
+        <w:rPr>
+          <w:rFonts w:ascii="Times New Roman" w:hAnsi="Times New Roman" w:eastAsia="Times New Roman" w:cs="Times New Roman"/>
+        </w:rPr>
+        <w:t xml:space="preserve"> </w:t>
+      </w:r>
+      <m:oMath>
+        <m:r>
+          <m:t>p</m:t>
+        </m:r>
+        <m:r>
+          <m:rPr>
+            <m:sty m:val="p"/>
+          </m:rPr>
+          <m:t>=</m:t>
+        </m:r>
+        <m:r>
+          <m:t>0.83</m:t>
+        </m:r>
+      </m:oMath>
+      <w:r>
+        <w:rPr>
+          <w:rFonts w:ascii="Times New Roman" w:hAnsi="Times New Roman" w:eastAsia="Times New Roman" w:cs="Times New Roman"/>
+        </w:rPr>
+        <w:t xml:space="preserve">). Complete assimilation with</w:t>
       </w:r>
       <w:r>
         <w:rPr>
@@ -10868,7 +11143,7 @@
           <m:t>−</m:t>
         </m:r>
         <m:r>
-          <m:t>0.004</m:t>
+          <m:t>0.005</m:t>
         </m:r>
       </m:oMath>
       <w:r>
@@ -10900,7 +11175,7 @@
           <m:t>×</m:t>
         </m:r>
         <m:r>
-          <m:t>0.051</m:t>
+          <m:t>0.048</m:t>
         </m:r>
         <m:r>
           <m:rPr>
@@ -10909,14 +11184,14 @@
           <m:t>/</m:t>
         </m:r>
         <m:r>
-          <m:t>5.7</m:t>
-        </m:r>
-      </m:oMath>
-      <w:r>
-        <w:rPr>
-          <w:rFonts w:ascii="Times New Roman" w:hAnsi="Times New Roman" w:eastAsia="Times New Roman" w:cs="Times New Roman"/>
-        </w:rPr>
-        <w:t xml:space="preserve">), far smaller than the standard errors, so the test cannot discriminate among the accounts. We report it because it is the only test here that uses variation in acquisition directly. It becomes informative only with more countries, more post-2022 years, and acquisition measured before the outcome. The detectability result does not depend on it, because that result depends only on acquisition rates, reference effect sizes, and standard errors.</w:t>
+          <m:t>5.3</m:t>
+        </m:r>
+      </m:oMath>
+      <w:r>
+        <w:rPr>
+          <w:rFonts w:ascii="Times New Roman" w:hAnsi="Times New Roman" w:eastAsia="Times New Roman" w:cs="Times New Roman"/>
+        </w:rPr>
+        <w:t xml:space="preserve">), far smaller than the 2024 standard error, so the test cannot discriminate among the accounts. Acquisition is measured in 2025, after the outcomes. We report the test because it is the only one here that uses variation in acquisition directly. It becomes informative only with more countries, more post-2022 years, and acquisition measured before the outcome. The detectability result does not depend on it, because that result depends only on acquisition rates, reference effect sizes, and standard errors.</w:t>
       </w:r>
     </w:p>
     <w:bookmarkEnd w:id="45"/>
@@ -11097,7 +11372,7 @@
           <m:t>=</m:t>
         </m:r>
         <m:r>
-          <m:t>5.7</m:t>
+          <m:t>5.3</m:t>
         </m:r>
       </m:oMath>
       <w:r>
@@ -11268,7 +11543,7 @@
           <m:t>≥</m:t>
         </m:r>
         <m:r>
-          <m:t>0.54</m:t>
+          <m:t>0.53</m:t>
         </m:r>
       </m:oMath>
       <w:r>
@@ -11341,7 +11616,7 @@
           <m:t>≥</m:t>
         </m:r>
         <m:r>
-          <m:t>0.34</m:t>
+          <m:t>0.33</m:t>
         </m:r>
       </m:oMath>
       <w:r>
@@ -11709,7 +11984,7 @@
                 <w:rFonts w:ascii="Times New Roman" w:hAnsi="Times New Roman"/>
                 <w:sz w:val="19"/>
               </w:rPr>
-              <w:t xml:space="preserve">54%</w:t>
+              <w:t xml:space="preserve">53%</w:t>
             </w:r>
           </w:p>
         </w:tc>
@@ -11801,7 +12076,7 @@
                 <w:rFonts w:ascii="Times New Roman" w:hAnsi="Times New Roman"/>
                 <w:sz w:val="19"/>
               </w:rPr>
-              <w:t xml:space="preserve">34%</w:t>
+              <w:t xml:space="preserve">33%</w:t>
             </w:r>
           </w:p>
         </w:tc>
@@ -11905,7 +12180,7 @@
           <m:t>×</m:t>
         </m:r>
         <m:r>
-          <m:t>0.017</m:t>
+          <m:t>0.018</m:t>
         </m:r>
         <m:r>
           <m:rPr>
@@ -11914,7 +12189,7 @@
           <m:t>×</m:t>
         </m:r>
         <m:r>
-          <m:t>5.7</m:t>
+          <m:t>5.3</m:t>
         </m:r>
         <m:r>
           <m:rPr>
@@ -12126,7 +12401,7 @@
         <w:rPr>
           <w:rFonts w:ascii="Times New Roman" w:hAnsi="Times New Roman" w:eastAsia="Times New Roman" w:cs="Times New Roman"/>
         </w:rPr>
-        <w:t xml:space="preserve">The paper also offers a methodological caution for a fast-growing literature. Exposure-based hiring designs are widely used to study generative AI, and their estimates are often read as early effects of the technology. The detectability bound shows that, for standing occupations and at current acquisition rates, these designs cannot detect plausible assimilation effects of the size observed on platforms, and that the gradients they do detect can be no larger than a trend that preceded the technology. A null or small coefficient in these designs is therefore uninformative about assimilation. The bound is simple enough to be reported alongside any such estimate, and doing so would prevent both false alarms and false reassurance. In this sense, the contribution is not a claim that generative visual AI has no labor-market effects, but a demonstration that occupation-level evidence of the kind currently available cannot yet reveal those effects.</w:t>
+        <w:t xml:space="preserve">The paper also offers a methodological caution for a fast-growing literature. Exposure-based hiring designs are widely used to study generative AI, and their estimates are often read as early effects of the technology. The detectability bound shows that, for standing occupations and at current acquisition rates, these designs cannot detect plausible assimilation effects of the size observed on platforms, and that the gradients they do detect cannot be told apart from a trend that preceded the technology. A null or small coefficient in these designs is therefore uninformative about assimilation. The bound is simple enough to be reported alongside any such estimate, and doing so would prevent both false alarms and false reassurance. In this sense, the contribution is not a claim that generative visual AI has no labor-market effects, but a demonstration that occupation-level evidence of the kind currently available cannot yet reveal those effects.</w:t>
       </w:r>
     </w:p>
     <w:p>
@@ -12272,7 +12547,7 @@
         <w:rPr>
           <w:rFonts w:ascii="Times New Roman" w:hAnsi="Times New Roman" w:eastAsia="Times New Roman" w:cs="Times New Roman"/>
         </w:rPr>
-        <w:t xml:space="preserve">We do not observe assimilation. The barrier items refer to AI in general and to firms that considered it, so they speak to the acquisition margin only. The hiring series are experimental, measure adverts or vacancies rather than employment, and would miss substitution through hours, outsourcing, or freelancing. Exposure is measured with low task-level agreement, and although we argue that this strengthens the detectability result, it limits what can be said about the gradients themselves; a categorical treatment defined by occupation codes (for example, graphic designers, visual artists, and photographers) would avoid model-based scoring and is a natural next step that we leave to future work. Acquisition rates are sector averages and do not identify the employers of particular occupations. We study occupations and sectors, not aggregate employment or productivity, and the macroeconomic reading in Section 10.2 interprets the results through the model rather than testing it. The review floor in Proposition 1 rests on the assumption that review hours do not fall with model quality; where better models reduce visible defects, review may become cheaper and the threshold in equation (1) may fall without any change in complements, which would weaken Implication 1 for those tasks. The detectability bound rests on a linear mapping from exposure to the visual share of work and on reference effect sizes from platforms, and both could be refined; however, plausible changes alter the numbers in Tables 5 and 6 without changing the conclusion that current designs lack the power to detect complete assimilation at platform-sized effects.</w:t>
+        <w:t xml:space="preserve">We do not observe assimilation. The barrier items refer to AI in general and to firms that considered it, so they speak to the acquisition margin only. The hiring series are experimental, measure adverts or vacancies rather than employment, and would miss substitution through hours, outsourcing, or freelancing. Exposure is measured with language-model scores that we have checked against a second model but not against human coders. We argue that measurement noise strengthens the detectability result, but it limits what can be said about the gradients themselves, and a categorical treatment defined by occupation codes (for example, graphic designers, visual artists, and photographers) would avoid model-based scoring and is a natural next step that we leave to future work. The control for language-model exposure is our own construction, and the 2024 estimate depends on it (Table 4). Acquisition rates are sector averages and do not identify the employers of particular occupations. We study occupations and sectors, not aggregate employment or productivity, and the macroeconomic reading in Section 10.2 interprets the results through the model rather than testing it. The review floor in Proposition 1 rests on the assumption that review hours do not fall with model quality; where better models reduce visible defects, review may become cheaper and the threshold in equation (1) may fall without any change in complements, which would weaken Implication 1 for those tasks. The detectability bound rests on a linear mapping from exposure to the visual share of work and on reference effect sizes from platforms, and both could be refined; however, plausible changes alter the numbers in Tables 5 and 6 without changing the conclusion that current designs lack the power to detect complete assimilation at platform-sized effects.</w:t>
       </w:r>
     </w:p>
     <w:bookmarkEnd w:id="53"/>
@@ -12300,7 +12575,7 @@
         <w:rPr>
           <w:rFonts w:ascii="Times New Roman" w:hAnsi="Times New Roman" w:eastAsia="Times New Roman" w:cs="Times New Roman"/>
         </w:rPr>
-        <w:t xml:space="preserve">Generative visual AI has been widely acquired: about one in ten European firms used it in 2025, and about one in three in publishing, film, and broadcasting. Firms that considered AI and did not adopt it point to missing expertise, legal uncertainty, and data protection rather than to a tool that is not useful. The theory developed here explains why such complements govern assimilation and why near-free acquisition can let adoption statistics run ahead of any change in work. In macroeconomic terms, general-purpose technologies, task-based labor demand, bottleneck tasks, and attrition-based adjustment together imply that effects reach hiring and employment with a lag and unevenly across occupations. The empirical lesson is equally important. So far, occupation-level hiring data show no detectable labor-market effect of generative visual AI: the exposure gradients are small, imprecise, and no larger than the trend that preceded the technology. That is not evidence of no effect, because these designs could not have detected complete assimilation at platform-sized effects and cannot tell whether acquisition has been assimilated. Answering the question requires linking firms’ use, their complementary assets, and their hiring, and this paper specifies what that evidence would have to show.</w:t>
+        <w:t xml:space="preserve">Generative visual AI has been widely acquired: about one in ten European firms used it in 2025, and about one in three in publishing, film, and broadcasting. Firms that considered AI and did not adopt it point to missing expertise, legal uncertainty, and data protection rather than to a tool that is not useful. The theory developed here explains why such complements govern assimilation and why near-free acquisition can let adoption statistics run ahead of any change in work. In macroeconomic terms, general-purpose technologies, task-based labor demand, bottleneck tasks, and attrition-based adjustment together imply that effects reach hiring and employment with a lag and unevenly across occupations. The empirical lesson is equally important. So far, occupation-level hiring data show no labor-market effect that can be attributed to generative visual AI: the exposure gradients are small, imprecise, and cannot be told apart from the trend that preceded the technology. That is not evidence of no effect, because these designs could not have detected complete assimilation at platform-sized effects and cannot tell whether acquisition has been assimilated. Answering the question requires linking firms’ use, their complementary assets, and their hiring, and this paper specifies what that evidence would have to show.</w:t>
       </w:r>
     </w:p>
     <w:bookmarkEnd w:id="55"/>
@@ -12327,33 +12602,7 @@
         <w:rPr>
           <w:rFonts w:ascii="Times New Roman" w:hAnsi="Times New Roman" w:eastAsia="Times New Roman" w:cs="Times New Roman"/>
         </w:rPr>
-        <w:t xml:space="preserve">All data are public (Eurostat, Statistics Canada, U.S. Census Bureau, O*NET, Indeed Hiring Lab). Code, prompts, task scores, and human coding files required to reproduce the tables are available in an anonymized replication repository.</w:t>
-      </w:r>
-      <w:r>
-        <w:rPr>
-          <w:rFonts w:ascii="Times New Roman" w:hAnsi="Times New Roman" w:eastAsia="Times New Roman" w:cs="Times New Roman"/>
-        </w:rPr>
-        <w:t xml:space="preserve"> </w:t>
-      </w:r>
-      <w:r>
-        <w:rPr>
-          <w:bCs/>
-          <w:rFonts w:ascii="Times New Roman" w:hAnsi="Times New Roman" w:eastAsia="Times New Roman" w:cs="Times New Roman"/>
-          <w:b/>
-        </w:rPr>
-        <w:t xml:space="preserve">[CONFIRM before submission: keep this sentence only if the repository exists; otherwise describe what is actually available.]</w:t>
-      </w:r>
-      <w:r>
-        <w:rPr>
-          <w:rFonts w:ascii="Times New Roman" w:hAnsi="Times New Roman" w:eastAsia="Times New Roman" w:cs="Times New Roman"/>
-        </w:rPr>
-        <w:t xml:space="preserve"> </w:t>
-      </w:r>
-      <w:r>
-        <w:rPr>
-          <w:rFonts w:ascii="Times New Roman" w:hAnsi="Times New Roman" w:eastAsia="Times New Roman" w:cs="Times New Roman"/>
-        </w:rPr>
-        <w:t xml:space="preserve">Large language models were used as measurement instruments to code task statements. A generative AI assistant was used to help write analysis code and to draft and edit the manuscript. The authors reviewed all results, text, and code and take responsibility for the content.</w:t>
+        <w:t xml:space="preserve">All data are public (Eurostat, Statistics Canada, U.S. Census Bureau, O*NET, Indeed Hiring Lab). Code, prompts, and the language-model task scores required to reproduce Tables 4 and 5 and the analyses in Sections 7.1 and 7.4 are available in an anonymized replication repository. Large language models (Claude Haiku 5.5, with GPT-5.6 Luna as a second scorer) were used as measurement instruments to code O*NET task statements and NOC main-duty statements. A generative AI assistant was used to help write analysis code and to draft and edit the manuscript. The authors reviewed all results, text, and code and take responsibility for the content.</w:t>
       </w:r>
     </w:p>
     <w:bookmarkEnd w:id="56"/>
@@ -12410,19 +12659,19 @@
           <w:rFonts w:ascii="Times New Roman" w:hAnsi="Times New Roman" w:eastAsia="Times New Roman" w:cs="Times New Roman"/>
           <w:b/>
         </w:rPr>
-        <w:t xml:space="preserve">Broad visual materials (exploratory).</w:t>
-      </w:r>
-      <w:r>
-        <w:rPr>
-          <w:rFonts w:ascii="Times New Roman" w:hAnsi="Times New Roman" w:eastAsia="Times New Roman" w:cs="Times New Roman"/>
-        </w:rPr>
-        <w:t xml:space="preserve"> </w:t>
-      </w:r>
-      <w:r>
-        <w:rPr>
-          <w:rFonts w:ascii="Times New Roman" w:hAnsi="Times New Roman" w:eastAsia="Times New Roman" w:cs="Times New Roman"/>
-        </w:rPr>
-        <w:t xml:space="preserve">Score 2 if producing, designing, or editing visual or aesthetic output is the core of the task; 1 if the task works with visual materials without that core; 0 otherwise. Tasks are not scored merely because the worker must see to do them. This rubric was written after inspecting one coder’s scores on a first half-sample and is reported only as exploratory.</w:t>
+        <w:t xml:space="preserve">Text work (control for language-model exposure).</w:t>
+      </w:r>
+      <w:r>
+        <w:rPr>
+          <w:rFonts w:ascii="Times New Roman" w:hAnsi="Times New Roman" w:eastAsia="Times New Roman" w:cs="Times New Roman"/>
+        </w:rPr>
+        <w:t xml:space="preserve"> </w:t>
+      </w:r>
+      <w:r>
+        <w:rPr>
+          <w:rFonts w:ascii="Times New Roman" w:hAnsi="Times New Roman" w:eastAsia="Times New Roman" w:cs="Times New Roman"/>
+        </w:rPr>
+        <w:t xml:space="preserve">Score 2 if reading, writing, summarizing, translating, or otherwise producing or editing text is central to the task; 1 if text is a partial or supporting product; 0 otherwise. Spoken conversation, numeric calculation, and purely physical work do not count. Both rubrics were applied in a single prompt, in batches of 20 statements, at temperature zero; the prompt is in the replication repository.</w:t>
       </w:r>
     </w:p>
     <w:bookmarkEnd w:id="57"/>
@@ -13139,7 +13388,7 @@
           <m:t>=</m:t>
         </m:r>
         <m:r>
-          <m:t>0.017</m:t>
+          <m:t>0.018</m:t>
         </m:r>
       </m:oMath>
       <w:r>
@@ -13171,7 +13420,7 @@
           <m:t>=</m:t>
         </m:r>
         <m:r>
-          <m:t>5.7</m:t>
+          <m:t>5.3</m:t>
         </m:r>
       </m:oMath>
       <w:r>
@@ -13277,7 +13526,7 @@
         <w:rPr>
           <w:rFonts w:ascii="Times New Roman" w:hAnsi="Times New Roman" w:eastAsia="Times New Roman" w:cs="Times New Roman"/>
         </w:rPr>
-        <w:t xml:space="preserve">would need to fall below about 4 under the most aggressive scenario.</w:t>
+        <w:t xml:space="preserve">would need to fall below about 3.6 under the most aggressive scenario.</w:t>
       </w:r>
     </w:p>
     <w:p>
@@ -13771,7 +14020,7 @@
           <m:t>−</m:t>
         </m:r>
         <m:r>
-          <m:t>0.032</m:t>
+          <m:t>0.034</m:t>
         </m:r>
       </m:oMath>
       <w:r>
@@ -13800,207 +14049,14 @@
           <m:t>−</m:t>
         </m:r>
         <m:r>
-          <m:t>0.023</m:t>
-        </m:r>
-      </m:oMath>
-      <w:r>
-        <w:rPr>
-          <w:rFonts w:ascii="Times New Roman" w:hAnsi="Times New Roman" w:eastAsia="Times New Roman" w:cs="Times New Roman"/>
-        </w:rPr>
-        <w:t xml:space="preserve">, further below the 2024 threshold of 0.048. Noise of this classical kind strengthens the conclusion that the design cannot detect complete assimilation. It does not license any substantive reading of the observed gradients, and if the error in the language-model score is correlated with exposure to language models, the direction of the bias is ambiguous.</w:t>
-      </w:r>
-    </w:p>
-    <w:p>
-      <w:pPr>
-        <w:pStyle w:val="BodyText"/>
-        <w:spacing w:line="480" w:lineRule="auto" w:after="0" w:before="0"/>
-        <w:ind w:firstLine="720"/>
-        <w:jc w:val="left"/>
-      </w:pPr>
-      <w:r>
-        <w:rPr>
-          <w:iCs/>
-          <w:rFonts w:ascii="Times New Roman" w:hAnsi="Times New Roman" w:eastAsia="Times New Roman" w:cs="Times New Roman"/>
-          <w:i/>
-        </w:rPr>
-        <w:t xml:space="preserve">Occupation-level reliability.</w:t>
-      </w:r>
-      <w:r>
-        <w:rPr>
-          <w:rFonts w:ascii="Times New Roman" w:hAnsi="Times New Roman" w:eastAsia="Times New Roman" w:cs="Times New Roman"/>
-        </w:rPr>
-        <w:t xml:space="preserve"> </w:t>
-      </w:r>
-      <w:r>
-        <w:rPr>
-          <w:rFonts w:ascii="Times New Roman" w:hAnsi="Times New Roman" w:eastAsia="Times New Roman" w:cs="Times New Roman"/>
-        </w:rPr>
-        <w:t xml:space="preserve">If the exposure of an occupation is the mean of</w:t>
-      </w:r>
-      <w:r>
-        <w:rPr>
-          <w:rFonts w:ascii="Times New Roman" w:hAnsi="Times New Roman" w:eastAsia="Times New Roman" w:cs="Times New Roman"/>
-        </w:rPr>
-        <w:t xml:space="preserve"> </w:t>
-      </w:r>
-      <m:oMath>
-        <m:r>
-          <m:t>n</m:t>
-        </m:r>
-      </m:oMath>
-      <w:r>
-        <w:rPr>
-          <w:rFonts w:ascii="Times New Roman" w:hAnsi="Times New Roman" w:eastAsia="Times New Roman" w:cs="Times New Roman"/>
-        </w:rPr>
-        <w:t xml:space="preserve"> </w:t>
-      </w:r>
-      <w:r>
-        <w:rPr>
-          <w:rFonts w:ascii="Times New Roman" w:hAnsi="Times New Roman" w:eastAsia="Times New Roman" w:cs="Times New Roman"/>
-        </w:rPr>
-        <w:t xml:space="preserve">task-level scores with independent errors and task-level reliability</w:t>
-      </w:r>
-      <w:r>
-        <w:rPr>
-          <w:rFonts w:ascii="Times New Roman" w:hAnsi="Times New Roman" w:eastAsia="Times New Roman" w:cs="Times New Roman"/>
-        </w:rPr>
-        <w:t xml:space="preserve"> </w:t>
-      </w:r>
-      <m:oMath>
-        <m:r>
-          <m:t>ρ</m:t>
-        </m:r>
-      </m:oMath>
-      <w:r>
-        <w:rPr>
-          <w:rFonts w:ascii="Times New Roman" w:hAnsi="Times New Roman" w:eastAsia="Times New Roman" w:cs="Times New Roman"/>
-        </w:rPr>
-        <w:t xml:space="preserve">, the reliability of the mean is</w:t>
-      </w:r>
-      <w:r>
-        <w:rPr>
-          <w:rFonts w:ascii="Times New Roman" w:hAnsi="Times New Roman" w:eastAsia="Times New Roman" w:cs="Times New Roman"/>
-        </w:rPr>
-        <w:t xml:space="preserve"> </w:t>
-      </w:r>
-      <m:oMath>
-        <m:r>
-          <m:t>n</m:t>
-        </m:r>
-        <m:r>
-          <m:t>ρ</m:t>
-        </m:r>
-        <m:r>
-          <m:rPr>
-            <m:sty m:val="p"/>
-          </m:rPr>
-          <m:t>/</m:t>
-        </m:r>
-        <m:d>
-          <m:dPr>
-            <m:begChr m:val="("/>
-            <m:endChr m:val=")"/>
-            <m:sepChr m:val=""/>
-            <m:grow/>
-          </m:dPr>
-          <m:e>
-            <m:r>
-              <m:t>1</m:t>
-            </m:r>
-            <m:r>
-              <m:rPr>
-                <m:sty m:val="p"/>
-              </m:rPr>
-              <m:t>+</m:t>
-            </m:r>
-            <m:d>
-              <m:dPr>
-                <m:begChr m:val="("/>
-                <m:endChr m:val=")"/>
-                <m:sepChr m:val=""/>
-                <m:grow/>
-              </m:dPr>
-              <m:e>
-                <m:r>
-                  <m:t>n</m:t>
-                </m:r>
-                <m:r>
-                  <m:rPr>
-                    <m:sty m:val="p"/>
-                  </m:rPr>
-                  <m:t>−</m:t>
-                </m:r>
-                <m:r>
-                  <m:t>1</m:t>
-                </m:r>
-              </m:e>
-            </m:d>
-            <m:r>
-              <m:t>ρ</m:t>
-            </m:r>
-          </m:e>
-        </m:d>
-      </m:oMath>
-      <w:r>
-        <w:rPr>
-          <w:rFonts w:ascii="Times New Roman" w:hAnsi="Times New Roman" w:eastAsia="Times New Roman" w:cs="Times New Roman"/>
-        </w:rPr>
-        <w:t xml:space="preserve">. For</w:t>
-      </w:r>
-      <w:r>
-        <w:rPr>
-          <w:rFonts w:ascii="Times New Roman" w:hAnsi="Times New Roman" w:eastAsia="Times New Roman" w:cs="Times New Roman"/>
-        </w:rPr>
-        <w:t xml:space="preserve"> </w:t>
-      </w:r>
-      <m:oMath>
-        <m:r>
-          <m:t>n</m:t>
-        </m:r>
-        <m:r>
-          <m:rPr>
-            <m:sty m:val="p"/>
-          </m:rPr>
-          <m:t>=</m:t>
-        </m:r>
-        <m:r>
-          <m:t>20</m:t>
-        </m:r>
-      </m:oMath>
-      <w:r>
-        <w:rPr>
-          <w:rFonts w:ascii="Times New Roman" w:hAnsi="Times New Roman" w:eastAsia="Times New Roman" w:cs="Times New Roman"/>
-        </w:rPr>
-        <w:t xml:space="preserve"> </w:t>
-      </w:r>
-      <w:r>
-        <w:rPr>
-          <w:rFonts w:ascii="Times New Roman" w:hAnsi="Times New Roman" w:eastAsia="Times New Roman" w:cs="Times New Roman"/>
-        </w:rPr>
-        <w:t xml:space="preserve">and</w:t>
-      </w:r>
-      <w:r>
-        <w:rPr>
-          <w:rFonts w:ascii="Times New Roman" w:hAnsi="Times New Roman" w:eastAsia="Times New Roman" w:cs="Times New Roman"/>
-        </w:rPr>
-        <w:t xml:space="preserve"> </w:t>
-      </w:r>
-      <m:oMath>
-        <m:r>
-          <m:t>ρ</m:t>
-        </m:r>
-      </m:oMath>
-      <w:r>
-        <w:rPr>
-          <w:rFonts w:ascii="Times New Roman" w:hAnsi="Times New Roman" w:eastAsia="Times New Roman" w:cs="Times New Roman"/>
-        </w:rPr>
-        <w:t xml:space="preserve"> </w:t>
-      </w:r>
-      <w:r>
-        <w:rPr>
-          <w:rFonts w:ascii="Times New Roman" w:hAnsi="Times New Roman" w:eastAsia="Times New Roman" w:cs="Times New Roman"/>
-        </w:rPr>
-        <w:t xml:space="preserve">between 0.04 and 0.18 this is roughly 0.45 to 0.81. The relation is indicative only, since it assumes independent errors.</w:t>
+          <m:t>0.024</m:t>
+        </m:r>
+      </m:oMath>
+      <w:r>
+        <w:rPr>
+          <w:rFonts w:ascii="Times New Roman" w:hAnsi="Times New Roman" w:eastAsia="Times New Roman" w:cs="Times New Roman"/>
+        </w:rPr>
+        <w:t xml:space="preserve">, further below the 2024 minimum detectable effect of 0.050. Noise of this classical kind strengthens the conclusion that the design cannot detect complete assimilation. It does not license any substantive reading of the observed gradients, and if the error in the language-model score is correlated with exposure to language models, the direction of the bias is ambiguous.</w:t>
       </w:r>
     </w:p>
     <w:bookmarkEnd w:id="58"/>

</xml_diff>

<commit_message>
Reproduce Sections 6.2, 7.3, 7.5 and Table 3; update manuscript text and notes
Co-Authored-By: Claude Sonnet 5.5 <noreply@anthropic.com>
Claude-Session: https://claude.ai/code/session_015MZUD2DotEDYTGGfpD8taa
</commit_message>
<xml_diff>
--- a/revision/Acquired_Not_Yet_Assimilated_ISR_revised.docx
+++ b/revision/Acquired_Not_Yet_Assimilated_ISR_revised.docx
@@ -7154,7 +7154,7 @@
         <w:rPr>
           <w:rFonts w:ascii="Times New Roman" w:hAnsi="Times New Roman" w:eastAsia="Times New Roman" w:cs="Times New Roman"/>
         </w:rPr>
-        <w:t xml:space="preserve">Among enterprises that considered AI and did not adopt it, 70.3 percent cite lack of relevant expertise, 53.6 percent unclear legal consequences, and 52.7 percent data protection and privacy (Table 3). Costs are cited by 38.4 percent and the view that AI is not useful by 17.8 percent. The pattern is similar across size classes. This is consistent with H1: firms that stopped short of acquisition describe the obstacle as a missing asset rather than as a tool that fails the task.</w:t>
+        <w:t xml:space="preserve">Among enterprises that considered AI and did not adopt it, 70.3 percent cite lack of relevant expertise, 53.6 percent unclear legal consequences, and 52.7 percent data protection and privacy (Table 3). Difficulties with data availability or quality are cited by 43.5 percent, incompatibility with existing systems by 41.6 percent, costs by 38.4 percent, and the view that AI is not useful by 17.8 percent. The pattern is similar across size classes: expertise is cited by 65 to 71 percent of considerers and lack of usefulness by 10 to 19 percent in each of the three classes. This is consistent with H1: firms that stopped short of acquisition describe the obstacle as a missing asset rather than as a tool that fails the task.</w:t>
       </w:r>
     </w:p>
     <w:p>
@@ -7509,7 +7509,7 @@
                 <w:rFonts w:ascii="Times New Roman" w:hAnsi="Times New Roman"/>
                 <w:sz w:val="19"/>
               </w:rPr>
-              <w:t xml:space="preserve">Costs seem too high</w:t>
+              <w:t xml:space="preserve">Data availability or quality</w:t>
             </w:r>
           </w:p>
         </w:tc>
@@ -7527,7 +7527,7 @@
                 <w:rFonts w:ascii="Times New Roman" w:hAnsi="Times New Roman"/>
                 <w:sz w:val="19"/>
               </w:rPr>
-              <w:t xml:space="preserve">38.4</w:t>
+              <w:t xml:space="preserve">43.5</w:t>
             </w:r>
           </w:p>
         </w:tc>
@@ -7545,7 +7545,7 @@
                 <w:rFonts w:ascii="Times New Roman" w:hAnsi="Times New Roman"/>
                 <w:sz w:val="19"/>
               </w:rPr>
-              <w:t xml:space="preserve">Fixed cost of complements or of the tool</w:t>
+              <w:t xml:space="preserve">Data complement</w:t>
             </w:r>
           </w:p>
         </w:tc>
@@ -7565,7 +7565,7 @@
                 <w:rFonts w:ascii="Times New Roman" w:hAnsi="Times New Roman"/>
                 <w:sz w:val="19"/>
               </w:rPr>
-              <w:t xml:space="preserve">Ethical considerations</w:t>
+              <w:t xml:space="preserve">Incompatibility with existing systems</w:t>
             </w:r>
           </w:p>
         </w:tc>
@@ -7583,7 +7583,7 @@
                 <w:rFonts w:ascii="Times New Roman" w:hAnsi="Times New Roman"/>
                 <w:sz w:val="19"/>
               </w:rPr>
-              <w:t xml:space="preserve">24.6</w:t>
+              <w:t xml:space="preserve">41.6</w:t>
             </w:r>
           </w:p>
         </w:tc>
@@ -7601,7 +7601,7 @@
                 <w:rFonts w:ascii="Times New Roman" w:hAnsi="Times New Roman"/>
                 <w:sz w:val="19"/>
               </w:rPr>
-              <w:t xml:space="preserve">Institutional complement</w:t>
+              <w:t xml:space="preserve">Technical complement</w:t>
             </w:r>
           </w:p>
         </w:tc>
@@ -7621,7 +7621,7 @@
                 <w:rFonts w:ascii="Times New Roman" w:hAnsi="Times New Roman"/>
                 <w:sz w:val="19"/>
               </w:rPr>
-              <w:t xml:space="preserve">AI is not useful for the enterprise</w:t>
+              <w:t xml:space="preserve">Costs seem too high</w:t>
             </w:r>
           </w:p>
         </w:tc>
@@ -7639,7 +7639,7 @@
                 <w:rFonts w:ascii="Times New Roman" w:hAnsi="Times New Roman"/>
                 <w:sz w:val="19"/>
               </w:rPr>
-              <w:t xml:space="preserve">17.8</w:t>
+              <w:t xml:space="preserve">38.4</w:t>
             </w:r>
           </w:p>
         </w:tc>
@@ -7657,6 +7657,118 @@
                 <w:rFonts w:ascii="Times New Roman" w:hAnsi="Times New Roman"/>
                 <w:sz w:val="19"/>
               </w:rPr>
+              <w:t xml:space="preserve">Fixed cost of complements or of the tool</w:t>
+            </w:r>
+          </w:p>
+        </w:tc>
+      </w:tr>
+      <w:tr>
+        <w:tc>
+          <w:tcPr/>
+          <w:p>
+            <w:pPr>
+              <w:pStyle w:val="Compact"/>
+              <w:spacing w:line="240" w:lineRule="auto" w:after="40"/>
+              <w:ind w:firstLine="0"/>
+              <w:jc w:val="left"/>
+            </w:pPr>
+            <w:r>
+              <w:rPr>
+                <w:rFonts w:ascii="Times New Roman" w:hAnsi="Times New Roman"/>
+                <w:sz w:val="19"/>
+              </w:rPr>
+              <w:t xml:space="preserve">Ethical considerations</w:t>
+            </w:r>
+          </w:p>
+        </w:tc>
+        <w:tc>
+          <w:tcPr/>
+          <w:p>
+            <w:pPr>
+              <w:pStyle w:val="Compact"/>
+              <w:spacing w:line="240" w:lineRule="auto" w:after="40"/>
+              <w:ind w:firstLine="0"/>
+              <w:jc w:val="right"/>
+            </w:pPr>
+            <w:r>
+              <w:rPr>
+                <w:rFonts w:ascii="Times New Roman" w:hAnsi="Times New Roman"/>
+                <w:sz w:val="19"/>
+              </w:rPr>
+              <w:t xml:space="preserve">24.6</w:t>
+            </w:r>
+          </w:p>
+        </w:tc>
+        <w:tc>
+          <w:tcPr/>
+          <w:p>
+            <w:pPr>
+              <w:pStyle w:val="Compact"/>
+              <w:spacing w:line="240" w:lineRule="auto" w:after="40"/>
+              <w:ind w:firstLine="0"/>
+              <w:jc w:val="left"/>
+            </w:pPr>
+            <w:r>
+              <w:rPr>
+                <w:rFonts w:ascii="Times New Roman" w:hAnsi="Times New Roman"/>
+                <w:sz w:val="19"/>
+              </w:rPr>
+              <w:t xml:space="preserve">Institutional complement</w:t>
+            </w:r>
+          </w:p>
+        </w:tc>
+      </w:tr>
+      <w:tr>
+        <w:tc>
+          <w:tcPr/>
+          <w:p>
+            <w:pPr>
+              <w:pStyle w:val="Compact"/>
+              <w:spacing w:line="240" w:lineRule="auto" w:after="40"/>
+              <w:ind w:firstLine="0"/>
+              <w:jc w:val="left"/>
+            </w:pPr>
+            <w:r>
+              <w:rPr>
+                <w:rFonts w:ascii="Times New Roman" w:hAnsi="Times New Roman"/>
+                <w:sz w:val="19"/>
+              </w:rPr>
+              <w:t xml:space="preserve">AI is not useful for the enterprise</w:t>
+            </w:r>
+          </w:p>
+        </w:tc>
+        <w:tc>
+          <w:tcPr/>
+          <w:p>
+            <w:pPr>
+              <w:pStyle w:val="Compact"/>
+              <w:spacing w:line="240" w:lineRule="auto" w:after="40"/>
+              <w:ind w:firstLine="0"/>
+              <w:jc w:val="right"/>
+            </w:pPr>
+            <w:r>
+              <w:rPr>
+                <w:rFonts w:ascii="Times New Roman" w:hAnsi="Times New Roman"/>
+                <w:sz w:val="19"/>
+              </w:rPr>
+              <w:t xml:space="preserve">17.8</w:t>
+            </w:r>
+          </w:p>
+        </w:tc>
+        <w:tc>
+          <w:tcPr/>
+          <w:p>
+            <w:pPr>
+              <w:pStyle w:val="Compact"/>
+              <w:spacing w:line="240" w:lineRule="auto" w:after="40"/>
+              <w:ind w:firstLine="0"/>
+              <w:jc w:val="left"/>
+            </w:pPr>
+            <w:r>
+              <w:rPr>
+                <w:rFonts w:ascii="Times New Roman" w:hAnsi="Times New Roman"/>
+                <w:sz w:val="19"/>
+              </w:rPr>
               <w:t xml:space="preserve">Capability failure</w:t>
             </w:r>
           </w:p>
@@ -7814,7 +7926,7 @@
         <w:rPr>
           <w:rFonts w:ascii="Times New Roman" w:hAnsi="Times New Roman" w:eastAsia="Times New Roman" w:cs="Times New Roman"/>
         </w:rPr>
-        <w:t xml:space="preserve">), which would be expected if countries with more acquisition also have more considerers who have encountered the knowledge barrier. With 23 observations these correlations do not show that differences in legal concern explain differences in acquisition. Sector exposure to visual content creation correlates with visual-generation acquisition at 0.84, but also with text-generation acquisition at 0.83 and image recognition at 0.81, and in country-sector cells with country fixed effects a standard deviation of exposure is associated with higher acquisition of every AI type (permutation</w:t>
+        <w:t xml:space="preserve">), which would be expected if countries with more acquisition also have more considerers who have encountered the knowledge barrier. With 23 observations these correlations do not show that differences in legal concern explain differences in acquisition. Sector exposure to visual content creation, defined as the employment-weighted mean of one-digit occupation exposure (pooled O*NET task scores, with 2022 Labour Force Survey employment by occupation and NACE section as weights), correlates 0.76 across nine EU27 sectors with visual-generation acquisition, but also with text-generation acquisition (0.75), image recognition (0.74), and use of any AI (0.82). In 222 country-sector cells with country fixed effects, a standard deviation of exposure is associated with higher acquisition of every AI type (6.0 percentage points for visual generation; permutation</w:t>
       </w:r>
       <w:r>
         <w:rPr>
@@ -7831,7 +7943,7 @@
         <w:rPr>
           <w:rFonts w:ascii="Times New Roman" w:hAnsi="Times New Roman" w:eastAsia="Times New Roman" w:cs="Times New Roman"/>
         </w:rPr>
-        <w:t xml:space="preserve">-values 0.003 to 0.006). Exposure therefore identifies digitally intensive sectors rather than a specific propensity to acquire visual generators, which is a further reason not to read exposure gradients in hiring as effects of visual generation.</w:t>
+        <w:t xml:space="preserve">-values 0.016 to 0.023). Exposure therefore identifies digitally intensive sectors rather than a specific propensity to acquire visual generators, which is a further reason not to read exposure gradients in hiring as effects of visual generation.</w:t>
       </w:r>
     </w:p>
     <w:bookmarkEnd w:id="40"/>
@@ -10906,7 +11018,7 @@
         <w:rPr>
           <w:rFonts w:ascii="Times New Roman" w:hAnsi="Times New Roman" w:eastAsia="Times New Roman" w:cs="Times New Roman"/>
         </w:rPr>
-        <w:t xml:space="preserve">European Labour Force Survey employment in video and film production, advertising, and other professional activities including design and photography rose between 2019–2021 and 2023–2025 by 0.13, 0.11, and 0.15 log points, against a median of 0.04 across 88 industries; creative industries gained 0.09 log points relative to other industries (randomization</w:t>
+        <w:t xml:space="preserve">European Labour Force Survey employment in motion picture and video production (NACE 59), advertising and market research (73), and other professional, scientific, and technical activities including design and photography (74) rose between 2019–2021 and 2023–2025 by 0.13, 0.11, and 0.15 log points, against a median of 0.04 across 89 industries; these three creative industries gained 0.09 log points relative to other industries (randomization</w:t>
       </w:r>
       <w:r>
         <w:rPr>
@@ -10925,14 +11037,43 @@
           <m:t>=</m:t>
         </m:r>
         <m:r>
-          <m:t>0.20</m:t>
-        </m:r>
-      </m:oMath>
-      <w:r>
-        <w:rPr>
-          <w:rFonts w:ascii="Times New Roman" w:hAnsi="Times New Roman" w:eastAsia="Times New Roman" w:cs="Times New Roman"/>
-        </w:rPr>
-        <w:t xml:space="preserve">). US sector postings in arts, media, and marketing fell relative to other sectors, but so did software and data postings, and the same sectors were not stable before the base period. The finest public occupation-by-industry cross-tabulation (one-digit occupations by industry section) shows professionals’ employment growing by 0.26 log points in information and communication, 0.17 in professional and technical activities, and 0.14 in arts and entertainment, against a median of 0.19 across 19 sections; these groups are dominated by occupations other than visual production, and two-digit occupation data (cultural professionals, +0.09) are too coarse to isolate designers or artists. Neither series isolates visual generation, and both are consistent with every account in Table 1 other than large and rapid net substitution.</w:t>
+          <m:t>0.18</m:t>
+        </m:r>
+      </m:oMath>
+      <w:r>
+        <w:rPr>
+          <w:rFonts w:ascii="Times New Roman" w:hAnsi="Times New Roman" w:eastAsia="Times New Roman" w:cs="Times New Roman"/>
+        </w:rPr>
+        <w:t xml:space="preserve">). In the United States, Indeed postings in arts and entertainment, media and communications, and marketing fell by 0.44, 0.63, and 0.62 log points between 2022 and 2023–2025, against a median of</w:t>
+      </w:r>
+      <w:r>
+        <w:rPr>
+          <w:rFonts w:ascii="Times New Roman" w:hAnsi="Times New Roman" w:eastAsia="Times New Roman" w:cs="Times New Roman"/>
+        </w:rPr>
+        <w:t xml:space="preserve"> </w:t>
+      </w:r>
+      <m:oMath>
+        <m:r>
+          <m:rPr>
+            <m:sty m:val="p"/>
+          </m:rPr>
+          <m:t>−</m:t>
+        </m:r>
+        <m:r>
+          <m:t>0.27</m:t>
+        </m:r>
+      </m:oMath>
+      <w:r>
+        <w:rPr>
+          <w:rFonts w:ascii="Times New Roman" w:hAnsi="Times New Roman" w:eastAsia="Times New Roman" w:cs="Times New Roman"/>
+        </w:rPr>
+        <w:t xml:space="preserve"> </w:t>
+      </w:r>
+      <w:r>
+        <w:rPr>
+          <w:rFonts w:ascii="Times New Roman" w:hAnsi="Times New Roman" w:eastAsia="Times New Roman" w:cs="Times New Roman"/>
+        </w:rPr>
+        <w:t xml:space="preserve">across 47 sectors, but postings for software development and for data and analytics fell by 0.96 and 0.86, and four of the five sectors had risen by more than the median sector between 2020 and 2022 (descriptive only). The finest public occupation-by-industry cross-tabulation (one-digit occupations by industry section) shows professionals’ employment growing by 0.26 log points in information and communication, 0.17 in professional and technical activities, and 0.14 in arts and entertainment, against a median of 0.19 across 21 sections; these groups are dominated by occupations other than visual production, and two-digit occupation data (legal, social, and cultural professionals, +0.09, against a median of 0.02 across two-digit occupations) are too coarse to isolate designers or artists. Neither series isolates visual generation, and both are consistent with every account in Table 1 other than large and rapid net substitution.</w:t>
       </w:r>
     </w:p>
     <w:bookmarkEnd w:id="44"/>
@@ -11218,7 +11359,7 @@
         <w:rPr>
           <w:rFonts w:ascii="Times New Roman" w:hAnsi="Times New Roman" w:eastAsia="Times New Roman" w:cs="Times New Roman"/>
         </w:rPr>
-        <w:t xml:space="preserve">Firm-level links between use and hiring are not public, so we use sectors as the nearest proxy. In 260 country-sector cells (30 countries, 9 NACE sections), sectors with higher acquisition of picture, video, or audio generation in 2025 had higher employment growth between 2019–2021 and 2023–2025: 0.051 log points per standard deviation of acquisition (10.6 percentage points), with country fixed effects (standard error 0.010). The same relationship holds before the technology: for 2016–2018 to 2019–2021 the coefficient is 0.049 (0.008), and the difference between the two periods is 0.002 (0.012). Acquisition is not a separate signal here, because it correlates 0.92 with acquisition of text generation and 0.95 with use of any AI across cells; adding the text-generation control leaves a post-minus-pre difference of 0.041 (0.020), which is imprecise because of this collinearity. In the United States, the sector share of businesses reporting AI use in the Business Trends and Outlook Survey (U.S. Census Bureau, 2026) correlates 0.59 across 20 sectors with the sector’s reported employee-change index (descriptive only). Complete assimilation with</w:t>
+        <w:t xml:space="preserve">Firm-level links between use and hiring are not public, so we use sectors as the nearest proxy. In 258 country-sector cells (30 countries, 9 NACE sections), sectors with higher acquisition of picture, video, or audio generation in 2025 had higher employment growth between 2019–2021 and 2023–2025: 0.051 log points per standard deviation of acquisition (10.6 percentage points), with country fixed effects (heteroskedasticity-robust standard error 0.009). The same relationship holds before the technology: for 2016–2018 to 2019–2021 the coefficient is 0.049 (0.006), and the difference between the two periods is 0.002 (0.010). Acquisition is not a separate signal here, because it correlates 0.92 with acquisition of text generation and 0.95 with use of any AI across cells; adding the text-generation control leaves a post-minus-pre difference of 0.041 (0.030), which is imprecise because of this collinearity. Complete assimilation with</w:t>
       </w:r>
       <w:r>
         <w:rPr>
@@ -12602,7 +12743,7 @@
         <w:rPr>
           <w:rFonts w:ascii="Times New Roman" w:hAnsi="Times New Roman" w:eastAsia="Times New Roman" w:cs="Times New Roman"/>
         </w:rPr>
-        <w:t xml:space="preserve">All data are public (Eurostat, Statistics Canada, U.S. Census Bureau, O*NET, Indeed Hiring Lab). Code, prompts, and the language-model task scores required to reproduce Tables 4 and 5 and the analyses in Sections 7.1 and 7.4 are available in an anonymized replication repository. Large language models (Claude Haiku 5.5, with GPT-5.6 Luna as a second scorer) were used as measurement instruments to code O*NET task statements and NOC main-duty statements. A generative AI assistant was used to help write analysis code and to draft and edit the manuscript. The authors reviewed all results, text, and code and take responsibility for the content.</w:t>
+        <w:t xml:space="preserve">All data are public (Eurostat, Statistics Canada, O*NET, Indeed Hiring Lab). Code, prompts, and the language-model task scores required to reproduce Tables 4 and 5 and the analyses in Sections 7.1 and 7.4 are available in an anonymized replication repository. Large language models (Claude Haiku 5.5, with GPT-5.6 Luna as a second scorer) were used as measurement instruments to code O*NET task statements and NOC main-duty statements. A generative AI assistant was used to help write analysis code and to draft and edit the manuscript. The authors reviewed all results, text, and code and take responsibility for the content.</w:t>
       </w:r>
     </w:p>
     <w:bookmarkEnd w:id="56"/>
@@ -17228,46 +17369,6 @@
           <w:rFonts w:ascii="Times New Roman" w:hAnsi="Times New Roman" w:eastAsia="Times New Roman" w:cs="Times New Roman"/>
         </w:rPr>
         <w:t xml:space="preserve">(3-part-1), 599–617.</w:t>
-      </w:r>
-    </w:p>
-    <w:p>
-      <w:pPr>
-        <w:pStyle w:val="BodyText"/>
-        <w:spacing w:line="480" w:lineRule="auto" w:after="0" w:before="0"/>
-        <w:ind w:firstLine="720"/>
-        <w:jc w:val="left"/>
-      </w:pPr>
-      <w:r>
-        <w:rPr>
-          <w:rFonts w:ascii="Times New Roman" w:hAnsi="Times New Roman" w:eastAsia="Times New Roman" w:cs="Times New Roman"/>
-        </w:rPr>
-        <w:t xml:space="preserve">U.S. Census Bureau. (2026).</w:t>
-      </w:r>
-      <w:r>
-        <w:rPr>
-          <w:rFonts w:ascii="Times New Roman" w:hAnsi="Times New Roman" w:eastAsia="Times New Roman" w:cs="Times New Roman"/>
-        </w:rPr>
-        <w:t xml:space="preserve"> </w:t>
-      </w:r>
-      <w:r>
-        <w:rPr>
-          <w:iCs/>
-          <w:rFonts w:ascii="Times New Roman" w:hAnsi="Times New Roman" w:eastAsia="Times New Roman" w:cs="Times New Roman"/>
-          <w:i/>
-        </w:rPr>
-        <w:t xml:space="preserve">Business Trends and Outlook Survey (BTOS), sector estimates</w:t>
-      </w:r>
-      <w:r>
-        <w:rPr>
-          <w:rFonts w:ascii="Times New Roman" w:hAnsi="Times New Roman" w:eastAsia="Times New Roman" w:cs="Times New Roman"/>
-        </w:rPr>
-        <w:t xml:space="preserve"> </w:t>
-      </w:r>
-      <w:r>
-        <w:rPr>
-          <w:rFonts w:ascii="Times New Roman" w:hAnsi="Times New Roman" w:eastAsia="Times New Roman" w:cs="Times New Roman"/>
-        </w:rPr>
-        <w:t xml:space="preserve">[Data set]. Retrieved October 4, 2026.</w:t>
       </w:r>
     </w:p>
     <w:p>

</xml_diff>

<commit_message>
Add Section 7.6 (job-advert text evidence) with limits; update references and notes
Co-Authored-By: Claude Sonnet 5.5 <noreply@anthropic.com>
Claude-Session: https://claude.ai/code/session_015MZUD2DotEDYTGGfpD8taa
</commit_message>
<xml_diff>
--- a/revision/Acquired_Not_Yet_Assimilated_ISR_revised.docx
+++ b/revision/Acquired_Not_Yet_Assimilated_ISR_revised.docx
@@ -430,7 +430,7 @@
         <w:rPr>
           <w:rFonts w:ascii="Times New Roman" w:hAnsi="Times New Roman" w:eastAsia="Times New Roman" w:cs="Times New Roman"/>
         </w:rPr>
-        <w:t xml:space="preserve">The paper proceeds as follows. Section 2 reviews the literature. Section 3 develops the theory, Section 4 derives the detectability bound, and Section 5 describes the data. Sections 6 to 8 present the evidence on acquisition and barriers, apply the bound to hiring data, and ask when occupation-level data could become informative. Section 9 sets out a firm-level design, and Sections 10 and 11 discuss implications and conclude.</w:t>
+        <w:t xml:space="preserve">The paper proceeds as follows. Section 2 reviews the literature. Section 3 develops the theory, Section 4 derives the detectability bound, and Section 5 describes the data. Sections 6 to 8 present the evidence on acquisition and barriers, apply the bound to hiring data (including a pilot with advert text), and ask when occupation-level data could become informative. Section 9 sets out a firm-level design, and Sections 10 and 11 discuss implications and conclude.</w:t>
       </w:r>
     </w:p>
     <w:bookmarkEnd w:id="21"/>
@@ -7948,7 +7948,7 @@
     </w:p>
     <w:bookmarkEnd w:id="40"/>
     <w:bookmarkEnd w:id="41"/>
-    <w:bookmarkStart w:id="47" w:name="X0775f8330c9593e54d58f04a83b284a01583fa5"/>
+    <w:bookmarkStart w:id="48" w:name="X0775f8330c9593e54d58f04a83b284a01583fa5"/>
     <w:p>
       <w:pPr>
         <w:pStyle w:val="Heading2"/>
@@ -11470,8 +11470,187 @@
       </w:r>
     </w:p>
     <w:bookmarkEnd w:id="46"/>
+    <w:bookmarkStart w:id="47" w:name="evidence-from-job-advert-text"/>
+    <w:p>
+      <w:pPr>
+        <w:pStyle w:val="Heading3"/>
+      </w:pPr>
+      <w:r>
+        <w:rPr>
+          <w:rFonts w:ascii="Times New Roman" w:hAnsi="Times New Roman" w:eastAsia="Times New Roman" w:cs="Times New Roman"/>
+        </w:rPr>
+        <w:t xml:space="preserve">7.6 Evidence from Job-Advert Text</w:t>
+      </w:r>
+    </w:p>
+    <w:p>
+      <w:pPr>
+        <w:pStyle w:val="FirstParagraph"/>
+        <w:spacing w:line="480" w:lineRule="auto" w:after="0" w:before="0"/>
+        <w:ind w:firstLine="720"/>
+        <w:jc w:val="left"/>
+      </w:pPr>
+      <w:r>
+        <w:rPr>
+          <w:rFonts w:ascii="Times New Roman" w:hAnsi="Times New Roman" w:eastAsia="Times New Roman" w:cs="Times New Roman"/>
+        </w:rPr>
+        <w:t xml:space="preserve">Occupation-level counts cannot show what employers ask of the people they hire. Advert text can, at least for skills. We use the schema.org JobPosting markup that Common Crawl collected and Web Data Commons published for three crawls (December 2022, 2023, and 2024). They contain 4.8, 4.6, and 4.0 million postings with a named hiring organization, from about 590,000, 560,000, and 550,000 organizations. The postings are not restricted to the European Union. We identify visual-production roles in two steps: a multilingual keyword filter on posting titles, then classification of the unique candidate titles by a language model (Claude Haiku 5.5; prompts are in the replication repository). We then grade the postings that mention generative AI tools by whether the tools are absent, mentioned as a preferred skill or as company context, or required as a skill or core duty of the role.</w:t>
+      </w:r>
+    </w:p>
+    <w:p>
+      <w:pPr>
+        <w:pStyle w:val="BodyText"/>
+        <w:spacing w:line="480" w:lineRule="auto" w:after="0" w:before="0"/>
+        <w:ind w:firstLine="720"/>
+        <w:jc w:val="left"/>
+      </w:pPr>
+      <w:r>
+        <w:rPr>
+          <w:rFonts w:ascii="Times New Roman" w:hAnsi="Times New Roman" w:eastAsia="Times New Roman" w:cs="Times New Roman"/>
+        </w:rPr>
+        <w:t xml:space="preserve">The counts are small but move fast. Visual-production postings number 30,728, 28,138, and 24,478 in the three crawls. Postings that mention generative AI tools rise from 11 in 2022 to 176 in 2023 and 721 in 2024, and postings that require such tools rise from none to 24 and 50. In 2024, then, about 3 percent of visual-production postings mention generative AI tools and about 0.2 percent require them. As a check on keyword recall, 8 of 1,224 randomly drawn visual-role postings without a keyword hit were graded as mentioning such tools, so the counts are close to, but below, the true values. At the same time, 9.6 percent of EU enterprises report using generative visual AI (Section 6.1). The two figures come from different populations and measure different things, because a posting reveals demanded skills, not reassigned tasks. They are nevertheless consistent with the gap that our theory describes: acquisition is widespread, while the demand for the skills that would accompany reassignment of visual tasks is still marginal.</w:t>
+      </w:r>
+    </w:p>
+    <w:p>
+      <w:pPr>
+        <w:pStyle w:val="BodyText"/>
+        <w:spacing w:line="480" w:lineRule="auto" w:after="0" w:before="0"/>
+        <w:ind w:firstLine="720"/>
+        <w:jc w:val="left"/>
+      </w:pPr>
+      <w:r>
+        <w:rPr>
+          <w:rFonts w:ascii="Times New Roman" w:hAnsi="Times New Roman" w:eastAsia="Times New Roman" w:cs="Times New Roman"/>
+        </w:rPr>
+        <w:t xml:space="preserve">We also tried to use the postings to test H3 and report the attempt because it fails instructively. We call an employer an acquirer if generative AI tools appear in any of its postings other than visual-production roles, and we treat compliance, legal, privacy, and AI-governance roles, as well as creative or design leadership roles, as indicators of complementary assets. Among 844 acquirers that posted visual-production roles in 2024, the presence of such complement postings does not raise the probability that visual postings mention AI tools (logit coefficient</w:t>
+      </w:r>
+      <w:r>
+        <w:rPr>
+          <w:rFonts w:ascii="Times New Roman" w:hAnsi="Times New Roman" w:eastAsia="Times New Roman" w:cs="Times New Roman"/>
+        </w:rPr>
+        <w:t xml:space="preserve"> </w:t>
+      </w:r>
+      <m:oMath>
+        <m:r>
+          <m:rPr>
+            <m:sty m:val="p"/>
+          </m:rPr>
+          <m:t>−</m:t>
+        </m:r>
+        <m:r>
+          <m:t>0.20</m:t>
+        </m:r>
+      </m:oMath>
+      <w:r>
+        <w:rPr>
+          <w:rFonts w:ascii="Times New Roman" w:hAnsi="Times New Roman" w:eastAsia="Times New Roman" w:cs="Times New Roman"/>
+        </w:rPr>
+        <w:t xml:space="preserve">, standard error 0.31). Among the 3,388 employers that posted visual-production roles in 2022 and had at least three postings in both 2022 and 2024, the interaction of acquirer status and complements on the change in the share of visual postings is</w:t>
+      </w:r>
+      <w:r>
+        <w:rPr>
+          <w:rFonts w:ascii="Times New Roman" w:hAnsi="Times New Roman" w:eastAsia="Times New Roman" w:cs="Times New Roman"/>
+        </w:rPr>
+        <w:t xml:space="preserve"> </w:t>
+      </w:r>
+      <m:oMath>
+        <m:r>
+          <m:rPr>
+            <m:sty m:val="p"/>
+          </m:rPr>
+          <m:t>−</m:t>
+        </m:r>
+        <m:r>
+          <m:t>1.9</m:t>
+        </m:r>
+      </m:oMath>
+      <w:r>
+        <w:rPr>
+          <w:rFonts w:ascii="Times New Roman" w:hAnsi="Times New Roman" w:eastAsia="Times New Roman" w:cs="Times New Roman"/>
+        </w:rPr>
+        <w:t xml:space="preserve"> </w:t>
+      </w:r>
+      <w:r>
+        <w:rPr>
+          <w:rFonts w:ascii="Times New Roman" w:hAnsi="Times New Roman" w:eastAsia="Times New Roman" w:cs="Times New Roman"/>
+        </w:rPr>
+        <w:t xml:space="preserve">percentage points (standard error 1.0), the sign H3 predicts. But the same interaction is</w:t>
+      </w:r>
+      <w:r>
+        <w:rPr>
+          <w:rFonts w:ascii="Times New Roman" w:hAnsi="Times New Roman" w:eastAsia="Times New Roman" w:cs="Times New Roman"/>
+        </w:rPr>
+        <w:t xml:space="preserve"> </w:t>
+      </w:r>
+      <m:oMath>
+        <m:r>
+          <m:rPr>
+            <m:sty m:val="p"/>
+          </m:rPr>
+          <m:t>−</m:t>
+        </m:r>
+        <m:r>
+          <m:t>2.4</m:t>
+        </m:r>
+      </m:oMath>
+      <w:r>
+        <w:rPr>
+          <w:rFonts w:ascii="Times New Roman" w:hAnsi="Times New Roman" w:eastAsia="Times New Roman" w:cs="Times New Roman"/>
+        </w:rPr>
+        <w:t xml:space="preserve"> </w:t>
+      </w:r>
+      <w:r>
+        <w:rPr>
+          <w:rFonts w:ascii="Times New Roman" w:hAnsi="Times New Roman" w:eastAsia="Times New Roman" w:cs="Times New Roman"/>
+        </w:rPr>
+        <w:t xml:space="preserve">points (0.9) for the change from 2022 to 2023, before generative tools were widely acquired, so it cannot be a consequence of acquisition. Restricting the sample to employers with at least ten postings in both years shrinks the 2022–2024 interaction to</w:t>
+      </w:r>
+      <w:r>
+        <w:rPr>
+          <w:rFonts w:ascii="Times New Roman" w:hAnsi="Times New Roman" w:eastAsia="Times New Roman" w:cs="Times New Roman"/>
+        </w:rPr>
+        <w:t xml:space="preserve"> </w:t>
+      </w:r>
+      <m:oMath>
+        <m:r>
+          <m:rPr>
+            <m:sty m:val="p"/>
+          </m:rPr>
+          <m:t>−</m:t>
+        </m:r>
+        <m:r>
+          <m:t>0.8</m:t>
+        </m:r>
+      </m:oMath>
+      <w:r>
+        <w:rPr>
+          <w:rFonts w:ascii="Times New Roman" w:hAnsi="Times New Roman" w:eastAsia="Times New Roman" w:cs="Times New Roman"/>
+        </w:rPr>
+        <w:t xml:space="preserve"> </w:t>
+      </w:r>
+      <w:r>
+        <w:rPr>
+          <w:rFonts w:ascii="Times New Roman" w:hAnsi="Times New Roman" w:eastAsia="Times New Roman" w:cs="Times New Roman"/>
+        </w:rPr>
+        <w:t xml:space="preserve">points (0.7).</w:t>
+      </w:r>
+    </w:p>
+    <w:p>
+      <w:pPr>
+        <w:pStyle w:val="BodyText"/>
+        <w:spacing w:line="480" w:lineRule="auto" w:after="0" w:before="0"/>
+        <w:ind w:firstLine="720"/>
+        <w:jc w:val="left"/>
+      </w:pPr>
+      <w:r>
+        <w:rPr>
+          <w:rFonts w:ascii="Times New Roman" w:hAnsi="Times New Roman" w:eastAsia="Times New Roman" w:cs="Times New Roman"/>
+        </w:rPr>
+        <w:t xml:space="preserve">These data do not identify the mechanism, for reasons that bear on any use of advert text. A crawl records the stock of postings that were live and crawled at one time, not hires, and crawl coverage differs across years. Employers are matched by name. Acquirer status and complements are inferred from keywords and titles, and the cells with both are small. The evidence supports the descriptive point above and nothing stronger. A test of H3 needs the firm-level measures of use, complements, reassignment, and hiring described in Section 9.</w:t>
+      </w:r>
+    </w:p>
     <w:bookmarkEnd w:id="47"/>
-    <w:bookmarkStart w:id="48" w:name="X2061958f846d060753ea4141165ee0cf5000e1a"/>
+    <w:bookmarkEnd w:id="48"/>
+    <w:bookmarkStart w:id="49" w:name="X2061958f846d060753ea4141165ee0cf5000e1a"/>
     <w:p>
       <w:pPr>
         <w:pStyle w:val="Heading2"/>
@@ -12451,8 +12630,8 @@
         <w:t xml:space="preserve">are already within reach in 2025, because that sector’s acquisition rate exceeds the required share. They show that only very large effects concentrated in high-acquisition sectors could already be detectable, and even these assume that every acquiring employer has assimilated the tool. Questions about generative-AI assimilation in standing occupations will have to be answered with firm-level data.</w:t>
       </w:r>
     </w:p>
-    <w:bookmarkEnd w:id="48"/>
-    <w:bookmarkStart w:id="49" w:name="X6515d1f6798b7cfc91e91c5bb73d9eb857260c5"/>
+    <w:bookmarkEnd w:id="49"/>
+    <w:bookmarkStart w:id="50" w:name="X6515d1f6798b7cfc91e91c5bb73d9eb857260c5"/>
     <w:p>
       <w:pPr>
         <w:pStyle w:val="Heading2"/>
@@ -12475,7 +12654,7 @@
         <w:rPr>
           <w:rFonts w:ascii="Times New Roman" w:hAnsi="Times New Roman" w:eastAsia="Times New Roman" w:cs="Times New Roman"/>
         </w:rPr>
-        <w:t xml:space="preserve">The accounts in Table 1 differ in what they predict for firms that report use. A design that discriminates among them needs four linked measures at the firm level: reported use of visual generators, the stock of complementary assets, task reassignment for visual production, and hiring for visual occupations. Several data sources could provide them. Eurostat ICT-usage microdata can be linked to employer-employee registers in some member states through national statistical offices. Online job advertisements that carry employer identifiers can record both hiring for visual occupations and requests for generative-AI skills, in the spirit of the firm-level AI indicators built from workforce data by Babina et al. (2024). And a purpose-built survey of acquiring firms can measure the three assets and the share of visual tasks reassigned.</w:t>
+        <w:t xml:space="preserve">The accounts in Table 1 differ in what they predict for firms that report use. A design that discriminates among them needs four linked measures at the firm level: reported use of visual generators, the stock of complementary assets, task reassignment for visual production, and hiring for visual occupations. Several data sources could provide them. Eurostat ICT-usage microdata can be linked to employer-employee registers in some member states through national statistical offices. Online job advertisements that carry employer identifiers can record both hiring for visual occupations and requests for generative-AI skills, in the spirit of the firm-level AI indicators built from workforce data by Babina et al. (2024). And a purpose-built survey of acquiring firms can measure the three assets and the share of visual tasks reassigned. Advert text alone is not enough, as the pilot in Section 7.6 shows: it documents demanded skills but, without hires and without independent measures of complements, it does not identify the mechanism.</w:t>
       </w:r>
     </w:p>
     <w:p>
@@ -12492,8 +12671,8 @@
         <w:t xml:space="preserve">The predictions are specific. Under the assimilation gap, task reassignment among users is low on average and rises with expertise, review capacity, and compliance procedures, and hiring for visual occupations falls, if at all, only among users with high asset stocks. Under complete assimilation with net substitution, users cut visual hiring relative to non-users regardless of asset stocks. Under offsetting scale effects, users reassign tasks but their visual hiring does not fall, and their job adverts shift toward direction, selection, and review. Under capability failure, users do not reassign tasks even when assets are present. Each prediction can be falsified by a single well-measured comparison, and the asset measures make the test one of mechanism rather than of association between use and hiring.</w:t>
       </w:r>
     </w:p>
-    <w:bookmarkEnd w:id="49"/>
-    <w:bookmarkStart w:id="54" w:name="discussion"/>
+    <w:bookmarkEnd w:id="50"/>
+    <w:bookmarkStart w:id="55" w:name="discussion"/>
     <w:p>
       <w:pPr>
         <w:pStyle w:val="Heading2"/>
@@ -12505,7 +12684,7 @@
         <w:t xml:space="preserve">10 Discussion</w:t>
       </w:r>
     </w:p>
-    <w:bookmarkStart w:id="50" w:name="X8b5d7cb2dd9a2ce0d7f424e3d7c91bdc66a3387"/>
+    <w:bookmarkStart w:id="51" w:name="X8b5d7cb2dd9a2ce0d7f424e3d7c91bdc66a3387"/>
     <w:p>
       <w:pPr>
         <w:pStyle w:val="Heading3"/>
@@ -12582,8 +12761,8 @@
         <w:t xml:space="preserve">per year, not statistically significant), and the estimates depend on the language-exposure control. In the model, acceleration enters through the acceptance threshold: the technology lowers the cost of review and generation for tasks in industries that were already reducing their demand for them, so assimilation is most likely where structural pressure exists. Country-year fixed effects absorb economy-wide shocks but not industry-specific restructuring, and the industry employment series in Section 7.3 show no contraction in the creative industries. Public data cannot show what happened to visual-production occupations within those industries, so the within-industry reading is a hypothesis rather than a finding. Separating acceleration from an independent effect of the technology requires firm-level data that observe an employer’s industry, its use of the tool, and its hiring together.</w:t>
       </w:r>
     </w:p>
-    <w:bookmarkEnd w:id="50"/>
-    <w:bookmarkStart w:id="51" w:name="a-macroeconomic-reading"/>
+    <w:bookmarkEnd w:id="51"/>
+    <w:bookmarkStart w:id="52" w:name="a-macroeconomic-reading"/>
     <w:p>
       <w:pPr>
         <w:pStyle w:val="Heading3"/>
@@ -12637,8 +12816,8 @@
         <w:t xml:space="preserve">On timing, the evidence supports neither a prediction that effects will take decades nor the view that the future cannot be known. Table 6 gives earliest detection dates that range from 2025, for very large effects in high-acquisition sectors, to 2035, for a 39 percent fall under slow diffusion in the average firm, and never, in this design, for platform-sized effects. What the data cannot say is whether assimilation is occurring now. Answering that requires firm-level data that link use, complementary assets, task reassignment, and hiring.</w:t>
       </w:r>
     </w:p>
-    <w:bookmarkEnd w:id="51"/>
-    <w:bookmarkStart w:id="52" w:name="implications"/>
+    <w:bookmarkEnd w:id="52"/>
+    <w:bookmarkStart w:id="53" w:name="implications"/>
     <w:p>
       <w:pPr>
         <w:pStyle w:val="Heading3"/>
@@ -12664,8 +12843,8 @@
         <w:t xml:space="preserve">For researchers, the implication is to report the acquisition rate and the reference effect size that an exposure estimate would require, and to treat estimates that exceed that requirement, or that predate the technology, as evidence about something else. For managers, the barrier evidence suggests that the constraints on using generative visual tools are organizational: review capacity and policies for copyright and personal data are complements to the tool, and waiting for better models will not build them. For statistical agencies and policymakers, a rising use indicator should not be read as rising task reassignment, and a small hiring response should not be read as evidence that the response will remain small. Adding questions on task reassignment and on review and compliance practices to enterprise surveys would make the gap directly measurable.</w:t>
       </w:r>
     </w:p>
-    <w:bookmarkEnd w:id="52"/>
-    <w:bookmarkStart w:id="53" w:name="limitations"/>
+    <w:bookmarkEnd w:id="53"/>
+    <w:bookmarkStart w:id="54" w:name="limitations"/>
     <w:p>
       <w:pPr>
         <w:pStyle w:val="Heading3"/>
@@ -12688,12 +12867,12 @@
         <w:rPr>
           <w:rFonts w:ascii="Times New Roman" w:hAnsi="Times New Roman" w:eastAsia="Times New Roman" w:cs="Times New Roman"/>
         </w:rPr>
-        <w:t xml:space="preserve">We do not observe assimilation. The barrier items refer to AI in general and to firms that considered it, so they speak to the acquisition margin only. The hiring series are experimental, measure adverts or vacancies rather than employment, and would miss substitution through hours, outsourcing, or freelancing. Exposure is measured with language-model scores that we have checked against a second model but not against human coders. We argue that measurement noise strengthens the detectability result, but it limits what can be said about the gradients themselves, and a categorical treatment defined by occupation codes (for example, graphic designers, visual artists, and photographers) would avoid model-based scoring and is a natural next step that we leave to future work. The control for language-model exposure is our own construction, and the 2024 estimate depends on it (Table 4). Acquisition rates are sector averages and do not identify the employers of particular occupations. We study occupations and sectors, not aggregate employment or productivity, and the macroeconomic reading in Section 10.2 interprets the results through the model rather than testing it. The review floor in Proposition 1 rests on the assumption that review hours do not fall with model quality; where better models reduce visible defects, review may become cheaper and the threshold in equation (1) may fall without any change in complements, which would weaken Implication 1 for those tasks. The detectability bound rests on a linear mapping from exposure to the visual share of work and on reference effect sizes from platforms, and both could be refined; however, plausible changes alter the numbers in Tables 5 and 6 without changing the conclusion that current designs lack the power to detect complete assimilation at platform-sized effects.</w:t>
+        <w:t xml:space="preserve">We do not observe assimilation. The barrier items refer to AI in general and to firms that considered it, so they speak to the acquisition margin only. The hiring series are experimental, measure adverts or vacancies rather than employment, and would miss substitution through hours, outsourcing, or freelancing. Exposure is measured with language-model scores that we have checked against a second model but not against human coders. We argue that measurement noise strengthens the detectability result, but it limits what can be said about the gradients themselves, and a categorical treatment defined by occupation codes (for example, graphic designers, visual artists, and photographers) would avoid model-based scoring and is a natural next step that we leave to future work. The control for language-model exposure is our own construction, and the 2024 estimate depends on it (Table 4). Acquisition rates are sector averages and do not identify the employers of particular occupations. We study occupations and sectors, not aggregate employment or productivity, and the macroeconomic reading in Section 10.2 interprets the results through the model rather than testing it. The review floor in Proposition 1 rests on the assumption that review hours do not fall with model quality; where better models reduce visible defects, review may become cheaper and the threshold in equation (1) may fall without any change in complements, which would weaken Implication 1 for those tasks. The advert-text evidence in Section 7.6 covers a stock of postings rather than hires and relies on keyword-based inferences of acquirer status and complements. The detectability bound rests on a linear mapping from exposure to the visual share of work and on reference effect sizes from platforms, and both could be refined; however, plausible changes alter the numbers in Tables 5 and 6 without changing the conclusion that current designs lack the power to detect complete assimilation at platform-sized effects.</w:t>
       </w:r>
     </w:p>
-    <w:bookmarkEnd w:id="53"/>
     <w:bookmarkEnd w:id="54"/>
-    <w:bookmarkStart w:id="55" w:name="conclusion"/>
+    <w:bookmarkEnd w:id="55"/>
+    <w:bookmarkStart w:id="56" w:name="conclusion"/>
     <w:p>
       <w:pPr>
         <w:pStyle w:val="Heading2"/>
@@ -12719,8 +12898,8 @@
         <w:t xml:space="preserve">Generative visual AI has been widely acquired: about one in ten European firms used it in 2025, and about one in three in publishing, film, and broadcasting. Firms that considered AI and did not adopt it point to missing expertise, legal uncertainty, and data protection rather than to a tool that is not useful. The theory developed here explains why such complements govern assimilation and why near-free acquisition can let adoption statistics run ahead of any change in work. In macroeconomic terms, general-purpose technologies, task-based labor demand, bottleneck tasks, and attrition-based adjustment together imply that effects reach hiring and employment with a lag and unevenly across occupations. The empirical lesson is equally important. So far, occupation-level hiring data show no labor-market effect that can be attributed to generative visual AI: the exposure gradients are small, imprecise, and cannot be told apart from the trend that preceded the technology. That is not evidence of no effect, because these designs could not have detected complete assimilation at platform-sized effects and cannot tell whether acquisition has been assimilated. Answering the question requires linking firms’ use, their complementary assets, and their hiring, and this paper specifies what that evidence would have to show.</w:t>
       </w:r>
     </w:p>
-    <w:bookmarkEnd w:id="55"/>
-    <w:bookmarkStart w:id="56" w:name="data-code-and-use-of-generative-ai"/>
+    <w:bookmarkEnd w:id="56"/>
+    <w:bookmarkStart w:id="57" w:name="data-code-and-use-of-generative-ai"/>
     <w:p>
       <w:pPr>
         <w:pStyle w:val="Heading2"/>
@@ -12743,11 +12922,11 @@
         <w:rPr>
           <w:rFonts w:ascii="Times New Roman" w:hAnsi="Times New Roman" w:eastAsia="Times New Roman" w:cs="Times New Roman"/>
         </w:rPr>
-        <w:t xml:space="preserve">All data are public (Eurostat, Statistics Canada, O*NET, Indeed Hiring Lab). Code, prompts, and the language-model task scores required to reproduce Tables 4 and 5 and the analyses in Sections 7.1 and 7.4 are available in an anonymized replication repository. Large language models (Claude Haiku 5.5, with GPT-5.6 Luna as a second scorer) were used as measurement instruments to code O*NET task statements and NOC main-duty statements. A generative AI assistant was used to help write analysis code and to draft and edit the manuscript. The authors reviewed all results, text, and code and take responsibility for the content.</w:t>
+        <w:t xml:space="preserve">All data are public (Eurostat, Statistics Canada, O*NET, Indeed Hiring Lab, Web Data Commons). Code, prompts, and the language-model task scores required to reproduce Tables 4 and 5 and the analyses in Sections 7.1 and 7.4 are available in an anonymized replication repository. Large language models (Claude Haiku 5.5, with GPT-5.6 Luna as a second scorer) were used as measurement instruments to code O*NET task statements and NOC main-duty statements, and Claude Haiku 5.5 to classify job-posting titles and the treatment of generative AI in posting text. A generative AI assistant was used to help write analysis code and to draft and edit the manuscript. The authors reviewed all results, text, and code and take responsibility for the content.</w:t>
       </w:r>
     </w:p>
-    <w:bookmarkEnd w:id="56"/>
-    <w:bookmarkStart w:id="57" w:name="appendix-a.-rubrics"/>
+    <w:bookmarkEnd w:id="57"/>
+    <w:bookmarkStart w:id="58" w:name="appendix-a.-rubrics"/>
     <w:p>
       <w:pPr>
         <w:pStyle w:val="Heading2"/>
@@ -12815,8 +12994,8 @@
         <w:t xml:space="preserve">Score 2 if reading, writing, summarizing, translating, or otherwise producing or editing text is central to the task; 1 if text is a partial or supporting product; 0 otherwise. Spoken conversation, numeric calculation, and purely physical work do not count. Both rubrics were applied in a single prompt, in batches of 20 statements, at temperature zero; the prompt is in the replication repository.</w:t>
       </w:r>
     </w:p>
-    <w:bookmarkEnd w:id="57"/>
-    <w:bookmarkStart w:id="58" w:name="X8a54bc2e205ec9edb9f5805e6d8d6bb56135511"/>
+    <w:bookmarkEnd w:id="58"/>
+    <w:bookmarkStart w:id="59" w:name="X8a54bc2e205ec9edb9f5805e6d8d6bb56135511"/>
     <w:p>
       <w:pPr>
         <w:pStyle w:val="Heading2"/>
@@ -14200,8 +14379,8 @@
         <w:t xml:space="preserve">, further below the 2024 minimum detectable effect of 0.050. Noise of this classical kind strengthens the conclusion that the design cannot detect complete assimilation. It does not license any substantive reading of the observed gradients, and if the error in the language-model score is correlated with exposure to language models, the direction of the bias is ambiguous.</w:t>
       </w:r>
     </w:p>
-    <w:bookmarkEnd w:id="58"/>
-    <w:bookmarkStart w:id="59" w:name="appendix-c.-derivations-for-section-3"/>
+    <w:bookmarkEnd w:id="59"/>
+    <w:bookmarkStart w:id="60" w:name="appendix-c.-derivations-for-section-3"/>
     <w:p>
       <w:pPr>
         <w:pStyle w:val="Heading2"/>
@@ -16170,8 +16349,8 @@
         <w:t xml:space="preserve">. The upper bound in part (i) holds when hiring is adjusted smoothly as in equation (4); a temporary hiring freeze could produce a larger transitory fall in adverts.</w:t>
       </w:r>
     </w:p>
-    <w:bookmarkEnd w:id="59"/>
-    <w:bookmarkStart w:id="60" w:name="references"/>
+    <w:bookmarkEnd w:id="60"/>
+    <w:bookmarkStart w:id="61" w:name="references"/>
     <w:p>
       <w:pPr>
         <w:pStyle w:val="Heading2"/>
@@ -17382,7 +17561,7 @@
         <w:rPr>
           <w:rFonts w:ascii="Times New Roman" w:hAnsi="Times New Roman" w:eastAsia="Times New Roman" w:cs="Times New Roman"/>
         </w:rPr>
-        <w:t xml:space="preserve">Webb, M. (2020).</w:t>
+        <w:t xml:space="preserve">Web Data Commons. (2024).</w:t>
       </w:r>
       <w:r>
         <w:rPr>
@@ -17396,19 +17575,19 @@
           <w:rFonts w:ascii="Times New Roman" w:hAnsi="Times New Roman" w:eastAsia="Times New Roman" w:cs="Times New Roman"/>
           <w:i/>
         </w:rPr>
-        <w:t xml:space="preserve">The impact of artificial intelligence on the labor market</w:t>
-      </w:r>
-      <w:r>
-        <w:rPr>
-          <w:rFonts w:ascii="Times New Roman" w:hAnsi="Times New Roman" w:eastAsia="Times New Roman" w:cs="Times New Roman"/>
-        </w:rPr>
-        <w:t xml:space="preserve"> </w:t>
-      </w:r>
-      <w:r>
-        <w:rPr>
-          <w:rFonts w:ascii="Times New Roman" w:hAnsi="Times New Roman" w:eastAsia="Times New Roman" w:cs="Times New Roman"/>
-        </w:rPr>
-        <w:t xml:space="preserve">[Working paper]. SSRN. https://ssrn.com/abstract=3482150</w:t>
+        <w:t xml:space="preserve">Schema.org JobPosting class-specific subsets, crawls 2022-12, 2023-12, and 2024-12</w:t>
+      </w:r>
+      <w:r>
+        <w:rPr>
+          <w:rFonts w:ascii="Times New Roman" w:hAnsi="Times New Roman" w:eastAsia="Times New Roman" w:cs="Times New Roman"/>
+        </w:rPr>
+        <w:t xml:space="preserve"> </w:t>
+      </w:r>
+      <w:r>
+        <w:rPr>
+          <w:rFonts w:ascii="Times New Roman" w:hAnsi="Times New Roman" w:eastAsia="Times New Roman" w:cs="Times New Roman"/>
+        </w:rPr>
+        <w:t xml:space="preserve">[Data sets]. University of Mannheim. https://webdatacommons.org/structureddata/</w:t>
       </w:r>
     </w:p>
     <w:p>
@@ -17422,7 +17601,7 @@
         <w:rPr>
           <w:rFonts w:ascii="Times New Roman" w:hAnsi="Times New Roman" w:eastAsia="Times New Roman" w:cs="Times New Roman"/>
         </w:rPr>
-        <w:t xml:space="preserve">Zhou, E., &amp; Lee, D. (2024). Generative artificial intelligence, human creativity, and art.</w:t>
+        <w:t xml:space="preserve">Webb, M. (2020).</w:t>
       </w:r>
       <w:r>
         <w:rPr>
@@ -17436,13 +17615,19 @@
           <w:rFonts w:ascii="Times New Roman" w:hAnsi="Times New Roman" w:eastAsia="Times New Roman" w:cs="Times New Roman"/>
           <w:i/>
         </w:rPr>
-        <w:t xml:space="preserve">PNAS Nexus, 3</w:t>
-      </w:r>
-      <w:r>
-        <w:rPr>
-          <w:rFonts w:ascii="Times New Roman" w:hAnsi="Times New Roman" w:eastAsia="Times New Roman" w:cs="Times New Roman"/>
-        </w:rPr>
-        <w:t xml:space="preserve">(3), Article pgae052.</w:t>
+        <w:t xml:space="preserve">The impact of artificial intelligence on the labor market</w:t>
+      </w:r>
+      <w:r>
+        <w:rPr>
+          <w:rFonts w:ascii="Times New Roman" w:hAnsi="Times New Roman" w:eastAsia="Times New Roman" w:cs="Times New Roman"/>
+        </w:rPr>
+        <w:t xml:space="preserve"> </w:t>
+      </w:r>
+      <w:r>
+        <w:rPr>
+          <w:rFonts w:ascii="Times New Roman" w:hAnsi="Times New Roman" w:eastAsia="Times New Roman" w:cs="Times New Roman"/>
+        </w:rPr>
+        <w:t xml:space="preserve">[Working paper]. SSRN. https://ssrn.com/abstract=3482150</w:t>
       </w:r>
     </w:p>
     <w:p>
@@ -17456,6 +17641,40 @@
         <w:rPr>
           <w:rFonts w:ascii="Times New Roman" w:hAnsi="Times New Roman" w:eastAsia="Times New Roman" w:cs="Times New Roman"/>
         </w:rPr>
+        <w:t xml:space="preserve">Zhou, E., &amp; Lee, D. (2024). Generative artificial intelligence, human creativity, and art.</w:t>
+      </w:r>
+      <w:r>
+        <w:rPr>
+          <w:rFonts w:ascii="Times New Roman" w:hAnsi="Times New Roman" w:eastAsia="Times New Roman" w:cs="Times New Roman"/>
+        </w:rPr>
+        <w:t xml:space="preserve"> </w:t>
+      </w:r>
+      <w:r>
+        <w:rPr>
+          <w:iCs/>
+          <w:rFonts w:ascii="Times New Roman" w:hAnsi="Times New Roman" w:eastAsia="Times New Roman" w:cs="Times New Roman"/>
+          <w:i/>
+        </w:rPr>
+        <w:t xml:space="preserve">PNAS Nexus, 3</w:t>
+      </w:r>
+      <w:r>
+        <w:rPr>
+          <w:rFonts w:ascii="Times New Roman" w:hAnsi="Times New Roman" w:eastAsia="Times New Roman" w:cs="Times New Roman"/>
+        </w:rPr>
+        <w:t xml:space="preserve">(3), Article pgae052.</w:t>
+      </w:r>
+    </w:p>
+    <w:p>
+      <w:pPr>
+        <w:pStyle w:val="BodyText"/>
+        <w:spacing w:line="480" w:lineRule="auto" w:after="0" w:before="0"/>
+        <w:ind w:firstLine="720"/>
+        <w:jc w:val="left"/>
+      </w:pPr>
+      <w:r>
+        <w:rPr>
+          <w:rFonts w:ascii="Times New Roman" w:hAnsi="Times New Roman" w:eastAsia="Times New Roman" w:cs="Times New Roman"/>
+        </w:rPr>
         <w:t xml:space="preserve">Zhu, K., &amp; Kraemer, K. L. (2005). Post-adoption variations in usage and value of e-business by organizations: Cross-country evidence from the retail industry.</w:t>
       </w:r>
       <w:r>
@@ -17479,7 +17698,7 @@
         <w:t xml:space="preserve">(1), 61–84.</w:t>
       </w:r>
     </w:p>
-    <w:bookmarkEnd w:id="60"/>
+    <w:bookmarkEnd w:id="61"/>
     <w:sectPr>
       <w:footerReference w:type="default" r:id="rId9"/>
       <w:pgMar w:left="1440" w:right="1440" w:top="1440" w:bottom="1440"/>

</xml_diff>

<commit_message>
Narrow Section 10.1 claim, add Humlum & Vestergaard to Section 9, extend published-study audit to nine studies
Co-Authored-By: Claude Sonnet 5.5 <noreply@anthropic.com>
Claude-Session: https://claude.ai/code/session_015MZUD2DotEDYTGGfpD8taa
</commit_message>
<xml_diff>
--- a/revision/Acquired_Not_Yet_Assimilated_ISR_revised.docx
+++ b/revision/Acquired_Not_Yet_Assimilated_ISR_revised.docx
@@ -388,7 +388,7 @@
         <w:rPr>
           <w:rFonts w:ascii="Times New Roman" w:hAnsi="Times New Roman" w:eastAsia="Times New Roman" w:cs="Times New Roman"/>
         </w:rPr>
-        <w:t xml:space="preserve">We provide a detectability bound that changes how the large and growing literature on AI exposure and hiring should be read. At current acquisition rates and at the substitution effects estimated on platforms, where assimilation is comparatively frictionless, complete assimilation of visual tasks would lower adverts in the most exposed occupations by roughly 2 to 17 percent. Standard European and Canadian occupation-level designs cannot detect effects of that size. The small gradients they do report cannot be told apart from an extrapolation of the pre-2022 trend and are therefore uninformative about assimilation. The bound is simple enough to be reported next to any exposure coefficient, and doing so guards against both false alarms and false reassurance.</w:t>
+        <w:t xml:space="preserve">We provide a detectability bound that changes how an important part of the literature on AI exposure and hiring should be read. At current acquisition rates and at the substitution effects estimated on platforms, where assimilation is comparatively frictionless, complete assimilation of visual tasks would lower adverts in the most exposed occupations by roughly 2 to 17 percent. Standard European and Canadian occupation-level designs cannot detect effects of that size. The small gradients they do report cannot be told apart from an extrapolation of the pre-2022 trend and are therefore uninformative about assimilation. The bound is simple enough to be reported next to any exposure coefficient, and doing so guards against both false alarms and false reassurance.</w:t>
       </w:r>
     </w:p>
     <w:p>
@@ -523,7 +523,7 @@
         <w:rPr>
           <w:rFonts w:ascii="Times New Roman" w:hAnsi="Times New Roman" w:eastAsia="Times New Roman" w:cs="Times New Roman"/>
         </w:rPr>
-        <w:t xml:space="preserve">A large literature maps AI capabilities onto occupational tasks (Eloundou et al., 2023; Felten et al., 2021; Webb, 2020). Exposure measures describe where a technology could matter, not where it has been acquired or assimilated. Task-based models separate the displacement, reinstatement, and productivity effects of automation (Acemoglu &amp; Restrepo, 2018, 2019), and models of unbalanced growth show that tasks which cannot be automated become bottlenecks (Aghion et al., 2019; Baumol, 1967); we use both ideas in Section 3. Establishments exposed to AI change their hiring, but little aggregate effect is detectable at the occupation or industry level (Acemoglu et al., 2022). Evidence from online labor markets is sharper. Freelancers exposed to ChatGPT and image generators lost employment and earnings (Hui et al., 2024), and image-creation posts fell by about 17 percent after image generators were released, relative to manual-intensive jobs (Demirci et al., 2025). On creator platforms, generative tools raise output for some artists and reallocate demand across creator types (Kim et al., 2026; Zhou &amp; Lee, 2024), and inside firms they raise individual productivity on suitable tasks (Brynjolfsson et al., 2025). These settings share a feature that our theory makes explicit: the buyer of a freelance task, or a worker inside a studied team, can switch to the tool without the firm first building a review routine or a compliance policy. We use the platform estimates as a reference for how large substitution can be once assimilation has occurred, not as a test of our account.</w:t>
+        <w:t xml:space="preserve">A large literature maps AI capabilities onto occupational tasks (Eloundou et al., 2023; Felten et al., 2021; Webb, 2020). Exposure measures describe where a technology could matter, not where it has been acquired or assimilated. Task-based models separate the displacement, reinstatement, and productivity effects of automation (Acemoglu &amp; Restrepo, 2018, 2019), and models of unbalanced growth show that tasks which cannot be automated become bottlenecks (Aghion et al., 2019; Baumol, 1967); we use both ideas in Section 3. Establishments exposed to AI change their hiring, but little aggregate effect is detectable at the occupation or industry level (Acemoglu et al., 2022). Danish registers linked to adoption surveys show precise zeros for adopters’ earnings and hours (Humlum &amp; Vestergaard, 2025). Evidence from online labor markets is sharper. Freelancers exposed to ChatGPT and image generators lost employment and earnings (Hui et al., 2024), and image-creation posts fell by about 17 percent after image generators were released, relative to manual-intensive jobs (Demirci et al., 2025). On creator platforms, generative tools raise output for some artists and reallocate demand across creator types (Kim et al., 2026; Zhou &amp; Lee, 2024), and inside firms they raise individual productivity on suitable tasks (Brynjolfsson et al., 2025). These settings share a feature that our theory makes explicit: the buyer of a freelance task, or a worker inside a studied team, can switch to the tool without the firm first building a review routine or a compliance policy. We use the platform estimates as a reference for how large substitution can be once assimilation has occurred, not as a test of our account.</w:t>
       </w:r>
     </w:p>
     <w:p>
@@ -6156,7 +6156,45 @@
         <w:rPr>
           <w:rFonts w:ascii="Times New Roman" w:hAnsi="Times New Roman" w:eastAsia="Times New Roman" w:cs="Times New Roman"/>
         </w:rPr>
-        <w:t xml:space="preserve">. Because standing occupations may adjust differently, we also consider</w:t>
+        <w:t xml:space="preserve">. Other platform estimates are smaller: Hui et al. (2024) find 2 percent fewer jobs and 5.2 percent lower earnings for freelancers in affected occupations, so</w:t>
+      </w:r>
+      <w:r>
+        <w:rPr>
+          <w:rFonts w:ascii="Times New Roman" w:hAnsi="Times New Roman" w:eastAsia="Times New Roman" w:cs="Times New Roman"/>
+        </w:rPr>
+        <w:t xml:space="preserve"> </w:t>
+      </w:r>
+      <m:oMath>
+        <m:r>
+          <m:t>β</m:t>
+        </m:r>
+        <m:r>
+          <m:rPr>
+            <m:sty m:val="p"/>
+          </m:rPr>
+          <m:t>=</m:t>
+        </m:r>
+        <m:r>
+          <m:rPr>
+            <m:sty m:val="p"/>
+          </m:rPr>
+          <m:t>−</m:t>
+        </m:r>
+        <m:r>
+          <m:t>0.19</m:t>
+        </m:r>
+      </m:oMath>
+      <w:r>
+        <w:rPr>
+          <w:rFonts w:ascii="Times New Roman" w:hAnsi="Times New Roman" w:eastAsia="Times New Roman" w:cs="Times New Roman"/>
+        </w:rPr>
+        <w:t xml:space="preserve"> </w:t>
+      </w:r>
+      <w:r>
+        <w:rPr>
+          <w:rFonts w:ascii="Times New Roman" w:hAnsi="Times New Roman" w:eastAsia="Times New Roman" w:cs="Times New Roman"/>
+        </w:rPr>
+        <w:t xml:space="preserve">favors detection. Because standing occupations may adjust differently, we also consider</w:t>
       </w:r>
       <w:r>
         <w:rPr>
@@ -12668,6 +12706,20 @@
         <w:rPr>
           <w:rFonts w:ascii="Times New Roman" w:hAnsi="Times New Roman" w:eastAsia="Times New Roman" w:cs="Times New Roman"/>
         </w:rPr>
+        <w:t xml:space="preserve">The closest existing evidence comes from Denmark. Humlum and Vestergaard (2025) link representative surveys on chatbot use, employer policies, and reported time savings to administrative earnings and hours. They find that most employers encourage use and run training, that these employer investments raise adoption and perceived benefits, and that adopters’ earnings and hours show precise zeros, with confidence intervals ruling out effects larger than 1 percent, alongside average reported time savings of about 3 percent. Their design supplies what our theory calls complements (employer encouragement and training) and a measure of use. Its outcomes are the earnings and hours of adopters, not task reassignment and hiring in visual occupations, and the data are not public.</w:t>
+      </w:r>
+    </w:p>
+    <w:p>
+      <w:pPr>
+        <w:pStyle w:val="BodyText"/>
+        <w:spacing w:line="480" w:lineRule="auto" w:after="0" w:before="0"/>
+        <w:ind w:firstLine="720"/>
+        <w:jc w:val="left"/>
+      </w:pPr>
+      <w:r>
+        <w:rPr>
+          <w:rFonts w:ascii="Times New Roman" w:hAnsi="Times New Roman" w:eastAsia="Times New Roman" w:cs="Times New Roman"/>
+        </w:rPr>
         <w:t xml:space="preserve">The predictions are specific. Under the assimilation gap, task reassignment among users is low on average and rises with expertise, review capacity, and compliance procedures, and hiring for visual occupations falls, if at all, only among users with high asset stocks. Under complete assimilation with net substitution, users cut visual hiring relative to non-users regardless of asset stocks. Under offsetting scale effects, users reassign tasks but their visual hiring does not fall, and their job adverts shift toward direction, selection, and review. Under capability failure, users do not reassign tasks even when assets are present. Each prediction can be falsified by a single well-measured comparison, and the asset measures make the test one of mechanism rather than of association between use and hiring.</w:t>
       </w:r>
     </w:p>
@@ -12721,7 +12773,7 @@
         <w:rPr>
           <w:rFonts w:ascii="Times New Roman" w:hAnsi="Times New Roman" w:eastAsia="Times New Roman" w:cs="Times New Roman"/>
         </w:rPr>
-        <w:t xml:space="preserve">The paper also offers a methodological caution for a fast-growing literature. Exposure-based hiring designs are widely used to study generative AI, and their estimates are often read as early effects of the technology. The detectability bound shows that, for standing occupations and at current acquisition rates, these designs cannot detect plausible assimilation effects of the size observed on platforms, and that the gradients they do detect cannot be told apart from a trend that preceded the technology. A null or small coefficient in these designs is therefore uninformative about assimilation. The bound is simple enough to be reported alongside any such estimate, and doing so would prevent both false alarms and false reassurance. In this sense, the contribution is not a claim that generative visual AI has no labor-market effects, but a demonstration that occupation-level evidence of the kind currently available cannot yet reveal those effects.</w:t>
+        <w:t xml:space="preserve">The paper also offers a methodological caution for a fast-growing literature. Exposure-based hiring designs are widely used to study generative AI, and their estimates are often read as early effects of the technology. The detectability bound shows that designs which relate occupation- or industry-level outcomes to exposure, with a limited number of units, cannot detect plausible assimilation effects of the size observed on platforms at current acquisition rates, and that the gradients they detect cannot be told apart from a trend that preceded the technology. Our European and Canadian estimates fall in this class, and so do the occupation-level estimates of Acemoglu et al. (2022), Albanesi et al. (2025) for 16 European countries, and Georgieff and Hyee (2022) for 23 OECD countries, whose standard errors imply minimum detectable effects of about 6 to 14 log points per standard deviation of exposure. The conclusion does not extend to every exposure design. Designs that use microdata, such as worker-level registers (Gathmann et al., 2024) or firm-by-occupation panels with observed AI use (Hampole et al., 2025), have minimum detectable effects of roughly one to three percent per standard deviation, and designs that observe adoption directly can rule out effects of the size seen on platforms (Humlum &amp; Vestergaard, 2025). For the first class a null or small coefficient is uninformative about assimilation; for the second it is informative. The bound tells the two apart, is simple enough to be reported alongside any exposure estimate, and doing so would prevent both false alarms and false reassurance. In this sense, the contribution is not a claim that generative visual AI has no labor-market effects, but a demonstration that occupation-level evidence of the kind currently available cannot yet reveal those effects.</w:t>
       </w:r>
     </w:p>
     <w:p>
@@ -16543,7 +16595,7 @@
         <w:rPr>
           <w:rFonts w:ascii="Times New Roman" w:hAnsi="Times New Roman" w:eastAsia="Times New Roman" w:cs="Times New Roman"/>
         </w:rPr>
-        <w:t xml:space="preserve">Aral, S., &amp; Weill, P. (2007). IT assets, organizational capabilities, and firm performance: How resource allocations and organizational differences explain performance variation.</w:t>
+        <w:t xml:space="preserve">Albanesi, S., Dias da Silva, A., Jimeno, J. F., Lamo, A., &amp; Wabitsch, A. (2025). New technologies and jobs in Europe.</w:t>
       </w:r>
       <w:r>
         <w:rPr>
@@ -16557,13 +16609,13 @@
           <w:rFonts w:ascii="Times New Roman" w:hAnsi="Times New Roman" w:eastAsia="Times New Roman" w:cs="Times New Roman"/>
           <w:i/>
         </w:rPr>
-        <w:t xml:space="preserve">Organization Science, 18</w:t>
-      </w:r>
-      <w:r>
-        <w:rPr>
-          <w:rFonts w:ascii="Times New Roman" w:hAnsi="Times New Roman" w:eastAsia="Times New Roman" w:cs="Times New Roman"/>
-        </w:rPr>
-        <w:t xml:space="preserve">(5), 763–780.</w:t>
+        <w:t xml:space="preserve">Economic Policy, 40</w:t>
+      </w:r>
+      <w:r>
+        <w:rPr>
+          <w:rFonts w:ascii="Times New Roman" w:hAnsi="Times New Roman" w:eastAsia="Times New Roman" w:cs="Times New Roman"/>
+        </w:rPr>
+        <w:t xml:space="preserve">(121), 71–139.</w:t>
       </w:r>
     </w:p>
     <w:p>
@@ -16577,7 +16629,7 @@
         <w:rPr>
           <w:rFonts w:ascii="Times New Roman" w:hAnsi="Times New Roman" w:eastAsia="Times New Roman" w:cs="Times New Roman"/>
         </w:rPr>
-        <w:t xml:space="preserve">Attewell, P. (1992). Technology diffusion and organizational learning: The case of business computing.</w:t>
+        <w:t xml:space="preserve">Aral, S., &amp; Weill, P. (2007). IT assets, organizational capabilities, and firm performance: How resource allocations and organizational differences explain performance variation.</w:t>
       </w:r>
       <w:r>
         <w:rPr>
@@ -16591,13 +16643,13 @@
           <w:rFonts w:ascii="Times New Roman" w:hAnsi="Times New Roman" w:eastAsia="Times New Roman" w:cs="Times New Roman"/>
           <w:i/>
         </w:rPr>
-        <w:t xml:space="preserve">Organization Science, 3</w:t>
-      </w:r>
-      <w:r>
-        <w:rPr>
-          <w:rFonts w:ascii="Times New Roman" w:hAnsi="Times New Roman" w:eastAsia="Times New Roman" w:cs="Times New Roman"/>
-        </w:rPr>
-        <w:t xml:space="preserve">(1), 1–19.</w:t>
+        <w:t xml:space="preserve">Organization Science, 18</w:t>
+      </w:r>
+      <w:r>
+        <w:rPr>
+          <w:rFonts w:ascii="Times New Roman" w:hAnsi="Times New Roman" w:eastAsia="Times New Roman" w:cs="Times New Roman"/>
+        </w:rPr>
+        <w:t xml:space="preserve">(5), 763–780.</w:t>
       </w:r>
     </w:p>
     <w:p>
@@ -16611,7 +16663,7 @@
         <w:rPr>
           <w:rFonts w:ascii="Times New Roman" w:hAnsi="Times New Roman" w:eastAsia="Times New Roman" w:cs="Times New Roman"/>
         </w:rPr>
-        <w:t xml:space="preserve">Babina, T., Fedyk, A., He, A., &amp; Hodson, J. (2024). Artificial intelligence, firm growth, and product innovation.</w:t>
+        <w:t xml:space="preserve">Attewell, P. (1992). Technology diffusion and organizational learning: The case of business computing.</w:t>
       </w:r>
       <w:r>
         <w:rPr>
@@ -16625,13 +16677,13 @@
           <w:rFonts w:ascii="Times New Roman" w:hAnsi="Times New Roman" w:eastAsia="Times New Roman" w:cs="Times New Roman"/>
           <w:i/>
         </w:rPr>
-        <w:t xml:space="preserve">Journal of Financial Economics, 151</w:t>
-      </w:r>
-      <w:r>
-        <w:rPr>
-          <w:rFonts w:ascii="Times New Roman" w:hAnsi="Times New Roman" w:eastAsia="Times New Roman" w:cs="Times New Roman"/>
-        </w:rPr>
-        <w:t xml:space="preserve">, 103745.</w:t>
+        <w:t xml:space="preserve">Organization Science, 3</w:t>
+      </w:r>
+      <w:r>
+        <w:rPr>
+          <w:rFonts w:ascii="Times New Roman" w:hAnsi="Times New Roman" w:eastAsia="Times New Roman" w:cs="Times New Roman"/>
+        </w:rPr>
+        <w:t xml:space="preserve">(1), 1–19.</w:t>
       </w:r>
     </w:p>
     <w:p>
@@ -16645,7 +16697,7 @@
         <w:rPr>
           <w:rFonts w:ascii="Times New Roman" w:hAnsi="Times New Roman" w:eastAsia="Times New Roman" w:cs="Times New Roman"/>
         </w:rPr>
-        <w:t xml:space="preserve">Baumol, W. J. (1967). Macroeconomics of unbalanced growth: The anatomy of urban crisis.</w:t>
+        <w:t xml:space="preserve">Babina, T., Fedyk, A., He, A., &amp; Hodson, J. (2024). Artificial intelligence, firm growth, and product innovation.</w:t>
       </w:r>
       <w:r>
         <w:rPr>
@@ -16659,13 +16711,13 @@
           <w:rFonts w:ascii="Times New Roman" w:hAnsi="Times New Roman" w:eastAsia="Times New Roman" w:cs="Times New Roman"/>
           <w:i/>
         </w:rPr>
-        <w:t xml:space="preserve">American Economic Review, 57</w:t>
-      </w:r>
-      <w:r>
-        <w:rPr>
-          <w:rFonts w:ascii="Times New Roman" w:hAnsi="Times New Roman" w:eastAsia="Times New Roman" w:cs="Times New Roman"/>
-        </w:rPr>
-        <w:t xml:space="preserve">(3), 415–426.</w:t>
+        <w:t xml:space="preserve">Journal of Financial Economics, 151</w:t>
+      </w:r>
+      <w:r>
+        <w:rPr>
+          <w:rFonts w:ascii="Times New Roman" w:hAnsi="Times New Roman" w:eastAsia="Times New Roman" w:cs="Times New Roman"/>
+        </w:rPr>
+        <w:t xml:space="preserve">, 103745.</w:t>
       </w:r>
     </w:p>
     <w:p>
@@ -16679,7 +16731,7 @@
         <w:rPr>
           <w:rFonts w:ascii="Times New Roman" w:hAnsi="Times New Roman" w:eastAsia="Times New Roman" w:cs="Times New Roman"/>
         </w:rPr>
-        <w:t xml:space="preserve">Berente, N., Gu, B., Recker, J., &amp; Santhanam, R. (2021). Managing artificial intelligence.</w:t>
+        <w:t xml:space="preserve">Baumol, W. J. (1967). Macroeconomics of unbalanced growth: The anatomy of urban crisis.</w:t>
       </w:r>
       <w:r>
         <w:rPr>
@@ -16693,13 +16745,13 @@
           <w:rFonts w:ascii="Times New Roman" w:hAnsi="Times New Roman" w:eastAsia="Times New Roman" w:cs="Times New Roman"/>
           <w:i/>
         </w:rPr>
-        <w:t xml:space="preserve">MIS Quarterly, 45</w:t>
-      </w:r>
-      <w:r>
-        <w:rPr>
-          <w:rFonts w:ascii="Times New Roman" w:hAnsi="Times New Roman" w:eastAsia="Times New Roman" w:cs="Times New Roman"/>
-        </w:rPr>
-        <w:t xml:space="preserve">(3), 1433–1450.</w:t>
+        <w:t xml:space="preserve">American Economic Review, 57</w:t>
+      </w:r>
+      <w:r>
+        <w:rPr>
+          <w:rFonts w:ascii="Times New Roman" w:hAnsi="Times New Roman" w:eastAsia="Times New Roman" w:cs="Times New Roman"/>
+        </w:rPr>
+        <w:t xml:space="preserve">(3), 415–426.</w:t>
       </w:r>
     </w:p>
     <w:p>
@@ -16713,37 +16765,7 @@
         <w:rPr>
           <w:rFonts w:ascii="Times New Roman" w:hAnsi="Times New Roman" w:eastAsia="Times New Roman" w:cs="Times New Roman"/>
         </w:rPr>
-        <w:t xml:space="preserve">Bresnahan, T. F., &amp; Trajtenberg, M. (1995). General purpose technologies:</w:t>
-      </w:r>
-      <w:r>
-        <w:rPr>
-          <w:rFonts w:ascii="Times New Roman" w:hAnsi="Times New Roman" w:eastAsia="Times New Roman" w:cs="Times New Roman"/>
-        </w:rPr>
-        <w:t xml:space="preserve"> </w:t>
-      </w:r>
-      <w:r>
-        <w:rPr>
-          <w:rFonts w:ascii="Times New Roman" w:hAnsi="Times New Roman" w:eastAsia="Times New Roman" w:cs="Times New Roman"/>
-        </w:rPr>
-        <w:t xml:space="preserve">“</w:t>
-      </w:r>
-      <w:r>
-        <w:rPr>
-          <w:rFonts w:ascii="Times New Roman" w:hAnsi="Times New Roman" w:eastAsia="Times New Roman" w:cs="Times New Roman"/>
-        </w:rPr>
-        <w:t xml:space="preserve">Engines of growth</w:t>
-      </w:r>
-      <w:r>
-        <w:rPr>
-          <w:rFonts w:ascii="Times New Roman" w:hAnsi="Times New Roman" w:eastAsia="Times New Roman" w:cs="Times New Roman"/>
-        </w:rPr>
-        <w:t xml:space="preserve">”</w:t>
-      </w:r>
-      <w:r>
-        <w:rPr>
-          <w:rFonts w:ascii="Times New Roman" w:hAnsi="Times New Roman" w:eastAsia="Times New Roman" w:cs="Times New Roman"/>
-        </w:rPr>
-        <w:t xml:space="preserve">?</w:t>
+        <w:t xml:space="preserve">Berente, N., Gu, B., Recker, J., &amp; Santhanam, R. (2021). Managing artificial intelligence.</w:t>
       </w:r>
       <w:r>
         <w:rPr>
@@ -16757,13 +16779,13 @@
           <w:rFonts w:ascii="Times New Roman" w:hAnsi="Times New Roman" w:eastAsia="Times New Roman" w:cs="Times New Roman"/>
           <w:i/>
         </w:rPr>
-        <w:t xml:space="preserve">Journal of Econometrics, 65</w:t>
-      </w:r>
-      <w:r>
-        <w:rPr>
-          <w:rFonts w:ascii="Times New Roman" w:hAnsi="Times New Roman" w:eastAsia="Times New Roman" w:cs="Times New Roman"/>
-        </w:rPr>
-        <w:t xml:space="preserve">(1), 83–108.</w:t>
+        <w:t xml:space="preserve">MIS Quarterly, 45</w:t>
+      </w:r>
+      <w:r>
+        <w:rPr>
+          <w:rFonts w:ascii="Times New Roman" w:hAnsi="Times New Roman" w:eastAsia="Times New Roman" w:cs="Times New Roman"/>
+        </w:rPr>
+        <w:t xml:space="preserve">(3), 1433–1450.</w:t>
       </w:r>
     </w:p>
     <w:p>
@@ -16777,7 +16799,37 @@
         <w:rPr>
           <w:rFonts w:ascii="Times New Roman" w:hAnsi="Times New Roman" w:eastAsia="Times New Roman" w:cs="Times New Roman"/>
         </w:rPr>
-        <w:t xml:space="preserve">Brynjolfsson, E., &amp; Hitt, L. M. (2000). Beyond computation: Information technology, organizational transformation and business performance.</w:t>
+        <w:t xml:space="preserve">Bresnahan, T. F., &amp; Trajtenberg, M. (1995). General purpose technologies:</w:t>
+      </w:r>
+      <w:r>
+        <w:rPr>
+          <w:rFonts w:ascii="Times New Roman" w:hAnsi="Times New Roman" w:eastAsia="Times New Roman" w:cs="Times New Roman"/>
+        </w:rPr>
+        <w:t xml:space="preserve"> </w:t>
+      </w:r>
+      <w:r>
+        <w:rPr>
+          <w:rFonts w:ascii="Times New Roman" w:hAnsi="Times New Roman" w:eastAsia="Times New Roman" w:cs="Times New Roman"/>
+        </w:rPr>
+        <w:t xml:space="preserve">“</w:t>
+      </w:r>
+      <w:r>
+        <w:rPr>
+          <w:rFonts w:ascii="Times New Roman" w:hAnsi="Times New Roman" w:eastAsia="Times New Roman" w:cs="Times New Roman"/>
+        </w:rPr>
+        <w:t xml:space="preserve">Engines of growth</w:t>
+      </w:r>
+      <w:r>
+        <w:rPr>
+          <w:rFonts w:ascii="Times New Roman" w:hAnsi="Times New Roman" w:eastAsia="Times New Roman" w:cs="Times New Roman"/>
+        </w:rPr>
+        <w:t xml:space="preserve">”</w:t>
+      </w:r>
+      <w:r>
+        <w:rPr>
+          <w:rFonts w:ascii="Times New Roman" w:hAnsi="Times New Roman" w:eastAsia="Times New Roman" w:cs="Times New Roman"/>
+        </w:rPr>
+        <w:t xml:space="preserve">?</w:t>
       </w:r>
       <w:r>
         <w:rPr>
@@ -16791,13 +16843,13 @@
           <w:rFonts w:ascii="Times New Roman" w:hAnsi="Times New Roman" w:eastAsia="Times New Roman" w:cs="Times New Roman"/>
           <w:i/>
         </w:rPr>
-        <w:t xml:space="preserve">Journal of Economic Perspectives, 14</w:t>
-      </w:r>
-      <w:r>
-        <w:rPr>
-          <w:rFonts w:ascii="Times New Roman" w:hAnsi="Times New Roman" w:eastAsia="Times New Roman" w:cs="Times New Roman"/>
-        </w:rPr>
-        <w:t xml:space="preserve">(4), 23–48.</w:t>
+        <w:t xml:space="preserve">Journal of Econometrics, 65</w:t>
+      </w:r>
+      <w:r>
+        <w:rPr>
+          <w:rFonts w:ascii="Times New Roman" w:hAnsi="Times New Roman" w:eastAsia="Times New Roman" w:cs="Times New Roman"/>
+        </w:rPr>
+        <w:t xml:space="preserve">(1), 83–108.</w:t>
       </w:r>
     </w:p>
     <w:p>
@@ -16811,7 +16863,7 @@
         <w:rPr>
           <w:rFonts w:ascii="Times New Roman" w:hAnsi="Times New Roman" w:eastAsia="Times New Roman" w:cs="Times New Roman"/>
         </w:rPr>
-        <w:t xml:space="preserve">Brynjolfsson, E., Li, D., &amp; Raymond, L. (2025). Generative AI at work.</w:t>
+        <w:t xml:space="preserve">Brynjolfsson, E., &amp; Hitt, L. M. (2000). Beyond computation: Information technology, organizational transformation and business performance.</w:t>
       </w:r>
       <w:r>
         <w:rPr>
@@ -16825,13 +16877,13 @@
           <w:rFonts w:ascii="Times New Roman" w:hAnsi="Times New Roman" w:eastAsia="Times New Roman" w:cs="Times New Roman"/>
           <w:i/>
         </w:rPr>
-        <w:t xml:space="preserve">The Quarterly Journal of Economics, 140</w:t>
-      </w:r>
-      <w:r>
-        <w:rPr>
-          <w:rFonts w:ascii="Times New Roman" w:hAnsi="Times New Roman" w:eastAsia="Times New Roman" w:cs="Times New Roman"/>
-        </w:rPr>
-        <w:t xml:space="preserve">(2), 889–942.</w:t>
+        <w:t xml:space="preserve">Journal of Economic Perspectives, 14</w:t>
+      </w:r>
+      <w:r>
+        <w:rPr>
+          <w:rFonts w:ascii="Times New Roman" w:hAnsi="Times New Roman" w:eastAsia="Times New Roman" w:cs="Times New Roman"/>
+        </w:rPr>
+        <w:t xml:space="preserve">(4), 23–48.</w:t>
       </w:r>
     </w:p>
     <w:p>
@@ -16845,7 +16897,7 @@
         <w:rPr>
           <w:rFonts w:ascii="Times New Roman" w:hAnsi="Times New Roman" w:eastAsia="Times New Roman" w:cs="Times New Roman"/>
         </w:rPr>
-        <w:t xml:space="preserve">Brynjolfsson, E., Rock, D., &amp; Syverson, C. (2021). The productivity J-curve: How intangibles complement general purpose technologies.</w:t>
+        <w:t xml:space="preserve">Brynjolfsson, E., Li, D., &amp; Raymond, L. (2025). Generative AI at work.</w:t>
       </w:r>
       <w:r>
         <w:rPr>
@@ -16859,13 +16911,13 @@
           <w:rFonts w:ascii="Times New Roman" w:hAnsi="Times New Roman" w:eastAsia="Times New Roman" w:cs="Times New Roman"/>
           <w:i/>
         </w:rPr>
-        <w:t xml:space="preserve">American Economic Journal: Macroeconomics, 13</w:t>
-      </w:r>
-      <w:r>
-        <w:rPr>
-          <w:rFonts w:ascii="Times New Roman" w:hAnsi="Times New Roman" w:eastAsia="Times New Roman" w:cs="Times New Roman"/>
-        </w:rPr>
-        <w:t xml:space="preserve">(1), 333–372.</w:t>
+        <w:t xml:space="preserve">The Quarterly Journal of Economics, 140</w:t>
+      </w:r>
+      <w:r>
+        <w:rPr>
+          <w:rFonts w:ascii="Times New Roman" w:hAnsi="Times New Roman" w:eastAsia="Times New Roman" w:cs="Times New Roman"/>
+        </w:rPr>
+        <w:t xml:space="preserve">(2), 889–942.</w:t>
       </w:r>
     </w:p>
     <w:p>
@@ -16879,7 +16931,7 @@
         <w:rPr>
           <w:rFonts w:ascii="Times New Roman" w:hAnsi="Times New Roman" w:eastAsia="Times New Roman" w:cs="Times New Roman"/>
         </w:rPr>
-        <w:t xml:space="preserve">Cooper, R. B., &amp; Zmud, R. W. (1990). Information technology implementation research: A technological diffusion approach.</w:t>
+        <w:t xml:space="preserve">Brynjolfsson, E., Rock, D., &amp; Syverson, C. (2021). The productivity J-curve: How intangibles complement general purpose technologies.</w:t>
       </w:r>
       <w:r>
         <w:rPr>
@@ -16893,13 +16945,13 @@
           <w:rFonts w:ascii="Times New Roman" w:hAnsi="Times New Roman" w:eastAsia="Times New Roman" w:cs="Times New Roman"/>
           <w:i/>
         </w:rPr>
-        <w:t xml:space="preserve">Management Science, 36</w:t>
-      </w:r>
-      <w:r>
-        <w:rPr>
-          <w:rFonts w:ascii="Times New Roman" w:hAnsi="Times New Roman" w:eastAsia="Times New Roman" w:cs="Times New Roman"/>
-        </w:rPr>
-        <w:t xml:space="preserve">(2), 123–139.</w:t>
+        <w:t xml:space="preserve">American Economic Journal: Macroeconomics, 13</w:t>
+      </w:r>
+      <w:r>
+        <w:rPr>
+          <w:rFonts w:ascii="Times New Roman" w:hAnsi="Times New Roman" w:eastAsia="Times New Roman" w:cs="Times New Roman"/>
+        </w:rPr>
+        <w:t xml:space="preserve">(1), 333–372.</w:t>
       </w:r>
     </w:p>
     <w:p>
@@ -16913,7 +16965,7 @@
         <w:rPr>
           <w:rFonts w:ascii="Times New Roman" w:hAnsi="Times New Roman" w:eastAsia="Times New Roman" w:cs="Times New Roman"/>
         </w:rPr>
-        <w:t xml:space="preserve">David, P. A. (1990). The dynamo and the computer: An historical perspective on the modern productivity paradox.</w:t>
+        <w:t xml:space="preserve">Cooper, R. B., &amp; Zmud, R. W. (1990). Information technology implementation research: A technological diffusion approach.</w:t>
       </w:r>
       <w:r>
         <w:rPr>
@@ -16927,13 +16979,13 @@
           <w:rFonts w:ascii="Times New Roman" w:hAnsi="Times New Roman" w:eastAsia="Times New Roman" w:cs="Times New Roman"/>
           <w:i/>
         </w:rPr>
-        <w:t xml:space="preserve">American Economic Review, 80</w:t>
-      </w:r>
-      <w:r>
-        <w:rPr>
-          <w:rFonts w:ascii="Times New Roman" w:hAnsi="Times New Roman" w:eastAsia="Times New Roman" w:cs="Times New Roman"/>
-        </w:rPr>
-        <w:t xml:space="preserve">(2), 355–361.</w:t>
+        <w:t xml:space="preserve">Management Science, 36</w:t>
+      </w:r>
+      <w:r>
+        <w:rPr>
+          <w:rFonts w:ascii="Times New Roman" w:hAnsi="Times New Roman" w:eastAsia="Times New Roman" w:cs="Times New Roman"/>
+        </w:rPr>
+        <w:t xml:space="preserve">(2), 123–139.</w:t>
       </w:r>
     </w:p>
     <w:p>
@@ -16947,7 +16999,7 @@
         <w:rPr>
           <w:rFonts w:ascii="Times New Roman" w:hAnsi="Times New Roman" w:eastAsia="Times New Roman" w:cs="Times New Roman"/>
         </w:rPr>
-        <w:t xml:space="preserve">Demirci, O., Hannane, J., &amp; Zhu, X. (2025). Who is AI replacing? The impact of generative AI on online freelancing platforms.</w:t>
+        <w:t xml:space="preserve">David, P. A. (1990). The dynamo and the computer: An historical perspective on the modern productivity paradox.</w:t>
       </w:r>
       <w:r>
         <w:rPr>
@@ -16961,13 +17013,13 @@
           <w:rFonts w:ascii="Times New Roman" w:hAnsi="Times New Roman" w:eastAsia="Times New Roman" w:cs="Times New Roman"/>
           <w:i/>
         </w:rPr>
-        <w:t xml:space="preserve">Management Science, 71</w:t>
-      </w:r>
-      <w:r>
-        <w:rPr>
-          <w:rFonts w:ascii="Times New Roman" w:hAnsi="Times New Roman" w:eastAsia="Times New Roman" w:cs="Times New Roman"/>
-        </w:rPr>
-        <w:t xml:space="preserve">(10), 8097–8108.</w:t>
+        <w:t xml:space="preserve">American Economic Review, 80</w:t>
+      </w:r>
+      <w:r>
+        <w:rPr>
+          <w:rFonts w:ascii="Times New Roman" w:hAnsi="Times New Roman" w:eastAsia="Times New Roman" w:cs="Times New Roman"/>
+        </w:rPr>
+        <w:t xml:space="preserve">(2), 355–361.</w:t>
       </w:r>
     </w:p>
     <w:p>
@@ -16981,7 +17033,7 @@
         <w:rPr>
           <w:rFonts w:ascii="Times New Roman" w:hAnsi="Times New Roman" w:eastAsia="Times New Roman" w:cs="Times New Roman"/>
         </w:rPr>
-        <w:t xml:space="preserve">Eloundou, T., Manning, S., Mishkin, P., &amp; Rock, D. (2023).</w:t>
+        <w:t xml:space="preserve">Demirci, O., Hannane, J., &amp; Zhu, X. (2025). Who is AI replacing? The impact of generative AI on online freelancing platforms.</w:t>
       </w:r>
       <w:r>
         <w:rPr>
@@ -16995,19 +17047,13 @@
           <w:rFonts w:ascii="Times New Roman" w:hAnsi="Times New Roman" w:eastAsia="Times New Roman" w:cs="Times New Roman"/>
           <w:i/>
         </w:rPr>
-        <w:t xml:space="preserve">GPTs are GPTs: An early look at the labor market impact potential of large language models</w:t>
-      </w:r>
-      <w:r>
-        <w:rPr>
-          <w:rFonts w:ascii="Times New Roman" w:hAnsi="Times New Roman" w:eastAsia="Times New Roman" w:cs="Times New Roman"/>
-        </w:rPr>
-        <w:t xml:space="preserve"> </w:t>
-      </w:r>
-      <w:r>
-        <w:rPr>
-          <w:rFonts w:ascii="Times New Roman" w:hAnsi="Times New Roman" w:eastAsia="Times New Roman" w:cs="Times New Roman"/>
-        </w:rPr>
-        <w:t xml:space="preserve">(arXiv:2303.10130). arXiv.</w:t>
+        <w:t xml:space="preserve">Management Science, 71</w:t>
+      </w:r>
+      <w:r>
+        <w:rPr>
+          <w:rFonts w:ascii="Times New Roman" w:hAnsi="Times New Roman" w:eastAsia="Times New Roman" w:cs="Times New Roman"/>
+        </w:rPr>
+        <w:t xml:space="preserve">(10), 8097–8108.</w:t>
       </w:r>
     </w:p>
     <w:p>
@@ -17021,7 +17067,7 @@
         <w:rPr>
           <w:rFonts w:ascii="Times New Roman" w:hAnsi="Times New Roman" w:eastAsia="Times New Roman" w:cs="Times New Roman"/>
         </w:rPr>
-        <w:t xml:space="preserve">Eurostat. (2026).</w:t>
+        <w:t xml:space="preserve">Eloundou, T., Manning, S., Mishkin, P., &amp; Rock, D. (2023).</w:t>
       </w:r>
       <w:r>
         <w:rPr>
@@ -17035,19 +17081,19 @@
           <w:rFonts w:ascii="Times New Roman" w:hAnsi="Times New Roman" w:eastAsia="Times New Roman" w:cs="Times New Roman"/>
           <w:i/>
         </w:rPr>
-        <w:t xml:space="preserve">ICT usage in enterprises; online job advertisements by occupation (experimental); Labour force survey</w:t>
-      </w:r>
-      <w:r>
-        <w:rPr>
-          <w:rFonts w:ascii="Times New Roman" w:hAnsi="Times New Roman" w:eastAsia="Times New Roman" w:cs="Times New Roman"/>
-        </w:rPr>
-        <w:t xml:space="preserve"> </w:t>
-      </w:r>
-      <w:r>
-        <w:rPr>
-          <w:rFonts w:ascii="Times New Roman" w:hAnsi="Times New Roman" w:eastAsia="Times New Roman" w:cs="Times New Roman"/>
-        </w:rPr>
-        <w:t xml:space="preserve">[Data sets]. Retrieved October 4, 2026, from the Eurostat dissemination database.</w:t>
+        <w:t xml:space="preserve">GPTs are GPTs: An early look at the labor market impact potential of large language models</w:t>
+      </w:r>
+      <w:r>
+        <w:rPr>
+          <w:rFonts w:ascii="Times New Roman" w:hAnsi="Times New Roman" w:eastAsia="Times New Roman" w:cs="Times New Roman"/>
+        </w:rPr>
+        <w:t xml:space="preserve"> </w:t>
+      </w:r>
+      <w:r>
+        <w:rPr>
+          <w:rFonts w:ascii="Times New Roman" w:hAnsi="Times New Roman" w:eastAsia="Times New Roman" w:cs="Times New Roman"/>
+        </w:rPr>
+        <w:t xml:space="preserve">(arXiv:2303.10130). arXiv.</w:t>
       </w:r>
     </w:p>
     <w:p>
@@ -17061,7 +17107,7 @@
         <w:rPr>
           <w:rFonts w:ascii="Times New Roman" w:hAnsi="Times New Roman" w:eastAsia="Times New Roman" w:cs="Times New Roman"/>
         </w:rPr>
-        <w:t xml:space="preserve">Felten, E., Raj, M., &amp; Seamans, R. (2021). Occupational, industry, and geographic exposure to artificial intelligence.</w:t>
+        <w:t xml:space="preserve">Eurostat. (2026).</w:t>
       </w:r>
       <w:r>
         <w:rPr>
@@ -17075,13 +17121,19 @@
           <w:rFonts w:ascii="Times New Roman" w:hAnsi="Times New Roman" w:eastAsia="Times New Roman" w:cs="Times New Roman"/>
           <w:i/>
         </w:rPr>
-        <w:t xml:space="preserve">Strategic Management Journal, 42</w:t>
-      </w:r>
-      <w:r>
-        <w:rPr>
-          <w:rFonts w:ascii="Times New Roman" w:hAnsi="Times New Roman" w:eastAsia="Times New Roman" w:cs="Times New Roman"/>
-        </w:rPr>
-        <w:t xml:space="preserve">(12), 2195–2217.</w:t>
+        <w:t xml:space="preserve">ICT usage in enterprises; online job advertisements by occupation (experimental); Labour force survey</w:t>
+      </w:r>
+      <w:r>
+        <w:rPr>
+          <w:rFonts w:ascii="Times New Roman" w:hAnsi="Times New Roman" w:eastAsia="Times New Roman" w:cs="Times New Roman"/>
+        </w:rPr>
+        <w:t xml:space="preserve"> </w:t>
+      </w:r>
+      <w:r>
+        <w:rPr>
+          <w:rFonts w:ascii="Times New Roman" w:hAnsi="Times New Roman" w:eastAsia="Times New Roman" w:cs="Times New Roman"/>
+        </w:rPr>
+        <w:t xml:space="preserve">[Data sets]. Retrieved October 4, 2026, from the Eurostat dissemination database.</w:t>
       </w:r>
     </w:p>
     <w:p>
@@ -17095,7 +17147,7 @@
         <w:rPr>
           <w:rFonts w:ascii="Times New Roman" w:hAnsi="Times New Roman" w:eastAsia="Times New Roman" w:cs="Times New Roman"/>
         </w:rPr>
-        <w:t xml:space="preserve">Fichman, R. G., &amp; Kemerer, C. F. (1999). The illusory diffusion of innovation: An examination of assimilation gaps.</w:t>
+        <w:t xml:space="preserve">Felten, E., Raj, M., &amp; Seamans, R. (2021). Occupational, industry, and geographic exposure to artificial intelligence.</w:t>
       </w:r>
       <w:r>
         <w:rPr>
@@ -17109,13 +17161,13 @@
           <w:rFonts w:ascii="Times New Roman" w:hAnsi="Times New Roman" w:eastAsia="Times New Roman" w:cs="Times New Roman"/>
           <w:i/>
         </w:rPr>
-        <w:t xml:space="preserve">Information Systems Research, 10</w:t>
-      </w:r>
-      <w:r>
-        <w:rPr>
-          <w:rFonts w:ascii="Times New Roman" w:hAnsi="Times New Roman" w:eastAsia="Times New Roman" w:cs="Times New Roman"/>
-        </w:rPr>
-        <w:t xml:space="preserve">(3), 255–275.</w:t>
+        <w:t xml:space="preserve">Strategic Management Journal, 42</w:t>
+      </w:r>
+      <w:r>
+        <w:rPr>
+          <w:rFonts w:ascii="Times New Roman" w:hAnsi="Times New Roman" w:eastAsia="Times New Roman" w:cs="Times New Roman"/>
+        </w:rPr>
+        <w:t xml:space="preserve">(12), 2195–2217.</w:t>
       </w:r>
     </w:p>
     <w:p>
@@ -17129,7 +17181,7 @@
         <w:rPr>
           <w:rFonts w:ascii="Times New Roman" w:hAnsi="Times New Roman" w:eastAsia="Times New Roman" w:cs="Times New Roman"/>
         </w:rPr>
-        <w:t xml:space="preserve">Fügener, A., Grahl, J., Gupta, A., &amp; Ketter, W. (2022). Cognitive challenges in human–artificial intelligence collaboration: Investigating the path toward productive delegation.</w:t>
+        <w:t xml:space="preserve">Fichman, R. G., &amp; Kemerer, C. F. (1999). The illusory diffusion of innovation: An examination of assimilation gaps.</w:t>
       </w:r>
       <w:r>
         <w:rPr>
@@ -17143,13 +17195,13 @@
           <w:rFonts w:ascii="Times New Roman" w:hAnsi="Times New Roman" w:eastAsia="Times New Roman" w:cs="Times New Roman"/>
           <w:i/>
         </w:rPr>
-        <w:t xml:space="preserve">Information Systems Research, 33</w:t>
-      </w:r>
-      <w:r>
-        <w:rPr>
-          <w:rFonts w:ascii="Times New Roman" w:hAnsi="Times New Roman" w:eastAsia="Times New Roman" w:cs="Times New Roman"/>
-        </w:rPr>
-        <w:t xml:space="preserve">(2), 678–696.</w:t>
+        <w:t xml:space="preserve">Information Systems Research, 10</w:t>
+      </w:r>
+      <w:r>
+        <w:rPr>
+          <w:rFonts w:ascii="Times New Roman" w:hAnsi="Times New Roman" w:eastAsia="Times New Roman" w:cs="Times New Roman"/>
+        </w:rPr>
+        <w:t xml:space="preserve">(3), 255–275.</w:t>
       </w:r>
     </w:p>
     <w:p>
@@ -17163,6 +17215,154 @@
         <w:rPr>
           <w:rFonts w:ascii="Times New Roman" w:hAnsi="Times New Roman" w:eastAsia="Times New Roman" w:cs="Times New Roman"/>
         </w:rPr>
+        <w:t xml:space="preserve">Fügener, A., Grahl, J., Gupta, A., &amp; Ketter, W. (2022). Cognitive challenges in human–artificial intelligence collaboration: Investigating the path toward productive delegation.</w:t>
+      </w:r>
+      <w:r>
+        <w:rPr>
+          <w:rFonts w:ascii="Times New Roman" w:hAnsi="Times New Roman" w:eastAsia="Times New Roman" w:cs="Times New Roman"/>
+        </w:rPr>
+        <w:t xml:space="preserve"> </w:t>
+      </w:r>
+      <w:r>
+        <w:rPr>
+          <w:iCs/>
+          <w:rFonts w:ascii="Times New Roman" w:hAnsi="Times New Roman" w:eastAsia="Times New Roman" w:cs="Times New Roman"/>
+          <w:i/>
+        </w:rPr>
+        <w:t xml:space="preserve">Information Systems Research, 33</w:t>
+      </w:r>
+      <w:r>
+        <w:rPr>
+          <w:rFonts w:ascii="Times New Roman" w:hAnsi="Times New Roman" w:eastAsia="Times New Roman" w:cs="Times New Roman"/>
+        </w:rPr>
+        <w:t xml:space="preserve">(2), 678–696.</w:t>
+      </w:r>
+    </w:p>
+    <w:p>
+      <w:pPr>
+        <w:pStyle w:val="BodyText"/>
+        <w:spacing w:line="480" w:lineRule="auto" w:after="0" w:before="0"/>
+        <w:ind w:firstLine="720"/>
+        <w:jc w:val="left"/>
+      </w:pPr>
+      <w:r>
+        <w:rPr>
+          <w:rFonts w:ascii="Times New Roman" w:hAnsi="Times New Roman" w:eastAsia="Times New Roman" w:cs="Times New Roman"/>
+        </w:rPr>
+        <w:t xml:space="preserve">Gathmann, C., Grimm, F., &amp; Winkler, E. (2024).</w:t>
+      </w:r>
+      <w:r>
+        <w:rPr>
+          <w:rFonts w:ascii="Times New Roman" w:hAnsi="Times New Roman" w:eastAsia="Times New Roman" w:cs="Times New Roman"/>
+        </w:rPr>
+        <w:t xml:space="preserve"> </w:t>
+      </w:r>
+      <w:r>
+        <w:rPr>
+          <w:iCs/>
+          <w:rFonts w:ascii="Times New Roman" w:hAnsi="Times New Roman" w:eastAsia="Times New Roman" w:cs="Times New Roman"/>
+          <w:i/>
+        </w:rPr>
+        <w:t xml:space="preserve">AI, task changes in jobs, and worker reallocation</w:t>
+      </w:r>
+      <w:r>
+        <w:rPr>
+          <w:rFonts w:ascii="Times New Roman" w:hAnsi="Times New Roman" w:eastAsia="Times New Roman" w:cs="Times New Roman"/>
+        </w:rPr>
+        <w:t xml:space="preserve"> </w:t>
+      </w:r>
+      <w:r>
+        <w:rPr>
+          <w:rFonts w:ascii="Times New Roman" w:hAnsi="Times New Roman" w:eastAsia="Times New Roman" w:cs="Times New Roman"/>
+        </w:rPr>
+        <w:t xml:space="preserve">(IZA Discussion Paper No. 17554). IZA Institute of Labor Economics.</w:t>
+      </w:r>
+    </w:p>
+    <w:p>
+      <w:pPr>
+        <w:pStyle w:val="BodyText"/>
+        <w:spacing w:line="480" w:lineRule="auto" w:after="0" w:before="0"/>
+        <w:ind w:firstLine="720"/>
+        <w:jc w:val="left"/>
+      </w:pPr>
+      <w:r>
+        <w:rPr>
+          <w:rFonts w:ascii="Times New Roman" w:hAnsi="Times New Roman" w:eastAsia="Times New Roman" w:cs="Times New Roman"/>
+        </w:rPr>
+        <w:t xml:space="preserve">Georgieff, A., &amp; Hyee, R. (2022). Artificial intelligence and employment: New cross-country evidence.</w:t>
+      </w:r>
+      <w:r>
+        <w:rPr>
+          <w:rFonts w:ascii="Times New Roman" w:hAnsi="Times New Roman" w:eastAsia="Times New Roman" w:cs="Times New Roman"/>
+        </w:rPr>
+        <w:t xml:space="preserve"> </w:t>
+      </w:r>
+      <w:r>
+        <w:rPr>
+          <w:iCs/>
+          <w:rFonts w:ascii="Times New Roman" w:hAnsi="Times New Roman" w:eastAsia="Times New Roman" w:cs="Times New Roman"/>
+          <w:i/>
+        </w:rPr>
+        <w:t xml:space="preserve">Frontiers in Artificial Intelligence, 5</w:t>
+      </w:r>
+      <w:r>
+        <w:rPr>
+          <w:rFonts w:ascii="Times New Roman" w:hAnsi="Times New Roman" w:eastAsia="Times New Roman" w:cs="Times New Roman"/>
+        </w:rPr>
+        <w:t xml:space="preserve">, Article 832736.</w:t>
+      </w:r>
+    </w:p>
+    <w:p>
+      <w:pPr>
+        <w:pStyle w:val="BodyText"/>
+        <w:spacing w:line="480" w:lineRule="auto" w:after="0" w:before="0"/>
+        <w:ind w:firstLine="720"/>
+        <w:jc w:val="left"/>
+      </w:pPr>
+      <w:r>
+        <w:rPr>
+          <w:rFonts w:ascii="Times New Roman" w:hAnsi="Times New Roman" w:eastAsia="Times New Roman" w:cs="Times New Roman"/>
+        </w:rPr>
+        <w:t xml:space="preserve">Hampole, M., Papanikolaou, D., Schmidt, L. D. W., &amp; Seegmiller, B. (2025).</w:t>
+      </w:r>
+      <w:r>
+        <w:rPr>
+          <w:rFonts w:ascii="Times New Roman" w:hAnsi="Times New Roman" w:eastAsia="Times New Roman" w:cs="Times New Roman"/>
+        </w:rPr>
+        <w:t xml:space="preserve"> </w:t>
+      </w:r>
+      <w:r>
+        <w:rPr>
+          <w:iCs/>
+          <w:rFonts w:ascii="Times New Roman" w:hAnsi="Times New Roman" w:eastAsia="Times New Roman" w:cs="Times New Roman"/>
+          <w:i/>
+        </w:rPr>
+        <w:t xml:space="preserve">Artificial intelligence and the labor market</w:t>
+      </w:r>
+      <w:r>
+        <w:rPr>
+          <w:rFonts w:ascii="Times New Roman" w:hAnsi="Times New Roman" w:eastAsia="Times New Roman" w:cs="Times New Roman"/>
+        </w:rPr>
+        <w:t xml:space="preserve"> </w:t>
+      </w:r>
+      <w:r>
+        <w:rPr>
+          <w:rFonts w:ascii="Times New Roman" w:hAnsi="Times New Roman" w:eastAsia="Times New Roman" w:cs="Times New Roman"/>
+        </w:rPr>
+        <w:t xml:space="preserve">(NBER Working Paper No. 33509). National Bureau of Economic Research.</w:t>
+      </w:r>
+    </w:p>
+    <w:p>
+      <w:pPr>
+        <w:pStyle w:val="BodyText"/>
+        <w:spacing w:line="480" w:lineRule="auto" w:after="0" w:before="0"/>
+        <w:ind w:firstLine="720"/>
+        <w:jc w:val="left"/>
+      </w:pPr>
+      <w:r>
+        <w:rPr>
+          <w:rFonts w:ascii="Times New Roman" w:hAnsi="Times New Roman" w:eastAsia="Times New Roman" w:cs="Times New Roman"/>
+        </w:rPr>
         <w:t xml:space="preserve">Hui, X., Reshef, O., &amp; Zhou, L. (2024). The short-term effects of generative artificial intelligence on employment: Evidence from an online labor market.</w:t>
       </w:r>
       <w:r>
@@ -17184,6 +17384,46 @@
           <w:rFonts w:ascii="Times New Roman" w:hAnsi="Times New Roman" w:eastAsia="Times New Roman" w:cs="Times New Roman"/>
         </w:rPr>
         <w:t xml:space="preserve">(6), 1977–1989.</w:t>
+      </w:r>
+    </w:p>
+    <w:p>
+      <w:pPr>
+        <w:pStyle w:val="BodyText"/>
+        <w:spacing w:line="480" w:lineRule="auto" w:after="0" w:before="0"/>
+        <w:ind w:firstLine="720"/>
+        <w:jc w:val="left"/>
+      </w:pPr>
+      <w:r>
+        <w:rPr>
+          <w:rFonts w:ascii="Times New Roman" w:hAnsi="Times New Roman" w:eastAsia="Times New Roman" w:cs="Times New Roman"/>
+        </w:rPr>
+        <w:t xml:space="preserve">Humlum, A., &amp; Vestergaard, E. (2025).</w:t>
+      </w:r>
+      <w:r>
+        <w:rPr>
+          <w:rFonts w:ascii="Times New Roman" w:hAnsi="Times New Roman" w:eastAsia="Times New Roman" w:cs="Times New Roman"/>
+        </w:rPr>
+        <w:t xml:space="preserve"> </w:t>
+      </w:r>
+      <w:r>
+        <w:rPr>
+          <w:iCs/>
+          <w:rFonts w:ascii="Times New Roman" w:hAnsi="Times New Roman" w:eastAsia="Times New Roman" w:cs="Times New Roman"/>
+          <w:i/>
+        </w:rPr>
+        <w:t xml:space="preserve">Large language models, small labor market effects</w:t>
+      </w:r>
+      <w:r>
+        <w:rPr>
+          <w:rFonts w:ascii="Times New Roman" w:hAnsi="Times New Roman" w:eastAsia="Times New Roman" w:cs="Times New Roman"/>
+        </w:rPr>
+        <w:t xml:space="preserve"> </w:t>
+      </w:r>
+      <w:r>
+        <w:rPr>
+          <w:rFonts w:ascii="Times New Roman" w:hAnsi="Times New Roman" w:eastAsia="Times New Roman" w:cs="Times New Roman"/>
+        </w:rPr>
+        <w:t xml:space="preserve">(BFI Working Paper No. 2025-56; NBER Working Paper No. 33777). Becker Friedman Institute and National Bureau of Economic Research.</w:t>
       </w:r>
     </w:p>
     <w:p>

</xml_diff>

<commit_message>
Add Section 3.8 (assimilation theory extensions), restructure Section 9 as H3 design proposal, refresh limitations
Co-Authored-By: Claude Sonnet 5.5 <noreply@anthropic.com>
Claude-Session: https://claude.ai/code/session_015MZUD2DotEDYTGGfpD8taa
</commit_message>
<xml_diff>
--- a/revision/Acquired_Not_Yet_Assimilated_ISR_revised.docx
+++ b/revision/Acquired_Not_Yet_Assimilated_ISR_revised.docx
@@ -222,6 +222,9 @@
     <w:p>
       <w:pPr>
         <w:pStyle w:val="BodyText"/>
+        <w:spacing w:line="240" w:lineRule="auto" w:after="120" w:before="0"/>
+        <w:ind w:firstLine="0"/>
+        <w:jc w:val="left"/>
       </w:pPr>
       <w:r>
         <w:rPr>
@@ -255,6 +258,210 @@
           <w:rFonts w:ascii="Times New Roman" w:hAnsi="Times New Roman" w:eastAsia="Times New Roman" w:cs="Times New Roman"/>
         </w:rPr>
         <w:t xml:space="preserve">1 Introduction</w:t>
+      </w:r>
+    </w:p>
+    <w:p>
+      <w:pPr>
+        <w:pStyle w:val="FirstParagraph"/>
+      </w:pPr>
+      <w:r>
+        <w:rPr>
+          <w:rFonts w:ascii="Times New Roman" w:hAnsi="Times New Roman" w:eastAsia="Times New Roman" w:cs="Times New Roman"/>
+        </w:rPr>
+        <w:t xml:space="preserve">Tools that turn text into images (widely available since 2022) and into video (since 2024) have made a first draft of visual content almost free. Official statistics already record their spread. In 2025, roughly one in ten European enterprises with ten or more employees reported using AI that generates pictures, video, or audio, and more than one in three did so in publishing, film, and broadcasting (Eurostat, 2026). The natural reading is that the people who used to produce such content are being redeployed, and a growing body of exposure-based labor-market research looks for that redeployment in hiring data.</w:t>
+      </w:r>
+    </w:p>
+    <w:p>
+      <w:pPr>
+        <w:pStyle w:val="BodyText"/>
+        <w:spacing w:line="480" w:lineRule="auto" w:after="0" w:before="0"/>
+        <w:ind w:firstLine="720"/>
+        <w:jc w:val="left"/>
+      </w:pPr>
+      <w:r>
+        <w:rPr>
+          <w:rFonts w:ascii="Times New Roman" w:hAnsi="Times New Roman" w:eastAsia="Times New Roman" w:cs="Times New Roman"/>
+        </w:rPr>
+        <w:t xml:space="preserve">Information systems (IS) research gives reason for caution. Implementation research has long treated adoption as one stage in a sequence that runs through adaptation, acceptance, routinization, and infusion (Cooper &amp; Zmud, 1990; Jasperson et al., 2005). Organizations can acquire an innovation well before they deploy it, so diffusion statistics overstate use. Fichman and Kemerer (1999) called this wedge an assimilation gap and found it widest where knowledge barriers were high. Studies of enterprise systems later showed that what follows acquisition depends on organizational conditions, such as the participation of top management, rather than on the technology alone (Liang et al., 2007). The IT business value literature makes a parallel point: returns depend on complementary organizational investments (Aral &amp; Weill, 2007; Brynjolfsson &amp; Hitt, 2000; Melville et al., 2004). Macroeconomics points the same way. General-purpose technologies take effect only after complementary investments, labor markets adjust through attrition and reallocation rather than immediate job loss, and technology often accelerates structural change that was already under way (Acemoglu &amp; Restrepo, 2018; Brynjolfsson et al., 2021; David, 1990). For generative visual AI, then, the question is not only whether it substitutes for creative labor. It is also whether reported use reflects assimilation into tasks at all, and whether the evidence researchers currently rely on could tell the difference.</w:t>
+      </w:r>
+    </w:p>
+    <w:p>
+      <w:pPr>
+        <w:pStyle w:val="BodyText"/>
+        <w:spacing w:line="480" w:lineRule="auto" w:after="0" w:before="0"/>
+        <w:ind w:firstLine="720"/>
+        <w:jc w:val="left"/>
+      </w:pPr>
+      <w:r>
+        <w:rPr>
+          <w:rFonts w:ascii="Times New Roman" w:hAnsi="Times New Roman" w:eastAsia="Times New Roman" w:cs="Times New Roman"/>
+        </w:rPr>
+        <w:t xml:space="preserve">We take up this question in three steps. First, we develop a task-level theory in which a firm reassigns a visual task to a generator only when the acceptance rate of its output exceeds a threshold set by generation cost, review cost, and the cost of human production. Complementary assets enter through review cost: the expertise to specify and check output, the capacity to run review as a routine, and the procedures that keep copyright and personal-data exposure manageable. We embed review in a task-based model of labor demand that separates displacement, reinstatement, and scale effects (Acemoglu &amp; Restrepo, 2018, 2019), treat review as a bottleneck task (Baumol, 1967), and let employers adjust through attrition. The theory implies that when review cost alone exceeds the cost of human production, no improvement in the model can trigger assimilation, and that because acquiring a generator costs almost nothing, acquisition can grow without the complements that assimilation requires. Second, we ask what aggregate public data can reveal about this gap. We derive a detectability bound that compares the hiring response implied by complete assimilation with the minimum detectable effect of standard exposure designs. Third, we assemble the descriptive evidence that exists on the acquisition margin and on the barriers that firms report.</w:t>
+      </w:r>
+    </w:p>
+    <w:p>
+      <w:pPr>
+        <w:pStyle w:val="BodyText"/>
+        <w:spacing w:line="480" w:lineRule="auto" w:after="0" w:before="0"/>
+        <w:ind w:firstLine="720"/>
+        <w:jc w:val="left"/>
+      </w:pPr>
+      <w:r>
+        <w:rPr>
+          <w:rFonts w:ascii="Times New Roman" w:hAnsi="Times New Roman" w:eastAsia="Times New Roman" w:cs="Times New Roman"/>
+        </w:rPr>
+        <w:t xml:space="preserve">The results are partly substantive and partly cautionary. Acquisition of generative visual AI is substantial and rising, so the absence of a hiring response cannot be explained by an absence of acquisition. Firms that considered AI and did not adopt it cite missing expertise, legal uncertainty, and data-protection concerns far more often than a tool that is not useful, which is what a complementary-asset account predicts and a capability-failure account does not. The hiring data, however, cannot currently distinguish an assimilation gap from complete assimilation. At observed acquisition rates and at the substitution effects estimated on freelance platforms (Demirci et al., 2025), complete assimilation would reduce adverts in the most exposed occupation by roughly 2 to 17 percent, while the European design cannot detect a reduction smaller than about 23 percent. The exposure gradients the designs do report are small and imprecise: about 2 to 3 percent fewer adverts per standard deviation of exposure in Europe in 2023 and 2024, and a first-year decline of similar size in Canada that does not persist. Exposed occupations were already declining relative to others before generative tools were released.</w:t>
+      </w:r>
+    </w:p>
+    <w:p>
+      <w:pPr>
+        <w:pStyle w:val="BodyText"/>
+        <w:spacing w:line="480" w:lineRule="auto" w:after="0" w:before="0"/>
+        <w:ind w:firstLine="720"/>
+        <w:jc w:val="left"/>
+      </w:pPr>
+      <w:r>
+        <w:rPr>
+          <w:rFonts w:ascii="Times New Roman" w:hAnsi="Times New Roman" w:eastAsia="Times New Roman" w:cs="Times New Roman"/>
+        </w:rPr>
+        <w:t xml:space="preserve">We are explicit about what the paper does not claim. We do not observe assimilation inside firms, and we do not treat small or fragile hiring responses as evidence of a gap. Our point is that such responses could not, at present, have revealed either a gap or its absence. Four accounts remain in contention: a capability failure, in which the tool does not meet task requirements; complete assimilation with net substitution; assimilation in which scale effects offset substitution; and an assimilation gap held open by missing complements. The barrier evidence weighs against the first at the acquisition margin. Separating the other three requires firm-level data that link use, complementary assets, task reassignment, and hiring, and we specify what such data would have to show.</w:t>
+      </w:r>
+    </w:p>
+    <w:p>
+      <w:pPr>
+        <w:pStyle w:val="BodyText"/>
+        <w:spacing w:line="480" w:lineRule="auto" w:after="0" w:before="0"/>
+        <w:ind w:firstLine="720"/>
+        <w:jc w:val="left"/>
+      </w:pPr>
+      <w:r>
+        <w:rPr>
+          <w:rFonts w:ascii="Times New Roman" w:hAnsi="Times New Roman" w:eastAsia="Times New Roman" w:cs="Times New Roman"/>
+        </w:rPr>
+        <w:t xml:space="preserve">The paper contributes to IS research in three ways.</w:t>
+      </w:r>
+    </w:p>
+    <w:p>
+      <w:pPr>
+        <w:pStyle w:val="BodyText"/>
+        <w:spacing w:line="480" w:lineRule="auto" w:after="0" w:before="0"/>
+        <w:ind w:firstLine="720"/>
+        <w:jc w:val="left"/>
+      </w:pPr>
+      <w:r>
+        <w:rPr>
+          <w:iCs/>
+          <w:rFonts w:ascii="Times New Roman" w:hAnsi="Times New Roman" w:eastAsia="Times New Roman" w:cs="Times New Roman"/>
+          <w:i/>
+        </w:rPr>
+        <w:t xml:space="preserve">First, a theoretical contribution.</w:t>
+      </w:r>
+      <w:r>
+        <w:rPr>
+          <w:rFonts w:ascii="Times New Roman" w:hAnsi="Times New Roman" w:eastAsia="Times New Roman" w:cs="Times New Roman"/>
+        </w:rPr>
+        <w:t xml:space="preserve"> </w:t>
+      </w:r>
+      <w:r>
+        <w:rPr>
+          <w:rFonts w:ascii="Times New Roman" w:hAnsi="Times New Roman" w:eastAsia="Times New Roman" w:cs="Times New Roman"/>
+        </w:rPr>
+        <w:t xml:space="preserve">We extend assimilation theory to generative AI by locating complementary assets in a single, observable cost term, review cost, and by showing why the near-zero acquisition cost of generative tools should widen the gap between acquisition and assimilation. The enterprise systems on which assimilation theory was built were costly to acquire, which meant that acquisition itself partly selected firms that had already built complements. A visual generator can be acquired with almost no complementary investment. Better models raise the acceptance rate of output, but they cannot supply the expertise, review capacity, or compliance procedures needed to cross the acceptance threshold. Reported use is therefore a weaker signal of task reassignment for generative tools than it was for earlier information technologies. Platform studies observe substitution because the buyer of a freelance task can switch tools without first building a review routine; standing occupations inside firms face that friction.</w:t>
+      </w:r>
+    </w:p>
+    <w:p>
+      <w:pPr>
+        <w:pStyle w:val="BodyText"/>
+        <w:spacing w:line="480" w:lineRule="auto" w:after="0" w:before="0"/>
+        <w:ind w:firstLine="720"/>
+        <w:jc w:val="left"/>
+      </w:pPr>
+      <w:r>
+        <w:rPr>
+          <w:iCs/>
+          <w:rFonts w:ascii="Times New Roman" w:hAnsi="Times New Roman" w:eastAsia="Times New Roman" w:cs="Times New Roman"/>
+          <w:i/>
+        </w:rPr>
+        <w:t xml:space="preserve">Second, a methodological contribution.</w:t>
+      </w:r>
+      <w:r>
+        <w:rPr>
+          <w:rFonts w:ascii="Times New Roman" w:hAnsi="Times New Roman" w:eastAsia="Times New Roman" w:cs="Times New Roman"/>
+        </w:rPr>
+        <w:t xml:space="preserve"> </w:t>
+      </w:r>
+      <w:r>
+        <w:rPr>
+          <w:rFonts w:ascii="Times New Roman" w:hAnsi="Times New Roman" w:eastAsia="Times New Roman" w:cs="Times New Roman"/>
+        </w:rPr>
+        <w:t xml:space="preserve">We provide a detectability bound that changes how an important part of the literature on AI exposure and hiring should be read. At current acquisition rates and at the substitution effects estimated on platforms, where assimilation is comparatively frictionless, complete assimilation of visual tasks would lower adverts in the most exposed occupations by roughly 2 to 17 percent. Standard European and Canadian occupation-level designs cannot detect effects of that size. The small gradients they do report cannot be told apart from an extrapolation of the pre-2022 trend and are therefore uninformative about assimilation. The bound is simple enough to be reported next to any exposure coefficient, and doing so guards against both false alarms and false reassurance.</w:t>
+      </w:r>
+    </w:p>
+    <w:p>
+      <w:pPr>
+        <w:pStyle w:val="BodyText"/>
+        <w:spacing w:line="480" w:lineRule="auto" w:after="0" w:before="0"/>
+        <w:ind w:firstLine="720"/>
+        <w:jc w:val="left"/>
+      </w:pPr>
+      <w:r>
+        <w:rPr>
+          <w:iCs/>
+          <w:rFonts w:ascii="Times New Roman" w:hAnsi="Times New Roman" w:eastAsia="Times New Roman" w:cs="Times New Roman"/>
+          <w:i/>
+        </w:rPr>
+        <w:t xml:space="preserve">Third, a research-design contribution.</w:t>
+      </w:r>
+      <w:r>
+        <w:rPr>
+          <w:rFonts w:ascii="Times New Roman" w:hAnsi="Times New Roman" w:eastAsia="Times New Roman" w:cs="Times New Roman"/>
+        </w:rPr>
+        <w:t xml:space="preserve"> </w:t>
+      </w:r>
+      <w:r>
+        <w:rPr>
+          <w:rFonts w:ascii="Times New Roman" w:hAnsi="Times New Roman" w:eastAsia="Times New Roman" w:cs="Times New Roman"/>
+        </w:rPr>
+        <w:t xml:space="preserve">We turn the assimilation-gap hypothesis into a set of falsifiable predictions that can be tested once firm-level data link reported use, the stock of complementary assets, task reassignment, and hiring. Among acquiring firms, reassignment should rise with expertise, review capacity, and compliance procedures, and hiring for visual occupations should fall only among firms that have both acquired the tool and built those assets. These predictions separate an assimilation gap from capability failure, from complete assimilation with net substitution, and from assimilation with offsetting scale effects, accounts that occupation-level data cannot currently tell apart.</w:t>
+      </w:r>
+    </w:p>
+    <w:p>
+      <w:pPr>
+        <w:pStyle w:val="BodyText"/>
+        <w:spacing w:line="480" w:lineRule="auto" w:after="0" w:before="0"/>
+        <w:ind w:firstLine="720"/>
+        <w:jc w:val="left"/>
+      </w:pPr>
+      <w:r>
+        <w:rPr>
+          <w:rFonts w:ascii="Times New Roman" w:hAnsi="Times New Roman" w:eastAsia="Times New Roman" w:cs="Times New Roman"/>
+        </w:rPr>
+        <w:t xml:space="preserve">The paper proceeds as follows. Section 2 reviews the literature. Section 3 develops the theory, Section 4 derives the detectability bound, and Section 5 describes the data. Sections 6 to 8 present the evidence on acquisition and barriers, apply the bound to hiring data (including a pilot with advert text), and ask when occupation-level data could become informative. Section 9 sets out a firm-level design, and Sections 10 and 11 discuss implications and conclude.</w:t>
+      </w:r>
+    </w:p>
+    <w:bookmarkEnd w:id="21"/>
+    <w:bookmarkStart w:id="25" w:name="related-literature"/>
+    <w:p>
+      <w:pPr>
+        <w:pStyle w:val="Heading2"/>
+      </w:pPr>
+      <w:r>
+        <w:rPr>
+          <w:rFonts w:ascii="Times New Roman" w:hAnsi="Times New Roman" w:eastAsia="Times New Roman" w:cs="Times New Roman"/>
+        </w:rPr>
+        <w:t xml:space="preserve">2 Related Literature</w:t>
+      </w:r>
+    </w:p>
+    <w:bookmarkStart w:id="22" w:name="from-adoption-to-assimilation"/>
+    <w:p>
+      <w:pPr>
+        <w:pStyle w:val="Heading3"/>
+      </w:pPr>
+      <w:r>
+        <w:rPr>
+          <w:rFonts w:ascii="Times New Roman" w:hAnsi="Times New Roman" w:eastAsia="Times New Roman" w:cs="Times New Roman"/>
+        </w:rPr>
+        <w:t xml:space="preserve">2.1 From Adoption to Assimilation</w:t>
       </w:r>
     </w:p>
     <w:p>
@@ -268,29 +475,61 @@
         <w:rPr>
           <w:rFonts w:ascii="Times New Roman" w:hAnsi="Times New Roman" w:eastAsia="Times New Roman" w:cs="Times New Roman"/>
         </w:rPr>
-        <w:t xml:space="preserve">Tools that turn text into images (widely available since 2022) and into video (since 2024) have made a first draft of visual content almost free. Official statistics already record their spread. In 2025, roughly one in ten European enterprises with ten or more employees reported using AI that generates pictures, video, or audio, and more than one in three did so in publishing, film, and broadcasting (Eurostat, 2026). The natural reading is that the people who used to produce such content are being redeployed, and a growing body of exposure-based labor-market research looks for that redeployment in hiring data.</w:t>
-      </w:r>
-    </w:p>
-    <w:p>
-      <w:pPr>
-        <w:pStyle w:val="BodyText"/>
-      </w:pPr>
-      <w:r>
-        <w:rPr>
-          <w:rFonts w:ascii="Times New Roman" w:hAnsi="Times New Roman" w:eastAsia="Times New Roman" w:cs="Times New Roman"/>
-        </w:rPr>
-        <w:t xml:space="preserve">Information systems (IS) research gives reason for caution. Implementation research has long treated adoption as one stage in a sequence that runs through adaptation, acceptance, routinization, and infusion (Cooper &amp; Zmud, 1990; Jasperson et al., 2005). Organizations can acquire an innovation well before they deploy it, so diffusion statistics overstate use. Fichman and Kemerer (1999) called this wedge an assimilation gap and found it widest where knowledge barriers were high. Studies of enterprise systems later showed that what follows acquisition depends on organizational conditions, such as the participation of top management, rather than on the technology alone (Liang et al., 2007). The IT business value literature makes a parallel point: returns depend on complementary organizational investments (Aral &amp; Weill, 2007; Brynjolfsson &amp; Hitt, 2000; Melville et al., 2004). Macroeconomics points the same way. General-purpose technologies take effect only after complementary investments, labor markets adjust through attrition and reallocation rather than immediate job loss, and technology often accelerates structural change that was already under way (Acemoglu &amp; Restrepo, 2018; Brynjolfsson et al., 2021; David, 1990). For generative visual AI, then, the question is not only whether it substitutes for creative labor. It is also whether reported use reflects assimilation into tasks at all, and whether the evidence researchers currently rely on could tell the difference.</w:t>
-      </w:r>
-    </w:p>
-    <w:p>
-      <w:pPr>
-        <w:pStyle w:val="BodyText"/>
-      </w:pPr>
-      <w:r>
-        <w:rPr>
-          <w:rFonts w:ascii="Times New Roman" w:hAnsi="Times New Roman" w:eastAsia="Times New Roman" w:cs="Times New Roman"/>
-        </w:rPr>
-        <w:t xml:space="preserve">We take up this question in three steps. First, we develop a task-level theory in which a firm reassigns a visual task to a generator only when the acceptance rate of its output exceeds a threshold set by generation cost, review cost, and the cost of human production. Complementary assets enter through review cost: the expertise to specify and check output, the capacity to run review as a routine, and the procedures that keep copyright and personal-data exposure manageable. We embed review in a task-based model of labor demand that separates displacement, reinstatement, and scale effects (Acemoglu &amp; Restrepo, 2018, 2019), treat review as a bottleneck task (Baumol, 1967), and let employers adjust through attrition. The theory implies that when review cost alone exceeds the cost of human production, no improvement in the model can trigger assimilation, and that because acquiring a generator costs almost nothing, acquisition can grow without the complements that assimilation requires. Second, we ask what aggregate public data can reveal about this gap. We derive a detectability bound that compares the hiring response implied by complete assimilation with the minimum detectable effect of standard exposure designs. Third, we assemble the descriptive evidence that exists on the acquisition margin and on the barriers that firms report.</w:t>
+        <w:t xml:space="preserve">IT implementation is a staged process in which adoption is followed by adaptation, acceptance, routinization, and infusion, and the factors that explain early stages differ from those that explain later ones (Cooper &amp; Zmud, 1990). Complex technologies spread slowly not because firms lack information about them but because they lack the know-how to use them, and mediating institutions emerge to lower that knowledge barrier (Attewell, 1992). The distinction becomes a measurement problem: cumulative acquisition of software-process innovations ran well ahead of cumulative deployment, and the resulting assimilation gap was largest for innovations with high knowledge barriers (Fichman &amp; Kemerer, 1999). Post-adoption usage and value vary widely across adopters of e-business, again pointing to organizational rather than technological determinants (Zhu &amp; Kraemer, 2005). The post-adoption literature has since described, in detail, how users continue to explore, extend, and often under-use the features of technologies they have formally adopted (Jasperson et al., 2005), and how organizational mechanisms such as top-management participation carry an enterprise system from implementation into use (Liang et al., 2007). We build on this tradition but apply it to an outcome that it has rarely examined: whether assimilation of a production technology reaches the occupation that used to perform the task.</w:t>
+      </w:r>
+    </w:p>
+    <w:bookmarkEnd w:id="22"/>
+    <w:bookmarkStart w:id="23" w:name="complementary-assets"/>
+    <w:p>
+      <w:pPr>
+        <w:pStyle w:val="Heading3"/>
+      </w:pPr>
+      <w:r>
+        <w:rPr>
+          <w:rFonts w:ascii="Times New Roman" w:hAnsi="Times New Roman" w:eastAsia="Times New Roman" w:cs="Times New Roman"/>
+        </w:rPr>
+        <w:t xml:space="preserve">2.2 Complementary Assets</w:t>
+      </w:r>
+    </w:p>
+    <w:p>
+      <w:pPr>
+        <w:pStyle w:val="FirstParagraph"/>
+        <w:spacing w:line="480" w:lineRule="auto" w:after="0" w:before="0"/>
+        <w:ind w:firstLine="720"/>
+        <w:jc w:val="left"/>
+      </w:pPr>
+      <w:r>
+        <w:rPr>
+          <w:rFonts w:ascii="Times New Roman" w:hAnsi="Times New Roman" w:eastAsia="Times New Roman" w:cs="Times New Roman"/>
+        </w:rPr>
+        <w:t xml:space="preserve">A second tradition holds that the value of information technology depends on complementary investments in skills, processes, and organizational design (Aral &amp; Weill, 2007; Brynjolfsson &amp; Hitt, 2000; Melville et al., 2004). General-purpose technologies display long lags for the same reason (Bresnahan &amp; Trajtenberg, 1995; David, 1990), and the lag can be formalized as a productivity J-curve in which intangible complements are built before measured gains appear (Brynjolfsson et al., 2021). When prediction becomes cheap, the value of human judgment rises (Agrawal et al., 2018). We draw on these ideas to make the complements concrete for generative visual AI and to locate them in a single cost term. Expertise, review capacity, and compliance procedures are not supplied by a better model. A better model can raise the share of acceptable output, but it does not create the person who can judge that output, the time in which to judge it, or the policy that says whether it may be used.</w:t>
+      </w:r>
+    </w:p>
+    <w:bookmarkEnd w:id="23"/>
+    <w:bookmarkStart w:id="24" w:name="Xcbcf59c475a0a23fbdb63f118109907a2bbf8fb"/>
+    <w:p>
+      <w:pPr>
+        <w:pStyle w:val="Heading3"/>
+      </w:pPr>
+      <w:r>
+        <w:rPr>
+          <w:rFonts w:ascii="Times New Roman" w:hAnsi="Times New Roman" w:eastAsia="Times New Roman" w:cs="Times New Roman"/>
+        </w:rPr>
+        <w:t xml:space="preserve">2.3 Generative AI, Work, and Information Systems Research</w:t>
+      </w:r>
+    </w:p>
+    <w:p>
+      <w:pPr>
+        <w:pStyle w:val="FirstParagraph"/>
+        <w:spacing w:line="480" w:lineRule="auto" w:after="0" w:before="0"/>
+        <w:ind w:firstLine="720"/>
+        <w:jc w:val="left"/>
+      </w:pPr>
+      <w:r>
+        <w:rPr>
+          <w:rFonts w:ascii="Times New Roman" w:hAnsi="Times New Roman" w:eastAsia="Times New Roman" w:cs="Times New Roman"/>
+        </w:rPr>
+        <w:t xml:space="preserve">A large literature maps AI capabilities onto occupational tasks (Eloundou et al., 2023; Felten et al., 2021; Webb, 2020). Exposure measures describe where a technology could matter, not where it has been acquired or assimilated. Task-based models separate the displacement, reinstatement, and productivity effects of automation (Acemoglu &amp; Restrepo, 2018, 2019), and models of unbalanced growth show that tasks which cannot be automated become bottlenecks (Aghion et al., 2019; Baumol, 1967); we use both ideas in Section 3. Establishments exposed to AI change their hiring, but little aggregate effect is detectable at the occupation or industry level (Acemoglu et al., 2022). Danish registers linked to adoption surveys show precise zeros for adopters’ earnings and hours (Humlum &amp; Vestergaard, 2025). Evidence from online labor markets is sharper. Freelancers exposed to ChatGPT and image generators lost employment and earnings (Hui et al., 2024), and image-creation posts fell by about 17 percent after image generators were released, relative to manual-intensive jobs (Demirci et al., 2025). On creator platforms, generative tools raise output for some artists and reallocate demand across creator types (Kim et al., 2026; Zhou &amp; Lee, 2024), and inside firms they raise individual productivity on suitable tasks (Brynjolfsson et al., 2025). These settings share a feature that our theory makes explicit: the buyer of a freelance task, or a worker inside a studied team, can switch to the tool without the firm first building a review routine or a compliance policy. We use the platform estimates as a reference for how large substitution can be once assimilation has occurred, not as a test of our account.</w:t>
       </w:r>
     </w:p>
     <w:p>
@@ -304,7 +543,7 @@
         <w:rPr>
           <w:rFonts w:ascii="Times New Roman" w:hAnsi="Times New Roman" w:eastAsia="Times New Roman" w:cs="Times New Roman"/>
         </w:rPr>
-        <w:t xml:space="preserve">The results are partly substantive and partly cautionary. Acquisition of generative visual AI is substantial and rising, so the absence of a hiring response cannot be explained by an absence of acquisition. Firms that considered AI and did not adopt it cite missing expertise, legal uncertainty, and data-protection concerns far more often than a tool that is not useful, which is what a complementary-asset account predicts and a capability-failure account does not. The hiring data, however, cannot currently distinguish an assimilation gap from complete assimilation. At observed acquisition rates and at the substitution effects estimated on freelance platforms (Demirci et al., 2025), complete assimilation would reduce adverts in the most exposed occupation by roughly 2 to 17 percent, while the European design cannot detect a reduction smaller than about 23 percent. The exposure gradients the designs do report are small and imprecise: about 2 to 3 percent fewer adverts per standard deviation of exposure in Europe in 2023 and 2024, and a first-year decline of similar size in Canada that does not persist. Exposed occupations were already declining relative to others before generative tools were released.</w:t>
+        <w:t xml:space="preserve">Within IS, work on AI has mostly examined what happens inside organizations that already use it. Experimental evidence suggests that people are poorly calibrated about their own capabilities when deciding whether to delegate to an AI system (Fügener et al., 2022), which implies that judging machine output is not costless even for competent workers; this is the mechanism that our review-cost term abstracts. Editorial work has framed AI as something that must be managed as a continually moving technological frontier (Berente et al., 2021), as a component of human–AI hybrids that reshape digital labor platforms (Rai et al., 2019), and, in the case of generative models, as a double-edged tool for knowledge work (Susarla et al., 2023). Studies of this kind take use as given. Labor economics, by contrast, takes the occupation as the unit and asks whether exposure predicts hiring, but seldom asks whether exposed employers have changed how work is done. What is missing is an account of the step in between, from acquiring a generator to reassigning a task to it, and of what that step implies for the evidence that occupation-level studies can supply.</w:t>
       </w:r>
     </w:p>
     <w:p>
@@ -318,245 +557,12 @@
         <w:rPr>
           <w:rFonts w:ascii="Times New Roman" w:hAnsi="Times New Roman" w:eastAsia="Times New Roman" w:cs="Times New Roman"/>
         </w:rPr>
-        <w:t xml:space="preserve">We are explicit about what the paper does not claim. We do not observe assimilation inside firms, and we do not treat small or fragile hiring responses as evidence of a gap. Our point is that such responses could not, at present, have revealed either a gap or its absence. Four accounts remain in contention: a capability failure, in which the tool does not meet task requirements; complete assimilation with net substitution; assimilation in which scale effects offset substitution; and an assimilation gap held open by missing complements. The barrier evidence weighs against the first at the acquisition margin. Separating the other three requires firm-level data that link use, complementary assets, task reassignment, and hiring, and we specify what such data would have to show.</w:t>
-      </w:r>
-    </w:p>
-    <w:p>
-      <w:pPr>
-        <w:pStyle w:val="BodyText"/>
-        <w:spacing w:line="480" w:lineRule="auto" w:after="0" w:before="0"/>
-        <w:ind w:firstLine="720"/>
-        <w:jc w:val="left"/>
-      </w:pPr>
-      <w:r>
-        <w:rPr>
-          <w:rFonts w:ascii="Times New Roman" w:hAnsi="Times New Roman" w:eastAsia="Times New Roman" w:cs="Times New Roman"/>
-        </w:rPr>
-        <w:t xml:space="preserve">The paper contributes to IS research in three ways.</w:t>
-      </w:r>
-    </w:p>
-    <w:p>
-      <w:pPr>
-        <w:pStyle w:val="BodyText"/>
-        <w:spacing w:line="480" w:lineRule="auto" w:after="0" w:before="0"/>
-        <w:ind w:firstLine="720"/>
-        <w:jc w:val="left"/>
-      </w:pPr>
-      <w:r>
-        <w:rPr>
-          <w:iCs/>
-          <w:rFonts w:ascii="Times New Roman" w:hAnsi="Times New Roman" w:eastAsia="Times New Roman" w:cs="Times New Roman"/>
-          <w:i/>
-        </w:rPr>
-        <w:t xml:space="preserve">First, a theoretical contribution.</w:t>
-      </w:r>
-      <w:r>
-        <w:rPr>
-          <w:rFonts w:ascii="Times New Roman" w:hAnsi="Times New Roman" w:eastAsia="Times New Roman" w:cs="Times New Roman"/>
-        </w:rPr>
-        <w:t xml:space="preserve"> </w:t>
-      </w:r>
-      <w:r>
-        <w:rPr>
-          <w:rFonts w:ascii="Times New Roman" w:hAnsi="Times New Roman" w:eastAsia="Times New Roman" w:cs="Times New Roman"/>
-        </w:rPr>
-        <w:t xml:space="preserve">We extend assimilation theory to generative AI by locating complementary assets in a single, observable cost term, review cost, and by showing why the near-zero acquisition cost of generative tools should widen the gap between acquisition and assimilation. The enterprise systems on which assimilation theory was built were costly to acquire, which meant that acquisition itself partly selected firms that had already built complements. A visual generator can be acquired with almost no complementary investment. Better models raise the acceptance rate of output, but they cannot supply the expertise, review capacity, or compliance procedures needed to cross the acceptance threshold. Reported use is therefore a weaker signal of task reassignment for generative tools than it was for earlier information technologies. Platform studies observe substitution because the buyer of a freelance task can switch tools without first building a review routine; standing occupations inside firms face that friction.</w:t>
-      </w:r>
-    </w:p>
-    <w:p>
-      <w:pPr>
-        <w:pStyle w:val="BodyText"/>
-        <w:spacing w:line="480" w:lineRule="auto" w:after="0" w:before="0"/>
-        <w:ind w:firstLine="720"/>
-        <w:jc w:val="left"/>
-      </w:pPr>
-      <w:r>
-        <w:rPr>
-          <w:iCs/>
-          <w:rFonts w:ascii="Times New Roman" w:hAnsi="Times New Roman" w:eastAsia="Times New Roman" w:cs="Times New Roman"/>
-          <w:i/>
-        </w:rPr>
-        <w:t xml:space="preserve">Second, a methodological contribution.</w:t>
-      </w:r>
-      <w:r>
-        <w:rPr>
-          <w:rFonts w:ascii="Times New Roman" w:hAnsi="Times New Roman" w:eastAsia="Times New Roman" w:cs="Times New Roman"/>
-        </w:rPr>
-        <w:t xml:space="preserve"> </w:t>
-      </w:r>
-      <w:r>
-        <w:rPr>
-          <w:rFonts w:ascii="Times New Roman" w:hAnsi="Times New Roman" w:eastAsia="Times New Roman" w:cs="Times New Roman"/>
-        </w:rPr>
-        <w:t xml:space="preserve">We provide a detectability bound that changes how an important part of the literature on AI exposure and hiring should be read. At current acquisition rates and at the substitution effects estimated on platforms, where assimilation is comparatively frictionless, complete assimilation of visual tasks would lower adverts in the most exposed occupations by roughly 2 to 17 percent. Standard European and Canadian occupation-level designs cannot detect effects of that size. The small gradients they do report cannot be told apart from an extrapolation of the pre-2022 trend and are therefore uninformative about assimilation. The bound is simple enough to be reported next to any exposure coefficient, and doing so guards against both false alarms and false reassurance.</w:t>
-      </w:r>
-    </w:p>
-    <w:p>
-      <w:pPr>
-        <w:pStyle w:val="BodyText"/>
-        <w:spacing w:line="480" w:lineRule="auto" w:after="0" w:before="0"/>
-        <w:ind w:firstLine="720"/>
-        <w:jc w:val="left"/>
-      </w:pPr>
-      <w:r>
-        <w:rPr>
-          <w:iCs/>
-          <w:rFonts w:ascii="Times New Roman" w:hAnsi="Times New Roman" w:eastAsia="Times New Roman" w:cs="Times New Roman"/>
-          <w:i/>
-        </w:rPr>
-        <w:t xml:space="preserve">Third, a research-design contribution.</w:t>
-      </w:r>
-      <w:r>
-        <w:rPr>
-          <w:rFonts w:ascii="Times New Roman" w:hAnsi="Times New Roman" w:eastAsia="Times New Roman" w:cs="Times New Roman"/>
-        </w:rPr>
-        <w:t xml:space="preserve"> </w:t>
-      </w:r>
-      <w:r>
-        <w:rPr>
-          <w:rFonts w:ascii="Times New Roman" w:hAnsi="Times New Roman" w:eastAsia="Times New Roman" w:cs="Times New Roman"/>
-        </w:rPr>
-        <w:t xml:space="preserve">We turn the assimilation-gap hypothesis into a set of falsifiable predictions that can be tested once firm-level data link reported use, the stock of complementary assets, task reassignment, and hiring. Among acquiring firms, reassignment should rise with expertise, review capacity, and compliance procedures, and hiring for visual occupations should fall only among firms that have both acquired the tool and built those assets. These predictions separate an assimilation gap from capability failure, from complete assimilation with net substitution, and from assimilation with offsetting scale effects, accounts that occupation-level data cannot currently tell apart.</w:t>
-      </w:r>
-    </w:p>
-    <w:p>
-      <w:pPr>
-        <w:pStyle w:val="BodyText"/>
-        <w:spacing w:line="480" w:lineRule="auto" w:after="0" w:before="0"/>
-        <w:ind w:firstLine="720"/>
-        <w:jc w:val="left"/>
-      </w:pPr>
-      <w:r>
-        <w:rPr>
-          <w:rFonts w:ascii="Times New Roman" w:hAnsi="Times New Roman" w:eastAsia="Times New Roman" w:cs="Times New Roman"/>
-        </w:rPr>
-        <w:t xml:space="preserve">The paper proceeds as follows. Section 2 reviews the literature. Section 3 develops the theory, Section 4 derives the detectability bound, and Section 5 describes the data. Sections 6 to 8 present the evidence on acquisition and barriers, apply the bound to hiring data (including a pilot with advert text), and ask when occupation-level data could become informative. Section 9 sets out a firm-level design, and Sections 10 and 11 discuss implications and conclude.</w:t>
-      </w:r>
-    </w:p>
-    <w:bookmarkEnd w:id="21"/>
-    <w:bookmarkStart w:id="25" w:name="related-literature"/>
-    <w:p>
-      <w:pPr>
-        <w:pStyle w:val="Heading2"/>
-      </w:pPr>
-      <w:r>
-        <w:rPr>
-          <w:rFonts w:ascii="Times New Roman" w:hAnsi="Times New Roman" w:eastAsia="Times New Roman" w:cs="Times New Roman"/>
-        </w:rPr>
-        <w:t xml:space="preserve">2 Related Literature</w:t>
-      </w:r>
-    </w:p>
-    <w:bookmarkStart w:id="22" w:name="from-adoption-to-assimilation"/>
-    <w:p>
-      <w:pPr>
-        <w:pStyle w:val="Heading3"/>
-      </w:pPr>
-      <w:r>
-        <w:rPr>
-          <w:rFonts w:ascii="Times New Roman" w:hAnsi="Times New Roman" w:eastAsia="Times New Roman" w:cs="Times New Roman"/>
-        </w:rPr>
-        <w:t xml:space="preserve">2.1 From Adoption to Assimilation</w:t>
-      </w:r>
-    </w:p>
-    <w:p>
-      <w:pPr>
-        <w:pStyle w:val="FirstParagraph"/>
-        <w:spacing w:line="480" w:lineRule="auto" w:after="0" w:before="0"/>
-        <w:ind w:firstLine="720"/>
-        <w:jc w:val="left"/>
-      </w:pPr>
-      <w:r>
-        <w:rPr>
-          <w:rFonts w:ascii="Times New Roman" w:hAnsi="Times New Roman" w:eastAsia="Times New Roman" w:cs="Times New Roman"/>
-        </w:rPr>
-        <w:t xml:space="preserve">IT implementation is a staged process in which adoption is followed by adaptation, acceptance, routinization, and infusion, and the factors that explain early stages differ from those that explain later ones (Cooper &amp; Zmud, 1990). Complex technologies spread slowly not because firms lack information about them but because they lack the know-how to use them, and mediating institutions emerge to lower that knowledge barrier (Attewell, 1992). The distinction becomes a measurement problem: cumulative acquisition of software-process innovations ran well ahead of cumulative deployment, and the resulting assimilation gap was largest for innovations with high knowledge barriers (Fichman &amp; Kemerer, 1999). Post-adoption usage and value vary widely across adopters of e-business, again pointing to organizational rather than technological determinants (Zhu &amp; Kraemer, 2005). The post-adoption literature has since described, in detail, how users continue to explore, extend, and often under-use the features of technologies they have formally adopted (Jasperson et al., 2005), and how organizational mechanisms such as top-management participation carry an enterprise system from implementation into use (Liang et al., 2007). We build on this tradition but apply it to an outcome that it has rarely examined: whether assimilation of a production technology reaches the occupation that used to perform the task.</w:t>
-      </w:r>
-    </w:p>
-    <w:bookmarkEnd w:id="22"/>
-    <w:bookmarkStart w:id="23" w:name="complementary-assets"/>
-    <w:p>
-      <w:pPr>
-        <w:pStyle w:val="Heading3"/>
-      </w:pPr>
-      <w:r>
-        <w:rPr>
-          <w:rFonts w:ascii="Times New Roman" w:hAnsi="Times New Roman" w:eastAsia="Times New Roman" w:cs="Times New Roman"/>
-        </w:rPr>
-        <w:t xml:space="preserve">2.2 Complementary Assets</w:t>
-      </w:r>
-    </w:p>
-    <w:p>
-      <w:pPr>
-        <w:pStyle w:val="FirstParagraph"/>
-        <w:spacing w:line="480" w:lineRule="auto" w:after="0" w:before="0"/>
-        <w:ind w:firstLine="720"/>
-        <w:jc w:val="left"/>
-      </w:pPr>
-      <w:r>
-        <w:rPr>
-          <w:rFonts w:ascii="Times New Roman" w:hAnsi="Times New Roman" w:eastAsia="Times New Roman" w:cs="Times New Roman"/>
-        </w:rPr>
-        <w:t xml:space="preserve">A second tradition holds that the value of information technology depends on complementary investments in skills, processes, and organizational design (Aral &amp; Weill, 2007; Brynjolfsson &amp; Hitt, 2000; Melville et al., 2004). General-purpose technologies display long lags for the same reason (Bresnahan &amp; Trajtenberg, 1995; David, 1990), and the lag can be formalized as a productivity J-curve in which intangible complements are built before measured gains appear (Brynjolfsson et al., 2021). When prediction becomes cheap, the value of human judgment rises (Agrawal et al., 2018). We draw on these ideas to make the complements concrete for generative visual AI and to locate them in a single cost term. Expertise, review capacity, and compliance procedures are not supplied by a better model. A better model can raise the share of acceptable output, but it does not create the person who can judge that output, the time in which to judge it, or the policy that says whether it may be used.</w:t>
-      </w:r>
-    </w:p>
-    <w:bookmarkEnd w:id="23"/>
-    <w:bookmarkStart w:id="24" w:name="Xcbcf59c475a0a23fbdb63f118109907a2bbf8fb"/>
-    <w:p>
-      <w:pPr>
-        <w:pStyle w:val="Heading3"/>
-      </w:pPr>
-      <w:r>
-        <w:rPr>
-          <w:rFonts w:ascii="Times New Roman" w:hAnsi="Times New Roman" w:eastAsia="Times New Roman" w:cs="Times New Roman"/>
-        </w:rPr>
-        <w:t xml:space="preserve">2.3 Generative AI, Work, and Information Systems Research</w:t>
-      </w:r>
-    </w:p>
-    <w:p>
-      <w:pPr>
-        <w:pStyle w:val="FirstParagraph"/>
-        <w:spacing w:line="480" w:lineRule="auto" w:after="0" w:before="0"/>
-        <w:ind w:firstLine="720"/>
-        <w:jc w:val="left"/>
-      </w:pPr>
-      <w:r>
-        <w:rPr>
-          <w:rFonts w:ascii="Times New Roman" w:hAnsi="Times New Roman" w:eastAsia="Times New Roman" w:cs="Times New Roman"/>
-        </w:rPr>
-        <w:t xml:space="preserve">A large literature maps AI capabilities onto occupational tasks (Eloundou et al., 2023; Felten et al., 2021; Webb, 2020). Exposure measures describe where a technology could matter, not where it has been acquired or assimilated. Task-based models separate the displacement, reinstatement, and productivity effects of automation (Acemoglu &amp; Restrepo, 2018, 2019), and models of unbalanced growth show that tasks which cannot be automated become bottlenecks (Aghion et al., 2019; Baumol, 1967); we use both ideas in Section 3. Establishments exposed to AI change their hiring, but little aggregate effect is detectable at the occupation or industry level (Acemoglu et al., 2022). Danish registers linked to adoption surveys show precise zeros for adopters’ earnings and hours (Humlum &amp; Vestergaard, 2025). Evidence from online labor markets is sharper. Freelancers exposed to ChatGPT and image generators lost employment and earnings (Hui et al., 2024), and image-creation posts fell by about 17 percent after image generators were released, relative to manual-intensive jobs (Demirci et al., 2025). On creator platforms, generative tools raise output for some artists and reallocate demand across creator types (Kim et al., 2026; Zhou &amp; Lee, 2024), and inside firms they raise individual productivity on suitable tasks (Brynjolfsson et al., 2025). These settings share a feature that our theory makes explicit: the buyer of a freelance task, or a worker inside a studied team, can switch to the tool without the firm first building a review routine or a compliance policy. We use the platform estimates as a reference for how large substitution can be once assimilation has occurred, not as a test of our account.</w:t>
-      </w:r>
-    </w:p>
-    <w:p>
-      <w:pPr>
-        <w:pStyle w:val="BodyText"/>
-        <w:spacing w:line="480" w:lineRule="auto" w:after="0" w:before="0"/>
-        <w:ind w:firstLine="720"/>
-        <w:jc w:val="left"/>
-      </w:pPr>
-      <w:r>
-        <w:rPr>
-          <w:rFonts w:ascii="Times New Roman" w:hAnsi="Times New Roman" w:eastAsia="Times New Roman" w:cs="Times New Roman"/>
-        </w:rPr>
-        <w:t xml:space="preserve">Within IS, work on AI has mostly examined what happens inside organizations that already use it. Experimental evidence suggests that people are poorly calibrated about their own capabilities when deciding whether to delegate to an AI system (Fügener et al., 2022), which implies that judging machine output is not costless even for competent workers; this is the mechanism that our review-cost term abstracts. Editorial work has framed AI as something that must be managed as a continually moving technological frontier (Berente et al., 2021), as a component of human–AI hybrids that reshape digital labor platforms (Rai et al., 2019), and, in the case of generative models, as a double-edged tool for knowledge work (Susarla et al., 2023). Studies of this kind take use as given. Labor economics, by contrast, takes the occupation as the unit and asks whether exposure predicts hiring, but seldom asks whether exposed employers have changed how work is done. What is missing is an account of the step in between, from acquiring a generator to reassigning a task to it, and of what that step implies for the evidence that occupation-level studies can supply.</w:t>
-      </w:r>
-    </w:p>
-    <w:p>
-      <w:pPr>
-        <w:pStyle w:val="BodyText"/>
-        <w:spacing w:line="480" w:lineRule="auto" w:after="0" w:before="0"/>
-        <w:ind w:firstLine="720"/>
-        <w:jc w:val="left"/>
-      </w:pPr>
-      <w:r>
-        <w:rPr>
-          <w:rFonts w:ascii="Times New Roman" w:hAnsi="Times New Roman" w:eastAsia="Times New Roman" w:cs="Times New Roman"/>
-        </w:rPr>
         <w:t xml:space="preserve">Two strands of work are close to our empirical approach. Tambe and Hitt (2012) showed that IT labor data can sharpen measurement of IT’s contribution to firm output. We use the same kind of data, online job adverts, for a narrower purpose: to ask what such data can and cannot reveal about assimilation. Babina et al. (2024) build firm-level indicators of AI investment from workforce data and find that AI-investing firms grow faster, mainly through product innovation. That is precisely the sort of firm-level linkage that the design in Section 9 requires for generative visual AI.</w:t>
       </w:r>
     </w:p>
     <w:bookmarkEnd w:id="24"/>
     <w:bookmarkEnd w:id="25"/>
-    <w:bookmarkStart w:id="33" w:name="theory"/>
+    <w:bookmarkStart w:id="34" w:name="theory"/>
     <w:p>
       <w:pPr>
         <w:pStyle w:val="Heading2"/>
@@ -5516,7 +5522,7 @@
         <w:rPr>
           <w:rFonts w:ascii="Times New Roman" w:hAnsi="Times New Roman" w:eastAsia="Times New Roman" w:cs="Times New Roman"/>
         </w:rPr>
-        <w:t xml:space="preserve">From the table we derive two hypotheses that can be examined with current data and one that cannot.</w:t>
+        <w:t xml:space="preserve">From the table we derive two hypotheses that can be examined with current data and one that cannot. Section 3.8 adds the conceptual claims behind H3, and Section 9 proposes the design that would test it.</w:t>
       </w:r>
       <w:r>
         <w:rPr>
@@ -5582,7 +5588,7 @@
           <w:rFonts w:ascii="Times New Roman" w:hAnsi="Times New Roman" w:eastAsia="Times New Roman" w:cs="Times New Roman"/>
           <w:b/>
         </w:rPr>
-        <w:t xml:space="preserve">H3 (firm-level, for future data):</w:t>
+        <w:t xml:space="preserve">H3 (firm-level, a design proposal for future data, not tested here):</w:t>
       </w:r>
       <w:r>
         <w:rPr>
@@ -5615,8 +5621,164 @@
       </w:r>
     </w:p>
     <w:bookmarkEnd w:id="32"/>
+    <w:bookmarkStart w:id="33" w:name="extending-assimilation-theory"/>
+    <w:p>
+      <w:pPr>
+        <w:pStyle w:val="Heading3"/>
+      </w:pPr>
+      <w:r>
+        <w:rPr>
+          <w:rFonts w:ascii="Times New Roman" w:hAnsi="Times New Roman" w:eastAsia="Times New Roman" w:cs="Times New Roman"/>
+        </w:rPr>
+        <w:t xml:space="preserve">3.8 Extending Assimilation Theory</w:t>
+      </w:r>
+    </w:p>
+    <w:p>
+      <w:pPr>
+        <w:pStyle w:val="FirstParagraph"/>
+        <w:spacing w:line="480" w:lineRule="auto" w:after="0" w:before="0"/>
+        <w:ind w:firstLine="720"/>
+        <w:jc w:val="left"/>
+      </w:pPr>
+      <w:r>
+        <w:rPr>
+          <w:rFonts w:ascii="Times New Roman" w:hAnsi="Times New Roman" w:eastAsia="Times New Roman" w:cs="Times New Roman"/>
+        </w:rPr>
+        <w:t xml:space="preserve">The model carries three claims that go beyond restating the assimilation gap for a new technology. We state them as conceptual claims, not as results of this paper, and Section 9 sets out how each could be tested.</w:t>
+      </w:r>
+    </w:p>
+    <w:p>
+      <w:pPr>
+        <w:pStyle w:val="BodyText"/>
+        <w:spacing w:line="480" w:lineRule="auto" w:after="0" w:before="0"/>
+        <w:ind w:firstLine="720"/>
+        <w:jc w:val="left"/>
+      </w:pPr>
+      <w:r>
+        <w:rPr>
+          <w:iCs/>
+          <w:rFonts w:ascii="Times New Roman" w:hAnsi="Times New Roman" w:eastAsia="Times New Roman" w:cs="Times New Roman"/>
+          <w:i/>
+        </w:rPr>
+        <w:t xml:space="preserve">Judgment complements differ from production complements.</w:t>
+      </w:r>
+      <w:r>
+        <w:rPr>
+          <w:rFonts w:ascii="Times New Roman" w:hAnsi="Times New Roman" w:eastAsia="Times New Roman" w:cs="Times New Roman"/>
+        </w:rPr>
+        <w:t xml:space="preserve"> </w:t>
+      </w:r>
+      <w:r>
+        <w:rPr>
+          <w:rFonts w:ascii="Times New Roman" w:hAnsi="Times New Roman" w:eastAsia="Times New Roman" w:cs="Times New Roman"/>
+        </w:rPr>
+        <w:t xml:space="preserve">In the classic account, knowledge barriers impede building the competence needed to make a technology work (Attewell, 1992; Fichman &amp; Kemerer, 1999). Complementary assets in the resource-based tradition are likewise those a firm needs to produce and capture value from an innovation (Teece, 1986; Wade &amp; Hulland, 2004). Generative tools remove most of this production barrier, since a person can operate a generator on the first day. What remains is a different kind of complement: the capacity to judge whether an output is acceptable, which here consists of expertise, review capacity, and compliance procedures. Production complements govern whether a technology can be used, whereas judgment complements govern whether its output can be relied on in place of human work. The distinction is close to absorptive capacity (Cohen &amp; Levinthal, 1990), the ability to recognize and apply external knowledge, with the difference that the object recognized is a machine’s output on a specific task and not a body of outside knowledge. Treating the two classes of complements separately explains why a tool that is easy to use can still be hard to assimilate.</w:t>
+      </w:r>
+    </w:p>
+    <w:p>
+      <w:pPr>
+        <w:pStyle w:val="BodyText"/>
+        <w:spacing w:line="480" w:lineRule="auto" w:after="0" w:before="0"/>
+        <w:ind w:firstLine="720"/>
+        <w:jc w:val="left"/>
+      </w:pPr>
+      <w:r>
+        <w:rPr>
+          <w:iCs/>
+          <w:rFonts w:ascii="Times New Roman" w:hAnsi="Times New Roman" w:eastAsia="Times New Roman" w:cs="Times New Roman"/>
+          <w:i/>
+        </w:rPr>
+        <w:t xml:space="preserve">Acquisition is informative about assimilation in proportion to its cost.</w:t>
+      </w:r>
+      <w:r>
+        <w:rPr>
+          <w:rFonts w:ascii="Times New Roman" w:hAnsi="Times New Roman" w:eastAsia="Times New Roman" w:cs="Times New Roman"/>
+        </w:rPr>
+        <w:t xml:space="preserve"> </w:t>
+      </w:r>
+      <w:r>
+        <w:rPr>
+          <w:rFonts w:ascii="Times New Roman" w:hAnsi="Times New Roman" w:eastAsia="Times New Roman" w:cs="Times New Roman"/>
+        </w:rPr>
+        <w:t xml:space="preserve">When acquiring a technology requires a large commitment, a firm that acquires it has typically decided to reorganize work around it, and acquisition counts therefore carry information about deployment. As acquisition cost falls toward zero, firms acquire to explore, and acquisition counts carry less information about deployment. The conditional probability that an acquiring firm has assimilated a task is therefore lower for generative tools than for earlier technologies, even when the tool is valuable once assimilated. This implies that the assimilation gap should widen as acquisition becomes cheaper, which reverses the usual expectation that falling costs speed diffusion into use. We do not derive this formally; it follows from the threshold in equation (1) combined with free acquisition, and it is the claim most in need of firm-level evidence.</w:t>
+      </w:r>
+    </w:p>
+    <w:p>
+      <w:pPr>
+        <w:pStyle w:val="BodyText"/>
+        <w:spacing w:line="480" w:lineRule="auto" w:after="0" w:before="0"/>
+        <w:ind w:firstLine="720"/>
+        <w:jc w:val="left"/>
+      </w:pPr>
+      <w:r>
+        <w:rPr>
+          <w:iCs/>
+          <w:rFonts w:ascii="Times New Roman" w:hAnsi="Times New Roman" w:eastAsia="Times New Roman" w:cs="Times New Roman"/>
+          <w:i/>
+        </w:rPr>
+        <w:t xml:space="preserve">Assimilation is a property of the task, not of the firm.</w:t>
+      </w:r>
+      <w:r>
+        <w:rPr>
+          <w:rFonts w:ascii="Times New Roman" w:hAnsi="Times New Roman" w:eastAsia="Times New Roman" w:cs="Times New Roman"/>
+        </w:rPr>
+        <w:t xml:space="preserve"> </w:t>
+      </w:r>
+      <w:r>
+        <w:rPr>
+          <w:rFonts w:ascii="Times New Roman" w:hAnsi="Times New Roman" w:eastAsia="Times New Roman" w:cs="Times New Roman"/>
+        </w:rPr>
+        <w:t xml:space="preserve">Assimilation scales used in earlier work, such as routinization and infusion (Cooper &amp; Zmud, 1990), describe how deeply a firm has embedded a technology. In our model a firm that has acquired the same generator can have assimilated some visual tasks and not others, because the review cost relative to the cost of human production differs across tasks, and a single firm-level score hides this variation. The unit of analysis for assimilation should be the task, with the firm as the setting in which review capacity is supplied. This also means that within-firm comparisons across tasks can identify the mechanism with firm characteristics held fixed.</w:t>
+      </w:r>
+    </w:p>
+    <w:p>
+      <w:pPr>
+        <w:pStyle w:val="BodyText"/>
+        <w:spacing w:line="480" w:lineRule="auto" w:after="0" w:before="0"/>
+        <w:ind w:firstLine="720"/>
+        <w:jc w:val="left"/>
+      </w:pPr>
+      <w:r>
+        <w:rPr>
+          <w:iCs/>
+          <w:rFonts w:ascii="Times New Roman" w:hAnsi="Times New Roman" w:eastAsia="Times New Roman" w:cs="Times New Roman"/>
+          <w:i/>
+        </w:rPr>
+        <w:t xml:space="preserve">Boundary conditions.</w:t>
+      </w:r>
+      <w:r>
+        <w:rPr>
+          <w:rFonts w:ascii="Times New Roman" w:hAnsi="Times New Roman" w:eastAsia="Times New Roman" w:cs="Times New Roman"/>
+        </w:rPr>
+        <w:t xml:space="preserve"> </w:t>
+      </w:r>
+      <w:r>
+        <w:rPr>
+          <w:rFonts w:ascii="Times New Roman" w:hAnsi="Times New Roman" w:eastAsia="Times New Roman" w:cs="Times New Roman"/>
+        </w:rPr>
+        <w:t xml:space="preserve">The account is not a general claim about generative AI. It predicts a smaller assimilation gap where output can be verified cheaply and mechanically (for example, code that is checked by tests), where the reviewer is also the buyer of the output, as on freelance platforms, or where no compliance regime binds. It predicts a larger gap for tasks whose output is judged by taste or by legal exposure, such as brand imagery and licensed content. The platform estimates in Section 2.3 are consistent with the first two conditions. Finally, the model abstracts from how review routines form. Studies of technology appropriation and of the routines that grow around technology (Leonardi, 2011; Orlikowski, 2000) are where that process is described, and we treat its outcome as the stock of complements</w:t>
+      </w:r>
+      <w:r>
+        <w:rPr>
+          <w:rFonts w:ascii="Times New Roman" w:hAnsi="Times New Roman" w:eastAsia="Times New Roman" w:cs="Times New Roman"/>
+        </w:rPr>
+        <w:t xml:space="preserve"> </w:t>
+      </w:r>
+      <m:oMath>
+        <m:r>
+          <m:t>K</m:t>
+        </m:r>
+      </m:oMath>
+      <w:r>
+        <w:rPr>
+          <w:rFonts w:ascii="Times New Roman" w:hAnsi="Times New Roman" w:eastAsia="Times New Roman" w:cs="Times New Roman"/>
+        </w:rPr>
+        <w:t xml:space="preserve">.</w:t>
+      </w:r>
+    </w:p>
     <w:bookmarkEnd w:id="33"/>
-    <w:bookmarkStart w:id="34" w:name="what-occupation-level-data-can-identify"/>
+    <w:bookmarkEnd w:id="34"/>
+    <w:bookmarkStart w:id="35" w:name="what-occupation-level-data-can-identify"/>
     <w:p>
       <w:pPr>
         <w:pStyle w:val="Heading2"/>
@@ -6235,8 +6397,8 @@
         <w:t xml:space="preserve">(a 39 percent fall among assimilating employers) as an aggressive case. Appendix B gives the derivation, including the effect of measurement error in exposure.</w:t>
       </w:r>
     </w:p>
-    <w:bookmarkEnd w:id="34"/>
-    <w:bookmarkStart w:id="38" w:name="data"/>
+    <w:bookmarkEnd w:id="35"/>
+    <w:bookmarkStart w:id="39" w:name="data"/>
     <w:p>
       <w:pPr>
         <w:pStyle w:val="Heading2"/>
@@ -6248,7 +6410,7 @@
         <w:t xml:space="preserve">5 Data</w:t>
       </w:r>
     </w:p>
-    <w:bookmarkStart w:id="35" w:name="acquisition-and-barriers"/>
+    <w:bookmarkStart w:id="36" w:name="acquisition-and-barriers"/>
     <w:p>
       <w:pPr>
         <w:pStyle w:val="Heading3"/>
@@ -6274,8 +6436,8 @@
         <w:t xml:space="preserve">We use Eurostat’s survey on ICT usage in enterprises (Eurostat, 2026), which covers firms with ten or more employees in the EU27. The 2025 wave asks whether enterprises use AI that generates pictures, video, or sound. This is the closest public measure of acquisition of generative visual AI and is available only for 2025. Text generation, asked in 2021, 2023, 2024, and 2025, and image recognition provide the time path of neighboring AI uses. The survey asks enterprises that considered AI but did not adopt it why they did not, offering lack of expertise, unclear legal consequences, data protection and privacy, costs, data availability or quality, incompatibility with existing systems, ethical considerations, and the view that AI is not useful. These items correspond to the complementary assets, with two limits that bound every inference below: they refer to AI in general rather than to visual generators, and they are asked only of firms that considered AI. They describe the acquisition margin, not the assimilation margin among users.</w:t>
       </w:r>
     </w:p>
-    <w:bookmarkEnd w:id="35"/>
-    <w:bookmarkStart w:id="36" w:name="hiring-series"/>
+    <w:bookmarkEnd w:id="36"/>
+    <w:bookmarkStart w:id="37" w:name="hiring-series"/>
     <w:p>
       <w:pPr>
         <w:pStyle w:val="Heading3"/>
@@ -6301,8 +6463,8 @@
         <w:t xml:space="preserve">Because the acquisition measure covers EU firms, the hiring series is Eurostat’s experimental online job advertisements by ISCO-08 three-digit occupation, 2019 to 2024 (Eurostat, 2026), with 2022 as the base year (604 country-occupation cells, 96 occupations, 16 countries, after a floor of 1,000 base-year adverts). Its population matches the acquisition data, but it offers only two post-2022 years. The Canadian series is the Job Vacancy and Wage Survey by NOC 2021 unit group, 2015 to 2026 (Statistics Canada, 2026), restricted to 312 unit groups with all four quarters observed in the 2022 base year and at least 1,000 vacancies in that year. The quarter 2020Q2 was not collected, so 2020 and 2021 cannot be used; annual figures are quarterly means, and 2026 covers the first two quarters, compared with the same quarters of 2022. European Labour Force Survey employment by industry and US sector postings from Indeed Hiring Lab (2026) are used descriptively.</w:t>
       </w:r>
     </w:p>
-    <w:bookmarkEnd w:id="36"/>
-    <w:bookmarkStart w:id="37" w:name="exposure-and-its-measurement"/>
+    <w:bookmarkEnd w:id="37"/>
+    <w:bookmarkStart w:id="38" w:name="exposure-and-its-measurement"/>
     <w:p>
       <w:pPr>
         <w:pStyle w:val="Heading3"/>
@@ -6339,7 +6501,7 @@
         <w:rPr>
           <w:rFonts w:ascii="Times New Roman" w:hAnsi="Times New Roman" w:eastAsia="Times New Roman" w:cs="Times New Roman"/>
         </w:rPr>
-        <w:t xml:space="preserve">The construct is hard to code, and we have no human coding of these scores. We therefore report two checks on measurement noise, neither of which substitutes for validation against human coders. First, we scored the same statements with a second, unrelated model (GPT-5.6 Luna). On the visual rubric the two models agree on 96.8 percent of task statements (Cohen’s</w:t>
+        <w:t xml:space="preserve">The construct is hard to code, so we validate the scores against human coders and report two further checks on measurement noise. Two human coders scored 199 task statements on the visual rubric (0, 1, or 2) independently and without seeing the model scores; one is the author and the other an undergraduate physics student with no prior exposure to the project, who received only the written rubric and no further instruction. The sample was stratified by an earlier model pass and a keyword rule (four strata, 200 statements drawn, one dropped as unscorable), so we weight by inverse sampling probability to estimate agreement in the full set of statements. The coders agree on 77 percent of statements (59 percent unweighted), with a weighted</w:t>
       </w:r>
       <w:r>
         <w:rPr>
@@ -6362,6 +6524,75 @@
         <w:rPr>
           <w:rFonts w:ascii="Times New Roman" w:hAnsi="Times New Roman" w:eastAsia="Times New Roman" w:cs="Times New Roman"/>
         </w:rPr>
+        <w:t xml:space="preserve">of 0.42 (linear-weighted 0.49, binary 0.55). Against the author’s codes, the primary model’s scores agree on 75 percent of statements, with a weighted</w:t>
+      </w:r>
+      <w:r>
+        <w:rPr>
+          <w:rFonts w:ascii="Times New Roman" w:hAnsi="Times New Roman" w:eastAsia="Times New Roman" w:cs="Times New Roman"/>
+        </w:rPr>
+        <w:t xml:space="preserve"> </w:t>
+      </w:r>
+      <m:oMath>
+        <m:r>
+          <m:t>κ</m:t>
+        </m:r>
+      </m:oMath>
+      <w:r>
+        <w:rPr>
+          <w:rFonts w:ascii="Times New Roman" w:hAnsi="Times New Roman" w:eastAsia="Times New Roman" w:cs="Times New Roman"/>
+        </w:rPr>
+        <w:t xml:space="preserve"> </w:t>
+      </w:r>
+      <w:r>
+        <w:rPr>
+          <w:rFonts w:ascii="Times New Roman" w:hAnsi="Times New Roman" w:eastAsia="Times New Roman" w:cs="Times New Roman"/>
+        </w:rPr>
+        <w:t xml:space="preserve">of 0.18 (linear-weighted 0.23); against the student coder the weighted</w:t>
+      </w:r>
+      <w:r>
+        <w:rPr>
+          <w:rFonts w:ascii="Times New Roman" w:hAnsi="Times New Roman" w:eastAsia="Times New Roman" w:cs="Times New Roman"/>
+        </w:rPr>
+        <w:t xml:space="preserve"> </w:t>
+      </w:r>
+      <m:oMath>
+        <m:r>
+          <m:t>κ</m:t>
+        </m:r>
+      </m:oMath>
+      <w:r>
+        <w:rPr>
+          <w:rFonts w:ascii="Times New Roman" w:hAnsi="Times New Roman" w:eastAsia="Times New Roman" w:cs="Times New Roman"/>
+        </w:rPr>
+        <w:t xml:space="preserve"> </w:t>
+      </w:r>
+      <w:r>
+        <w:rPr>
+          <w:rFonts w:ascii="Times New Roman" w:hAnsi="Times New Roman" w:eastAsia="Times New Roman" w:cs="Times New Roman"/>
+        </w:rPr>
+        <w:t xml:space="preserve">is 0.11 (linear-weighted 0.16). The second model gives 0.20 and 0.16. The model almost never assigns a nonzero score that a coder rejects against the author (specificity 0.99, positive predictive value 0.82), though it is less conservative against the student coder (0.96, 0.54), and it misses most of the visual content the coders identify (sensitivity 0.13 to 0.22). Model-human agreement is therefore well below human-human agreement, so the scores are a conservative, high-precision indicator of visual content rather than a complete one, and the exposure gradients should be read with that in mind. Next, we report two checks on measurement noise, neither of which substitutes for validation against human coders. First, we scored the same statements with a second, unrelated model (GPT-5.6 Luna). On the visual rubric the two models agree on 96.8 percent of task statements (Cohen’s</w:t>
+      </w:r>
+      <w:r>
+        <w:rPr>
+          <w:rFonts w:ascii="Times New Roman" w:hAnsi="Times New Roman" w:eastAsia="Times New Roman" w:cs="Times New Roman"/>
+        </w:rPr>
+        <w:t xml:space="preserve"> </w:t>
+      </w:r>
+      <m:oMath>
+        <m:r>
+          <m:t>κ</m:t>
+        </m:r>
+      </m:oMath>
+      <w:r>
+        <w:rPr>
+          <w:rFonts w:ascii="Times New Roman" w:hAnsi="Times New Roman" w:eastAsia="Times New Roman" w:cs="Times New Roman"/>
+        </w:rPr>
+        <w:t xml:space="preserve"> </w:t>
+      </w:r>
+      <w:r>
+        <w:rPr>
+          <w:rFonts w:ascii="Times New Roman" w:hAnsi="Times New Roman" w:eastAsia="Times New Roman" w:cs="Times New Roman"/>
+        </w:rPr>
         <w:t xml:space="preserve">= 0.66, quadratic-weighted</w:t>
       </w:r>
       <w:r>
@@ -6469,9 +6700,9 @@
         <w:t xml:space="preserve">(0.017) in 2024). Agreement between two language models shows that the scores are stable, not that they are valid, because the models may share biases. Second, classical measurement error attenuates the coefficient per standard deviation of exposure by the square root of the reliability (Appendix B). Complete assimilation would then produce a smaller coefficient than the one in equation (5), while the minimum detectable effect is unchanged, so noise in exposure strengthens the detectability result. What noise weakens is the substantive reading of any observed gradient, which is why we classify gradients with the bound before interpreting them. We do not correct the coefficients for attenuation.</w:t>
       </w:r>
     </w:p>
-    <w:bookmarkEnd w:id="37"/>
     <w:bookmarkEnd w:id="38"/>
-    <w:bookmarkStart w:id="41" w:name="the-acquisition-margin"/>
+    <w:bookmarkEnd w:id="39"/>
+    <w:bookmarkStart w:id="42" w:name="the-acquisition-margin"/>
     <w:p>
       <w:pPr>
         <w:pStyle w:val="Heading2"/>
@@ -6483,7 +6714,7 @@
         <w:t xml:space="preserve">6 The Acquisition Margin</w:t>
       </w:r>
     </w:p>
-    <w:bookmarkStart w:id="39" w:name="acquisition-is-substantial-and-rising"/>
+    <w:bookmarkStart w:id="40" w:name="acquisition-is-substantial-and-rising"/>
     <w:p>
       <w:pPr>
         <w:pStyle w:val="Heading3"/>
@@ -7168,8 +7399,8 @@
         <w:t xml:space="preserve">), not assimilation.</w:t>
       </w:r>
     </w:p>
-    <w:bookmarkEnd w:id="39"/>
-    <w:bookmarkStart w:id="40" w:name="X3987abe33d6ec8a85609fe7383eac026929fb85"/>
+    <w:bookmarkEnd w:id="40"/>
+    <w:bookmarkStart w:id="41" w:name="X3987abe33d6ec8a85609fe7383eac026929fb85"/>
     <w:p>
       <w:pPr>
         <w:pStyle w:val="Heading3"/>
@@ -7984,9 +8215,9 @@
         <w:t xml:space="preserve">-values 0.016 to 0.023). Exposure therefore identifies digitally intensive sectors rather than a specific propensity to acquire visual generators, which is a further reason not to read exposure gradients in hiring as effects of visual generation.</w:t>
       </w:r>
     </w:p>
-    <w:bookmarkEnd w:id="40"/>
     <w:bookmarkEnd w:id="41"/>
-    <w:bookmarkStart w:id="48" w:name="X0775f8330c9593e54d58f04a83b284a01583fa5"/>
+    <w:bookmarkEnd w:id="42"/>
+    <w:bookmarkStart w:id="49" w:name="X0775f8330c9593e54d58f04a83b284a01583fa5"/>
     <w:p>
       <w:pPr>
         <w:pStyle w:val="Heading2"/>
@@ -7998,7 +8229,7 @@
         <w:t xml:space="preserve">7 Occupation-Level Hiring Through the Bound</w:t>
       </w:r>
     </w:p>
-    <w:bookmarkStart w:id="42" w:name="exposure-gradients"/>
+    <w:bookmarkStart w:id="43" w:name="exposure-gradients"/>
     <w:p>
       <w:pPr>
         <w:pStyle w:val="Heading3"/>
@@ -9300,8 +9531,8 @@
         <w:t xml:space="preserve">percent in 2024, 2025, and the first half of 2026, with standard errors of 3.3, 2.2, and 4.3), in a market where total vacancies fell 47 percent between 2022 and 2025–2026.</w:t>
       </w:r>
     </w:p>
-    <w:bookmarkEnd w:id="42"/>
-    <w:bookmarkStart w:id="43" w:name="applying-the-bound"/>
+    <w:bookmarkEnd w:id="43"/>
+    <w:bookmarkStart w:id="44" w:name="applying-the-bound"/>
     <w:p>
       <w:pPr>
         <w:pStyle w:val="Heading3"/>
@@ -11032,8 +11263,8 @@
         <w:t xml:space="preserve">The Canadian series has standard errors of 0.013 to 0.043 per standard deviation after 2022, so its minimum detectable effect is about 0.04 to 0.12 per standard deviation. For the most exposed unit group, 7.1 standard deviations above the mean, this corresponds to a log change of about 0.25 to 0.85. The Canadian series is therefore uninformative about assimilation at any plausible acquisition rate, and its first-year coefficient, which does not persist, leads to the same classification.</w:t>
       </w:r>
     </w:p>
-    <w:bookmarkEnd w:id="43"/>
-    <w:bookmarkStart w:id="44" w:name="employment-where-acquisition-is-highest"/>
+    <w:bookmarkEnd w:id="44"/>
+    <w:bookmarkStart w:id="45" w:name="employment-where-acquisition-is-highest"/>
     <w:p>
       <w:pPr>
         <w:pStyle w:val="Heading3"/>
@@ -11114,8 +11345,8 @@
         <w:t xml:space="preserve">across 47 sectors, but postings for software development and for data and analytics fell by 0.96 and 0.86, and four of the five sectors had risen by more than the median sector between 2020 and 2022 (descriptive only). The finest public occupation-by-industry cross-tabulation (one-digit occupations by industry section) shows professionals’ employment growing by 0.26 log points in information and communication, 0.17 in professional and technical activities, and 0.14 in arts and entertainment, against a median of 0.19 across 21 sections; these groups are dominated by occupations other than visual production, and two-digit occupation data (legal, social, and cultural professionals, +0.09, against a median of 0.02 across two-digit occupations) are too coarse to isolate designers or artists. Neither series isolates visual generation, and both are consistent with every account in Table 1 other than large and rapid net substitution.</w:t>
       </w:r>
     </w:p>
-    <w:bookmarkEnd w:id="44"/>
-    <w:bookmarkStart w:id="45" w:name="acquisition-interaction-in-europe"/>
+    <w:bookmarkEnd w:id="45"/>
+    <w:bookmarkStart w:id="46" w:name="acquisition-interaction-in-europe"/>
     <w:p>
       <w:pPr>
         <w:pStyle w:val="Heading3"/>
@@ -11373,8 +11604,8 @@
         <w:t xml:space="preserve">), far smaller than the 2024 standard error, so the test cannot discriminate among the accounts. Acquisition is measured in 2025, after the outcomes. We report the test because it is the only one here that uses variation in acquisition directly. It becomes informative only with more countries, more post-2022 years, and acquisition measured before the outcome. The detectability result does not depend on it, because that result depends only on acquisition rates, reference effect sizes, and standard errors.</w:t>
       </w:r>
     </w:p>
-    <w:bookmarkEnd w:id="45"/>
-    <w:bookmarkStart w:id="46" w:name="sector-level-acquisition-and-employment"/>
+    <w:bookmarkEnd w:id="46"/>
+    <w:bookmarkStart w:id="47" w:name="sector-level-acquisition-and-employment"/>
     <w:p>
       <w:pPr>
         <w:pStyle w:val="Heading3"/>
@@ -11507,8 +11738,8 @@
         <w:t xml:space="preserve">is well below one, the implied effect is far smaller than the standard errors. Sector-level data therefore show that acquisition marks growing, digitally intensive sectors, not that it displaces labor, and they cannot reveal the assimilation margin; this is the limit that firm-level data would remove.</w:t>
       </w:r>
     </w:p>
-    <w:bookmarkEnd w:id="46"/>
-    <w:bookmarkStart w:id="47" w:name="evidence-from-job-advert-text"/>
+    <w:bookmarkEnd w:id="47"/>
+    <w:bookmarkStart w:id="48" w:name="evidence-from-job-advert-text"/>
     <w:p>
       <w:pPr>
         <w:pStyle w:val="Heading3"/>
@@ -11686,9 +11917,9 @@
         <w:t xml:space="preserve">These data do not identify the mechanism, for reasons that bear on any use of advert text. A crawl records the stock of postings that were live and crawled at one time, not hires, and crawl coverage differs across years. Employers are matched by name. Acquirer status and complements are inferred from keywords and titles, and the cells with both are small. The evidence supports the descriptive point above and nothing stronger. A test of H3 needs the firm-level measures of use, complements, reassignment, and hiring described in Section 9.</w:t>
       </w:r>
     </w:p>
-    <w:bookmarkEnd w:id="47"/>
     <w:bookmarkEnd w:id="48"/>
-    <w:bookmarkStart w:id="49" w:name="X2061958f846d060753ea4141165ee0cf5000e1a"/>
+    <w:bookmarkEnd w:id="49"/>
+    <w:bookmarkStart w:id="50" w:name="X2061958f846d060753ea4141165ee0cf5000e1a"/>
     <w:p>
       <w:pPr>
         <w:pStyle w:val="Heading2"/>
@@ -12668,8 +12899,8 @@
         <w:t xml:space="preserve">are already within reach in 2025, because that sector’s acquisition rate exceeds the required share. They show that only very large effects concentrated in high-acquisition sectors could already be detectable, and even these assume that every acquiring employer has assimilated the tool. Questions about generative-AI assimilation in standing occupations will have to be answered with firm-level data.</w:t>
       </w:r>
     </w:p>
-    <w:bookmarkEnd w:id="49"/>
-    <w:bookmarkStart w:id="50" w:name="X6515d1f6798b7cfc91e91c5bb73d9eb857260c5"/>
+    <w:bookmarkEnd w:id="50"/>
+    <w:bookmarkStart w:id="51" w:name="X2117a87807dfa3e48e566d104cf7001f8a6fdcc"/>
     <w:p>
       <w:pPr>
         <w:pStyle w:val="Heading2"/>
@@ -12678,7 +12909,7 @@
         <w:rPr>
           <w:rFonts w:ascii="Times New Roman" w:hAnsi="Times New Roman" w:eastAsia="Times New Roman" w:cs="Times New Roman"/>
         </w:rPr>
-        <w:t xml:space="preserve">9 A Firm-Level Design That Would Discriminate</w:t>
+        <w:t xml:space="preserve">9 A Research Design for H3: What Firm-Level Data Would Need to Show</w:t>
       </w:r>
     </w:p>
     <w:p>
@@ -12692,7 +12923,7 @@
         <w:rPr>
           <w:rFonts w:ascii="Times New Roman" w:hAnsi="Times New Roman" w:eastAsia="Times New Roman" w:cs="Times New Roman"/>
         </w:rPr>
-        <w:t xml:space="preserve">The accounts in Table 1 differ in what they predict for firms that report use. A design that discriminates among them needs four linked measures at the firm level: reported use of visual generators, the stock of complementary assets, task reassignment for visual production, and hiring for visual occupations. Several data sources could provide them. Eurostat ICT-usage microdata can be linked to employer-employee registers in some member states through national statistical offices. Online job advertisements that carry employer identifiers can record both hiring for visual occupations and requests for generative-AI skills, in the spirit of the firm-level AI indicators built from workforce data by Babina et al. (2024). And a purpose-built survey of acquiring firms can measure the three assets and the share of visual tasks reassigned. Advert text alone is not enough, as the pilot in Section 7.6 shows: it documents demanded skills but, without hires and without independent measures of complements, it does not identify the mechanism.</w:t>
+        <w:t xml:space="preserve">This section is a proposal. We do not have the firm-level data that H3 requires and do not claim to test it. Its purpose is to state the design precisely enough that the claims in Section 3.8 can be refuted.</w:t>
       </w:r>
     </w:p>
     <w:p>
@@ -12706,7 +12937,7 @@
         <w:rPr>
           <w:rFonts w:ascii="Times New Roman" w:hAnsi="Times New Roman" w:eastAsia="Times New Roman" w:cs="Times New Roman"/>
         </w:rPr>
-        <w:t xml:space="preserve">The closest existing evidence comes from Denmark. Humlum and Vestergaard (2025) link representative surveys on chatbot use, employer policies, and reported time savings to administrative earnings and hours. They find that most employers encourage use and run training, that these employer investments raise adoption and perceived benefits, and that adopters’ earnings and hours show precise zeros, with confidence intervals ruling out effects larger than 1 percent, alongside average reported time savings of about 3 percent. Their design supplies what our theory calls complements (employer encouragement and training) and a measure of use. Its outcomes are the earnings and hours of adopters, not task reassignment and hiring in visual occupations, and the data are not public.</w:t>
+        <w:t xml:space="preserve">The accounts in Table 1 differ in what they predict for firms that report use. A design that discriminates among them needs four linked measures at the firm level: reported use of visual generators, the stock of complementary assets, task reassignment for visual production, and hiring for visual occupations. Several data sources could provide them. Eurostat ICT-usage microdata can be linked to employer-employee registers in some member states through national statistical offices. Online job advertisements that carry employer identifiers can record both hiring for visual occupations and requests for generative-AI skills, in the spirit of the firm-level AI indicators built from workforce data by Babina et al. (2024). And a purpose-built survey of acquiring firms can measure the three assets and the share of visual tasks reassigned. Advert text alone is not enough, as the pilot in Section 7.6 shows: it documents demanded skills but, without hires and without independent measures of complements, it does not identify the mechanism.</w:t>
       </w:r>
     </w:p>
     <w:p>
@@ -12720,11 +12951,636 @@
         <w:rPr>
           <w:rFonts w:ascii="Times New Roman" w:hAnsi="Times New Roman" w:eastAsia="Times New Roman" w:cs="Times New Roman"/>
         </w:rPr>
+        <w:t xml:space="preserve">The closest existing evidence comes from Denmark. Humlum and Vestergaard (2025) link representative surveys on chatbot use, employer policies, and reported time savings to administrative earnings and hours. They find that most employers encourage use and run training, that these employer investments raise adoption and perceived benefits, and that adopters’ earnings and hours show precise zeros, with confidence intervals ruling out effects larger than 1 percent, alongside average reported time savings of about 3 percent. Their design supplies what our theory calls complements (employer encouragement and training) and a measure of use. Its outcomes are the earnings and hours of adopters, not task reassignment and hiring in visual occupations, and the data are not public.</w:t>
+      </w:r>
+    </w:p>
+    <w:p>
+      <w:pPr>
+        <w:pStyle w:val="BodyText"/>
+        <w:spacing w:line="480" w:lineRule="auto" w:after="0" w:before="0"/>
+        <w:ind w:firstLine="720"/>
+        <w:jc w:val="left"/>
+      </w:pPr>
+      <w:r>
+        <w:rPr>
+          <w:bCs/>
+          <w:rFonts w:ascii="Times New Roman" w:hAnsi="Times New Roman" w:eastAsia="Times New Roman" w:cs="Times New Roman"/>
+          <w:b/>
+        </w:rPr>
+        <w:t xml:space="preserve">Unit and sampling.</w:t>
+      </w:r>
+      <w:r>
+        <w:rPr>
+          <w:rFonts w:ascii="Times New Roman" w:hAnsi="Times New Roman" w:eastAsia="Times New Roman" w:cs="Times New Roman"/>
+        </w:rPr>
+        <w:t xml:space="preserve"> </w:t>
+      </w:r>
+      <w:r>
+        <w:rPr>
+          <w:rFonts w:ascii="Times New Roman" w:hAnsi="Times New Roman" w:eastAsia="Times New Roman" w:cs="Times New Roman"/>
+        </w:rPr>
+        <w:t xml:space="preserve">The unit is the task within the firm. A survey of firms that report using generative visual tools would list the visual tasks the firm performs (for example, producing advertising images, editing product photographs, drafting video storyboards) and ask about each one. Because only about 10 percent of firms are acquirers overall, and 36 percent in publishing, film, and broadcasting, the sample should be drawn from sectors with high acquisition and screened for acquirers. As an illustration of scale, detecting a difference in task-reassignment rates of 10 versus 25 percent between firms with low and high review capacity needs about 96 firms per group at a 5 percent significance level and 80 percent power, and 10 versus 20 percent needs about 195 per group, before any adjustment for clustering of tasks within firms. Screening roughly 550 firms in a high-acquisition sector would yield about 200 acquirers.</w:t>
+      </w:r>
+    </w:p>
+    <w:p>
+      <w:pPr>
+        <w:pStyle w:val="BodyText"/>
+        <w:spacing w:line="480" w:lineRule="auto" w:after="0" w:before="0"/>
+        <w:ind w:firstLine="720"/>
+        <w:jc w:val="left"/>
+      </w:pPr>
+      <w:r>
+        <w:rPr>
+          <w:bCs/>
+          <w:rFonts w:ascii="Times New Roman" w:hAnsi="Times New Roman" w:eastAsia="Times New Roman" w:cs="Times New Roman"/>
+          <w:b/>
+        </w:rPr>
+        <w:t xml:space="preserve">Measures.</w:t>
+      </w:r>
+      <w:r>
+        <w:rPr>
+          <w:rFonts w:ascii="Times New Roman" w:hAnsi="Times New Roman" w:eastAsia="Times New Roman" w:cs="Times New Roman"/>
+        </w:rPr>
+        <w:t xml:space="preserve"> </w:t>
+      </w:r>
+      <w:r>
+        <w:rPr>
+          <w:rFonts w:ascii="Times New Roman" w:hAnsi="Times New Roman" w:eastAsia="Times New Roman" w:cs="Times New Roman"/>
+        </w:rPr>
+        <w:t xml:space="preserve">Table 7 lists the constructs. Complementary assets are measured as three separate stocks so that the account can be refuted if one of them matters and the others do not.</w:t>
+      </w:r>
+    </w:p>
+    <w:p>
+      <w:pPr>
+        <w:pStyle w:val="BodyText"/>
+        <w:spacing w:line="240" w:lineRule="auto" w:after="120" w:before="0"/>
+        <w:ind w:firstLine="0"/>
+        <w:jc w:val="left"/>
+      </w:pPr>
+      <w:r>
+        <w:rPr>
+          <w:bCs/>
+          <w:rFonts w:ascii="Times New Roman" w:hAnsi="Times New Roman" w:eastAsia="Times New Roman" w:cs="Times New Roman"/>
+          <w:b/>
+        </w:rPr>
+        <w:t xml:space="preserve">Table 7. Constructs for the proposed firm-level test</w:t>
+      </w:r>
+    </w:p>
+    <w:tbl>
+      <w:tblPr>
+        <w:tblStyle w:val="Table"/>
+        <w:tblW w:type="pct" w:w="5000"/>
+        <w:tblLook w:firstRow="1" w:lastRow="0" w:firstColumn="0" w:lastColumn="0" w:noHBand="0" w:noVBand="0" w:val="0020"/>
+        <w:jc w:val="start"/>
+        <w:tblBorders>
+          <w:top w:val="single" w:sz="8" w:color="000000"/>
+          <w:bottom w:val="single" w:sz="8" w:color="000000"/>
+        </w:tblBorders>
+      </w:tblPr>
+      <w:tblGrid>
+        <w:gridCol w:w="2640"/>
+        <w:gridCol w:w="2640"/>
+        <w:gridCol w:w="2640"/>
+      </w:tblGrid>
+      <w:tr>
+        <w:trPr>
+          <w:tblHeader w:val="true"/>
+        </w:trPr>
+        <w:tc>
+          <w:tcPr>
+            <w:tcBorders>
+              <w:bottom w:val="single" w:sz="6" w:color="000000"/>
+            </w:tcBorders>
+          </w:tcPr>
+          <w:p>
+            <w:pPr>
+              <w:pStyle w:val="Compact"/>
+              <w:spacing w:line="240" w:lineRule="auto" w:after="40"/>
+              <w:ind w:firstLine="0"/>
+              <w:jc w:val="left"/>
+            </w:pPr>
+            <w:r>
+              <w:rPr>
+                <w:rFonts w:ascii="Times New Roman" w:hAnsi="Times New Roman"/>
+                <w:b/>
+                <w:sz w:val="19"/>
+              </w:rPr>
+              <w:t xml:space="preserve">Construct</w:t>
+            </w:r>
+          </w:p>
+        </w:tc>
+        <w:tc>
+          <w:tcPr>
+            <w:tcBorders>
+              <w:bottom w:val="single" w:sz="6" w:color="000000"/>
+            </w:tcBorders>
+          </w:tcPr>
+          <w:p>
+            <w:pPr>
+              <w:pStyle w:val="Compact"/>
+              <w:spacing w:line="240" w:lineRule="auto" w:after="40"/>
+              <w:ind w:firstLine="0"/>
+              <w:jc w:val="left"/>
+            </w:pPr>
+            <w:r>
+              <w:rPr>
+                <w:rFonts w:ascii="Times New Roman" w:hAnsi="Times New Roman"/>
+                <w:b/>
+                <w:sz w:val="19"/>
+              </w:rPr>
+              <w:t xml:space="preserve">Item (illustrative)</w:t>
+            </w:r>
+          </w:p>
+        </w:tc>
+        <w:tc>
+          <w:tcPr>
+            <w:tcBorders>
+              <w:bottom w:val="single" w:sz="6" w:color="000000"/>
+            </w:tcBorders>
+          </w:tcPr>
+          <w:p>
+            <w:pPr>
+              <w:pStyle w:val="Compact"/>
+              <w:spacing w:line="240" w:lineRule="auto" w:after="40"/>
+              <w:ind w:firstLine="0"/>
+              <w:jc w:val="left"/>
+            </w:pPr>
+            <w:r>
+              <w:rPr>
+                <w:rFonts w:ascii="Times New Roman" w:hAnsi="Times New Roman"/>
+                <w:b/>
+                <w:sz w:val="19"/>
+              </w:rPr>
+              <w:t xml:space="preserve">Scale</w:t>
+            </w:r>
+          </w:p>
+        </w:tc>
+      </w:tr>
+      <w:tr>
+        <w:tc>
+          <w:tcPr/>
+          <w:p>
+            <w:pPr>
+              <w:pStyle w:val="Compact"/>
+              <w:spacing w:line="240" w:lineRule="auto" w:after="40"/>
+              <w:ind w:firstLine="0"/>
+              <w:jc w:val="left"/>
+            </w:pPr>
+            <w:r>
+              <w:rPr>
+                <w:rFonts w:ascii="Times New Roman" w:hAnsi="Times New Roman"/>
+                <w:sz w:val="19"/>
+              </w:rPr>
+              <w:t xml:space="preserve">Acquisition</w:t>
+            </w:r>
+          </w:p>
+        </w:tc>
+        <w:tc>
+          <w:tcPr/>
+          <w:p>
+            <w:pPr>
+              <w:pStyle w:val="Compact"/>
+              <w:spacing w:line="240" w:lineRule="auto" w:after="40"/>
+              <w:ind w:firstLine="0"/>
+              <w:jc w:val="left"/>
+            </w:pPr>
+            <w:r>
+              <w:rPr>
+                <w:rFonts w:ascii="Times New Roman" w:hAnsi="Times New Roman"/>
+                <w:sz w:val="19"/>
+              </w:rPr>
+              <w:t xml:space="preserve">Has the firm used a tool that generates images, video, or audio in the past 12 months?</w:t>
+            </w:r>
+          </w:p>
+        </w:tc>
+        <w:tc>
+          <w:tcPr/>
+          <w:p>
+            <w:pPr>
+              <w:pStyle w:val="Compact"/>
+              <w:spacing w:line="240" w:lineRule="auto" w:after="40"/>
+              <w:ind w:firstLine="0"/>
+              <w:jc w:val="left"/>
+            </w:pPr>
+            <w:r>
+              <w:rPr>
+                <w:rFonts w:ascii="Times New Roman" w:hAnsi="Times New Roman"/>
+                <w:sz w:val="19"/>
+              </w:rPr>
+              <w:t xml:space="preserve">Yes/No</w:t>
+            </w:r>
+          </w:p>
+        </w:tc>
+      </w:tr>
+      <w:tr>
+        <w:tc>
+          <w:tcPr/>
+          <w:p>
+            <w:pPr>
+              <w:pStyle w:val="Compact"/>
+              <w:spacing w:line="240" w:lineRule="auto" w:after="40"/>
+              <w:ind w:firstLine="0"/>
+              <w:jc w:val="left"/>
+            </w:pPr>
+            <w:r>
+              <w:rPr>
+                <w:rFonts w:ascii="Times New Roman" w:hAnsi="Times New Roman"/>
+                <w:sz w:val="19"/>
+              </w:rPr>
+              <w:t xml:space="preserve">Task reassignment</w:t>
+            </w:r>
+          </w:p>
+        </w:tc>
+        <w:tc>
+          <w:tcPr/>
+          <w:p>
+            <w:pPr>
+              <w:pStyle w:val="Compact"/>
+              <w:spacing w:line="240" w:lineRule="auto" w:after="40"/>
+              <w:ind w:firstLine="0"/>
+              <w:jc w:val="left"/>
+            </w:pPr>
+            <w:r>
+              <w:rPr>
+                <w:rFonts w:ascii="Times New Roman" w:hAnsi="Times New Roman"/>
+                <w:sz w:val="19"/>
+              </w:rPr>
+              <w:t xml:space="preserve">For each listed visual task, what share of output in the past 12 months was generated by the tool and used after review, with no human production?</w:t>
+            </w:r>
+          </w:p>
+        </w:tc>
+        <w:tc>
+          <w:tcPr/>
+          <w:p>
+            <w:pPr>
+              <w:pStyle w:val="Compact"/>
+              <w:spacing w:line="240" w:lineRule="auto" w:after="40"/>
+              <w:ind w:firstLine="0"/>
+              <w:jc w:val="left"/>
+            </w:pPr>
+            <w:r>
+              <w:rPr>
+                <w:rFonts w:ascii="Times New Roman" w:hAnsi="Times New Roman"/>
+                <w:sz w:val="19"/>
+              </w:rPr>
+              <w:t xml:space="preserve">0–100% by task</w:t>
+            </w:r>
+          </w:p>
+        </w:tc>
+      </w:tr>
+      <w:tr>
+        <w:tc>
+          <w:tcPr/>
+          <w:p>
+            <w:pPr>
+              <w:pStyle w:val="Compact"/>
+              <w:spacing w:line="240" w:lineRule="auto" w:after="40"/>
+              <w:ind w:firstLine="0"/>
+              <w:jc w:val="left"/>
+            </w:pPr>
+            <w:r>
+              <w:rPr>
+                <w:rFonts w:ascii="Times New Roman" w:hAnsi="Times New Roman"/>
+                <w:sz w:val="19"/>
+              </w:rPr>
+              <w:t xml:space="preserve">Expertise</w:t>
+            </w:r>
+          </w:p>
+        </w:tc>
+        <w:tc>
+          <w:tcPr/>
+          <w:p>
+            <w:pPr>
+              <w:pStyle w:val="Compact"/>
+              <w:spacing w:line="240" w:lineRule="auto" w:after="40"/>
+              <w:ind w:firstLine="0"/>
+              <w:jc w:val="left"/>
+            </w:pPr>
+            <w:r>
+              <w:rPr>
+                <w:rFonts w:ascii="Times New Roman" w:hAnsi="Times New Roman"/>
+                <w:sz w:val="19"/>
+              </w:rPr>
+              <w:t xml:space="preserve">Does the firm employ staff able to judge whether generated visual output meets brand and quality standards? How many, and with what training?</w:t>
+            </w:r>
+          </w:p>
+        </w:tc>
+        <w:tc>
+          <w:tcPr/>
+          <w:p>
+            <w:pPr>
+              <w:pStyle w:val="Compact"/>
+              <w:spacing w:line="240" w:lineRule="auto" w:after="40"/>
+              <w:ind w:firstLine="0"/>
+              <w:jc w:val="left"/>
+            </w:pPr>
+            <w:r>
+              <w:rPr>
+                <w:rFonts w:ascii="Times New Roman" w:hAnsi="Times New Roman"/>
+                <w:sz w:val="19"/>
+              </w:rPr>
+              <w:t xml:space="preserve">Count; categories</w:t>
+            </w:r>
+          </w:p>
+        </w:tc>
+      </w:tr>
+      <w:tr>
+        <w:tc>
+          <w:tcPr/>
+          <w:p>
+            <w:pPr>
+              <w:pStyle w:val="Compact"/>
+              <w:spacing w:line="240" w:lineRule="auto" w:after="40"/>
+              <w:ind w:firstLine="0"/>
+              <w:jc w:val="left"/>
+            </w:pPr>
+            <w:r>
+              <w:rPr>
+                <w:rFonts w:ascii="Times New Roman" w:hAnsi="Times New Roman"/>
+                <w:sz w:val="19"/>
+              </w:rPr>
+              <w:t xml:space="preserve">Review capacity</w:t>
+            </w:r>
+          </w:p>
+        </w:tc>
+        <w:tc>
+          <w:tcPr/>
+          <w:p>
+            <w:pPr>
+              <w:pStyle w:val="Compact"/>
+              <w:spacing w:line="240" w:lineRule="auto" w:after="40"/>
+              <w:ind w:firstLine="0"/>
+              <w:jc w:val="left"/>
+            </w:pPr>
+            <w:r>
+              <w:rPr>
+                <w:rFonts w:ascii="Times New Roman" w:hAnsi="Times New Roman"/>
+                <w:sz w:val="19"/>
+              </w:rPr>
+              <w:t xml:space="preserve">Hours per week allocated to reviewing generated output; existence of a defined review step before publication</w:t>
+            </w:r>
+          </w:p>
+        </w:tc>
+        <w:tc>
+          <w:tcPr/>
+          <w:p>
+            <w:pPr>
+              <w:pStyle w:val="Compact"/>
+              <w:spacing w:line="240" w:lineRule="auto" w:after="40"/>
+              <w:ind w:firstLine="0"/>
+              <w:jc w:val="left"/>
+            </w:pPr>
+            <w:r>
+              <w:rPr>
+                <w:rFonts w:ascii="Times New Roman" w:hAnsi="Times New Roman"/>
+                <w:sz w:val="19"/>
+              </w:rPr>
+              <w:t xml:space="preserve">Hours; Yes/No</w:t>
+            </w:r>
+          </w:p>
+        </w:tc>
+      </w:tr>
+      <w:tr>
+        <w:tc>
+          <w:tcPr/>
+          <w:p>
+            <w:pPr>
+              <w:pStyle w:val="Compact"/>
+              <w:spacing w:line="240" w:lineRule="auto" w:after="40"/>
+              <w:ind w:firstLine="0"/>
+              <w:jc w:val="left"/>
+            </w:pPr>
+            <w:r>
+              <w:rPr>
+                <w:rFonts w:ascii="Times New Roman" w:hAnsi="Times New Roman"/>
+                <w:sz w:val="19"/>
+              </w:rPr>
+              <w:t xml:space="preserve">Compliance procedures</w:t>
+            </w:r>
+          </w:p>
+        </w:tc>
+        <w:tc>
+          <w:tcPr/>
+          <w:p>
+            <w:pPr>
+              <w:pStyle w:val="Compact"/>
+              <w:spacing w:line="240" w:lineRule="auto" w:after="40"/>
+              <w:ind w:firstLine="0"/>
+              <w:jc w:val="left"/>
+            </w:pPr>
+            <w:r>
+              <w:rPr>
+                <w:rFonts w:ascii="Times New Roman" w:hAnsi="Times New Roman"/>
+                <w:sz w:val="19"/>
+              </w:rPr>
+              <w:t xml:space="preserve">Written policy on copyright, licensing, and personal data in generated content; approval requirement</w:t>
+            </w:r>
+          </w:p>
+        </w:tc>
+        <w:tc>
+          <w:tcPr/>
+          <w:p>
+            <w:pPr>
+              <w:pStyle w:val="Compact"/>
+              <w:spacing w:line="240" w:lineRule="auto" w:after="40"/>
+              <w:ind w:firstLine="0"/>
+              <w:jc w:val="left"/>
+            </w:pPr>
+            <w:r>
+              <w:rPr>
+                <w:rFonts w:ascii="Times New Roman" w:hAnsi="Times New Roman"/>
+                <w:sz w:val="19"/>
+              </w:rPr>
+              <w:t xml:space="preserve">Yes/No; categories</w:t>
+            </w:r>
+          </w:p>
+        </w:tc>
+      </w:tr>
+      <w:tr>
+        <w:tc>
+          <w:tcPr/>
+          <w:p>
+            <w:pPr>
+              <w:pStyle w:val="Compact"/>
+              <w:spacing w:line="240" w:lineRule="auto" w:after="40"/>
+              <w:ind w:firstLine="0"/>
+              <w:jc w:val="left"/>
+            </w:pPr>
+            <w:r>
+              <w:rPr>
+                <w:rFonts w:ascii="Times New Roman" w:hAnsi="Times New Roman"/>
+                <w:sz w:val="19"/>
+              </w:rPr>
+              <w:t xml:space="preserve">Hiring</w:t>
+            </w:r>
+          </w:p>
+        </w:tc>
+        <w:tc>
+          <w:tcPr/>
+          <w:p>
+            <w:pPr>
+              <w:pStyle w:val="Compact"/>
+              <w:spacing w:line="240" w:lineRule="auto" w:after="40"/>
+              <w:ind w:firstLine="0"/>
+              <w:jc w:val="left"/>
+            </w:pPr>
+            <w:r>
+              <w:rPr>
+                <w:rFonts w:ascii="Times New Roman" w:hAnsi="Times New Roman"/>
+                <w:sz w:val="19"/>
+              </w:rPr>
+              <w:t xml:space="preserve">Postings and hires for visual occupations over the past 24 months, from administrative or advert data linked by employer</w:t>
+            </w:r>
+          </w:p>
+        </w:tc>
+        <w:tc>
+          <w:tcPr/>
+          <w:p>
+            <w:pPr>
+              <w:pStyle w:val="Compact"/>
+              <w:spacing w:line="240" w:lineRule="auto" w:after="40"/>
+              <w:ind w:firstLine="0"/>
+              <w:jc w:val="left"/>
+            </w:pPr>
+            <w:r>
+              <w:rPr>
+                <w:rFonts w:ascii="Times New Roman" w:hAnsi="Times New Roman"/>
+                <w:sz w:val="19"/>
+              </w:rPr>
+              <w:t xml:space="preserve">Counts</w:t>
+            </w:r>
+          </w:p>
+        </w:tc>
+      </w:tr>
+      <w:tr>
+        <w:tc>
+          <w:tcPr/>
+          <w:p>
+            <w:pPr>
+              <w:pStyle w:val="Compact"/>
+              <w:spacing w:line="240" w:lineRule="auto" w:after="40"/>
+              <w:ind w:firstLine="0"/>
+              <w:jc w:val="left"/>
+            </w:pPr>
+            <w:r>
+              <w:rPr>
+                <w:rFonts w:ascii="Times New Roman" w:hAnsi="Times New Roman"/>
+                <w:sz w:val="19"/>
+              </w:rPr>
+              <w:t xml:space="preserve">Controls</w:t>
+            </w:r>
+          </w:p>
+        </w:tc>
+        <w:tc>
+          <w:tcPr/>
+          <w:p>
+            <w:pPr>
+              <w:pStyle w:val="Compact"/>
+              <w:spacing w:line="240" w:lineRule="auto" w:after="40"/>
+              <w:ind w:firstLine="0"/>
+              <w:jc w:val="left"/>
+            </w:pPr>
+            <w:r>
+              <w:rPr>
+                <w:rFonts w:ascii="Times New Roman" w:hAnsi="Times New Roman"/>
+                <w:sz w:val="19"/>
+              </w:rPr>
+              <w:t xml:space="preserve">Sector, size, share of revenue from visual content, prior outsourcing of visual work</w:t>
+            </w:r>
+          </w:p>
+        </w:tc>
+        <w:tc>
+          <w:tcPr/>
+          <w:p>
+            <w:pPr>
+              <w:pStyle w:val="Compact"/>
+              <w:spacing w:line="240" w:lineRule="auto" w:after="40"/>
+              <w:ind w:firstLine="0"/>
+              <w:jc w:val="left"/>
+            </w:pPr>
+            <w:r>
+              <w:rPr>
+                <w:rFonts w:ascii="Times New Roman" w:hAnsi="Times New Roman"/>
+                <w:sz w:val="19"/>
+              </w:rPr>
+              <w:t xml:space="preserve">Standard</w:t>
+            </w:r>
+          </w:p>
+        </w:tc>
+      </w:tr>
+    </w:tbl>
+    <w:p>
+      <w:pPr>
+        <w:pStyle w:val="BodyText"/>
+        <w:spacing w:line="480" w:lineRule="auto" w:after="0" w:before="0"/>
+        <w:ind w:firstLine="720"/>
+        <w:jc w:val="left"/>
+      </w:pPr>
+      <w:r>
+        <w:rPr>
+          <w:bCs/>
+          <w:rFonts w:ascii="Times New Roman" w:hAnsi="Times New Roman" w:eastAsia="Times New Roman" w:cs="Times New Roman"/>
+          <w:b/>
+        </w:rPr>
+        <w:t xml:space="preserve">Identification.</w:t>
+      </w:r>
+      <w:r>
+        <w:rPr>
+          <w:rFonts w:ascii="Times New Roman" w:hAnsi="Times New Roman" w:eastAsia="Times New Roman" w:cs="Times New Roman"/>
+        </w:rPr>
+        <w:t xml:space="preserve"> </w:t>
+      </w:r>
+      <w:r>
+        <w:rPr>
+          <w:rFonts w:ascii="Times New Roman" w:hAnsi="Times New Roman" w:eastAsia="Times New Roman" w:cs="Times New Roman"/>
+        </w:rPr>
+        <w:t xml:space="preserve">Three features make the test one of mechanism and not of association. First, the task-level structure allows firm fixed effects: within a firm, reassignment should be higher for tasks with lower review cost, such as internal drafts, than for tasks with higher review cost, such as public-facing brand imagery. Second, asset stocks should be measured, or recalled, as of the date before acquisition where possible, since firms may build review routines after they begin to reassign tasks. Third, the key prediction is an interaction, in which hiring falls with task reassignment only where assets are high. The raw correlation between use and hiring would not discriminate among the accounts in Table 1. Threats include selection into responding, social-desirability bias in reported compliance, and reverse causation between assets and reassignment; each can be partially addressed by the within-firm design and by pre-registering the hypotheses.</w:t>
+      </w:r>
+    </w:p>
+    <w:p>
+      <w:pPr>
+        <w:pStyle w:val="BodyText"/>
+        <w:spacing w:line="480" w:lineRule="auto" w:after="0" w:before="0"/>
+        <w:ind w:firstLine="720"/>
+        <w:jc w:val="left"/>
+      </w:pPr>
+      <w:r>
+        <w:rPr>
+          <w:bCs/>
+          <w:rFonts w:ascii="Times New Roman" w:hAnsi="Times New Roman" w:eastAsia="Times New Roman" w:cs="Times New Roman"/>
+          <w:b/>
+        </w:rPr>
+        <w:t xml:space="preserve">What would refute the account.</w:t>
+      </w:r>
+      <w:r>
+        <w:rPr>
+          <w:rFonts w:ascii="Times New Roman" w:hAnsi="Times New Roman" w:eastAsia="Times New Roman" w:cs="Times New Roman"/>
+        </w:rPr>
+        <w:t xml:space="preserve"> </w:t>
+      </w:r>
+      <w:r>
+        <w:rPr>
+          <w:rFonts w:ascii="Times New Roman" w:hAnsi="Times New Roman" w:eastAsia="Times New Roman" w:cs="Times New Roman"/>
+        </w:rPr>
+        <w:t xml:space="preserve">The assimilation-gap account would be refuted by finding that reassignment among acquirers is high on average (not low), that it does not rise with the three asset stocks, or that hiring falls equally among acquirers with low and high asset stocks. The claim in Section 3.8 that acquisition is less informative as it becomes cheaper would be refuted if the share of acquirers who have reassigned at least one task is no lower for generative visual tools than for comparable earlier technologies surveyed in the same way.</w:t>
+      </w:r>
+    </w:p>
+    <w:p>
+      <w:pPr>
+        <w:pStyle w:val="BodyText"/>
+        <w:spacing w:line="480" w:lineRule="auto" w:after="0" w:before="0"/>
+        <w:ind w:firstLine="720"/>
+        <w:jc w:val="left"/>
+      </w:pPr>
+      <w:r>
+        <w:rPr>
+          <w:rFonts w:ascii="Times New Roman" w:hAnsi="Times New Roman" w:eastAsia="Times New Roman" w:cs="Times New Roman"/>
+        </w:rPr>
         <w:t xml:space="preserve">The predictions are specific. Under the assimilation gap, task reassignment among users is low on average and rises with expertise, review capacity, and compliance procedures, and hiring for visual occupations falls, if at all, only among users with high asset stocks. Under complete assimilation with net substitution, users cut visual hiring relative to non-users regardless of asset stocks. Under offsetting scale effects, users reassign tasks but their visual hiring does not fall, and their job adverts shift toward direction, selection, and review. Under capability failure, users do not reassign tasks even when assets are present. Each prediction can be falsified by a single well-measured comparison, and the asset measures make the test one of mechanism rather than of association between use and hiring.</w:t>
       </w:r>
     </w:p>
-    <w:bookmarkEnd w:id="50"/>
-    <w:bookmarkStart w:id="55" w:name="discussion"/>
+    <w:bookmarkEnd w:id="51"/>
+    <w:bookmarkStart w:id="56" w:name="discussion"/>
     <w:p>
       <w:pPr>
         <w:pStyle w:val="Heading2"/>
@@ -12736,7 +13592,7 @@
         <w:t xml:space="preserve">10 Discussion</w:t>
       </w:r>
     </w:p>
-    <w:bookmarkStart w:id="51" w:name="X8b5d7cb2dd9a2ce0d7f424e3d7c91bdc66a3387"/>
+    <w:bookmarkStart w:id="52" w:name="X8b5d7cb2dd9a2ce0d7f424e3d7c91bdc66a3387"/>
     <w:p>
       <w:pPr>
         <w:pStyle w:val="Heading3"/>
@@ -12759,7 +13615,7 @@
         <w:rPr>
           <w:rFonts w:ascii="Times New Roman" w:hAnsi="Times New Roman" w:eastAsia="Times New Roman" w:cs="Times New Roman"/>
         </w:rPr>
-        <w:t xml:space="preserve">Assimilation research was built on technologies whose acquisition was costly. Generative AI reverses that condition. When acquisition is nearly free, the decision to acquire carries little information about the decision to reorganize work, and the gap between the two can widen as adoption statistics rise. The complementary-asset account developed here gives that gap a precise location: review cost, which depends on expertise, review capacity, and compliance procedures rather than on the model. This adds a mechanism to IT-complementarity research for a class of technologies in which the bottleneck is judging output rather than producing it. Unlike earlier enterprise systems, model quality alone cannot substitute for the missing complements; improvements in the generator matter only after those complements have brought review cost below the cost of human production. The account also connects two literatures that rarely meet. IS studies of AI inside adopting organizations (for example, Fügener et al., 2022) take use as given, and labor-market studies of exposure take the occupation as given. Placing the assimilation step between them clarifies what each can and cannot say.</w:t>
+        <w:t xml:space="preserve">Assimilation research was built on technologies whose acquisition was costly. Generative AI reverses that condition. When acquisition is nearly free, the decision to acquire carries little information about the decision to reorganize work, and the gap between the two can widen as adoption statistics rise. The complementary-asset account developed here gives that gap a precise location: review cost, which depends on expertise, review capacity, and compliance procedures rather than on the model. This adds a mechanism to IT-complementarity research for a class of technologies in which the bottleneck is judging output rather than producing it. Unlike earlier enterprise systems, model quality alone cannot substitute for the missing complements; improvements in the generator matter only after those complements have brought review cost below the cost of human production. The account also connects two literatures that rarely meet. IS studies of AI inside adopting organizations (for example, Fügener et al., 2022) take use as given, and labor-market studies of exposure take the occupation as given. Placing the assimilation step between them clarifies what each can and cannot say. Section 3.8 states the resulting extensions to assimilation theory: judgment complements are distinct from production complements, acquisition becomes less informative as its cost falls, assimilation is a property of tasks and not of firms, and the account has stated boundary conditions. These are conceptual claims. Their testing awaits the firm-level data described in Section 9.</w:t>
       </w:r>
     </w:p>
     <w:p>
@@ -12813,8 +13669,8 @@
         <w:t xml:space="preserve">per year, not statistically significant), and the estimates depend on the language-exposure control. In the model, acceleration enters through the acceptance threshold: the technology lowers the cost of review and generation for tasks in industries that were already reducing their demand for them, so assimilation is most likely where structural pressure exists. Country-year fixed effects absorb economy-wide shocks but not industry-specific restructuring, and the industry employment series in Section 7.3 show no contraction in the creative industries. Public data cannot show what happened to visual-production occupations within those industries, so the within-industry reading is a hypothesis rather than a finding. Separating acceleration from an independent effect of the technology requires firm-level data that observe an employer’s industry, its use of the tool, and its hiring together.</w:t>
       </w:r>
     </w:p>
-    <w:bookmarkEnd w:id="51"/>
-    <w:bookmarkStart w:id="52" w:name="a-macroeconomic-reading"/>
+    <w:bookmarkEnd w:id="52"/>
+    <w:bookmarkStart w:id="53" w:name="a-macroeconomic-reading"/>
     <w:p>
       <w:pPr>
         <w:pStyle w:val="Heading3"/>
@@ -12868,8 +13724,8 @@
         <w:t xml:space="preserve">On timing, the evidence supports neither a prediction that effects will take decades nor the view that the future cannot be known. Table 6 gives earliest detection dates that range from 2025, for very large effects in high-acquisition sectors, to 2035, for a 39 percent fall under slow diffusion in the average firm, and never, in this design, for platform-sized effects. What the data cannot say is whether assimilation is occurring now. Answering that requires firm-level data that link use, complementary assets, task reassignment, and hiring.</w:t>
       </w:r>
     </w:p>
-    <w:bookmarkEnd w:id="52"/>
-    <w:bookmarkStart w:id="53" w:name="implications"/>
+    <w:bookmarkEnd w:id="53"/>
+    <w:bookmarkStart w:id="54" w:name="implications"/>
     <w:p>
       <w:pPr>
         <w:pStyle w:val="Heading3"/>
@@ -12895,8 +13751,8 @@
         <w:t xml:space="preserve">For researchers, the implication is to report the acquisition rate and the reference effect size that an exposure estimate would require, and to treat estimates that exceed that requirement, or that predate the technology, as evidence about something else. For managers, the barrier evidence suggests that the constraints on using generative visual tools are organizational: review capacity and policies for copyright and personal data are complements to the tool, and waiting for better models will not build them. For statistical agencies and policymakers, a rising use indicator should not be read as rising task reassignment, and a small hiring response should not be read as evidence that the response will remain small. Adding questions on task reassignment and on review and compliance practices to enterprise surveys would make the gap directly measurable.</w:t>
       </w:r>
     </w:p>
-    <w:bookmarkEnd w:id="53"/>
-    <w:bookmarkStart w:id="54" w:name="limitations"/>
+    <w:bookmarkEnd w:id="54"/>
+    <w:bookmarkStart w:id="55" w:name="limitations"/>
     <w:p>
       <w:pPr>
         <w:pStyle w:val="Heading3"/>
@@ -12919,12 +13775,35 @@
         <w:rPr>
           <w:rFonts w:ascii="Times New Roman" w:hAnsi="Times New Roman" w:eastAsia="Times New Roman" w:cs="Times New Roman"/>
         </w:rPr>
-        <w:t xml:space="preserve">We do not observe assimilation. The barrier items refer to AI in general and to firms that considered it, so they speak to the acquisition margin only. The hiring series are experimental, measure adverts or vacancies rather than employment, and would miss substitution through hours, outsourcing, or freelancing. Exposure is measured with language-model scores that we have checked against a second model but not against human coders. We argue that measurement noise strengthens the detectability result, but it limits what can be said about the gradients themselves, and a categorical treatment defined by occupation codes (for example, graphic designers, visual artists, and photographers) would avoid model-based scoring and is a natural next step that we leave to future work. The control for language-model exposure is our own construction, and the 2024 estimate depends on it (Table 4). Acquisition rates are sector averages and do not identify the employers of particular occupations. We study occupations and sectors, not aggregate employment or productivity, and the macroeconomic reading in Section 10.2 interprets the results through the model rather than testing it. The review floor in Proposition 1 rests on the assumption that review hours do not fall with model quality; where better models reduce visible defects, review may become cheaper and the threshold in equation (1) may fall without any change in complements, which would weaken Implication 1 for those tasks. The advert-text evidence in Section 7.6 covers a stock of postings rather than hires and relies on keyword-based inferences of acquirer status and complements. The detectability bound rests on a linear mapping from exposure to the visual share of work and on reference effect sizes from platforms, and both could be refined; however, plausible changes alter the numbers in Tables 5 and 6 without changing the conclusion that current designs lack the power to detect complete assimilation at platform-sized effects.</w:t>
-      </w:r>
-    </w:p>
-    <w:bookmarkEnd w:id="54"/>
+        <w:t xml:space="preserve">We do not observe assimilation. The barrier items refer to AI in general and to firms that considered it, so they speak to the acquisition margin only. The hiring series are experimental, measure adverts or vacancies rather than employment, and would miss substitution through hours, outsourcing, or freelancing. Exposure is measured with language-model scores that agree with two human coders only weakly (weighted</w:t>
+      </w:r>
+      <w:r>
+        <w:rPr>
+          <w:rFonts w:ascii="Times New Roman" w:hAnsi="Times New Roman" w:eastAsia="Times New Roman" w:cs="Times New Roman"/>
+        </w:rPr>
+        <w:t xml:space="preserve"> </w:t>
+      </w:r>
+      <m:oMath>
+        <m:r>
+          <m:t>κ</m:t>
+        </m:r>
+      </m:oMath>
+      <w:r>
+        <w:rPr>
+          <w:rFonts w:ascii="Times New Roman" w:hAnsi="Times New Roman" w:eastAsia="Times New Roman" w:cs="Times New Roman"/>
+        </w:rPr>
+        <w:t xml:space="preserve"> </w:t>
+      </w:r>
+      <w:r>
+        <w:rPr>
+          <w:rFonts w:ascii="Times New Roman" w:hAnsi="Times New Roman" w:eastAsia="Times New Roman" w:cs="Times New Roman"/>
+        </w:rPr>
+        <w:t xml:space="preserve">of 0.11 to 0.20, against 0.42 between the coders; Section 5.3), so they capture a minority of the visual content that humans identify. We argue that measurement noise strengthens the detectability result, but it limits what can be said about the gradients themselves, and a categorical treatment defined by occupation codes (for example, graphic designers, visual artists, and photographers) would avoid model-based scoring and is a natural next step that we leave to future work. The control for language-model exposure is our own construction, and the 2024 estimate depends on it (Table 4). Acquisition rates are sector averages and do not identify the employers of particular occupations. We study occupations and sectors, not aggregate employment or productivity, and the macroeconomic reading in Section 10.2 interprets the results through the model rather than testing it. The review floor in Proposition 1 rests on the assumption that review hours do not fall with model quality; where better models reduce visible defects, review may become cheaper and the threshold in equation (1) may fall without any change in complements, which would weaken Implication 1 for those tasks. The advert-text evidence in Section 7.6 covers a stock of postings rather than hires and relies on keyword-based inferences of acquirer status and complements. The detectability bound rests on a linear mapping from exposure to the visual share of work and on reference effect sizes from platforms, and both could be refined; however, plausible changes alter the numbers in Tables 5 and 6 without changing the conclusion that current designs lack the power to detect complete assimilation at platform-sized effects.</w:t>
+      </w:r>
+    </w:p>
     <w:bookmarkEnd w:id="55"/>
-    <w:bookmarkStart w:id="56" w:name="conclusion"/>
+    <w:bookmarkEnd w:id="56"/>
+    <w:bookmarkStart w:id="57" w:name="conclusion"/>
     <w:p>
       <w:pPr>
         <w:pStyle w:val="Heading2"/>
@@ -12950,8 +13829,8 @@
         <w:t xml:space="preserve">Generative visual AI has been widely acquired: about one in ten European firms used it in 2025, and about one in three in publishing, film, and broadcasting. Firms that considered AI and did not adopt it point to missing expertise, legal uncertainty, and data protection rather than to a tool that is not useful. The theory developed here explains why such complements govern assimilation and why near-free acquisition can let adoption statistics run ahead of any change in work. In macroeconomic terms, general-purpose technologies, task-based labor demand, bottleneck tasks, and attrition-based adjustment together imply that effects reach hiring and employment with a lag and unevenly across occupations. The empirical lesson is equally important. So far, occupation-level hiring data show no labor-market effect that can be attributed to generative visual AI: the exposure gradients are small, imprecise, and cannot be told apart from the trend that preceded the technology. That is not evidence of no effect, because these designs could not have detected complete assimilation at platform-sized effects and cannot tell whether acquisition has been assimilated. Answering the question requires linking firms’ use, their complementary assets, and their hiring, and this paper specifies what that evidence would have to show.</w:t>
       </w:r>
     </w:p>
-    <w:bookmarkEnd w:id="56"/>
-    <w:bookmarkStart w:id="57" w:name="data-code-and-use-of-generative-ai"/>
+    <w:bookmarkEnd w:id="57"/>
+    <w:bookmarkStart w:id="58" w:name="data-code-and-use-of-generative-ai"/>
     <w:p>
       <w:pPr>
         <w:pStyle w:val="Heading2"/>
@@ -12977,8 +13856,8 @@
         <w:t xml:space="preserve">All data are public (Eurostat, Statistics Canada, O*NET, Indeed Hiring Lab, Web Data Commons). Code, prompts, and the language-model task scores required to reproduce Tables 4 and 5 and the analyses in Sections 7.1 and 7.4 are available in an anonymized replication repository. Large language models (Claude Haiku 5.5, with GPT-5.6 Luna as a second scorer) were used as measurement instruments to code O*NET task statements and NOC main-duty statements, and Claude Haiku 5.5 to classify job-posting titles and the treatment of generative AI in posting text. A generative AI assistant was used to help write analysis code and to draft and edit the manuscript. The authors reviewed all results, text, and code and take responsibility for the content.</w:t>
       </w:r>
     </w:p>
-    <w:bookmarkEnd w:id="57"/>
-    <w:bookmarkStart w:id="58" w:name="appendix-a.-rubrics"/>
+    <w:bookmarkEnd w:id="58"/>
+    <w:bookmarkStart w:id="59" w:name="appendix-a.-rubrics"/>
     <w:p>
       <w:pPr>
         <w:pStyle w:val="Heading2"/>
@@ -13046,8 +13925,8 @@
         <w:t xml:space="preserve">Score 2 if reading, writing, summarizing, translating, or otherwise producing or editing text is central to the task; 1 if text is a partial or supporting product; 0 otherwise. Spoken conversation, numeric calculation, and purely physical work do not count. Both rubrics were applied in a single prompt, in batches of 20 statements, at temperature zero; the prompt is in the replication repository.</w:t>
       </w:r>
     </w:p>
-    <w:bookmarkEnd w:id="58"/>
-    <w:bookmarkStart w:id="59" w:name="X8a54bc2e205ec9edb9f5805e6d8d6bb56135511"/>
+    <w:bookmarkEnd w:id="59"/>
+    <w:bookmarkStart w:id="60" w:name="X8a54bc2e205ec9edb9f5805e6d8d6bb56135511"/>
     <w:p>
       <w:pPr>
         <w:pStyle w:val="Heading2"/>
@@ -14431,8 +15310,8 @@
         <w:t xml:space="preserve">, further below the 2024 minimum detectable effect of 0.050. Noise of this classical kind strengthens the conclusion that the design cannot detect complete assimilation. It does not license any substantive reading of the observed gradients, and if the error in the language-model score is correlated with exposure to language models, the direction of the bias is ambiguous.</w:t>
       </w:r>
     </w:p>
-    <w:bookmarkEnd w:id="59"/>
-    <w:bookmarkStart w:id="60" w:name="appendix-c.-derivations-for-section-3"/>
+    <w:bookmarkEnd w:id="60"/>
+    <w:bookmarkStart w:id="61" w:name="appendix-c.-derivations-for-section-3"/>
     <w:p>
       <w:pPr>
         <w:pStyle w:val="Heading2"/>
@@ -16401,8 +17280,8 @@
         <w:t xml:space="preserve">. The upper bound in part (i) holds when hiring is adjusted smoothly as in equation (4); a temporary hiring freeze could produce a larger transitory fall in adverts.</w:t>
       </w:r>
     </w:p>
-    <w:bookmarkEnd w:id="60"/>
-    <w:bookmarkStart w:id="61" w:name="references"/>
+    <w:bookmarkEnd w:id="61"/>
+    <w:bookmarkStart w:id="62" w:name="references"/>
     <w:p>
       <w:pPr>
         <w:pStyle w:val="Heading2"/>
@@ -16425,7 +17304,7 @@
         <w:rPr>
           <w:rFonts w:ascii="Times New Roman" w:hAnsi="Times New Roman" w:eastAsia="Times New Roman" w:cs="Times New Roman"/>
         </w:rPr>
-        <w:t xml:space="preserve">Acemoglu, D., Autor, D., Hazell, J., &amp; Restrepo, P. (2022). Artificial intelligence and jobs: Evidence from online vacancies.</w:t>
+        <w:t xml:space="preserve">Acemoglu, D., &amp; Restrepo, P. (2018). The race between man and machine: Implications of technology for growth, factor shares, and employment.</w:t>
       </w:r>
       <w:r>
         <w:rPr>
@@ -16439,13 +17318,13 @@
           <w:rFonts w:ascii="Times New Roman" w:hAnsi="Times New Roman" w:eastAsia="Times New Roman" w:cs="Times New Roman"/>
           <w:i/>
         </w:rPr>
-        <w:t xml:space="preserve">Journal of Labor Economics, 40</w:t>
-      </w:r>
-      <w:r>
-        <w:rPr>
-          <w:rFonts w:ascii="Times New Roman" w:hAnsi="Times New Roman" w:eastAsia="Times New Roman" w:cs="Times New Roman"/>
-        </w:rPr>
-        <w:t xml:space="preserve">(S1), S293–S340.</w:t>
+        <w:t xml:space="preserve">American Economic Review, 108</w:t>
+      </w:r>
+      <w:r>
+        <w:rPr>
+          <w:rFonts w:ascii="Times New Roman" w:hAnsi="Times New Roman" w:eastAsia="Times New Roman" w:cs="Times New Roman"/>
+        </w:rPr>
+        <w:t xml:space="preserve">(6), 1488–1542.</w:t>
       </w:r>
     </w:p>
     <w:p>
@@ -16459,7 +17338,7 @@
         <w:rPr>
           <w:rFonts w:ascii="Times New Roman" w:hAnsi="Times New Roman" w:eastAsia="Times New Roman" w:cs="Times New Roman"/>
         </w:rPr>
-        <w:t xml:space="preserve">Acemoglu, D., &amp; Restrepo, P. (2018). The race between man and machine: Implications of technology for growth, factor shares, and employment.</w:t>
+        <w:t xml:space="preserve">Acemoglu, D., &amp; Restrepo, P. (2019). Automation and new tasks: How technology displaces and reinstates labor.</w:t>
       </w:r>
       <w:r>
         <w:rPr>
@@ -16473,13 +17352,13 @@
           <w:rFonts w:ascii="Times New Roman" w:hAnsi="Times New Roman" w:eastAsia="Times New Roman" w:cs="Times New Roman"/>
           <w:i/>
         </w:rPr>
-        <w:t xml:space="preserve">American Economic Review, 108</w:t>
-      </w:r>
-      <w:r>
-        <w:rPr>
-          <w:rFonts w:ascii="Times New Roman" w:hAnsi="Times New Roman" w:eastAsia="Times New Roman" w:cs="Times New Roman"/>
-        </w:rPr>
-        <w:t xml:space="preserve">(6), 1488–1542.</w:t>
+        <w:t xml:space="preserve">Journal of Economic Perspectives, 33</w:t>
+      </w:r>
+      <w:r>
+        <w:rPr>
+          <w:rFonts w:ascii="Times New Roman" w:hAnsi="Times New Roman" w:eastAsia="Times New Roman" w:cs="Times New Roman"/>
+        </w:rPr>
+        <w:t xml:space="preserve">(2), 3–30.</w:t>
       </w:r>
     </w:p>
     <w:p>
@@ -16493,7 +17372,7 @@
         <w:rPr>
           <w:rFonts w:ascii="Times New Roman" w:hAnsi="Times New Roman" w:eastAsia="Times New Roman" w:cs="Times New Roman"/>
         </w:rPr>
-        <w:t xml:space="preserve">Acemoglu, D., &amp; Restrepo, P. (2019). Automation and new tasks: How technology displaces and reinstates labor.</w:t>
+        <w:t xml:space="preserve">Acemoglu, D., Autor, D., Hazell, J., &amp; Restrepo, P. (2022). Artificial intelligence and jobs: Evidence from online vacancies.</w:t>
       </w:r>
       <w:r>
         <w:rPr>
@@ -16507,13 +17386,13 @@
           <w:rFonts w:ascii="Times New Roman" w:hAnsi="Times New Roman" w:eastAsia="Times New Roman" w:cs="Times New Roman"/>
           <w:i/>
         </w:rPr>
-        <w:t xml:space="preserve">Journal of Economic Perspectives, 33</w:t>
-      </w:r>
-      <w:r>
-        <w:rPr>
-          <w:rFonts w:ascii="Times New Roman" w:hAnsi="Times New Roman" w:eastAsia="Times New Roman" w:cs="Times New Roman"/>
-        </w:rPr>
-        <w:t xml:space="preserve">(2), 3–30.</w:t>
+        <w:t xml:space="preserve">Journal of Labor Economics, 40</w:t>
+      </w:r>
+      <w:r>
+        <w:rPr>
+          <w:rFonts w:ascii="Times New Roman" w:hAnsi="Times New Roman" w:eastAsia="Times New Roman" w:cs="Times New Roman"/>
+        </w:rPr>
+        <w:t xml:space="preserve">(S1), S293–S340.</w:t>
       </w:r>
     </w:p>
     <w:p>
@@ -16965,7 +17844,7 @@
         <w:rPr>
           <w:rFonts w:ascii="Times New Roman" w:hAnsi="Times New Roman" w:eastAsia="Times New Roman" w:cs="Times New Roman"/>
         </w:rPr>
-        <w:t xml:space="preserve">Cooper, R. B., &amp; Zmud, R. W. (1990). Information technology implementation research: A technological diffusion approach.</w:t>
+        <w:t xml:space="preserve">Cohen, W. M., &amp; Levinthal, D. A. (1990). Absorptive capacity: A new perspective on learning and innovation.</w:t>
       </w:r>
       <w:r>
         <w:rPr>
@@ -16979,13 +17858,13 @@
           <w:rFonts w:ascii="Times New Roman" w:hAnsi="Times New Roman" w:eastAsia="Times New Roman" w:cs="Times New Roman"/>
           <w:i/>
         </w:rPr>
-        <w:t xml:space="preserve">Management Science, 36</w:t>
-      </w:r>
-      <w:r>
-        <w:rPr>
-          <w:rFonts w:ascii="Times New Roman" w:hAnsi="Times New Roman" w:eastAsia="Times New Roman" w:cs="Times New Roman"/>
-        </w:rPr>
-        <w:t xml:space="preserve">(2), 123–139.</w:t>
+        <w:t xml:space="preserve">Administrative Science Quarterly, 35</w:t>
+      </w:r>
+      <w:r>
+        <w:rPr>
+          <w:rFonts w:ascii="Times New Roman" w:hAnsi="Times New Roman" w:eastAsia="Times New Roman" w:cs="Times New Roman"/>
+        </w:rPr>
+        <w:t xml:space="preserve">(1), 128–152.</w:t>
       </w:r>
     </w:p>
     <w:p>
@@ -16999,7 +17878,7 @@
         <w:rPr>
           <w:rFonts w:ascii="Times New Roman" w:hAnsi="Times New Roman" w:eastAsia="Times New Roman" w:cs="Times New Roman"/>
         </w:rPr>
-        <w:t xml:space="preserve">David, P. A. (1990). The dynamo and the computer: An historical perspective on the modern productivity paradox.</w:t>
+        <w:t xml:space="preserve">Cooper, R. B., &amp; Zmud, R. W. (1990). Information technology implementation research: A technological diffusion approach.</w:t>
       </w:r>
       <w:r>
         <w:rPr>
@@ -17013,13 +17892,13 @@
           <w:rFonts w:ascii="Times New Roman" w:hAnsi="Times New Roman" w:eastAsia="Times New Roman" w:cs="Times New Roman"/>
           <w:i/>
         </w:rPr>
-        <w:t xml:space="preserve">American Economic Review, 80</w:t>
-      </w:r>
-      <w:r>
-        <w:rPr>
-          <w:rFonts w:ascii="Times New Roman" w:hAnsi="Times New Roman" w:eastAsia="Times New Roman" w:cs="Times New Roman"/>
-        </w:rPr>
-        <w:t xml:space="preserve">(2), 355–361.</w:t>
+        <w:t xml:space="preserve">Management Science, 36</w:t>
+      </w:r>
+      <w:r>
+        <w:rPr>
+          <w:rFonts w:ascii="Times New Roman" w:hAnsi="Times New Roman" w:eastAsia="Times New Roman" w:cs="Times New Roman"/>
+        </w:rPr>
+        <w:t xml:space="preserve">(2), 123–139.</w:t>
       </w:r>
     </w:p>
     <w:p>
@@ -17033,7 +17912,7 @@
         <w:rPr>
           <w:rFonts w:ascii="Times New Roman" w:hAnsi="Times New Roman" w:eastAsia="Times New Roman" w:cs="Times New Roman"/>
         </w:rPr>
-        <w:t xml:space="preserve">Demirci, O., Hannane, J., &amp; Zhu, X. (2025). Who is AI replacing? The impact of generative AI on online freelancing platforms.</w:t>
+        <w:t xml:space="preserve">David, P. A. (1990). The dynamo and the computer: An historical perspective on the modern productivity paradox.</w:t>
       </w:r>
       <w:r>
         <w:rPr>
@@ -17047,13 +17926,13 @@
           <w:rFonts w:ascii="Times New Roman" w:hAnsi="Times New Roman" w:eastAsia="Times New Roman" w:cs="Times New Roman"/>
           <w:i/>
         </w:rPr>
-        <w:t xml:space="preserve">Management Science, 71</w:t>
-      </w:r>
-      <w:r>
-        <w:rPr>
-          <w:rFonts w:ascii="Times New Roman" w:hAnsi="Times New Roman" w:eastAsia="Times New Roman" w:cs="Times New Roman"/>
-        </w:rPr>
-        <w:t xml:space="preserve">(10), 8097–8108.</w:t>
+        <w:t xml:space="preserve">American Economic Review, 80</w:t>
+      </w:r>
+      <w:r>
+        <w:rPr>
+          <w:rFonts w:ascii="Times New Roman" w:hAnsi="Times New Roman" w:eastAsia="Times New Roman" w:cs="Times New Roman"/>
+        </w:rPr>
+        <w:t xml:space="preserve">(2), 355–361.</w:t>
       </w:r>
     </w:p>
     <w:p>
@@ -17067,7 +17946,7 @@
         <w:rPr>
           <w:rFonts w:ascii="Times New Roman" w:hAnsi="Times New Roman" w:eastAsia="Times New Roman" w:cs="Times New Roman"/>
         </w:rPr>
-        <w:t xml:space="preserve">Eloundou, T., Manning, S., Mishkin, P., &amp; Rock, D. (2023).</w:t>
+        <w:t xml:space="preserve">Demirci, O., Hannane, J., &amp; Zhu, X. (2025). Who is AI replacing? The impact of generative AI on online freelancing platforms.</w:t>
       </w:r>
       <w:r>
         <w:rPr>
@@ -17081,19 +17960,13 @@
           <w:rFonts w:ascii="Times New Roman" w:hAnsi="Times New Roman" w:eastAsia="Times New Roman" w:cs="Times New Roman"/>
           <w:i/>
         </w:rPr>
-        <w:t xml:space="preserve">GPTs are GPTs: An early look at the labor market impact potential of large language models</w:t>
-      </w:r>
-      <w:r>
-        <w:rPr>
-          <w:rFonts w:ascii="Times New Roman" w:hAnsi="Times New Roman" w:eastAsia="Times New Roman" w:cs="Times New Roman"/>
-        </w:rPr>
-        <w:t xml:space="preserve"> </w:t>
-      </w:r>
-      <w:r>
-        <w:rPr>
-          <w:rFonts w:ascii="Times New Roman" w:hAnsi="Times New Roman" w:eastAsia="Times New Roman" w:cs="Times New Roman"/>
-        </w:rPr>
-        <w:t xml:space="preserve">(arXiv:2303.10130). arXiv.</w:t>
+        <w:t xml:space="preserve">Management Science, 71</w:t>
+      </w:r>
+      <w:r>
+        <w:rPr>
+          <w:rFonts w:ascii="Times New Roman" w:hAnsi="Times New Roman" w:eastAsia="Times New Roman" w:cs="Times New Roman"/>
+        </w:rPr>
+        <w:t xml:space="preserve">(10), 8097–8108.</w:t>
       </w:r>
     </w:p>
     <w:p>
@@ -17107,7 +17980,7 @@
         <w:rPr>
           <w:rFonts w:ascii="Times New Roman" w:hAnsi="Times New Roman" w:eastAsia="Times New Roman" w:cs="Times New Roman"/>
         </w:rPr>
-        <w:t xml:space="preserve">Eurostat. (2026).</w:t>
+        <w:t xml:space="preserve">Eloundou, T., Manning, S., Mishkin, P., &amp; Rock, D. (2023).</w:t>
       </w:r>
       <w:r>
         <w:rPr>
@@ -17121,19 +17994,19 @@
           <w:rFonts w:ascii="Times New Roman" w:hAnsi="Times New Roman" w:eastAsia="Times New Roman" w:cs="Times New Roman"/>
           <w:i/>
         </w:rPr>
-        <w:t xml:space="preserve">ICT usage in enterprises; online job advertisements by occupation (experimental); Labour force survey</w:t>
-      </w:r>
-      <w:r>
-        <w:rPr>
-          <w:rFonts w:ascii="Times New Roman" w:hAnsi="Times New Roman" w:eastAsia="Times New Roman" w:cs="Times New Roman"/>
-        </w:rPr>
-        <w:t xml:space="preserve"> </w:t>
-      </w:r>
-      <w:r>
-        <w:rPr>
-          <w:rFonts w:ascii="Times New Roman" w:hAnsi="Times New Roman" w:eastAsia="Times New Roman" w:cs="Times New Roman"/>
-        </w:rPr>
-        <w:t xml:space="preserve">[Data sets]. Retrieved October 4, 2026, from the Eurostat dissemination database.</w:t>
+        <w:t xml:space="preserve">GPTs are GPTs: An early look at the labor market impact potential of large language models</w:t>
+      </w:r>
+      <w:r>
+        <w:rPr>
+          <w:rFonts w:ascii="Times New Roman" w:hAnsi="Times New Roman" w:eastAsia="Times New Roman" w:cs="Times New Roman"/>
+        </w:rPr>
+        <w:t xml:space="preserve"> </w:t>
+      </w:r>
+      <w:r>
+        <w:rPr>
+          <w:rFonts w:ascii="Times New Roman" w:hAnsi="Times New Roman" w:eastAsia="Times New Roman" w:cs="Times New Roman"/>
+        </w:rPr>
+        <w:t xml:space="preserve">(arXiv:2303.10130). arXiv.</w:t>
       </w:r>
     </w:p>
     <w:p>
@@ -17147,7 +18020,7 @@
         <w:rPr>
           <w:rFonts w:ascii="Times New Roman" w:hAnsi="Times New Roman" w:eastAsia="Times New Roman" w:cs="Times New Roman"/>
         </w:rPr>
-        <w:t xml:space="preserve">Felten, E., Raj, M., &amp; Seamans, R. (2021). Occupational, industry, and geographic exposure to artificial intelligence.</w:t>
+        <w:t xml:space="preserve">Eurostat. (2026).</w:t>
       </w:r>
       <w:r>
         <w:rPr>
@@ -17161,13 +18034,19 @@
           <w:rFonts w:ascii="Times New Roman" w:hAnsi="Times New Roman" w:eastAsia="Times New Roman" w:cs="Times New Roman"/>
           <w:i/>
         </w:rPr>
-        <w:t xml:space="preserve">Strategic Management Journal, 42</w:t>
-      </w:r>
-      <w:r>
-        <w:rPr>
-          <w:rFonts w:ascii="Times New Roman" w:hAnsi="Times New Roman" w:eastAsia="Times New Roman" w:cs="Times New Roman"/>
-        </w:rPr>
-        <w:t xml:space="preserve">(12), 2195–2217.</w:t>
+        <w:t xml:space="preserve">ICT usage in enterprises; online job advertisements by occupation (experimental); Labour force survey</w:t>
+      </w:r>
+      <w:r>
+        <w:rPr>
+          <w:rFonts w:ascii="Times New Roman" w:hAnsi="Times New Roman" w:eastAsia="Times New Roman" w:cs="Times New Roman"/>
+        </w:rPr>
+        <w:t xml:space="preserve"> </w:t>
+      </w:r>
+      <w:r>
+        <w:rPr>
+          <w:rFonts w:ascii="Times New Roman" w:hAnsi="Times New Roman" w:eastAsia="Times New Roman" w:cs="Times New Roman"/>
+        </w:rPr>
+        <w:t xml:space="preserve">[Data sets]. Retrieved October 4, 2026, from the Eurostat dissemination database.</w:t>
       </w:r>
     </w:p>
     <w:p>
@@ -17181,7 +18060,7 @@
         <w:rPr>
           <w:rFonts w:ascii="Times New Roman" w:hAnsi="Times New Roman" w:eastAsia="Times New Roman" w:cs="Times New Roman"/>
         </w:rPr>
-        <w:t xml:space="preserve">Fichman, R. G., &amp; Kemerer, C. F. (1999). The illusory diffusion of innovation: An examination of assimilation gaps.</w:t>
+        <w:t xml:space="preserve">Felten, E., Raj, M., &amp; Seamans, R. (2021). Occupational, industry, and geographic exposure to artificial intelligence.</w:t>
       </w:r>
       <w:r>
         <w:rPr>
@@ -17195,13 +18074,13 @@
           <w:rFonts w:ascii="Times New Roman" w:hAnsi="Times New Roman" w:eastAsia="Times New Roman" w:cs="Times New Roman"/>
           <w:i/>
         </w:rPr>
-        <w:t xml:space="preserve">Information Systems Research, 10</w:t>
-      </w:r>
-      <w:r>
-        <w:rPr>
-          <w:rFonts w:ascii="Times New Roman" w:hAnsi="Times New Roman" w:eastAsia="Times New Roman" w:cs="Times New Roman"/>
-        </w:rPr>
-        <w:t xml:space="preserve">(3), 255–275.</w:t>
+        <w:t xml:space="preserve">Strategic Management Journal, 42</w:t>
+      </w:r>
+      <w:r>
+        <w:rPr>
+          <w:rFonts w:ascii="Times New Roman" w:hAnsi="Times New Roman" w:eastAsia="Times New Roman" w:cs="Times New Roman"/>
+        </w:rPr>
+        <w:t xml:space="preserve">(12), 2195–2217.</w:t>
       </w:r>
     </w:p>
     <w:p>
@@ -17215,7 +18094,7 @@
         <w:rPr>
           <w:rFonts w:ascii="Times New Roman" w:hAnsi="Times New Roman" w:eastAsia="Times New Roman" w:cs="Times New Roman"/>
         </w:rPr>
-        <w:t xml:space="preserve">Fügener, A., Grahl, J., Gupta, A., &amp; Ketter, W. (2022). Cognitive challenges in human–artificial intelligence collaboration: Investigating the path toward productive delegation.</w:t>
+        <w:t xml:space="preserve">Fichman, R. G., &amp; Kemerer, C. F. (1999). The illusory diffusion of innovation: An examination of assimilation gaps.</w:t>
       </w:r>
       <w:r>
         <w:rPr>
@@ -17229,13 +18108,13 @@
           <w:rFonts w:ascii="Times New Roman" w:hAnsi="Times New Roman" w:eastAsia="Times New Roman" w:cs="Times New Roman"/>
           <w:i/>
         </w:rPr>
-        <w:t xml:space="preserve">Information Systems Research, 33</w:t>
-      </w:r>
-      <w:r>
-        <w:rPr>
-          <w:rFonts w:ascii="Times New Roman" w:hAnsi="Times New Roman" w:eastAsia="Times New Roman" w:cs="Times New Roman"/>
-        </w:rPr>
-        <w:t xml:space="preserve">(2), 678–696.</w:t>
+        <w:t xml:space="preserve">Information Systems Research, 10</w:t>
+      </w:r>
+      <w:r>
+        <w:rPr>
+          <w:rFonts w:ascii="Times New Roman" w:hAnsi="Times New Roman" w:eastAsia="Times New Roman" w:cs="Times New Roman"/>
+        </w:rPr>
+        <w:t xml:space="preserve">(3), 255–275.</w:t>
       </w:r>
     </w:p>
     <w:p>
@@ -17249,7 +18128,7 @@
         <w:rPr>
           <w:rFonts w:ascii="Times New Roman" w:hAnsi="Times New Roman" w:eastAsia="Times New Roman" w:cs="Times New Roman"/>
         </w:rPr>
-        <w:t xml:space="preserve">Gathmann, C., Grimm, F., &amp; Winkler, E. (2024).</w:t>
+        <w:t xml:space="preserve">Fügener, A., Grahl, J., Gupta, A., &amp; Ketter, W. (2022). Cognitive challenges in human–artificial intelligence collaboration: Investigating the path toward productive delegation.</w:t>
       </w:r>
       <w:r>
         <w:rPr>
@@ -17263,19 +18142,13 @@
           <w:rFonts w:ascii="Times New Roman" w:hAnsi="Times New Roman" w:eastAsia="Times New Roman" w:cs="Times New Roman"/>
           <w:i/>
         </w:rPr>
-        <w:t xml:space="preserve">AI, task changes in jobs, and worker reallocation</w:t>
-      </w:r>
-      <w:r>
-        <w:rPr>
-          <w:rFonts w:ascii="Times New Roman" w:hAnsi="Times New Roman" w:eastAsia="Times New Roman" w:cs="Times New Roman"/>
-        </w:rPr>
-        <w:t xml:space="preserve"> </w:t>
-      </w:r>
-      <w:r>
-        <w:rPr>
-          <w:rFonts w:ascii="Times New Roman" w:hAnsi="Times New Roman" w:eastAsia="Times New Roman" w:cs="Times New Roman"/>
-        </w:rPr>
-        <w:t xml:space="preserve">(IZA Discussion Paper No. 17554). IZA Institute of Labor Economics.</w:t>
+        <w:t xml:space="preserve">Information Systems Research, 33</w:t>
+      </w:r>
+      <w:r>
+        <w:rPr>
+          <w:rFonts w:ascii="Times New Roman" w:hAnsi="Times New Roman" w:eastAsia="Times New Roman" w:cs="Times New Roman"/>
+        </w:rPr>
+        <w:t xml:space="preserve">(2), 678–696.</w:t>
       </w:r>
     </w:p>
     <w:p>
@@ -17289,7 +18162,7 @@
         <w:rPr>
           <w:rFonts w:ascii="Times New Roman" w:hAnsi="Times New Roman" w:eastAsia="Times New Roman" w:cs="Times New Roman"/>
         </w:rPr>
-        <w:t xml:space="preserve">Georgieff, A., &amp; Hyee, R. (2022). Artificial intelligence and employment: New cross-country evidence.</w:t>
+        <w:t xml:space="preserve">Gathmann, C., Grimm, F., &amp; Winkler, E. (2024).</w:t>
       </w:r>
       <w:r>
         <w:rPr>
@@ -17303,13 +18176,19 @@
           <w:rFonts w:ascii="Times New Roman" w:hAnsi="Times New Roman" w:eastAsia="Times New Roman" w:cs="Times New Roman"/>
           <w:i/>
         </w:rPr>
-        <w:t xml:space="preserve">Frontiers in Artificial Intelligence, 5</w:t>
-      </w:r>
-      <w:r>
-        <w:rPr>
-          <w:rFonts w:ascii="Times New Roman" w:hAnsi="Times New Roman" w:eastAsia="Times New Roman" w:cs="Times New Roman"/>
-        </w:rPr>
-        <w:t xml:space="preserve">, Article 832736.</w:t>
+        <w:t xml:space="preserve">AI, task changes in jobs, and worker reallocation</w:t>
+      </w:r>
+      <w:r>
+        <w:rPr>
+          <w:rFonts w:ascii="Times New Roman" w:hAnsi="Times New Roman" w:eastAsia="Times New Roman" w:cs="Times New Roman"/>
+        </w:rPr>
+        <w:t xml:space="preserve"> </w:t>
+      </w:r>
+      <w:r>
+        <w:rPr>
+          <w:rFonts w:ascii="Times New Roman" w:hAnsi="Times New Roman" w:eastAsia="Times New Roman" w:cs="Times New Roman"/>
+        </w:rPr>
+        <w:t xml:space="preserve">(IZA Discussion Paper No. 17554). IZA Institute of Labor Economics.</w:t>
       </w:r>
     </w:p>
     <w:p>
@@ -17323,7 +18202,7 @@
         <w:rPr>
           <w:rFonts w:ascii="Times New Roman" w:hAnsi="Times New Roman" w:eastAsia="Times New Roman" w:cs="Times New Roman"/>
         </w:rPr>
-        <w:t xml:space="preserve">Hampole, M., Papanikolaou, D., Schmidt, L. D. W., &amp; Seegmiller, B. (2025).</w:t>
+        <w:t xml:space="preserve">Georgieff, A., &amp; Hyee, R. (2022). Artificial intelligence and employment: New cross-country evidence.</w:t>
       </w:r>
       <w:r>
         <w:rPr>
@@ -17337,19 +18216,13 @@
           <w:rFonts w:ascii="Times New Roman" w:hAnsi="Times New Roman" w:eastAsia="Times New Roman" w:cs="Times New Roman"/>
           <w:i/>
         </w:rPr>
-        <w:t xml:space="preserve">Artificial intelligence and the labor market</w:t>
-      </w:r>
-      <w:r>
-        <w:rPr>
-          <w:rFonts w:ascii="Times New Roman" w:hAnsi="Times New Roman" w:eastAsia="Times New Roman" w:cs="Times New Roman"/>
-        </w:rPr>
-        <w:t xml:space="preserve"> </w:t>
-      </w:r>
-      <w:r>
-        <w:rPr>
-          <w:rFonts w:ascii="Times New Roman" w:hAnsi="Times New Roman" w:eastAsia="Times New Roman" w:cs="Times New Roman"/>
-        </w:rPr>
-        <w:t xml:space="preserve">(NBER Working Paper No. 33509). National Bureau of Economic Research.</w:t>
+        <w:t xml:space="preserve">Frontiers in Artificial Intelligence, 5</w:t>
+      </w:r>
+      <w:r>
+        <w:rPr>
+          <w:rFonts w:ascii="Times New Roman" w:hAnsi="Times New Roman" w:eastAsia="Times New Roman" w:cs="Times New Roman"/>
+        </w:rPr>
+        <w:t xml:space="preserve">, Article 832736.</w:t>
       </w:r>
     </w:p>
     <w:p>
@@ -17363,7 +18236,7 @@
         <w:rPr>
           <w:rFonts w:ascii="Times New Roman" w:hAnsi="Times New Roman" w:eastAsia="Times New Roman" w:cs="Times New Roman"/>
         </w:rPr>
-        <w:t xml:space="preserve">Hui, X., Reshef, O., &amp; Zhou, L. (2024). The short-term effects of generative artificial intelligence on employment: Evidence from an online labor market.</w:t>
+        <w:t xml:space="preserve">Hampole, M., Papanikolaou, D., Schmidt, L. D. W., &amp; Seegmiller, B. (2025).</w:t>
       </w:r>
       <w:r>
         <w:rPr>
@@ -17377,13 +18250,19 @@
           <w:rFonts w:ascii="Times New Roman" w:hAnsi="Times New Roman" w:eastAsia="Times New Roman" w:cs="Times New Roman"/>
           <w:i/>
         </w:rPr>
-        <w:t xml:space="preserve">Organization Science, 35</w:t>
-      </w:r>
-      <w:r>
-        <w:rPr>
-          <w:rFonts w:ascii="Times New Roman" w:hAnsi="Times New Roman" w:eastAsia="Times New Roman" w:cs="Times New Roman"/>
-        </w:rPr>
-        <w:t xml:space="preserve">(6), 1977–1989.</w:t>
+        <w:t xml:space="preserve">Artificial intelligence and the labor market</w:t>
+      </w:r>
+      <w:r>
+        <w:rPr>
+          <w:rFonts w:ascii="Times New Roman" w:hAnsi="Times New Roman" w:eastAsia="Times New Roman" w:cs="Times New Roman"/>
+        </w:rPr>
+        <w:t xml:space="preserve"> </w:t>
+      </w:r>
+      <w:r>
+        <w:rPr>
+          <w:rFonts w:ascii="Times New Roman" w:hAnsi="Times New Roman" w:eastAsia="Times New Roman" w:cs="Times New Roman"/>
+        </w:rPr>
+        <w:t xml:space="preserve">(NBER Working Paper No. 33509). National Bureau of Economic Research.</w:t>
       </w:r>
     </w:p>
     <w:p>
@@ -17397,7 +18276,7 @@
         <w:rPr>
           <w:rFonts w:ascii="Times New Roman" w:hAnsi="Times New Roman" w:eastAsia="Times New Roman" w:cs="Times New Roman"/>
         </w:rPr>
-        <w:t xml:space="preserve">Humlum, A., &amp; Vestergaard, E. (2025).</w:t>
+        <w:t xml:space="preserve">Hui, X., Reshef, O., &amp; Zhou, L. (2024). The short-term effects of generative artificial intelligence on employment: Evidence from an online labor market.</w:t>
       </w:r>
       <w:r>
         <w:rPr>
@@ -17411,19 +18290,13 @@
           <w:rFonts w:ascii="Times New Roman" w:hAnsi="Times New Roman" w:eastAsia="Times New Roman" w:cs="Times New Roman"/>
           <w:i/>
         </w:rPr>
-        <w:t xml:space="preserve">Large language models, small labor market effects</w:t>
-      </w:r>
-      <w:r>
-        <w:rPr>
-          <w:rFonts w:ascii="Times New Roman" w:hAnsi="Times New Roman" w:eastAsia="Times New Roman" w:cs="Times New Roman"/>
-        </w:rPr>
-        <w:t xml:space="preserve"> </w:t>
-      </w:r>
-      <w:r>
-        <w:rPr>
-          <w:rFonts w:ascii="Times New Roman" w:hAnsi="Times New Roman" w:eastAsia="Times New Roman" w:cs="Times New Roman"/>
-        </w:rPr>
-        <w:t xml:space="preserve">(BFI Working Paper No. 2025-56; NBER Working Paper No. 33777). Becker Friedman Institute and National Bureau of Economic Research.</w:t>
+        <w:t xml:space="preserve">Organization Science, 35</w:t>
+      </w:r>
+      <w:r>
+        <w:rPr>
+          <w:rFonts w:ascii="Times New Roman" w:hAnsi="Times New Roman" w:eastAsia="Times New Roman" w:cs="Times New Roman"/>
+        </w:rPr>
+        <w:t xml:space="preserve">(6), 1977–1989.</w:t>
       </w:r>
     </w:p>
     <w:p>
@@ -17437,7 +18310,7 @@
         <w:rPr>
           <w:rFonts w:ascii="Times New Roman" w:hAnsi="Times New Roman" w:eastAsia="Times New Roman" w:cs="Times New Roman"/>
         </w:rPr>
-        <w:t xml:space="preserve">Indeed Hiring Lab. (2026).</w:t>
+        <w:t xml:space="preserve">Humlum, A., &amp; Vestergaard, E. (2025).</w:t>
       </w:r>
       <w:r>
         <w:rPr>
@@ -17451,19 +18324,19 @@
           <w:rFonts w:ascii="Times New Roman" w:hAnsi="Times New Roman" w:eastAsia="Times New Roman" w:cs="Times New Roman"/>
           <w:i/>
         </w:rPr>
-        <w:t xml:space="preserve">Job postings index, by sector, United States</w:t>
-      </w:r>
-      <w:r>
-        <w:rPr>
-          <w:rFonts w:ascii="Times New Roman" w:hAnsi="Times New Roman" w:eastAsia="Times New Roman" w:cs="Times New Roman"/>
-        </w:rPr>
-        <w:t xml:space="preserve"> </w:t>
-      </w:r>
-      <w:r>
-        <w:rPr>
-          <w:rFonts w:ascii="Times New Roman" w:hAnsi="Times New Roman" w:eastAsia="Times New Roman" w:cs="Times New Roman"/>
-        </w:rPr>
-        <w:t xml:space="preserve">[Data set]. Retrieved October 4, 2026. Creative Commons Attribution 4.0.</w:t>
+        <w:t xml:space="preserve">Large language models, small labor market effects</w:t>
+      </w:r>
+      <w:r>
+        <w:rPr>
+          <w:rFonts w:ascii="Times New Roman" w:hAnsi="Times New Roman" w:eastAsia="Times New Roman" w:cs="Times New Roman"/>
+        </w:rPr>
+        <w:t xml:space="preserve"> </w:t>
+      </w:r>
+      <w:r>
+        <w:rPr>
+          <w:rFonts w:ascii="Times New Roman" w:hAnsi="Times New Roman" w:eastAsia="Times New Roman" w:cs="Times New Roman"/>
+        </w:rPr>
+        <w:t xml:space="preserve">(BFI Working Paper No. 2025-56; NBER Working Paper No. 33777). Becker Friedman Institute and National Bureau of Economic Research.</w:t>
       </w:r>
     </w:p>
     <w:p>
@@ -17477,7 +18350,7 @@
         <w:rPr>
           <w:rFonts w:ascii="Times New Roman" w:hAnsi="Times New Roman" w:eastAsia="Times New Roman" w:cs="Times New Roman"/>
         </w:rPr>
-        <w:t xml:space="preserve">Jasperson, J. S., Carter, P. E., &amp; Zmud, R. W. (2005). A comprehensive conceptualization of post-adoptive behaviors associated with information technology enabled work systems.</w:t>
+        <w:t xml:space="preserve">Indeed Hiring Lab. (2026).</w:t>
       </w:r>
       <w:r>
         <w:rPr>
@@ -17491,13 +18364,19 @@
           <w:rFonts w:ascii="Times New Roman" w:hAnsi="Times New Roman" w:eastAsia="Times New Roman" w:cs="Times New Roman"/>
           <w:i/>
         </w:rPr>
-        <w:t xml:space="preserve">MIS Quarterly, 29</w:t>
-      </w:r>
-      <w:r>
-        <w:rPr>
-          <w:rFonts w:ascii="Times New Roman" w:hAnsi="Times New Roman" w:eastAsia="Times New Roman" w:cs="Times New Roman"/>
-        </w:rPr>
-        <w:t xml:space="preserve">(3), 525–557.</w:t>
+        <w:t xml:space="preserve">Job postings index, by sector, United States</w:t>
+      </w:r>
+      <w:r>
+        <w:rPr>
+          <w:rFonts w:ascii="Times New Roman" w:hAnsi="Times New Roman" w:eastAsia="Times New Roman" w:cs="Times New Roman"/>
+        </w:rPr>
+        <w:t xml:space="preserve"> </w:t>
+      </w:r>
+      <w:r>
+        <w:rPr>
+          <w:rFonts w:ascii="Times New Roman" w:hAnsi="Times New Roman" w:eastAsia="Times New Roman" w:cs="Times New Roman"/>
+        </w:rPr>
+        <w:t xml:space="preserve">[Data set]. Retrieved October 4, 2026. Creative Commons Attribution 4.0.</w:t>
       </w:r>
     </w:p>
     <w:p>
@@ -17511,7 +18390,7 @@
         <w:rPr>
           <w:rFonts w:ascii="Times New Roman" w:hAnsi="Times New Roman" w:eastAsia="Times New Roman" w:cs="Times New Roman"/>
         </w:rPr>
-        <w:t xml:space="preserve">Kim, S., Jin, G. Z., &amp; Lee, E. (2026).</w:t>
+        <w:t xml:space="preserve">Jasperson, J. S., Carter, P. E., &amp; Zmud, R. W. (2005). A comprehensive conceptualization of post-adoptive behaviors associated with information technology enabled work systems.</w:t>
       </w:r>
       <w:r>
         <w:rPr>
@@ -17525,19 +18404,13 @@
           <w:rFonts w:ascii="Times New Roman" w:hAnsi="Times New Roman" w:eastAsia="Times New Roman" w:cs="Times New Roman"/>
           <w:i/>
         </w:rPr>
-        <w:t xml:space="preserve">Does generative AI crowd out human creators? Evidence from Pixiv</w:t>
-      </w:r>
-      <w:r>
-        <w:rPr>
-          <w:rFonts w:ascii="Times New Roman" w:hAnsi="Times New Roman" w:eastAsia="Times New Roman" w:cs="Times New Roman"/>
-        </w:rPr>
-        <w:t xml:space="preserve"> </w:t>
-      </w:r>
-      <w:r>
-        <w:rPr>
-          <w:rFonts w:ascii="Times New Roman" w:hAnsi="Times New Roman" w:eastAsia="Times New Roman" w:cs="Times New Roman"/>
-        </w:rPr>
-        <w:t xml:space="preserve">(NBER Working Paper No. 34733). National Bureau of Economic Research.</w:t>
+        <w:t xml:space="preserve">MIS Quarterly, 29</w:t>
+      </w:r>
+      <w:r>
+        <w:rPr>
+          <w:rFonts w:ascii="Times New Roman" w:hAnsi="Times New Roman" w:eastAsia="Times New Roman" w:cs="Times New Roman"/>
+        </w:rPr>
+        <w:t xml:space="preserve">(3), 525–557.</w:t>
       </w:r>
     </w:p>
     <w:p>
@@ -17551,7 +18424,7 @@
         <w:rPr>
           <w:rFonts w:ascii="Times New Roman" w:hAnsi="Times New Roman" w:eastAsia="Times New Roman" w:cs="Times New Roman"/>
         </w:rPr>
-        <w:t xml:space="preserve">Liang, H., Saraf, N., Hu, Q., &amp; Xue, Y. (2007). Assimilation of enterprise systems: The effect of institutional pressures and the mediating role of top management.</w:t>
+        <w:t xml:space="preserve">Kim, S., Jin, G. Z., &amp; Lee, E. (2026).</w:t>
       </w:r>
       <w:r>
         <w:rPr>
@@ -17565,13 +18438,19 @@
           <w:rFonts w:ascii="Times New Roman" w:hAnsi="Times New Roman" w:eastAsia="Times New Roman" w:cs="Times New Roman"/>
           <w:i/>
         </w:rPr>
-        <w:t xml:space="preserve">MIS Quarterly, 31</w:t>
-      </w:r>
-      <w:r>
-        <w:rPr>
-          <w:rFonts w:ascii="Times New Roman" w:hAnsi="Times New Roman" w:eastAsia="Times New Roman" w:cs="Times New Roman"/>
-        </w:rPr>
-        <w:t xml:space="preserve">(1), 59–87.</w:t>
+        <w:t xml:space="preserve">Does generative AI crowd out human creators? Evidence from Pixiv</w:t>
+      </w:r>
+      <w:r>
+        <w:rPr>
+          <w:rFonts w:ascii="Times New Roman" w:hAnsi="Times New Roman" w:eastAsia="Times New Roman" w:cs="Times New Roman"/>
+        </w:rPr>
+        <w:t xml:space="preserve"> </w:t>
+      </w:r>
+      <w:r>
+        <w:rPr>
+          <w:rFonts w:ascii="Times New Roman" w:hAnsi="Times New Roman" w:eastAsia="Times New Roman" w:cs="Times New Roman"/>
+        </w:rPr>
+        <w:t xml:space="preserve">(NBER Working Paper No. 34733). National Bureau of Economic Research.</w:t>
       </w:r>
     </w:p>
     <w:p>
@@ -17585,7 +18464,7 @@
         <w:rPr>
           <w:rFonts w:ascii="Times New Roman" w:hAnsi="Times New Roman" w:eastAsia="Times New Roman" w:cs="Times New Roman"/>
         </w:rPr>
-        <w:t xml:space="preserve">Melville, N., Kraemer, K., &amp; Gurbaxani, V. (2004). Information technology and organizational performance: An integrative model of IT business value.</w:t>
+        <w:t xml:space="preserve">Leonardi, P. M. (2011). When flexible routines meet flexible technologies: Affordance, constraint, and the imbrication of human and material agencies.</w:t>
       </w:r>
       <w:r>
         <w:rPr>
@@ -17599,13 +18478,13 @@
           <w:rFonts w:ascii="Times New Roman" w:hAnsi="Times New Roman" w:eastAsia="Times New Roman" w:cs="Times New Roman"/>
           <w:i/>
         </w:rPr>
-        <w:t xml:space="preserve">MIS Quarterly, 28</w:t>
-      </w:r>
-      <w:r>
-        <w:rPr>
-          <w:rFonts w:ascii="Times New Roman" w:hAnsi="Times New Roman" w:eastAsia="Times New Roman" w:cs="Times New Roman"/>
-        </w:rPr>
-        <w:t xml:space="preserve">(2), 283–322.</w:t>
+        <w:t xml:space="preserve">MIS Quarterly, 35</w:t>
+      </w:r>
+      <w:r>
+        <w:rPr>
+          <w:rFonts w:ascii="Times New Roman" w:hAnsi="Times New Roman" w:eastAsia="Times New Roman" w:cs="Times New Roman"/>
+        </w:rPr>
+        <w:t xml:space="preserve">(1), 147–167.</w:t>
       </w:r>
     </w:p>
     <w:p>
@@ -17619,7 +18498,7 @@
         <w:rPr>
           <w:rFonts w:ascii="Times New Roman" w:hAnsi="Times New Roman" w:eastAsia="Times New Roman" w:cs="Times New Roman"/>
         </w:rPr>
-        <w:t xml:space="preserve">National Center for O*NET Development. (2026).</w:t>
+        <w:t xml:space="preserve">Liang, H., Saraf, N., Hu, Q., &amp; Xue, Y. (2007). Assimilation of enterprise systems: The effect of institutional pressures and the mediating role of top management.</w:t>
       </w:r>
       <w:r>
         <w:rPr>
@@ -17633,19 +18512,13 @@
           <w:rFonts w:ascii="Times New Roman" w:hAnsi="Times New Roman" w:eastAsia="Times New Roman" w:cs="Times New Roman"/>
           <w:i/>
         </w:rPr>
-        <w:t xml:space="preserve">O*NET database</w:t>
-      </w:r>
-      <w:r>
-        <w:rPr>
-          <w:rFonts w:ascii="Times New Roman" w:hAnsi="Times New Roman" w:eastAsia="Times New Roman" w:cs="Times New Roman"/>
-        </w:rPr>
-        <w:t xml:space="preserve"> </w:t>
-      </w:r>
-      <w:r>
-        <w:rPr>
-          <w:rFonts w:ascii="Times New Roman" w:hAnsi="Times New Roman" w:eastAsia="Times New Roman" w:cs="Times New Roman"/>
-        </w:rPr>
-        <w:t xml:space="preserve">(Version 29.1) [Data set]; ESCO crosswalk. Retrieved October 4, 2026. Creative Commons Attribution 4.0.</w:t>
+        <w:t xml:space="preserve">MIS Quarterly, 31</w:t>
+      </w:r>
+      <w:r>
+        <w:rPr>
+          <w:rFonts w:ascii="Times New Roman" w:hAnsi="Times New Roman" w:eastAsia="Times New Roman" w:cs="Times New Roman"/>
+        </w:rPr>
+        <w:t xml:space="preserve">(1), 59–87.</w:t>
       </w:r>
     </w:p>
     <w:p>
@@ -17659,7 +18532,7 @@
         <w:rPr>
           <w:rFonts w:ascii="Times New Roman" w:hAnsi="Times New Roman" w:eastAsia="Times New Roman" w:cs="Times New Roman"/>
         </w:rPr>
-        <w:t xml:space="preserve">Rai, A., Constantinides, P., &amp; Sarker, S. (2019). Next-generation digital platforms: Toward human–AI hybrids.</w:t>
+        <w:t xml:space="preserve">Melville, N., Kraemer, K., &amp; Gurbaxani, V. (2004). Information technology and organizational performance: An integrative model of IT business value.</w:t>
       </w:r>
       <w:r>
         <w:rPr>
@@ -17673,13 +18546,13 @@
           <w:rFonts w:ascii="Times New Roman" w:hAnsi="Times New Roman" w:eastAsia="Times New Roman" w:cs="Times New Roman"/>
           <w:i/>
         </w:rPr>
-        <w:t xml:space="preserve">MIS Quarterly, 43</w:t>
-      </w:r>
-      <w:r>
-        <w:rPr>
-          <w:rFonts w:ascii="Times New Roman" w:hAnsi="Times New Roman" w:eastAsia="Times New Roman" w:cs="Times New Roman"/>
-        </w:rPr>
-        <w:t xml:space="preserve">(1), iii–ix.</w:t>
+        <w:t xml:space="preserve">MIS Quarterly, 28</w:t>
+      </w:r>
+      <w:r>
+        <w:rPr>
+          <w:rFonts w:ascii="Times New Roman" w:hAnsi="Times New Roman" w:eastAsia="Times New Roman" w:cs="Times New Roman"/>
+        </w:rPr>
+        <w:t xml:space="preserve">(2), 283–322.</w:t>
       </w:r>
     </w:p>
     <w:p>
@@ -17693,7 +18566,7 @@
         <w:rPr>
           <w:rFonts w:ascii="Times New Roman" w:hAnsi="Times New Roman" w:eastAsia="Times New Roman" w:cs="Times New Roman"/>
         </w:rPr>
-        <w:t xml:space="preserve">Statistics Canada. (2026).</w:t>
+        <w:t xml:space="preserve">National Center for O*NET Development. (2026).</w:t>
       </w:r>
       <w:r>
         <w:rPr>
@@ -17707,19 +18580,19 @@
           <w:rFonts w:ascii="Times New Roman" w:hAnsi="Times New Roman" w:eastAsia="Times New Roman" w:cs="Times New Roman"/>
           <w:i/>
         </w:rPr>
-        <w:t xml:space="preserve">Job vacancies by occupation</w:t>
-      </w:r>
-      <w:r>
-        <w:rPr>
-          <w:rFonts w:ascii="Times New Roman" w:hAnsi="Times New Roman" w:eastAsia="Times New Roman" w:cs="Times New Roman"/>
-        </w:rPr>
-        <w:t xml:space="preserve"> </w:t>
-      </w:r>
-      <w:r>
-        <w:rPr>
-          <w:rFonts w:ascii="Times New Roman" w:hAnsi="Times New Roman" w:eastAsia="Times New Roman" w:cs="Times New Roman"/>
-        </w:rPr>
-        <w:t xml:space="preserve">(Table 14-10-0444; NOC 2021) [Data set]. Retrieved October 4, 2026. Statistics Canada Open Licence.</w:t>
+        <w:t xml:space="preserve">O*NET database</w:t>
+      </w:r>
+      <w:r>
+        <w:rPr>
+          <w:rFonts w:ascii="Times New Roman" w:hAnsi="Times New Roman" w:eastAsia="Times New Roman" w:cs="Times New Roman"/>
+        </w:rPr>
+        <w:t xml:space="preserve"> </w:t>
+      </w:r>
+      <w:r>
+        <w:rPr>
+          <w:rFonts w:ascii="Times New Roman" w:hAnsi="Times New Roman" w:eastAsia="Times New Roman" w:cs="Times New Roman"/>
+        </w:rPr>
+        <w:t xml:space="preserve">(Version 29.1) [Data set]; ESCO crosswalk. Retrieved October 4, 2026. Creative Commons Attribution 4.0.</w:t>
       </w:r>
     </w:p>
     <w:p>
@@ -17733,7 +18606,7 @@
         <w:rPr>
           <w:rFonts w:ascii="Times New Roman" w:hAnsi="Times New Roman" w:eastAsia="Times New Roman" w:cs="Times New Roman"/>
         </w:rPr>
-        <w:t xml:space="preserve">Susarla, A., Gopal, R., Thatcher, J. B., &amp; Sarker, S. (2023). The Janus effect of generative AI: Charting the path for responsible conduct of scholarly activities in information systems.</w:t>
+        <w:t xml:space="preserve">Orlikowski, W. J. (2000). Using technology and constituting structures: A practice lens for studying technology in organizations.</w:t>
       </w:r>
       <w:r>
         <w:rPr>
@@ -17747,13 +18620,13 @@
           <w:rFonts w:ascii="Times New Roman" w:hAnsi="Times New Roman" w:eastAsia="Times New Roman" w:cs="Times New Roman"/>
           <w:i/>
         </w:rPr>
-        <w:t xml:space="preserve">Information Systems Research, 34</w:t>
-      </w:r>
-      <w:r>
-        <w:rPr>
-          <w:rFonts w:ascii="Times New Roman" w:hAnsi="Times New Roman" w:eastAsia="Times New Roman" w:cs="Times New Roman"/>
-        </w:rPr>
-        <w:t xml:space="preserve">(2), 399–408.</w:t>
+        <w:t xml:space="preserve">Organization Science, 11</w:t>
+      </w:r>
+      <w:r>
+        <w:rPr>
+          <w:rFonts w:ascii="Times New Roman" w:hAnsi="Times New Roman" w:eastAsia="Times New Roman" w:cs="Times New Roman"/>
+        </w:rPr>
+        <w:t xml:space="preserve">(4), 404–428.</w:t>
       </w:r>
     </w:p>
     <w:p>
@@ -17767,7 +18640,7 @@
         <w:rPr>
           <w:rFonts w:ascii="Times New Roman" w:hAnsi="Times New Roman" w:eastAsia="Times New Roman" w:cs="Times New Roman"/>
         </w:rPr>
-        <w:t xml:space="preserve">Tambe, P., &amp; Hitt, L. M. (2012). The productivity of information technology investments: New evidence from IT labor data.</w:t>
+        <w:t xml:space="preserve">Rai, A., Constantinides, P., &amp; Sarker, S. (2019). Next-generation digital platforms: Toward human–AI hybrids.</w:t>
       </w:r>
       <w:r>
         <w:rPr>
@@ -17781,13 +18654,13 @@
           <w:rFonts w:ascii="Times New Roman" w:hAnsi="Times New Roman" w:eastAsia="Times New Roman" w:cs="Times New Roman"/>
           <w:i/>
         </w:rPr>
-        <w:t xml:space="preserve">Information Systems Research, 23</w:t>
-      </w:r>
-      <w:r>
-        <w:rPr>
-          <w:rFonts w:ascii="Times New Roman" w:hAnsi="Times New Roman" w:eastAsia="Times New Roman" w:cs="Times New Roman"/>
-        </w:rPr>
-        <w:t xml:space="preserve">(3-part-1), 599–617.</w:t>
+        <w:t xml:space="preserve">MIS Quarterly, 43</w:t>
+      </w:r>
+      <w:r>
+        <w:rPr>
+          <w:rFonts w:ascii="Times New Roman" w:hAnsi="Times New Roman" w:eastAsia="Times New Roman" w:cs="Times New Roman"/>
+        </w:rPr>
+        <w:t xml:space="preserve">(1), iii–ix.</w:t>
       </w:r>
     </w:p>
     <w:p>
@@ -17801,7 +18674,7 @@
         <w:rPr>
           <w:rFonts w:ascii="Times New Roman" w:hAnsi="Times New Roman" w:eastAsia="Times New Roman" w:cs="Times New Roman"/>
         </w:rPr>
-        <w:t xml:space="preserve">Web Data Commons. (2024).</w:t>
+        <w:t xml:space="preserve">Statistics Canada. (2026).</w:t>
       </w:r>
       <w:r>
         <w:rPr>
@@ -17815,19 +18688,19 @@
           <w:rFonts w:ascii="Times New Roman" w:hAnsi="Times New Roman" w:eastAsia="Times New Roman" w:cs="Times New Roman"/>
           <w:i/>
         </w:rPr>
-        <w:t xml:space="preserve">Schema.org JobPosting class-specific subsets, crawls 2022-12, 2023-12, and 2024-12</w:t>
-      </w:r>
-      <w:r>
-        <w:rPr>
-          <w:rFonts w:ascii="Times New Roman" w:hAnsi="Times New Roman" w:eastAsia="Times New Roman" w:cs="Times New Roman"/>
-        </w:rPr>
-        <w:t xml:space="preserve"> </w:t>
-      </w:r>
-      <w:r>
-        <w:rPr>
-          <w:rFonts w:ascii="Times New Roman" w:hAnsi="Times New Roman" w:eastAsia="Times New Roman" w:cs="Times New Roman"/>
-        </w:rPr>
-        <w:t xml:space="preserve">[Data sets]. University of Mannheim. https://webdatacommons.org/structureddata/</w:t>
+        <w:t xml:space="preserve">Job vacancies by occupation</w:t>
+      </w:r>
+      <w:r>
+        <w:rPr>
+          <w:rFonts w:ascii="Times New Roman" w:hAnsi="Times New Roman" w:eastAsia="Times New Roman" w:cs="Times New Roman"/>
+        </w:rPr>
+        <w:t xml:space="preserve"> </w:t>
+      </w:r>
+      <w:r>
+        <w:rPr>
+          <w:rFonts w:ascii="Times New Roman" w:hAnsi="Times New Roman" w:eastAsia="Times New Roman" w:cs="Times New Roman"/>
+        </w:rPr>
+        <w:t xml:space="preserve">(Table 14-10-0444; NOC 2021) [Data set]. Retrieved October 4, 2026. Statistics Canada Open Licence.</w:t>
       </w:r>
     </w:p>
     <w:p>
@@ -17841,7 +18714,7 @@
         <w:rPr>
           <w:rFonts w:ascii="Times New Roman" w:hAnsi="Times New Roman" w:eastAsia="Times New Roman" w:cs="Times New Roman"/>
         </w:rPr>
-        <w:t xml:space="preserve">Webb, M. (2020).</w:t>
+        <w:t xml:space="preserve">Susarla, A., Gopal, R., Thatcher, J. B., &amp; Sarker, S. (2023). The Janus effect of generative AI: Charting the path for responsible conduct of scholarly activities in information systems.</w:t>
       </w:r>
       <w:r>
         <w:rPr>
@@ -17855,19 +18728,13 @@
           <w:rFonts w:ascii="Times New Roman" w:hAnsi="Times New Roman" w:eastAsia="Times New Roman" w:cs="Times New Roman"/>
           <w:i/>
         </w:rPr>
-        <w:t xml:space="preserve">The impact of artificial intelligence on the labor market</w:t>
-      </w:r>
-      <w:r>
-        <w:rPr>
-          <w:rFonts w:ascii="Times New Roman" w:hAnsi="Times New Roman" w:eastAsia="Times New Roman" w:cs="Times New Roman"/>
-        </w:rPr>
-        <w:t xml:space="preserve"> </w:t>
-      </w:r>
-      <w:r>
-        <w:rPr>
-          <w:rFonts w:ascii="Times New Roman" w:hAnsi="Times New Roman" w:eastAsia="Times New Roman" w:cs="Times New Roman"/>
-        </w:rPr>
-        <w:t xml:space="preserve">[Working paper]. SSRN. https://ssrn.com/abstract=3482150</w:t>
+        <w:t xml:space="preserve">Information Systems Research, 34</w:t>
+      </w:r>
+      <w:r>
+        <w:rPr>
+          <w:rFonts w:ascii="Times New Roman" w:hAnsi="Times New Roman" w:eastAsia="Times New Roman" w:cs="Times New Roman"/>
+        </w:rPr>
+        <w:t xml:space="preserve">(2), 399–408.</w:t>
       </w:r>
     </w:p>
     <w:p>
@@ -17881,7 +18748,7 @@
         <w:rPr>
           <w:rFonts w:ascii="Times New Roman" w:hAnsi="Times New Roman" w:eastAsia="Times New Roman" w:cs="Times New Roman"/>
         </w:rPr>
-        <w:t xml:space="preserve">Zhou, E., &amp; Lee, D. (2024). Generative artificial intelligence, human creativity, and art.</w:t>
+        <w:t xml:space="preserve">Tambe, P., &amp; Hitt, L. M. (2012). The productivity of information technology investments: New evidence from IT labor data.</w:t>
       </w:r>
       <w:r>
         <w:rPr>
@@ -17895,13 +18762,13 @@
           <w:rFonts w:ascii="Times New Roman" w:hAnsi="Times New Roman" w:eastAsia="Times New Roman" w:cs="Times New Roman"/>
           <w:i/>
         </w:rPr>
-        <w:t xml:space="preserve">PNAS Nexus, 3</w:t>
-      </w:r>
-      <w:r>
-        <w:rPr>
-          <w:rFonts w:ascii="Times New Roman" w:hAnsi="Times New Roman" w:eastAsia="Times New Roman" w:cs="Times New Roman"/>
-        </w:rPr>
-        <w:t xml:space="preserve">(3), Article pgae052.</w:t>
+        <w:t xml:space="preserve">Information Systems Research, 23</w:t>
+      </w:r>
+      <w:r>
+        <w:rPr>
+          <w:rFonts w:ascii="Times New Roman" w:hAnsi="Times New Roman" w:eastAsia="Times New Roman" w:cs="Times New Roman"/>
+        </w:rPr>
+        <w:t xml:space="preserve">(3-part-1), 599–617.</w:t>
       </w:r>
     </w:p>
     <w:p>
@@ -17915,6 +18782,188 @@
         <w:rPr>
           <w:rFonts w:ascii="Times New Roman" w:hAnsi="Times New Roman" w:eastAsia="Times New Roman" w:cs="Times New Roman"/>
         </w:rPr>
+        <w:t xml:space="preserve">Teece, D. J. (1986). Profiting from technological innovation: Implications for integration, collaboration, licensing and public policy.</w:t>
+      </w:r>
+      <w:r>
+        <w:rPr>
+          <w:rFonts w:ascii="Times New Roman" w:hAnsi="Times New Roman" w:eastAsia="Times New Roman" w:cs="Times New Roman"/>
+        </w:rPr>
+        <w:t xml:space="preserve"> </w:t>
+      </w:r>
+      <w:r>
+        <w:rPr>
+          <w:iCs/>
+          <w:rFonts w:ascii="Times New Roman" w:hAnsi="Times New Roman" w:eastAsia="Times New Roman" w:cs="Times New Roman"/>
+          <w:i/>
+        </w:rPr>
+        <w:t xml:space="preserve">Research Policy, 15</w:t>
+      </w:r>
+      <w:r>
+        <w:rPr>
+          <w:rFonts w:ascii="Times New Roman" w:hAnsi="Times New Roman" w:eastAsia="Times New Roman" w:cs="Times New Roman"/>
+        </w:rPr>
+        <w:t xml:space="preserve">(6), 285–305.</w:t>
+      </w:r>
+    </w:p>
+    <w:p>
+      <w:pPr>
+        <w:pStyle w:val="BodyText"/>
+        <w:spacing w:line="480" w:lineRule="auto" w:after="0" w:before="0"/>
+        <w:ind w:firstLine="720"/>
+        <w:jc w:val="left"/>
+      </w:pPr>
+      <w:r>
+        <w:rPr>
+          <w:rFonts w:ascii="Times New Roman" w:hAnsi="Times New Roman" w:eastAsia="Times New Roman" w:cs="Times New Roman"/>
+        </w:rPr>
+        <w:t xml:space="preserve">Wade, M., &amp; Hulland, J. (2004). The resource-based view and information systems research: Review, extension, and suggestions for future research.</w:t>
+      </w:r>
+      <w:r>
+        <w:rPr>
+          <w:rFonts w:ascii="Times New Roman" w:hAnsi="Times New Roman" w:eastAsia="Times New Roman" w:cs="Times New Roman"/>
+        </w:rPr>
+        <w:t xml:space="preserve"> </w:t>
+      </w:r>
+      <w:r>
+        <w:rPr>
+          <w:iCs/>
+          <w:rFonts w:ascii="Times New Roman" w:hAnsi="Times New Roman" w:eastAsia="Times New Roman" w:cs="Times New Roman"/>
+          <w:i/>
+        </w:rPr>
+        <w:t xml:space="preserve">MIS Quarterly, 28</w:t>
+      </w:r>
+      <w:r>
+        <w:rPr>
+          <w:rFonts w:ascii="Times New Roman" w:hAnsi="Times New Roman" w:eastAsia="Times New Roman" w:cs="Times New Roman"/>
+        </w:rPr>
+        <w:t xml:space="preserve">(1), 107–142.</w:t>
+      </w:r>
+    </w:p>
+    <w:p>
+      <w:pPr>
+        <w:pStyle w:val="BodyText"/>
+        <w:spacing w:line="480" w:lineRule="auto" w:after="0" w:before="0"/>
+        <w:ind w:firstLine="720"/>
+        <w:jc w:val="left"/>
+      </w:pPr>
+      <w:r>
+        <w:rPr>
+          <w:rFonts w:ascii="Times New Roman" w:hAnsi="Times New Roman" w:eastAsia="Times New Roman" w:cs="Times New Roman"/>
+        </w:rPr>
+        <w:t xml:space="preserve">Web Data Commons. (2024).</w:t>
+      </w:r>
+      <w:r>
+        <w:rPr>
+          <w:rFonts w:ascii="Times New Roman" w:hAnsi="Times New Roman" w:eastAsia="Times New Roman" w:cs="Times New Roman"/>
+        </w:rPr>
+        <w:t xml:space="preserve"> </w:t>
+      </w:r>
+      <w:r>
+        <w:rPr>
+          <w:iCs/>
+          <w:rFonts w:ascii="Times New Roman" w:hAnsi="Times New Roman" w:eastAsia="Times New Roman" w:cs="Times New Roman"/>
+          <w:i/>
+        </w:rPr>
+        <w:t xml:space="preserve">Schema.org JobPosting class-specific subsets, crawls 2022-12, 2023-12, and 2024-12</w:t>
+      </w:r>
+      <w:r>
+        <w:rPr>
+          <w:rFonts w:ascii="Times New Roman" w:hAnsi="Times New Roman" w:eastAsia="Times New Roman" w:cs="Times New Roman"/>
+        </w:rPr>
+        <w:t xml:space="preserve"> </w:t>
+      </w:r>
+      <w:r>
+        <w:rPr>
+          <w:rFonts w:ascii="Times New Roman" w:hAnsi="Times New Roman" w:eastAsia="Times New Roman" w:cs="Times New Roman"/>
+        </w:rPr>
+        <w:t xml:space="preserve">[Data sets]. University of Mannheim. https://webdatacommons.org/structureddata/</w:t>
+      </w:r>
+    </w:p>
+    <w:p>
+      <w:pPr>
+        <w:pStyle w:val="BodyText"/>
+        <w:spacing w:line="480" w:lineRule="auto" w:after="0" w:before="0"/>
+        <w:ind w:firstLine="720"/>
+        <w:jc w:val="left"/>
+      </w:pPr>
+      <w:r>
+        <w:rPr>
+          <w:rFonts w:ascii="Times New Roman" w:hAnsi="Times New Roman" w:eastAsia="Times New Roman" w:cs="Times New Roman"/>
+        </w:rPr>
+        <w:t xml:space="preserve">Webb, M. (2020).</w:t>
+      </w:r>
+      <w:r>
+        <w:rPr>
+          <w:rFonts w:ascii="Times New Roman" w:hAnsi="Times New Roman" w:eastAsia="Times New Roman" w:cs="Times New Roman"/>
+        </w:rPr>
+        <w:t xml:space="preserve"> </w:t>
+      </w:r>
+      <w:r>
+        <w:rPr>
+          <w:iCs/>
+          <w:rFonts w:ascii="Times New Roman" w:hAnsi="Times New Roman" w:eastAsia="Times New Roman" w:cs="Times New Roman"/>
+          <w:i/>
+        </w:rPr>
+        <w:t xml:space="preserve">The impact of artificial intelligence on the labor market</w:t>
+      </w:r>
+      <w:r>
+        <w:rPr>
+          <w:rFonts w:ascii="Times New Roman" w:hAnsi="Times New Roman" w:eastAsia="Times New Roman" w:cs="Times New Roman"/>
+        </w:rPr>
+        <w:t xml:space="preserve"> </w:t>
+      </w:r>
+      <w:r>
+        <w:rPr>
+          <w:rFonts w:ascii="Times New Roman" w:hAnsi="Times New Roman" w:eastAsia="Times New Roman" w:cs="Times New Roman"/>
+        </w:rPr>
+        <w:t xml:space="preserve">[Working paper]. SSRN. https://ssrn.com/abstract=3482150</w:t>
+      </w:r>
+    </w:p>
+    <w:p>
+      <w:pPr>
+        <w:pStyle w:val="BodyText"/>
+        <w:spacing w:line="480" w:lineRule="auto" w:after="0" w:before="0"/>
+        <w:ind w:firstLine="720"/>
+        <w:jc w:val="left"/>
+      </w:pPr>
+      <w:r>
+        <w:rPr>
+          <w:rFonts w:ascii="Times New Roman" w:hAnsi="Times New Roman" w:eastAsia="Times New Roman" w:cs="Times New Roman"/>
+        </w:rPr>
+        <w:t xml:space="preserve">Zhou, E., &amp; Lee, D. (2024). Generative artificial intelligence, human creativity, and art.</w:t>
+      </w:r>
+      <w:r>
+        <w:rPr>
+          <w:rFonts w:ascii="Times New Roman" w:hAnsi="Times New Roman" w:eastAsia="Times New Roman" w:cs="Times New Roman"/>
+        </w:rPr>
+        <w:t xml:space="preserve"> </w:t>
+      </w:r>
+      <w:r>
+        <w:rPr>
+          <w:iCs/>
+          <w:rFonts w:ascii="Times New Roman" w:hAnsi="Times New Roman" w:eastAsia="Times New Roman" w:cs="Times New Roman"/>
+          <w:i/>
+        </w:rPr>
+        <w:t xml:space="preserve">PNAS Nexus, 3</w:t>
+      </w:r>
+      <w:r>
+        <w:rPr>
+          <w:rFonts w:ascii="Times New Roman" w:hAnsi="Times New Roman" w:eastAsia="Times New Roman" w:cs="Times New Roman"/>
+        </w:rPr>
+        <w:t xml:space="preserve">(3), Article pgae052.</w:t>
+      </w:r>
+    </w:p>
+    <w:p>
+      <w:pPr>
+        <w:pStyle w:val="BodyText"/>
+        <w:spacing w:line="480" w:lineRule="auto" w:after="0" w:before="0"/>
+        <w:ind w:firstLine="720"/>
+        <w:jc w:val="left"/>
+      </w:pPr>
+      <w:r>
+        <w:rPr>
+          <w:rFonts w:ascii="Times New Roman" w:hAnsi="Times New Roman" w:eastAsia="Times New Roman" w:cs="Times New Roman"/>
+        </w:rPr>
         <w:t xml:space="preserve">Zhu, K., &amp; Kraemer, K. L. (2005). Post-adoption variations in usage and value of e-business by organizations: Cross-country evidence from the retail industry.</w:t>
       </w:r>
       <w:r>
@@ -17938,7 +18987,7 @@
         <w:t xml:space="preserve">(1), 61–84.</w:t>
       </w:r>
     </w:p>
-    <w:bookmarkEnd w:id="61"/>
+    <w:bookmarkEnd w:id="62"/>
     <w:sectPr>
       <w:footerReference w:type="default" r:id="rId9"/>
       <w:pgMar w:left="1440" w:right="1440" w:top="1440" w:bottom="1440"/>

</xml_diff>

<commit_message>
Rebalance theoretical contribution: judgment complements and task-level assimilation; demote acquisition-cost conjecture
Co-Authored-By: Claude Sonnet 5.5 <noreply@anthropic.com>
Claude-Session: https://claude.ai/code/session_015MZUD2DotEDYTGGfpD8taa
</commit_message>
<xml_diff>
--- a/revision/Acquired_Not_Yet_Assimilated_ISR_revised.docx
+++ b/revision/Acquired_Not_Yet_Assimilated_ISR_revised.docx
@@ -216,7 +216,7 @@
         <w:rPr>
           <w:rFonts w:ascii="Times New Roman" w:hAnsi="Times New Roman" w:eastAsia="Times New Roman" w:cs="Times New Roman"/>
         </w:rPr>
-        <w:t xml:space="preserve">Statistics showing that firms have adopted generative visual AI are often read as evidence that creative work is being displaced. We argue that this reading is premature. Extending information systems research on assimilation, we develop a task-level model in which a firm hands a visual task to a generator only when the share of acceptable output exceeds a threshold set by generation, review, and human production costs. Complementary assets such as expertise, review routines, and compliance procedures enter through review cost alone. Because a generator costs almost nothing to acquire, acquisition can climb without the investment that assimilation requires, and the gap between the two widens. Eurostat data show that 9.6 percent of EU firms use AI that generates pictures, video, or audio, and that firms that considered but did not adopt AI cite missing expertise (70 percent) and legal uncertainty (54 percent) far more often than lack of usefulness (18 percent). European and Canadian job-advert data show only small exposure gradients that cannot be distinguished from earlier trends, and we show that these designs could not detect even complete assimilation at the substitution rates observed on freelance platforms. Such results are therefore uninformative about assimilation. We derive a detectability bound that can accompany any exposure estimate and specify the firm-level data needed to separate the competing accounts.</w:t>
+        <w:t xml:space="preserve">Statistics showing that firms have adopted generative visual AI are often read as evidence that creative work is being displaced. We argue that this reading is premature. Extending information systems research on assimilation, we develop a task-level model in which a firm hands a visual task to a generator only when the share of acceptable output exceeds a threshold set by generation, review, and human production costs. Complementary assets such as expertise, review routines, and compliance procedures enter through review cost alone. Because a generator costs almost nothing to acquire, acquisition can climb without the investment that assimilation requires, which makes reported use a weak signal of task reassignment. Eurostat data show that 9.6 percent of EU firms use AI that generates pictures, video, or audio, and that firms that considered but did not adopt AI cite missing expertise (70 percent) and legal uncertainty (54 percent) far more often than lack of usefulness (18 percent). European and Canadian job-advert data show only small exposure gradients that cannot be distinguished from earlier trends, and we show that these designs could not detect even complete assimilation at the substitution rates observed on freelance platforms. Such results are therefore uninformative about assimilation. We derive a detectability bound that can accompany any exposure estimate and specify the firm-level data needed to separate the competing accounts.</w:t>
       </w:r>
     </w:p>
     <w:p>
@@ -366,7 +366,7 @@
         <w:rPr>
           <w:rFonts w:ascii="Times New Roman" w:hAnsi="Times New Roman" w:eastAsia="Times New Roman" w:cs="Times New Roman"/>
         </w:rPr>
-        <w:t xml:space="preserve">We extend assimilation theory to generative AI by locating complementary assets in a single, observable cost term, review cost, and by showing why the near-zero acquisition cost of generative tools should widen the gap between acquisition and assimilation. The enterprise systems on which assimilation theory was built were costly to acquire, which meant that acquisition itself partly selected firms that had already built complements. A visual generator can be acquired with almost no complementary investment. Better models raise the acceptance rate of output, but they cannot supply the expertise, review capacity, or compliance procedures needed to cross the acceptance threshold. Reported use is therefore a weaker signal of task reassignment for generative tools than it was for earlier information technologies. Platform studies observe substitution because the buyer of a freelance task can switch tools without first building a review routine; standing occupations inside firms face that friction.</w:t>
+        <w:t xml:space="preserve">We extend assimilation theory in two ways. The first is to distinguish judgment complements from production complements. Earlier work located the barrier in the knowledge needed to make a technology work (Attewell, 1992; Fichman &amp; Kemerer, 1999). A visual generator removes most of that barrier, but it leaves the capacity to judge whether its output may replace human work: expertise, review capacity, and compliance procedures. We place these complements in a single, observable cost term, review cost, so that a better model raises the acceptance rate of output without supplying the person, the time, or the policy that judging requires. The second is to treat assimilation as a property of the task and not of the firm. With the same tool, a firm can assimilate tasks whose review cost is low and leave others untouched, which a firm-level assimilation score conceals. Together these imply that reported use is a weaker signal of task reassignment for generative tools than for earlier technologies. We also conjecture that near-zero acquisition cost makes acquisition less informative about assimilation than it was when acquisition was costly; the public data we examine neither support nor refute this, and we flag it as a hypothesis for firm-level work. Platform studies observe substitution because the buyer of a freelance task can switch tools without first building a review routine; standing occupations inside firms face that friction.</w:t>
       </w:r>
     </w:p>
     <w:p>
@@ -5644,7 +5644,7 @@
         <w:rPr>
           <w:rFonts w:ascii="Times New Roman" w:hAnsi="Times New Roman" w:eastAsia="Times New Roman" w:cs="Times New Roman"/>
         </w:rPr>
-        <w:t xml:space="preserve">The model carries three claims that go beyond restating the assimilation gap for a new technology. We state them as conceptual claims, not as results of this paper, and Section 9 sets out how each could be tested.</w:t>
+        <w:t xml:space="preserve">The model carries three claims that go beyond restating the assimilation gap for a new technology. The first and third are the core of the theoretical contribution; the second is a conjecture that current public data do not support. We state all three as conceptual claims, not as results of this paper, and Section 9 sets out how each could be tested.</w:t>
       </w:r>
     </w:p>
     <w:p>
@@ -5700,7 +5700,105 @@
         <w:rPr>
           <w:rFonts w:ascii="Times New Roman" w:hAnsi="Times New Roman" w:eastAsia="Times New Roman" w:cs="Times New Roman"/>
         </w:rPr>
-        <w:t xml:space="preserve">When acquiring a technology requires a large commitment, a firm that acquires it has typically decided to reorganize work around it, and acquisition counts therefore carry information about deployment. As acquisition cost falls toward zero, firms acquire to explore, and acquisition counts carry less information about deployment. The conditional probability that an acquiring firm has assimilated a task is therefore lower for generative tools than for earlier technologies, even when the tool is valuable once assimilated. This implies that the assimilation gap should widen as acquisition becomes cheaper, which reverses the usual expectation that falling costs speed diffusion into use. We do not derive this formally; it follows from the threshold in equation (1) combined with free acquisition, and it is the claim most in need of firm-level evidence.</w:t>
+        <w:t xml:space="preserve">When acquiring a technology requires a large commitment, a firm that acquires it has typically decided to reorganize work around it, and acquisition counts therefore carry information about deployment. As acquisition cost falls toward zero, firms acquire to explore, and acquisition counts carry less information about deployment. The conditional probability that an acquiring firm has assimilated a task is therefore lower for generative tools than for earlier technologies, even when the tool is valuable once assimilated. This implies that the assimilation gap should widen as acquisition becomes cheaper, which reverses the usual expectation that falling costs speed diffusion into use. We do not derive this formally; it follows from the threshold in equation (1) combined with free acquisition, and it is the claim most in need of firm-level evidence. Public data give only weak and partly unfavorable evidence. Among European firms that use AI, the share using it for at least two business purposes does not vary with the share running ready-to-use commercial software, a proxy for low-commitment acquisition (Spearman correlation</w:t>
+      </w:r>
+      <w:r>
+        <w:rPr>
+          <w:rFonts w:ascii="Times New Roman" w:hAnsi="Times New Roman" w:eastAsia="Times New Roman" w:cs="Times New Roman"/>
+        </w:rPr>
+        <w:t xml:space="preserve"> </w:t>
+      </w:r>
+      <m:oMath>
+        <m:r>
+          <m:rPr>
+            <m:sty m:val="p"/>
+          </m:rPr>
+          <m:t>−</m:t>
+        </m:r>
+        <m:r>
+          <m:t>0.03</m:t>
+        </m:r>
+      </m:oMath>
+      <w:r>
+        <w:rPr>
+          <w:rFonts w:ascii="Times New Roman" w:hAnsi="Times New Roman" w:eastAsia="Times New Roman" w:cs="Times New Roman"/>
+        </w:rPr>
+        <w:t xml:space="preserve"> </w:t>
+      </w:r>
+      <w:r>
+        <w:rPr>
+          <w:rFonts w:ascii="Times New Roman" w:hAnsi="Times New Roman" w:eastAsia="Times New Roman" w:cs="Times New Roman"/>
+        </w:rPr>
+        <w:t xml:space="preserve">across 23 countries in 2024,</w:t>
+      </w:r>
+      <w:r>
+        <w:rPr>
+          <w:rFonts w:ascii="Times New Roman" w:hAnsi="Times New Roman" w:eastAsia="Times New Roman" w:cs="Times New Roman"/>
+        </w:rPr>
+        <w:t xml:space="preserve"> </w:t>
+      </w:r>
+      <m:oMath>
+        <m:r>
+          <m:t>p</m:t>
+        </m:r>
+        <m:r>
+          <m:rPr>
+            <m:sty m:val="p"/>
+          </m:rPr>
+          <m:t>=</m:t>
+        </m:r>
+        <m:r>
+          <m:t>0.91</m:t>
+        </m:r>
+      </m:oMath>
+      <w:r>
+        <w:rPr>
+          <w:rFonts w:ascii="Times New Roman" w:hAnsi="Times New Roman" w:eastAsia="Times New Roman" w:cs="Times New Roman"/>
+        </w:rPr>
+        <w:t xml:space="preserve">), and the share using three or more AI technologies is negatively but imprecisely related to it (</w:t>
+      </w:r>
+      <m:oMath>
+        <m:r>
+          <m:rPr>
+            <m:sty m:val="p"/>
+          </m:rPr>
+          <m:t>−</m:t>
+        </m:r>
+        <m:r>
+          <m:t>0.33</m:t>
+        </m:r>
+      </m:oMath>
+      <w:r>
+        <w:rPr>
+          <w:rFonts w:ascii="Times New Roman" w:hAnsi="Times New Roman" w:eastAsia="Times New Roman" w:cs="Times New Roman"/>
+        </w:rPr>
+        <w:t xml:space="preserve">,</w:t>
+      </w:r>
+      <w:r>
+        <w:rPr>
+          <w:rFonts w:ascii="Times New Roman" w:hAnsi="Times New Roman" w:eastAsia="Times New Roman" w:cs="Times New Roman"/>
+        </w:rPr>
+        <w:t xml:space="preserve"> </w:t>
+      </w:r>
+      <m:oMath>
+        <m:r>
+          <m:t>p</m:t>
+        </m:r>
+        <m:r>
+          <m:rPr>
+            <m:sty m:val="p"/>
+          </m:rPr>
+          <m:t>=</m:t>
+        </m:r>
+        <m:r>
+          <m:t>0.13</m:t>
+        </m:r>
+      </m:oMath>
+      <w:r>
+        <w:rPr>
+          <w:rFonts w:ascii="Times New Roman" w:hAnsi="Times New Roman" w:eastAsia="Times New Roman" w:cs="Times New Roman"/>
+        </w:rPr>
+        <w:t xml:space="preserve">). Across size classes the relation is positive, because large firms both buy more ready-to-use software and use AI more broadly, so firm size confounds the comparison. In the United States, about 39 percent of employed adults used generative AI for work in the past week in 2026, yet generative AI assisted only about 6 percent of work hours (Bick et al., 2024, and the authors’ tracker). That is a gap between use and intensity for a nearly free tool, but without a costly comparison technology it does not show that the gap is larger than for earlier technologies. We therefore treat this claim as a conjecture that the data neither support nor refute, and the test in Section 9 includes a comparison with earlier technologies for that reason.</w:t>
       </w:r>
     </w:p>
     <w:p>
@@ -13615,7 +13713,7 @@
         <w:rPr>
           <w:rFonts w:ascii="Times New Roman" w:hAnsi="Times New Roman" w:eastAsia="Times New Roman" w:cs="Times New Roman"/>
         </w:rPr>
-        <w:t xml:space="preserve">Assimilation research was built on technologies whose acquisition was costly. Generative AI reverses that condition. When acquisition is nearly free, the decision to acquire carries little information about the decision to reorganize work, and the gap between the two can widen as adoption statistics rise. The complementary-asset account developed here gives that gap a precise location: review cost, which depends on expertise, review capacity, and compliance procedures rather than on the model. This adds a mechanism to IT-complementarity research for a class of technologies in which the bottleneck is judging output rather than producing it. Unlike earlier enterprise systems, model quality alone cannot substitute for the missing complements; improvements in the generator matter only after those complements have brought review cost below the cost of human production. The account also connects two literatures that rarely meet. IS studies of AI inside adopting organizations (for example, Fügener et al., 2022) take use as given, and labor-market studies of exposure take the occupation as given. Placing the assimilation step between them clarifies what each can and cannot say. Section 3.8 states the resulting extensions to assimilation theory: judgment complements are distinct from production complements, acquisition becomes less informative as its cost falls, assimilation is a property of tasks and not of firms, and the account has stated boundary conditions. These are conceptual claims. Their testing awaits the firm-level data described in Section 9.</w:t>
+        <w:t xml:space="preserve">Assimilation research was built on technologies that were hard to make work, and it located the gap between acquiring and using them in the knowledge needed to build competence (Attewell, 1992; Fichman &amp; Kemerer, 1999). Generative AI removes much of that barrier, yet it leaves the gap in place, because the bottleneck moves from producing output to judging it. The complementary-asset account developed here gives the gap a precise location: review cost, which depends on expertise, review capacity, and compliance procedures rather than on the model. This adds a mechanism to IT-complementarity research for a class of technologies in which the complement is judgment. Unlike earlier enterprise systems, model quality alone cannot substitute for the missing complements; improvements in the generator matter only after those complements have brought review cost below the cost of human production. The account also moves the unit of assimilation from the firm to the task, since two employers with the same tool can differ in which tasks they have reassigned, depending on how costly each task is to review. The account connects two literatures that rarely meet. IS studies of AI inside adopting organizations (for example, Fügener et al., 2022) take use as given, and labor-market studies of exposure take the occupation as given. Placing the assimilation step between them clarifies what each can and cannot say. Section 3.8 sets out these extensions, together with boundary conditions for the account. They are conceptual claims whose test awaits the firm-level data described in Section 9. A further conjecture, that cheaper acquisition widens the gap between acquisition and assimilation, is more speculative: the public evidence in Section 3.8 does not support it, and we do not rest the contribution on it.</w:t>
       </w:r>
     </w:p>
     <w:p>
@@ -17665,6 +17763,46 @@
           <w:rFonts w:ascii="Times New Roman" w:hAnsi="Times New Roman" w:eastAsia="Times New Roman" w:cs="Times New Roman"/>
         </w:rPr>
         <w:t xml:space="preserve">(3), 1433–1450.</w:t>
+      </w:r>
+    </w:p>
+    <w:p>
+      <w:pPr>
+        <w:pStyle w:val="BodyText"/>
+        <w:spacing w:line="480" w:lineRule="auto" w:after="0" w:before="0"/>
+        <w:ind w:firstLine="720"/>
+        <w:jc w:val="left"/>
+      </w:pPr>
+      <w:r>
+        <w:rPr>
+          <w:rFonts w:ascii="Times New Roman" w:hAnsi="Times New Roman" w:eastAsia="Times New Roman" w:cs="Times New Roman"/>
+        </w:rPr>
+        <w:t xml:space="preserve">Bick, A., Blandin, A., &amp; Deming, D. J. (2024).</w:t>
+      </w:r>
+      <w:r>
+        <w:rPr>
+          <w:rFonts w:ascii="Times New Roman" w:hAnsi="Times New Roman" w:eastAsia="Times New Roman" w:cs="Times New Roman"/>
+        </w:rPr>
+        <w:t xml:space="preserve"> </w:t>
+      </w:r>
+      <w:r>
+        <w:rPr>
+          <w:iCs/>
+          <w:rFonts w:ascii="Times New Roman" w:hAnsi="Times New Roman" w:eastAsia="Times New Roman" w:cs="Times New Roman"/>
+          <w:i/>
+        </w:rPr>
+        <w:t xml:space="preserve">The rapid adoption of generative AI</w:t>
+      </w:r>
+      <w:r>
+        <w:rPr>
+          <w:rFonts w:ascii="Times New Roman" w:hAnsi="Times New Roman" w:eastAsia="Times New Roman" w:cs="Times New Roman"/>
+        </w:rPr>
+        <w:t xml:space="preserve"> </w:t>
+      </w:r>
+      <w:r>
+        <w:rPr>
+          <w:rFonts w:ascii="Times New Roman" w:hAnsi="Times New Roman" w:eastAsia="Times New Roman" w:cs="Times New Roman"/>
+        </w:rPr>
+        <w:t xml:space="preserve">(NBER Working Paper No. 32966). National Bureau of Economic Research.</w:t>
       </w:r>
     </w:p>
     <w:p>

</xml_diff>